<commit_message>
Create outline for introduction
</commit_message>
<xml_diff>
--- a/submission/manuscript.docx
+++ b/submission/manuscript.docx
@@ -2,7 +2,7 @@
 <file path=word/document.xml><?xml version="1.0" encoding="utf-8"?>
 <w:document xmlns:w="http://schemas.openxmlformats.org/wordprocessingml/2006/main" xmlns:m="http://schemas.openxmlformats.org/officeDocument/2006/math" xmlns:r="http://schemas.openxmlformats.org/officeDocument/2006/relationships" xmlns:o="urn:schemas-microsoft-com:office:office" xmlns:v="urn:schemas-microsoft-com:vml" xmlns:w10="urn:schemas-microsoft-com:office:word" xmlns:a="http://schemas.openxmlformats.org/drawingml/2006/main" xmlns:pic="http://schemas.openxmlformats.org/drawingml/2006/picture" xmlns:wp="http://schemas.openxmlformats.org/drawingml/2006/wordprocessingDrawing">
   <w:body>
-    <w:bookmarkStart w:id="32" w:name="lorem-ipsum"/>
+    <w:bookmarkStart w:id="31" w:name="lorem-ipsum"/>
     <w:p>
       <w:pPr>
         <w:pStyle w:val="Heading1"/>
@@ -36,39 +36,14 @@
       <w:r>
         <w:t xml:space="preserve">Patrick D. Schloss</w:t>
       </w:r>
-      <m:oMath>
-        <m:sSup>
-          <m:e>
-            <m:r>
-              <m:t>​</m:t>
-            </m:r>
-          </m:e>
-          <m:sup>
-            <m:r>
-              <m:rPr>
-                <m:sty m:val="p"/>
-              </m:rPr>
-              <m:t>†</m:t>
-            </m:r>
-          </m:sup>
-        </m:sSup>
-      </m:oMath>
+      <w:r>
+        <w:t xml:space="preserve"> </w:t>
+      </w:r>
     </w:p>
     <w:p>
       <w:pPr>
         <w:pStyle w:val="BodyText"/>
       </w:pPr>
-      <m:oMath>
-        <m:r>
-          <m:rPr>
-            <m:sty m:val="p"/>
-          </m:rPr>
-          <m:t>†</m:t>
-        </m:r>
-      </m:oMath>
-      <w:r>
-        <w:t xml:space="preserve"> </w:t>
-      </w:r>
       <w:r>
         <w:t xml:space="preserve">To whom correspondence should be addressed:</w:t>
       </w:r>
@@ -119,15 +94,31 @@
         <w:br w:type="page"/>
       </w:r>
     </w:p>
-    <w:bookmarkStart w:id="20" w:name="datasets"/>
+    <w:bookmarkStart w:id="20" w:name="abstract"/>
+    <w:p>
+      <w:pPr>
+        <w:pStyle w:val="Heading2"/>
+      </w:pPr>
+      <w:r>
+        <w:t xml:space="preserve">Abstract</w:t>
+      </w:r>
+    </w:p>
+    <w:p>
+      <w:pPr>
+        <w:pStyle w:val="FirstParagraph"/>
+      </w:pPr>
+      <w:r>
+        <w:t xml:space="preserve">Sus umami skateboard activated charcoal XOXO cornhole, thundercats pitchfork. Succulents street art semiotics, artisan lo-fi same food truck forage aesthetic plaid drinking vinegar ugh slow-carb. Sustainable vexillologist ramps cold-pressed, selfies pop-up microdosing messenger bag slow-carb. Lo-fi fingerstache cred, copper mug chicharrones DSA chambray. Craft beer meditation shabby chic, put a bird on it tonx ramps tumeric palo santo etsy dreamcatcher chartreuse snackwave. Fashion axe kogi sus, migas etsy gluten-free semiotics hammock chartreuse cardigan.</w:t>
+      </w:r>
+    </w:p>
     <w:bookmarkEnd w:id="20"/>
-    <w:bookmarkStart w:id="21" w:name="abstract"/>
+    <w:bookmarkStart w:id="21" w:name="importance"/>
     <w:p>
       <w:pPr>
         <w:pStyle w:val="Heading2"/>
       </w:pPr>
       <w:r>
-        <w:t xml:space="preserve">Abstract</w:t>
+        <w:t xml:space="preserve">Importance</w:t>
       </w:r>
     </w:p>
     <w:p>
@@ -135,17 +126,573 @@
         <w:pStyle w:val="FirstParagraph"/>
       </w:pPr>
       <w:r>
-        <w:t xml:space="preserve">Sus umami skateboard activated charcoal XOXO cornhole, thundercats pitchfork. Succulents street art semiotics, artisan lo-fi same food truck forage aesthetic plaid drinking vinegar ugh slow-carb. Sustainable vexillologist ramps cold-pressed, selfies pop-up microdosing messenger bag slow-carb. Lo-fi fingerstache cred, copper mug chicharrones DSA chambray. Craft beer meditation shabby chic, put a bird on it tonx ramps tumeric palo santo etsy dreamcatcher chartreuse snackwave. Fashion axe kogi sus, migas etsy gluten-free semiotics hammock chartreuse cardigan.</w:t>
+        <w:t xml:space="preserve">Taiyaki hoodie letterpress, franzen man braid bushwick food truck humblebrag chia palo santo vinyl keffiyeh. IPhone ugh kitsch tousled tumblr messenger bag, kogi actually taiyaki. Austin taiyaki succulents vaporware letterpress bruh. Wayfarers listicle lyft beard tousled keffiyeh fingerstache neutral milk hotel ramps prism. Tote bag vape gentrify, fingerstache fixie marxism enamel pin pork belly cardigan microdosing hoodie. Freegan Brooklyn biodiesel, fanny pack actually kombucha organic whatever literally crucifix. Fingerstache kombucha subway tile squid, marxism kogi VHS ethical distillery fanny pack jean shorts.</w:t>
+      </w:r>
+    </w:p>
+    <w:p>
+      <w:r>
+        <w:br w:type="page"/>
       </w:r>
     </w:p>
     <w:bookmarkEnd w:id="21"/>
-    <w:bookmarkStart w:id="22" w:name="importance"/>
+    <w:bookmarkStart w:id="22" w:name="introduction"/>
     <w:p>
       <w:pPr>
         <w:pStyle w:val="Heading2"/>
       </w:pPr>
       <w:r>
-        <w:t xml:space="preserve">Importance</w:t>
+        <w:t xml:space="preserve">Introduction</w:t>
+      </w:r>
+    </w:p>
+    <w:p>
+      <w:pPr>
+        <w:numPr>
+          <w:ilvl w:val="0"/>
+          <w:numId w:val="1001"/>
+        </w:numPr>
+        <w:pStyle w:val="Compact"/>
+      </w:pPr>
+      <w:r>
+        <w:t xml:space="preserve">AND - Problem of uneven sampling effort and how to control for the effects</w:t>
+      </w:r>
+    </w:p>
+    <w:p>
+      <w:pPr>
+        <w:numPr>
+          <w:ilvl w:val="1"/>
+          <w:numId w:val="1002"/>
+        </w:numPr>
+        <w:pStyle w:val="Compact"/>
+      </w:pPr>
+      <w:r>
+        <w:t xml:space="preserve">Previous work from me has show rarefaction controls for sampling effort</w:t>
+      </w:r>
+      <w:r>
+        <w:t xml:space="preserve"> </w:t>
+      </w:r>
+      <w:r>
+        <w:t xml:space="preserve">better than other methods</w:t>
+      </w:r>
+    </w:p>
+    <w:p>
+      <w:pPr>
+        <w:numPr>
+          <w:ilvl w:val="1"/>
+          <w:numId w:val="1002"/>
+        </w:numPr>
+        <w:pStyle w:val="Compact"/>
+      </w:pPr>
+      <w:r>
+        <w:t xml:space="preserve">BUT - Confusion over difference between rarefaction and rarefying</w:t>
+      </w:r>
+    </w:p>
+    <w:p>
+      <w:pPr>
+        <w:numPr>
+          <w:ilvl w:val="1"/>
+          <w:numId w:val="1002"/>
+        </w:numPr>
+        <w:pStyle w:val="Compact"/>
+      </w:pPr>
+      <w:r>
+        <w:t xml:space="preserve">THEREFORE - Define rarefaction</w:t>
+      </w:r>
+    </w:p>
+    <w:p>
+      <w:pPr>
+        <w:numPr>
+          <w:ilvl w:val="0"/>
+          <w:numId w:val="1001"/>
+        </w:numPr>
+        <w:pStyle w:val="Compact"/>
+      </w:pPr>
+      <w:r>
+        <w:t xml:space="preserve">AND - Critiques against rarefaction include</w:t>
+      </w:r>
+    </w:p>
+    <w:p>
+      <w:pPr>
+        <w:numPr>
+          <w:ilvl w:val="1"/>
+          <w:numId w:val="1003"/>
+        </w:numPr>
+        <w:pStyle w:val="Compact"/>
+      </w:pPr>
+      <w:r>
+        <w:t xml:space="preserve">Compresses the alpha and beta diversity metrics</w:t>
+      </w:r>
+    </w:p>
+    <w:p>
+      <w:pPr>
+        <w:numPr>
+          <w:ilvl w:val="1"/>
+          <w:numId w:val="1003"/>
+        </w:numPr>
+        <w:pStyle w:val="Compact"/>
+      </w:pPr>
+      <w:r>
+        <w:t xml:space="preserve">Perceived as</w:t>
+      </w:r>
+      <w:r>
+        <w:t xml:space="preserve"> </w:t>
+      </w:r>
+      <w:r>
+        <w:t xml:space="preserve">“</w:t>
+      </w:r>
+      <w:r>
+        <w:t xml:space="preserve">throwing away</w:t>
+      </w:r>
+      <w:r>
+        <w:t xml:space="preserve">”</w:t>
+      </w:r>
+      <w:r>
+        <w:t xml:space="preserve"> </w:t>
+      </w:r>
+      <w:r>
+        <w:t xml:space="preserve">data</w:t>
+      </w:r>
+    </w:p>
+    <w:p>
+      <w:pPr>
+        <w:numPr>
+          <w:ilvl w:val="1"/>
+          <w:numId w:val="1003"/>
+        </w:numPr>
+        <w:pStyle w:val="Compact"/>
+      </w:pPr>
+      <w:r>
+        <w:t xml:space="preserve">Arbitrary choice for rarefaction threshold</w:t>
+      </w:r>
+    </w:p>
+    <w:p>
+      <w:pPr>
+        <w:numPr>
+          <w:ilvl w:val="1"/>
+          <w:numId w:val="1003"/>
+        </w:numPr>
+        <w:pStyle w:val="Compact"/>
+      </w:pPr>
+      <w:r>
+        <w:t xml:space="preserve">BUT - these really aren’t problems; largely unavoidable</w:t>
+      </w:r>
+    </w:p>
+    <w:p>
+      <w:pPr>
+        <w:numPr>
+          <w:ilvl w:val="1"/>
+          <w:numId w:val="1003"/>
+        </w:numPr>
+        <w:pStyle w:val="Compact"/>
+      </w:pPr>
+      <w:r>
+        <w:t xml:space="preserve">THEREFORE - Use rarefaction</w:t>
+      </w:r>
+    </w:p>
+    <w:p>
+      <w:pPr>
+        <w:numPr>
+          <w:ilvl w:val="0"/>
+          <w:numId w:val="1001"/>
+        </w:numPr>
+        <w:pStyle w:val="Compact"/>
+      </w:pPr>
+      <w:r>
+        <w:t xml:space="preserve">AND - Additional problem with 16S rRNA gene sequencing is that the data are compositional</w:t>
+      </w:r>
+    </w:p>
+    <w:p>
+      <w:pPr>
+        <w:numPr>
+          <w:ilvl w:val="1"/>
+          <w:numId w:val="1004"/>
+        </w:numPr>
+        <w:pStyle w:val="Compact"/>
+      </w:pPr>
+      <w:r>
+        <w:t xml:space="preserve">Define compositionality</w:t>
+      </w:r>
+    </w:p>
+    <w:p>
+      <w:pPr>
+        <w:numPr>
+          <w:ilvl w:val="1"/>
+          <w:numId w:val="1004"/>
+        </w:numPr>
+        <w:pStyle w:val="Compact"/>
+      </w:pPr>
+      <w:r>
+        <w:t xml:space="preserve">Solutions to problem of compositionality</w:t>
+      </w:r>
+    </w:p>
+    <w:p>
+      <w:pPr>
+        <w:numPr>
+          <w:ilvl w:val="1"/>
+          <w:numId w:val="1004"/>
+        </w:numPr>
+        <w:pStyle w:val="Compact"/>
+      </w:pPr>
+      <w:r>
+        <w:t xml:space="preserve">BUT - Still have sensitivity to uneven sampling effort</w:t>
+      </w:r>
+    </w:p>
+    <w:p>
+      <w:pPr>
+        <w:numPr>
+          <w:ilvl w:val="1"/>
+          <w:numId w:val="1004"/>
+        </w:numPr>
+        <w:pStyle w:val="Compact"/>
+      </w:pPr>
+      <w:r>
+        <w:t xml:space="preserve">THEREFORE - Question of why I found different results from proponents of CLR-based methods</w:t>
+      </w:r>
+    </w:p>
+    <w:p>
+      <w:pPr>
+        <w:numPr>
+          <w:ilvl w:val="0"/>
+          <w:numId w:val="1001"/>
+        </w:numPr>
+        <w:pStyle w:val="Compact"/>
+      </w:pPr>
+      <w:r>
+        <w:t xml:space="preserve">AND - RPCA as a solution</w:t>
+      </w:r>
+    </w:p>
+    <w:p>
+      <w:pPr>
+        <w:numPr>
+          <w:ilvl w:val="1"/>
+          <w:numId w:val="1005"/>
+        </w:numPr>
+        <w:pStyle w:val="Compact"/>
+      </w:pPr>
+      <w:r>
+        <w:t xml:space="preserve">Describe RPCA</w:t>
+      </w:r>
+    </w:p>
+    <w:p>
+      <w:pPr>
+        <w:numPr>
+          <w:ilvl w:val="1"/>
+          <w:numId w:val="1005"/>
+        </w:numPr>
+        <w:pStyle w:val="Compact"/>
+      </w:pPr>
+      <w:r>
+        <w:t xml:space="preserve">Claims made by Martino</w:t>
+      </w:r>
+    </w:p>
+    <w:p>
+      <w:pPr>
+        <w:numPr>
+          <w:ilvl w:val="1"/>
+          <w:numId w:val="1005"/>
+        </w:numPr>
+        <w:pStyle w:val="Compact"/>
+      </w:pPr>
+      <w:r>
+        <w:t xml:space="preserve">Methods used in Martino</w:t>
+      </w:r>
+    </w:p>
+    <w:p>
+      <w:pPr>
+        <w:numPr>
+          <w:ilvl w:val="1"/>
+          <w:numId w:val="1005"/>
+        </w:numPr>
+        <w:pStyle w:val="Compact"/>
+      </w:pPr>
+      <w:r>
+        <w:t xml:space="preserve">BUT - Problems with analysis including not using rarefaction, arbitrary threshold selection, not using other CLR-based methods</w:t>
+      </w:r>
+    </w:p>
+    <w:p>
+      <w:pPr>
+        <w:numPr>
+          <w:ilvl w:val="1"/>
+          <w:numId w:val="1005"/>
+        </w:numPr>
+        <w:pStyle w:val="Compact"/>
+      </w:pPr>
+      <w:r>
+        <w:t xml:space="preserve">THEREFORE - The goal of this study was to reassess RPCA using the framework and methods used by Martino et al. alongside other methods commonly used by microbial ecologists</w:t>
+      </w:r>
+    </w:p>
+    <w:p>
+      <w:pPr>
+        <w:numPr>
+          <w:ilvl w:val="0"/>
+          <w:numId w:val="1001"/>
+        </w:numPr>
+        <w:pStyle w:val="Compact"/>
+      </w:pPr>
+      <w:r>
+        <w:t xml:space="preserve">Other…</w:t>
+      </w:r>
+    </w:p>
+    <w:p>
+      <w:pPr>
+        <w:numPr>
+          <w:ilvl w:val="1"/>
+          <w:numId w:val="1006"/>
+        </w:numPr>
+        <w:pStyle w:val="Compact"/>
+      </w:pPr>
+      <w:r>
+        <w:t xml:space="preserve">RPCA -&gt; deicode -&gt; gemelli</w:t>
+      </w:r>
+    </w:p>
+    <w:p>
+      <w:pPr>
+        <w:numPr>
+          <w:ilvl w:val="1"/>
+          <w:numId w:val="1006"/>
+        </w:numPr>
+        <w:pStyle w:val="Compact"/>
+      </w:pPr>
+      <w:r>
+        <w:t xml:space="preserve">Benchmarking data and code forked from deicode</w:t>
+      </w:r>
+    </w:p>
+    <w:p>
+      <w:pPr>
+        <w:numPr>
+          <w:ilvl w:val="0"/>
+          <w:numId w:val="1001"/>
+        </w:numPr>
+        <w:pStyle w:val="Compact"/>
+      </w:pPr>
+      <w:r>
+        <w:t xml:space="preserve">Problems with original analysis</w:t>
+      </w:r>
+    </w:p>
+    <w:p>
+      <w:pPr>
+        <w:numPr>
+          <w:ilvl w:val="1"/>
+          <w:numId w:val="1007"/>
+        </w:numPr>
+      </w:pPr>
+      <w:r>
+        <w:t xml:space="preserve">Simulation design</w:t>
+      </w:r>
+    </w:p>
+    <w:p>
+      <w:pPr>
+        <w:numPr>
+          <w:ilvl w:val="2"/>
+          <w:numId w:val="1008"/>
+        </w:numPr>
+        <w:pStyle w:val="Compact"/>
+      </w:pPr>
+      <w:r>
+        <w:t xml:space="preserve">1 seed to generate simulated communities</w:t>
+      </w:r>
+    </w:p>
+    <w:p>
+      <w:pPr>
+        <w:numPr>
+          <w:ilvl w:val="2"/>
+          <w:numId w:val="1008"/>
+        </w:numPr>
+        <w:pStyle w:val="Compact"/>
+      </w:pPr>
+      <w:r>
+        <w:t xml:space="preserve">Null model had no skew to it</w:t>
+      </w:r>
+    </w:p>
+    <w:p>
+      <w:pPr>
+        <w:numPr>
+          <w:ilvl w:val="2"/>
+          <w:numId w:val="1008"/>
+        </w:numPr>
+        <w:pStyle w:val="Compact"/>
+      </w:pPr>
+      <w:r>
+        <w:t xml:space="preserve">Simulated communities had uneven sampling effort</w:t>
+      </w:r>
+    </w:p>
+    <w:p>
+      <w:pPr>
+        <w:numPr>
+          <w:ilvl w:val="1"/>
+          <w:numId w:val="1007"/>
+        </w:numPr>
+      </w:pPr>
+      <w:r>
+        <w:t xml:space="preserve">Choice of distance metrics for comparison</w:t>
+      </w:r>
+    </w:p>
+    <w:p>
+      <w:pPr>
+        <w:numPr>
+          <w:ilvl w:val="2"/>
+          <w:numId w:val="1009"/>
+        </w:numPr>
+        <w:pStyle w:val="Compact"/>
+      </w:pPr>
+      <w:r>
+        <w:t xml:space="preserve">Compared RPCA to MatrixCompletion without using RCLR. Who would do this? Why not at least also compare to CLR w/ a pseudocount?</w:t>
+      </w:r>
+    </w:p>
+    <w:p>
+      <w:pPr>
+        <w:numPr>
+          <w:ilvl w:val="1"/>
+          <w:numId w:val="1007"/>
+        </w:numPr>
+      </w:pPr>
+      <w:r>
+        <w:t xml:space="preserve">kNN</w:t>
+      </w:r>
+    </w:p>
+    <w:p>
+      <w:pPr>
+        <w:numPr>
+          <w:ilvl w:val="2"/>
+          <w:numId w:val="1010"/>
+        </w:numPr>
+        <w:pStyle w:val="Compact"/>
+      </w:pPr>
+      <w:r>
+        <w:t xml:space="preserve">Used 1st 2 axes of PCoA of Bray-Curtis distances to calcualte euclidean distances, which were then fed into kNN. Why not use the original Bray-Curtis distance matrix?</w:t>
+      </w:r>
+    </w:p>
+    <w:p>
+      <w:pPr>
+        <w:numPr>
+          <w:ilvl w:val="2"/>
+          <w:numId w:val="1010"/>
+        </w:numPr>
+        <w:pStyle w:val="Compact"/>
+      </w:pPr>
+      <w:r>
+        <w:t xml:space="preserve">1 60:40 split (said 10-fold, but only repeated knn 10 times, not parititioning), did not fit hyperparameter; choice for case studies was messed up</w:t>
+      </w:r>
+    </w:p>
+    <w:p>
+      <w:pPr>
+        <w:numPr>
+          <w:ilvl w:val="1"/>
+          <w:numId w:val="1007"/>
+        </w:numPr>
+      </w:pPr>
+      <w:r>
+        <w:t xml:space="preserve">Comparison of PERMANOVA Fst values misleading since they removed all of the noise by only considering first two axes from RPCA and comparing to PERMANOVA on original Bray-Curtis distances</w:t>
+      </w:r>
+    </w:p>
+    <w:p>
+      <w:pPr>
+        <w:numPr>
+          <w:ilvl w:val="1"/>
+          <w:numId w:val="1007"/>
+        </w:numPr>
+      </w:pPr>
+      <w:r>
+        <w:t xml:space="preserve">Case study analysis</w:t>
+      </w:r>
+    </w:p>
+    <w:p>
+      <w:pPr>
+        <w:numPr>
+          <w:ilvl w:val="2"/>
+          <w:numId w:val="1011"/>
+        </w:numPr>
+        <w:pStyle w:val="Compact"/>
+      </w:pPr>
+      <w:r>
+        <w:t xml:space="preserve">Picked case studies with large effect sizes that are easily seen on PCoA/PCA; most microbiome studies are not so easy to differentiate</w:t>
+      </w:r>
+    </w:p>
+    <w:p>
+      <w:pPr>
+        <w:numPr>
+          <w:ilvl w:val="2"/>
+          <w:numId w:val="1011"/>
+        </w:numPr>
+        <w:pStyle w:val="Compact"/>
+      </w:pPr>
+      <w:r>
+        <w:t xml:space="preserve">Thresholds for subsampling case study datasets are arbitrary</w:t>
+      </w:r>
+    </w:p>
+    <w:p>
+      <w:pPr>
+        <w:numPr>
+          <w:ilvl w:val="1"/>
+          <w:numId w:val="1007"/>
+        </w:numPr>
+      </w:pPr>
+      <w:r>
+        <w:t xml:space="preserve">Overall method problems</w:t>
+      </w:r>
+    </w:p>
+    <w:p>
+      <w:pPr>
+        <w:numPr>
+          <w:ilvl w:val="2"/>
+          <w:numId w:val="1012"/>
+        </w:numPr>
+        <w:pStyle w:val="Compact"/>
+      </w:pPr>
+      <w:r>
+        <w:t xml:space="preserve">Choice of number of partitions/axes seems arbitrary/no guidance. Controls and sponges used 2, sleep apnea used 3. Default is 3, also auto_rpca available within recent implementation</w:t>
+      </w:r>
+    </w:p>
+    <w:p>
+      <w:pPr>
+        <w:numPr>
+          <w:ilvl w:val="1"/>
+          <w:numId w:val="1007"/>
+        </w:numPr>
+      </w:pPr>
+      <w:r>
+        <w:t xml:space="preserve">Analysis of sequencing depth sensitivity was qualitative when quantitative methods are available</w:t>
+      </w:r>
+    </w:p>
+    <w:bookmarkEnd w:id="22"/>
+    <w:bookmarkStart w:id="23" w:name="results"/>
+    <w:p>
+      <w:pPr>
+        <w:pStyle w:val="Heading2"/>
+      </w:pPr>
+      <w:r>
+        <w:t xml:space="preserve">Results</w:t>
+      </w:r>
+    </w:p>
+    <w:p>
+      <w:pPr>
+        <w:numPr>
+          <w:ilvl w:val="0"/>
+          <w:numId w:val="1013"/>
+        </w:numPr>
+      </w:pPr>
+      <w:r>
+        <w:t xml:space="preserve">Simulation</w:t>
+      </w:r>
+    </w:p>
+    <w:p>
+      <w:pPr>
+        <w:numPr>
+          <w:ilvl w:val="0"/>
+          <w:numId w:val="1013"/>
+        </w:numPr>
+      </w:pPr>
+      <w:r>
+        <w:t xml:space="preserve">Compositionality</w:t>
+      </w:r>
+    </w:p>
+    <w:bookmarkEnd w:id="23"/>
+    <w:bookmarkStart w:id="24" w:name="discussion"/>
+    <w:p>
+      <w:pPr>
+        <w:pStyle w:val="Heading2"/>
+      </w:pPr>
+      <w:r>
+        <w:t xml:space="preserve">Discussion</w:t>
       </w:r>
     </w:p>
     <w:p>
@@ -153,7 +700,43 @@
         <w:pStyle w:val="FirstParagraph"/>
       </w:pPr>
       <w:r>
-        <w:t xml:space="preserve">Taiyaki hoodie letterpress, franzen man braid bushwick food truck humblebrag chia palo santo vinyl keffiyeh. IPhone ugh kitsch tousled tumblr messenger bag, kogi actually taiyaki. Austin taiyaki succulents vaporware letterpress bruh. Wayfarers listicle lyft beard tousled keffiyeh fingerstache neutral milk hotel ramps prism. Tote bag vape gentrify, fingerstache fixie marxism enamel pin pork belly cardigan microdosing hoodie. Freegan Brooklyn biodiesel, fanny pack actually kombucha organic whatever literally crucifix. Fingerstache kombucha subway tile squid, marxism kogi VHS ethical distillery fanny pack jean shorts.</w:t>
+        <w:t xml:space="preserve">Viral glossier taxidermy keytar celiac ethical. Next level knausgaard tousled palo santo photo booth kogi brunch wayfarers vice tilde squid. Marfa edison bulb fashion axe flannel. Shabby chic man bun heirloom kitsch DIY marfa ascot same migas. Venmo tacos chambray yr ramps green juice man bun fixie gastropub craft beer enamel pin. Ascot irony blog, pork belly microdosing tumblr cardigan shaman before they sold out hell of la croix grailed intelligentsia activated charcoal tumeric. Copper mug bicycle rights scenester 3 wolf moon whatever schlitz.</w:t>
+      </w:r>
+    </w:p>
+    <w:bookmarkEnd w:id="24"/>
+    <w:bookmarkStart w:id="25" w:name="materials-methods"/>
+    <w:p>
+      <w:pPr>
+        <w:pStyle w:val="Heading2"/>
+      </w:pPr>
+      <w:r>
+        <w:t xml:space="preserve">Materials &amp; Methods</w:t>
+      </w:r>
+    </w:p>
+    <w:p>
+      <w:pPr>
+        <w:pStyle w:val="FirstParagraph"/>
+      </w:pPr>
+      <w:r>
+        <w:t xml:space="preserve">Viral glossier taxidermy keytar celiac ethical. Next level knausgaard tousled palo santo photo booth kogi brunch wayfarers vice tilde squid. Marfa edison bulb fashion axe flannel. Shabby chic man bun heirloom kitsch DIY marfa ascot same migas. Venmo tacos chambray yr ramps green juice man bun fixie gastropub craft beer enamel pin. Ascot irony blog, pork belly microdosing tumblr cardigan shaman before they sold out hell of la croix grailed intelligentsia activated charcoal tumeric. Copper mug bicycle rights scenester 3 wolf moon whatever schlitz.</w:t>
+      </w:r>
+    </w:p>
+    <w:bookmarkEnd w:id="25"/>
+    <w:bookmarkStart w:id="26" w:name="acknowledgements"/>
+    <w:p>
+      <w:pPr>
+        <w:pStyle w:val="Heading2"/>
+      </w:pPr>
+      <w:r>
+        <w:t xml:space="preserve">Acknowledgements</w:t>
+      </w:r>
+    </w:p>
+    <w:p>
+      <w:pPr>
+        <w:pStyle w:val="FirstParagraph"/>
+      </w:pPr>
+      <w:r>
+        <w:t xml:space="preserve">Viral glossier taxidermy keytar celiac ethical. Next level knausgaard tousled palo santo photo booth kogi brunch wayfarers vice tilde squid. Marfa edison bulb fashion axe flannel. Shabby chic man bun heirloom kitsch DIY marfa ascot same migas. Venmo tacos chambray yr ramps green juice man bun fixie gastropub craft beer enamel pin. Ascot irony blog, pork belly microdosing tumblr cardigan shaman before they sold out hell of la croix grailed intelligentsia activated charcoal tumeric. Copper mug bicycle rights scenester 3 wolf moon whatever schlitz.</w:t>
       </w:r>
     </w:p>
     <w:p>
@@ -161,145 +744,50 @@
         <w:br w:type="page"/>
       </w:r>
     </w:p>
-    <w:bookmarkEnd w:id="22"/>
-    <w:bookmarkStart w:id="23" w:name="introduction"/>
+    <w:bookmarkEnd w:id="26"/>
+    <w:bookmarkStart w:id="28" w:name="references"/>
     <w:p>
       <w:pPr>
         <w:pStyle w:val="Heading2"/>
       </w:pPr>
       <w:r>
-        <w:t xml:space="preserve">Introduction</w:t>
-      </w:r>
-    </w:p>
-    <w:p>
-      <w:pPr>
-        <w:pStyle w:val="FirstParagraph"/>
-      </w:pPr>
-      <w:r>
-        <w:t xml:space="preserve">Viral glossier taxidermy keytar celiac ethical. Next level knausgaard tousled palo santo photo booth kogi brunch wayfarers vice tilde squid. Marfa edison bulb fashion axe flannel. Shabby chic man bun heirloom kitsch DIY marfa ascot same migas. Venmo tacos chambray yr ramps green juice man bun fixie gastropub craft beer enamel pin. Ascot irony blog, pork belly microdosing tumblr cardigan shaman before they sold out hell of la croix grailed intelligentsia activated charcoal tumeric. Copper mug bicycle rights scenester 3 wolf moon whatever schlitz.</w:t>
-      </w:r>
-    </w:p>
-    <w:bookmarkEnd w:id="23"/>
-    <w:bookmarkStart w:id="24" w:name="results"/>
+        <w:t xml:space="preserve">References</w:t>
+      </w:r>
+    </w:p>
+    <w:bookmarkStart w:id="27" w:name="refs"/>
+    <w:bookmarkEnd w:id="27"/>
+    <w:p>
+      <w:r>
+        <w:br w:type="page"/>
+      </w:r>
+    </w:p>
+    <w:bookmarkEnd w:id="28"/>
+    <w:bookmarkStart w:id="29" w:name="figures"/>
     <w:p>
       <w:pPr>
         <w:pStyle w:val="Heading2"/>
       </w:pPr>
       <w:r>
-        <w:t xml:space="preserve">Results</w:t>
-      </w:r>
-    </w:p>
-    <w:p>
-      <w:pPr>
-        <w:pStyle w:val="FirstParagraph"/>
-      </w:pPr>
-      <w:r>
-        <w:t xml:space="preserve">Viral glossier taxidermy keytar celiac ethical. Next level knausgaard tousled palo santo photo booth kogi brunch wayfarers vice tilde squid. Marfa edison bulb fashion axe flannel. Shabby chic man bun heirloom kitsch DIY marfa ascot same migas. Venmo tacos chambray yr ramps green juice man bun fixie gastropub craft beer enamel pin. Ascot irony blog, pork belly microdosing tumblr cardigan shaman before they sold out hell of la croix grailed intelligentsia activated charcoal tumeric. Copper mug bicycle rights scenester 3 wolf moon whatever schlitz.</w:t>
-      </w:r>
-    </w:p>
-    <w:bookmarkEnd w:id="24"/>
-    <w:bookmarkStart w:id="25" w:name="discussion"/>
+        <w:t xml:space="preserve">Figures</w:t>
+      </w:r>
+    </w:p>
+    <w:p>
+      <w:r>
+        <w:br w:type="page"/>
+      </w:r>
+    </w:p>
+    <w:bookmarkEnd w:id="29"/>
+    <w:bookmarkStart w:id="30" w:name="supplemental-figures"/>
     <w:p>
       <w:pPr>
         <w:pStyle w:val="Heading2"/>
       </w:pPr>
       <w:r>
-        <w:t xml:space="preserve">Discussion</w:t>
-      </w:r>
-    </w:p>
-    <w:p>
-      <w:pPr>
-        <w:pStyle w:val="FirstParagraph"/>
-      </w:pPr>
-      <w:r>
-        <w:t xml:space="preserve">Viral glossier taxidermy keytar celiac ethical. Next level knausgaard tousled palo santo photo booth kogi brunch wayfarers vice tilde squid. Marfa edison bulb fashion axe flannel. Shabby chic man bun heirloom kitsch DIY marfa ascot same migas. Venmo tacos chambray yr ramps green juice man bun fixie gastropub craft beer enamel pin. Ascot irony blog, pork belly microdosing tumblr cardigan shaman before they sold out hell of la croix grailed intelligentsia activated charcoal tumeric. Copper mug bicycle rights scenester 3 wolf moon whatever schlitz.</w:t>
-      </w:r>
-    </w:p>
-    <w:bookmarkEnd w:id="25"/>
-    <w:bookmarkStart w:id="26" w:name="materials-methods"/>
-    <w:p>
-      <w:pPr>
-        <w:pStyle w:val="Heading2"/>
-      </w:pPr>
-      <w:r>
-        <w:t xml:space="preserve">Materials &amp; Methods</w:t>
-      </w:r>
-    </w:p>
-    <w:p>
-      <w:pPr>
-        <w:pStyle w:val="FirstParagraph"/>
-      </w:pPr>
-      <w:r>
-        <w:t xml:space="preserve">Viral glossier taxidermy keytar celiac ethical. Next level knausgaard tousled palo santo photo booth kogi brunch wayfarers vice tilde squid. Marfa edison bulb fashion axe flannel. Shabby chic man bun heirloom kitsch DIY marfa ascot same migas. Venmo tacos chambray yr ramps green juice man bun fixie gastropub craft beer enamel pin. Ascot irony blog, pork belly microdosing tumblr cardigan shaman before they sold out hell of la croix grailed intelligentsia activated charcoal tumeric. Copper mug bicycle rights scenester 3 wolf moon whatever schlitz.</w:t>
-      </w:r>
-    </w:p>
-    <w:bookmarkEnd w:id="26"/>
-    <w:bookmarkStart w:id="27" w:name="acknowledgements"/>
-    <w:p>
-      <w:pPr>
-        <w:pStyle w:val="Heading2"/>
-      </w:pPr>
-      <w:r>
-        <w:t xml:space="preserve">Acknowledgements</w:t>
-      </w:r>
-    </w:p>
-    <w:p>
-      <w:pPr>
-        <w:pStyle w:val="FirstParagraph"/>
-      </w:pPr>
-      <w:r>
-        <w:t xml:space="preserve">Viral glossier taxidermy keytar celiac ethical. Next level knausgaard tousled palo santo photo booth kogi brunch wayfarers vice tilde squid. Marfa edison bulb fashion axe flannel. Shabby chic man bun heirloom kitsch DIY marfa ascot same migas. Venmo tacos chambray yr ramps green juice man bun fixie gastropub craft beer enamel pin. Ascot irony blog, pork belly microdosing tumblr cardigan shaman before they sold out hell of la croix grailed intelligentsia activated charcoal tumeric. Copper mug bicycle rights scenester 3 wolf moon whatever schlitz.</w:t>
-      </w:r>
-    </w:p>
-    <w:p>
-      <w:r>
-        <w:br w:type="page"/>
-      </w:r>
-    </w:p>
-    <w:bookmarkEnd w:id="27"/>
-    <w:bookmarkStart w:id="29" w:name="references"/>
-    <w:p>
-      <w:pPr>
-        <w:pStyle w:val="Heading2"/>
-      </w:pPr>
-      <w:r>
-        <w:t xml:space="preserve">References</w:t>
-      </w:r>
-    </w:p>
-    <w:bookmarkStart w:id="28" w:name="refs"/>
-    <w:bookmarkEnd w:id="28"/>
-    <w:p>
-      <w:r>
-        <w:br w:type="page"/>
-      </w:r>
-    </w:p>
-    <w:bookmarkEnd w:id="29"/>
-    <w:bookmarkStart w:id="30" w:name="figures"/>
-    <w:p>
-      <w:pPr>
-        <w:pStyle w:val="Heading2"/>
-      </w:pPr>
-      <w:r>
-        <w:t xml:space="preserve">Figures</w:t>
-      </w:r>
-    </w:p>
-    <w:p>
-      <w:r>
-        <w:br w:type="page"/>
+        <w:t xml:space="preserve">Supplemental Figures</w:t>
       </w:r>
     </w:p>
     <w:bookmarkEnd w:id="30"/>
-    <w:bookmarkStart w:id="31" w:name="supplemental-figures"/>
-    <w:p>
-      <w:pPr>
-        <w:pStyle w:val="Heading2"/>
-      </w:pPr>
-      <w:r>
-        <w:t xml:space="preserve">Supplemental Figures</w:t>
-      </w:r>
-    </w:p>
     <w:bookmarkEnd w:id="31"/>
-    <w:bookmarkEnd w:id="32"/>
     <w:sectPr/>
   </w:body>
 </w:document>
@@ -406,8 +894,123 @@
       </w:pPr>
     </w:lvl>
   </w:abstractNum>
+  <w:abstractNum w:abstractNumId="991">
+    <w:nsid w:val="A991"/>
+    <w:multiLevelType w:val="multilevel"/>
+    <w:lvl w:ilvl="0">
+      <w:numFmt w:val="bullet"/>
+      <w:lvlText w:val="•"/>
+      <w:lvlJc w:val="left"/>
+      <w:pPr>
+        <w:ind w:left="720" w:hanging="480"/>
+      </w:pPr>
+    </w:lvl>
+    <w:lvl w:ilvl="1">
+      <w:numFmt w:val="bullet"/>
+      <w:lvlText w:val="–"/>
+      <w:lvlJc w:val="left"/>
+      <w:pPr>
+        <w:ind w:left="1440" w:hanging="480"/>
+      </w:pPr>
+    </w:lvl>
+    <w:lvl w:ilvl="2">
+      <w:numFmt w:val="bullet"/>
+      <w:lvlText w:val="•"/>
+      <w:lvlJc w:val="left"/>
+      <w:pPr>
+        <w:ind w:left="2160" w:hanging="480"/>
+      </w:pPr>
+    </w:lvl>
+    <w:lvl w:ilvl="3">
+      <w:numFmt w:val="bullet"/>
+      <w:lvlText w:val="–"/>
+      <w:lvlJc w:val="left"/>
+      <w:pPr>
+        <w:ind w:left="2880" w:hanging="480"/>
+      </w:pPr>
+    </w:lvl>
+    <w:lvl w:ilvl="4">
+      <w:numFmt w:val="bullet"/>
+      <w:lvlText w:val="•"/>
+      <w:lvlJc w:val="left"/>
+      <w:pPr>
+        <w:ind w:left="3600" w:hanging="480"/>
+      </w:pPr>
+    </w:lvl>
+    <w:lvl w:ilvl="5">
+      <w:numFmt w:val="bullet"/>
+      <w:lvlText w:val="–"/>
+      <w:lvlJc w:val="left"/>
+      <w:pPr>
+        <w:ind w:left="4320" w:hanging="480"/>
+      </w:pPr>
+    </w:lvl>
+    <w:lvl w:ilvl="6">
+      <w:numFmt w:val="bullet"/>
+      <w:lvlText w:val="•"/>
+      <w:lvlJc w:val="left"/>
+      <w:pPr>
+        <w:ind w:left="5040" w:hanging="480"/>
+      </w:pPr>
+    </w:lvl>
+    <w:lvl w:ilvl="7">
+      <w:numFmt w:val="bullet"/>
+      <w:lvlText w:val="–"/>
+      <w:lvlJc w:val="left"/>
+      <w:pPr>
+        <w:ind w:left="5760" w:hanging="480"/>
+      </w:pPr>
+    </w:lvl>
+    <w:lvl w:ilvl="8">
+      <w:numFmt w:val="bullet"/>
+      <w:lvlText w:val="•"/>
+      <w:lvlJc w:val="left"/>
+      <w:pPr>
+        <w:ind w:left="6480" w:hanging="480"/>
+      </w:pPr>
+    </w:lvl>
+  </w:abstractNum>
   <w:num w:numId="1000">
     <w:abstractNumId w:val="990"/>
+  </w:num>
+  <w:num w:numId="1001">
+    <w:abstractNumId w:val="991"/>
+  </w:num>
+  <w:num w:numId="1002">
+    <w:abstractNumId w:val="991"/>
+  </w:num>
+  <w:num w:numId="1003">
+    <w:abstractNumId w:val="991"/>
+  </w:num>
+  <w:num w:numId="1004">
+    <w:abstractNumId w:val="991"/>
+  </w:num>
+  <w:num w:numId="1005">
+    <w:abstractNumId w:val="991"/>
+  </w:num>
+  <w:num w:numId="1006">
+    <w:abstractNumId w:val="991"/>
+  </w:num>
+  <w:num w:numId="1007">
+    <w:abstractNumId w:val="991"/>
+  </w:num>
+  <w:num w:numId="1008">
+    <w:abstractNumId w:val="991"/>
+  </w:num>
+  <w:num w:numId="1009">
+    <w:abstractNumId w:val="991"/>
+  </w:num>
+  <w:num w:numId="1010">
+    <w:abstractNumId w:val="991"/>
+  </w:num>
+  <w:num w:numId="1011">
+    <w:abstractNumId w:val="991"/>
+  </w:num>
+  <w:num w:numId="1012">
+    <w:abstractNumId w:val="991"/>
+  </w:num>
+  <w:num w:numId="1013">
+    <w:abstractNumId w:val="991"/>
   </w:num>
 </w:numbering>
 </file>

</xml_diff>

<commit_message>
First swing at outline of manuscript
</commit_message>
<xml_diff>
--- a/submission/manuscript.docx
+++ b/submission/manuscript.docx
@@ -2,7 +2,7 @@
 <file path=word/document.xml><?xml version="1.0" encoding="utf-8"?>
 <w:document xmlns:w="http://schemas.openxmlformats.org/wordprocessingml/2006/main" xmlns:m="http://schemas.openxmlformats.org/officeDocument/2006/math" xmlns:r="http://schemas.openxmlformats.org/officeDocument/2006/relationships" xmlns:o="urn:schemas-microsoft-com:office:office" xmlns:v="urn:schemas-microsoft-com:vml" xmlns:w10="urn:schemas-microsoft-com:office:word" xmlns:a="http://schemas.openxmlformats.org/drawingml/2006/main" xmlns:pic="http://schemas.openxmlformats.org/drawingml/2006/picture" xmlns:wp="http://schemas.openxmlformats.org/drawingml/2006/wordprocessingDrawing">
   <w:body>
-    <w:bookmarkStart w:id="31" w:name="lorem-ipsum"/>
+    <w:bookmarkStart w:id="38" w:name="lorem-ipsum"/>
     <w:p>
       <w:pPr>
         <w:pStyle w:val="Heading1"/>
@@ -146,6 +146,118 @@
     </w:p>
     <w:p>
       <w:pPr>
+        <w:pStyle w:val="FirstParagraph"/>
+      </w:pPr>
+      <w:r>
+        <w:t xml:space="preserve">A persistent challenge in amplicon and shotgun metagenomic sequencing of microbial communities is the variation in the number of reads obtained across samples. This challenge is not unique to microbial communities and has long plagued ecologists, in general. The classical approach to control for uneven sampling is rarefaction. In rarefaction, a consistent number of individuals are randomly sampled from each sample. An alpha or beta diversity metric is then calculated from the sampling. The random subsampling and diversity measurement steps are repeated a large number of times (e.g., 100 or 1,000) and the measurements are averaged over the subsamples. Unfortunately, the term</w:t>
+      </w:r>
+      <w:r>
+        <w:t xml:space="preserve"> </w:t>
+      </w:r>
+      <w:r>
+        <w:t xml:space="preserve">“</w:t>
+      </w:r>
+      <w:r>
+        <w:t xml:space="preserve">rarefying</w:t>
+      </w:r>
+      <w:r>
+        <w:t xml:space="preserve">”</w:t>
+      </w:r>
+      <w:r>
+        <w:t xml:space="preserve"> </w:t>
+      </w:r>
+      <w:r>
+        <w:t xml:space="preserve">and occasionally rarefaction have been misdefined as a single subsampling step. Regardless, over the past 10 years, the process of rarefaction has become controversial because some view the choice of the sampling depth as arbitrary, the metrics can become more similar than they truly are, and because the practice of downsampling to a common number of sequences leaves the impression that good data are being unnecessarily discarded. Numerous alternatives have been proposed including calcuting the relative abundance of each taxon in in a community so that they sum to 1 within a sample, normalization of counts so that the total number of individuals sums to a user defined value, use of estimators of diversity that can extrapolate beyond the number of observed individuals, and the use of compositional statistics, which are based on a log ratio to a reference value.</w:t>
+      </w:r>
+    </w:p>
+    <w:p>
+      <w:pPr>
+        <w:pStyle w:val="BodyText"/>
+      </w:pPr>
+      <w:r>
+        <w:t xml:space="preserve">Researchers have adopted compositional methods because the number of sequences obtained per sample is typically independent of the true number of individuals in a community and so the number of times each taxon is observed is not independent of the other taxa. The general approach is to calculate a centralized log ratio (i.e., CLR) where the abundance of each taxon within a sample is divided by the geometric mean abundance within the sample. This ratio is then used as the argument for the natural logrithm. These values are then used to calculate pairwise euclidean distances between samples resulting in so-called Aitchison distances. Aside from controlling for the compositional nature of sequence data, proponents of the Aitchison distance claim that the distances are insensitive to differences in sampling effort. A challenge of Aitchison distances is that because microbial communities are patchy a large number of features will have a frquency of zero in each sample. This will cause the geometric mean to be undefined. To overcome this challenge, factors are added to the data. Three approaches have been proposed: adding a pseudocount of 1 all frequency data (i.e., Nudge CLR), adding a pseudocount of 1 divided by the total number of individuals in the sample (i.e., Nudge CLR), and imputing zero values to be a random small value (i.e. Zero CLR). As an alternative to these transformations, Martino et al. [</w:t>
+      </w:r>
+      <w:r>
+        <w:rPr>
+          <w:bCs/>
+          <w:b/>
+        </w:rPr>
+        <w:t xml:space="preserve">XXXXX</w:t>
+      </w:r>
+      <w:r>
+        <w:t xml:space="preserve">] proposed calculating CLR values for each sample after ignoring zero values followed by matrix completion or robust Principal Components Analysis (i.e., RPCA). The authors claim that the advantages of RPCA over the other CLR-based approaches is that it does not require imputing zero values and that the method is less sensitive to uneven sampling effort.</w:t>
+      </w:r>
+    </w:p>
+    <w:p>
+      <w:pPr>
+        <w:pStyle w:val="BodyText"/>
+      </w:pPr>
+      <w:r>
+        <w:t xml:space="preserve">In contrast to these claims, my previous work has shown that the output of RPCA and other alternatives to rarefaction are more sensitive to uneven sampling than rarefaction. Futhermore, use of these methods can inflate the false detection rate and decrease the statistical power to detect differences in alpha and beta diversity metrics. Given the near unanimous agreement over the past decade that rarefaction is</w:t>
+      </w:r>
+      <w:r>
+        <w:t xml:space="preserve"> </w:t>
+      </w:r>
+      <w:r>
+        <w:t xml:space="preserve">“</w:t>
+      </w:r>
+      <w:r>
+        <w:t xml:space="preserve">inadmissible</w:t>
+      </w:r>
+      <w:r>
+        <w:t xml:space="preserve">”</w:t>
+      </w:r>
+      <w:r>
+        <w:t xml:space="preserve"> </w:t>
+      </w:r>
+      <w:r>
+        <w:t xml:space="preserve">and the development of alternatives to rarefaction, one might question why my results disagree so markedly with those of others. There are several possible reasons. First, researchers often propose new methods by demonstrating their method reveals new insights over old methods without actually benchmarking the method. Because one cannot know the true difference between samples, a positive or negative result with experimental data cannot be interpreted. Second, when bencharking tests are developed, researchers may inadvertantly select tests that favor the method they are developing. This was the case in my recent re-analysis of the original paper that called rarefaction into question. Therefore, it is necessary to use a comprehensive benchmarking test suite that allows one to compare diverse methods using inference methods that are commonly used by researchers. Third, the choice of how to simulate community data can indadvertantly favor the method being developed. A popular cliche states that</w:t>
+      </w:r>
+      <w:r>
+        <w:t xml:space="preserve"> </w:t>
+      </w:r>
+      <w:r>
+        <w:t xml:space="preserve">“</w:t>
+      </w:r>
+      <w:r>
+        <w:t xml:space="preserve">all models are wrong, some are useful</w:t>
+      </w:r>
+      <w:r>
+        <w:t xml:space="preserve">”</w:t>
+      </w:r>
+      <w:r>
+        <w:t xml:space="preserve">. Similar to one’s choice of benchmarking tests, the modelling approach may favor some methods over others. For instance, I have critiqued how others have accounted for variation in sampling depth as being unlike what we see in experimental data.</w:t>
+      </w:r>
+    </w:p>
+    <w:p>
+      <w:pPr>
+        <w:pStyle w:val="BodyText"/>
+      </w:pPr>
+      <w:r>
+        <w:t xml:space="preserve">Previously, I generated null community models and treatment groups with known effect sizes by creating taxon abundance distributions and sampling depths based on 12 published datasets. Alternatively, Martino et al. modelled communites with known effect sizes using a statistical model. This difference in modelling strategy has created an interesting opportunity to reframe the question of whether to use rarefaction and to reassess the performance of RPCA and other CLR-based approaches. Although Martino et al., used an interesing modelling approach, they did not compare RPCA to other CLR-based approaches or to rarefaction. Furthermore, they used benchmarking tests that did not reflect how researchers typically analyze microbial community data. Therefore, the goal of the current study was to reassess RPCA and other CLR-based methods to rarefaction using the modelling and benchmarking framework used by Martino et al.</w:t>
+      </w:r>
+    </w:p>
+    <w:bookmarkEnd w:id="22"/>
+    <w:bookmarkStart w:id="30" w:name="results"/>
+    <w:p>
+      <w:pPr>
+        <w:pStyle w:val="Heading2"/>
+      </w:pPr>
+      <w:r>
+        <w:t xml:space="preserve">Results</w:t>
+      </w:r>
+    </w:p>
+    <w:bookmarkStart w:id="23" w:name="simulated-communities---overview"/>
+    <w:p>
+      <w:pPr>
+        <w:pStyle w:val="Heading3"/>
+      </w:pPr>
+      <w:r>
+        <w:t xml:space="preserve">Simulated communities - Overview</w:t>
+      </w:r>
+    </w:p>
+    <w:p>
+      <w:pPr>
         <w:numPr>
           <w:ilvl w:val="0"/>
           <w:numId w:val="1001"/>
@@ -153,7 +265,19 @@
         <w:pStyle w:val="Compact"/>
       </w:pPr>
       <w:r>
-        <w:t xml:space="preserve">AND - Problem of uneven sampling effort and how to control for the effects</w:t>
+        <w:t xml:space="preserve">Used code for simulations found in the deicode benchmarking github repository</w:t>
+      </w:r>
+    </w:p>
+    <w:p>
+      <w:pPr>
+        <w:numPr>
+          <w:ilvl w:val="0"/>
+          <w:numId w:val="1001"/>
+        </w:numPr>
+        <w:pStyle w:val="Compact"/>
+      </w:pPr>
+      <w:r>
+        <w:t xml:space="preserve">Describe simulations as indicated in paper</w:t>
       </w:r>
     </w:p>
     <w:p>
@@ -165,466 +289,721 @@
         <w:pStyle w:val="Compact"/>
       </w:pPr>
       <w:r>
-        <w:t xml:space="preserve">Previous work from me has show rarefaction controls for sampling effort</w:t>
+        <w:t xml:space="preserve">Relative abundance of features described by following a normal distribution with mean and standard deviation determined by fitting data from a hand microbiome study</w:t>
+      </w:r>
+    </w:p>
+    <w:p>
+      <w:pPr>
+        <w:numPr>
+          <w:ilvl w:val="1"/>
+          <w:numId w:val="1002"/>
+        </w:numPr>
+        <w:pStyle w:val="Compact"/>
+      </w:pPr>
+      <w:r>
+        <w:t xml:space="preserve">Add random amount of noise to each relative abundance value</w:t>
+      </w:r>
+    </w:p>
+    <w:p>
+      <w:pPr>
+        <w:numPr>
+          <w:ilvl w:val="1"/>
+          <w:numId w:val="1002"/>
+        </w:numPr>
+        <w:pStyle w:val="Compact"/>
+      </w:pPr>
+      <w:r>
+        <w:t xml:space="preserve">Add random amount of noise to subset of relative abundance values</w:t>
+      </w:r>
+    </w:p>
+    <w:p>
+      <w:pPr>
+        <w:numPr>
+          <w:ilvl w:val="1"/>
+          <w:numId w:val="1002"/>
+        </w:numPr>
+        <w:pStyle w:val="Compact"/>
+      </w:pPr>
+      <w:r>
+        <w:t xml:space="preserve">Used Poisson-lognormal distribution to sample frequency of each feature in each sample to obtain overall desired level of sampling effort for each sample</w:t>
+      </w:r>
+    </w:p>
+    <w:p>
+      <w:pPr>
+        <w:numPr>
+          <w:ilvl w:val="0"/>
+          <w:numId w:val="1001"/>
+        </w:numPr>
+        <w:pStyle w:val="Compact"/>
+      </w:pPr>
+      <w:r>
+        <w:t xml:space="preserve">Found numerous problems with simulations as coded</w:t>
+      </w:r>
+    </w:p>
+    <w:p>
+      <w:pPr>
+        <w:numPr>
+          <w:ilvl w:val="1"/>
+          <w:numId w:val="1003"/>
+        </w:numPr>
+        <w:pStyle w:val="Compact"/>
+      </w:pPr>
+      <w:r>
+        <w:t xml:space="preserve">Only one replicate of each sequencing depth rather than 10 or 100</w:t>
+      </w:r>
+    </w:p>
+    <w:p>
+      <w:pPr>
+        <w:numPr>
+          <w:ilvl w:val="1"/>
+          <w:numId w:val="1003"/>
+        </w:numPr>
+        <w:pStyle w:val="Compact"/>
+      </w:pPr>
+      <w:r>
+        <w:t xml:space="preserve">the axis labels in original heatmap (Fig 3DE) were switched</w:t>
+      </w:r>
+    </w:p>
+    <w:p>
+      <w:pPr>
+        <w:numPr>
+          <w:ilvl w:val="1"/>
+          <w:numId w:val="1003"/>
+        </w:numPr>
+        <w:pStyle w:val="Compact"/>
+      </w:pPr>
+      <w:r>
+        <w:t xml:space="preserve">Overlapped samples rather than features</w:t>
+      </w:r>
+    </w:p>
+    <w:p>
+      <w:pPr>
+        <w:numPr>
+          <w:ilvl w:val="1"/>
+          <w:numId w:val="1003"/>
+        </w:numPr>
+        <w:pStyle w:val="Compact"/>
+      </w:pPr>
+      <w:r>
+        <w:t xml:space="preserve">Variation in feature abundance was across samples rather than across features</w:t>
+      </w:r>
+    </w:p>
+    <w:p>
+      <w:pPr>
+        <w:numPr>
+          <w:ilvl w:val="1"/>
+          <w:numId w:val="1003"/>
+        </w:numPr>
+        <w:pStyle w:val="Compact"/>
+      </w:pPr>
+      <w:r>
+        <w:t xml:space="preserve">Homoscedastic and heteroscedastic variation and creating sparsity was screwed up - didn’t actually subsample, signs of negative values were removed</w:t>
+      </w:r>
+    </w:p>
+    <w:p>
+      <w:pPr>
+        <w:numPr>
+          <w:ilvl w:val="0"/>
+          <w:numId w:val="1001"/>
+        </w:numPr>
+        <w:pStyle w:val="Compact"/>
+      </w:pPr>
+      <w:r>
+        <w:t xml:space="preserve">Rewrote simulation code and analyzed original simulation data in parallel to revised data (except for PERMANOVA power analysis because it was not possible to get treatment groups to truly overlap with each other)</w:t>
+      </w:r>
+    </w:p>
+    <w:p>
+      <w:pPr>
+        <w:numPr>
+          <w:ilvl w:val="1"/>
+          <w:numId w:val="1004"/>
+        </w:numPr>
+        <w:pStyle w:val="Compact"/>
+      </w:pPr>
+      <w:r>
+        <w:t xml:space="preserve">Simulated communitites had uneven sampling effort, increased sampling effort and then subsampled to correct depth</w:t>
+      </w:r>
+    </w:p>
+    <w:p>
+      <w:pPr>
+        <w:numPr>
+          <w:ilvl w:val="0"/>
+          <w:numId w:val="1001"/>
+        </w:numPr>
+        <w:pStyle w:val="Compact"/>
+      </w:pPr>
+      <w:r>
+        <w:t xml:space="preserve">Qualitatively was able to reproduce the original results</w:t>
+      </w:r>
+    </w:p>
+    <w:bookmarkEnd w:id="23"/>
+    <w:bookmarkStart w:id="24" w:name="X7760e1757cabe5ee4c12a3c2b1e9d6ec07d1fc3"/>
+    <w:p>
+      <w:pPr>
+        <w:pStyle w:val="Heading3"/>
+      </w:pPr>
+      <w:r>
+        <w:t xml:space="preserve">Simulated communities - PERMANOVA analysis</w:t>
+      </w:r>
+    </w:p>
+    <w:p>
+      <w:pPr>
+        <w:numPr>
+          <w:ilvl w:val="0"/>
+          <w:numId w:val="1005"/>
+        </w:numPr>
+        <w:pStyle w:val="Compact"/>
+      </w:pPr>
+      <w:r>
+        <w:t xml:space="preserve">Used PERMANOVA F-statistic rather than p-values (why?!), likely because even MatrixCompletionon raw counts was was significant</w:t>
+      </w:r>
+    </w:p>
+    <w:p>
+      <w:pPr>
+        <w:numPr>
+          <w:ilvl w:val="0"/>
+          <w:numId w:val="1005"/>
+        </w:numPr>
+        <w:pStyle w:val="Compact"/>
+      </w:pPr>
+      <w:r>
+        <w:t xml:space="preserve">Using rclr transformed data outperformed raw data when followed by matrix completion</w:t>
+      </w:r>
+    </w:p>
+    <w:p>
+      <w:pPr>
+        <w:numPr>
+          <w:ilvl w:val="0"/>
+          <w:numId w:val="1005"/>
+        </w:numPr>
+        <w:pStyle w:val="Compact"/>
+      </w:pPr>
+      <w:r>
+        <w:t xml:space="preserve">F statistic values were inflated because they only used 2 dimensions, which artificailly cut out a lot of noise that would bring down the F statistic values</w:t>
+      </w:r>
+    </w:p>
+    <w:p>
+      <w:pPr>
+        <w:numPr>
+          <w:ilvl w:val="0"/>
+          <w:numId w:val="1005"/>
+        </w:numPr>
+        <w:pStyle w:val="Compact"/>
+      </w:pPr>
+      <w:r>
+        <w:t xml:space="preserve">Investigators compared results using overlapped community and found RPCA outperformed MatrixCompletion; didn’t compare to Bray-Curtis, rarefaction, other compositional methods</w:t>
+      </w:r>
+    </w:p>
+    <w:p>
+      <w:pPr>
+        <w:numPr>
+          <w:ilvl w:val="0"/>
+          <w:numId w:val="1005"/>
+        </w:numPr>
+        <w:pStyle w:val="Compact"/>
+      </w:pPr>
+      <w:r>
+        <w:t xml:space="preserve">Noted that they did not include other relevant comparisons such as using relative abundance, other compositional transformations, rarefaction, subsampling, etc. Expande workflow pipeline to include these other methods</w:t>
+      </w:r>
+    </w:p>
+    <w:p>
+      <w:pPr>
+        <w:numPr>
+          <w:ilvl w:val="0"/>
+          <w:numId w:val="1005"/>
+        </w:numPr>
+        <w:pStyle w:val="Compact"/>
+      </w:pPr>
+      <w:r>
+        <w:t xml:space="preserve">Found numerous problems with simulations</w:t>
+      </w:r>
+    </w:p>
+    <w:p>
+      <w:pPr>
+        <w:numPr>
+          <w:ilvl w:val="1"/>
+          <w:numId w:val="1006"/>
+        </w:numPr>
+        <w:pStyle w:val="Compact"/>
+      </w:pPr>
+      <w:r>
+        <w:t xml:space="preserve">Desired to increase number of replicate datasets from 10 to 100 to test statistical power</w:t>
+      </w:r>
+    </w:p>
+    <w:p>
+      <w:pPr>
+        <w:numPr>
+          <w:ilvl w:val="0"/>
+          <w:numId w:val="1005"/>
+        </w:numPr>
+        <w:pStyle w:val="Compact"/>
+      </w:pPr>
+      <w:r>
+        <w:t xml:space="preserve">Rewrote simulation code and selected a level of overlap and a total number of features so that approximately 50% of tests using 4000 sequences would have been significant when using rarefaction</w:t>
+      </w:r>
+    </w:p>
+    <w:p>
+      <w:pPr>
+        <w:numPr>
+          <w:ilvl w:val="0"/>
+          <w:numId w:val="1005"/>
+        </w:numPr>
+        <w:pStyle w:val="Compact"/>
+      </w:pPr>
+      <w:r>
+        <w:t xml:space="preserve">Bray-Curtis and OCLR did as well as each other; much better than RPCA and other methods</w:t>
+      </w:r>
+    </w:p>
+    <w:p>
+      <w:pPr>
+        <w:numPr>
+          <w:ilvl w:val="0"/>
+          <w:numId w:val="1005"/>
+        </w:numPr>
+        <w:pStyle w:val="Compact"/>
+      </w:pPr>
+      <w:r>
+        <w:t xml:space="preserve">Researchers used balanced designs with varying number of samples per treatment group. Unnecessary other than to show the change in power with sampling effort. Likely done because knn analysis is sensitive to uneven smapling effort. Regardless, the results did not change</w:t>
+      </w:r>
+    </w:p>
+    <w:bookmarkEnd w:id="24"/>
+    <w:bookmarkStart w:id="25" w:name="simulated-communities---knn-analysis"/>
+    <w:p>
+      <w:pPr>
+        <w:pStyle w:val="Heading3"/>
+      </w:pPr>
+      <w:r>
+        <w:t xml:space="preserve">Simulated communities - KNN analysis</w:t>
+      </w:r>
+    </w:p>
+    <w:p>
+      <w:pPr>
+        <w:numPr>
+          <w:ilvl w:val="0"/>
+          <w:numId w:val="1007"/>
+        </w:numPr>
+        <w:pStyle w:val="Compact"/>
+      </w:pPr>
+      <w:r>
+        <w:t xml:space="preserve">Unaware of researchers who have used KNN to differentiate communities. Far more likely that they would use PERMANOVA or another machine learning technique like logistic regresssion or random forest.</w:t>
+      </w:r>
+    </w:p>
+    <w:p>
+      <w:pPr>
+        <w:numPr>
+          <w:ilvl w:val="0"/>
+          <w:numId w:val="1007"/>
+        </w:numPr>
+        <w:pStyle w:val="Compact"/>
+      </w:pPr>
+      <w:r>
+        <w:t xml:space="preserve">Problems with analysis</w:t>
+      </w:r>
+    </w:p>
+    <w:p>
+      <w:pPr>
+        <w:numPr>
+          <w:ilvl w:val="1"/>
+          <w:numId w:val="1008"/>
+        </w:numPr>
+        <w:pStyle w:val="Compact"/>
+      </w:pPr>
+      <w:r>
+        <w:t xml:space="preserve">Only generated one simulation for each sequencing depth - would have done 10 to test sensitivity on RNG seed</w:t>
+      </w:r>
+    </w:p>
+    <w:p>
+      <w:pPr>
+        <w:numPr>
+          <w:ilvl w:val="1"/>
+          <w:numId w:val="1008"/>
+        </w:numPr>
+        <w:pStyle w:val="Compact"/>
+      </w:pPr>
+      <w:r>
+        <w:t xml:space="preserve">Did not run knn on negative and positive control samples - included all three simulation datasets</w:t>
+      </w:r>
+    </w:p>
+    <w:p>
+      <w:pPr>
+        <w:numPr>
+          <w:ilvl w:val="1"/>
+          <w:numId w:val="1008"/>
+        </w:numPr>
+        <w:pStyle w:val="Compact"/>
+      </w:pPr>
+      <w:r>
+        <w:t xml:space="preserve">Said they did 40:60 training-testing splits, but actually did 60:40 training-testing splits - would have prefered 80:20 training-testing splits</w:t>
+      </w:r>
+    </w:p>
+    <w:p>
+      <w:pPr>
+        <w:numPr>
+          <w:ilvl w:val="1"/>
+          <w:numId w:val="1008"/>
+        </w:numPr>
+        <w:pStyle w:val="Compact"/>
+      </w:pPr>
+      <w:r>
+        <w:t xml:space="preserve">Used a single seed per simulation replicate - modified to use 100 seeds to generate 100 80:20 splits (did they say they used 1 or 10; pretty sure code only was for 1 iteration)</w:t>
+      </w:r>
+    </w:p>
+    <w:p>
+      <w:pPr>
+        <w:numPr>
+          <w:ilvl w:val="1"/>
+          <w:numId w:val="1008"/>
+        </w:numPr>
+        <w:pStyle w:val="Compact"/>
+      </w:pPr>
+      <w:r>
+        <w:t xml:space="preserve">Hard coded k value - would have preferred to use a variety of values in the training with the optimal value selected for the testing phase</w:t>
+      </w:r>
+    </w:p>
+    <w:p>
+      <w:pPr>
+        <w:numPr>
+          <w:ilvl w:val="1"/>
+          <w:numId w:val="1008"/>
+        </w:numPr>
+        <w:pStyle w:val="Compact"/>
+      </w:pPr>
+      <w:r>
+        <w:t xml:space="preserve">Only used raw and rclr transformed data as input to matrix completion followed by PCA and used that as input to kNN. Later, they used weighted UniFrac and Bray-Curtis ordinations to generate distances - would have preferred to use the distances themselves as input</w:t>
+      </w:r>
+    </w:p>
+    <w:p>
+      <w:pPr>
+        <w:numPr>
+          <w:ilvl w:val="0"/>
+          <w:numId w:val="1007"/>
+        </w:numPr>
+        <w:pStyle w:val="Compact"/>
+      </w:pPr>
+      <w:r>
+        <w:t xml:space="preserve">Regardless of how the training-testing splits were generated or whether their simulated data or mine were used rarefaction performed as well or better than all other methods, including RPCA.</w:t>
+      </w:r>
+    </w:p>
+    <w:p>
+      <w:pPr>
+        <w:numPr>
+          <w:ilvl w:val="0"/>
+          <w:numId w:val="1007"/>
+        </w:numPr>
+        <w:pStyle w:val="Compact"/>
+      </w:pPr>
+      <w:r>
+        <w:t xml:space="preserve">Across the board, as shown in original paper, the classification accuracy increased with sampling effort</w:t>
+      </w:r>
+    </w:p>
+    <w:p>
+      <w:pPr>
+        <w:numPr>
+          <w:ilvl w:val="0"/>
+          <w:numId w:val="1007"/>
+        </w:numPr>
+        <w:pStyle w:val="Compact"/>
+      </w:pPr>
+      <w:r>
+        <w:t xml:space="preserve">Median k values were…</w:t>
+      </w:r>
+    </w:p>
+    <w:bookmarkEnd w:id="25"/>
+    <w:bookmarkStart w:id="26" w:name="experimental-data---overview"/>
+    <w:p>
+      <w:pPr>
+        <w:pStyle w:val="Heading3"/>
+      </w:pPr>
+      <w:r>
+        <w:t xml:space="preserve">Experimental data - Overview</w:t>
+      </w:r>
+    </w:p>
+    <w:p>
+      <w:pPr>
+        <w:numPr>
+          <w:ilvl w:val="0"/>
+          <w:numId w:val="1009"/>
+        </w:numPr>
+        <w:pStyle w:val="Compact"/>
+      </w:pPr>
+      <w:r>
+        <w:t xml:space="preserve">Picked case studies with large effect sizes that were easily seen on PCoA/PCA; most microbiome studies are not so easy to differentiate</w:t>
+      </w:r>
+    </w:p>
+    <w:p>
+      <w:pPr>
+        <w:numPr>
+          <w:ilvl w:val="1"/>
+          <w:numId w:val="1010"/>
+        </w:numPr>
+        <w:pStyle w:val="Compact"/>
+      </w:pPr>
+      <w:r>
+        <w:t xml:space="preserve">Sleep apnea and sponge datasets - relatively small and had treatment groups that were highly distinct</w:t>
+      </w:r>
+    </w:p>
+    <w:p>
+      <w:pPr>
+        <w:numPr>
+          <w:ilvl w:val="1"/>
+          <w:numId w:val="1010"/>
+        </w:numPr>
+        <w:pStyle w:val="Compact"/>
+      </w:pPr>
+      <w:r>
+        <w:t xml:space="preserve">I added a third dataset - CRC, which was larger and had treatment groups that were more similar to each other</w:t>
+      </w:r>
+    </w:p>
+    <w:p>
+      <w:pPr>
+        <w:numPr>
+          <w:ilvl w:val="0"/>
+          <w:numId w:val="1009"/>
+        </w:numPr>
+        <w:pStyle w:val="Compact"/>
+      </w:pPr>
+      <w:r>
+        <w:t xml:space="preserve">All sequences were used for RPCA; only 1000 sequences per sample were used for Bray-Curtis and WUniFrac</w:t>
+      </w:r>
+    </w:p>
+    <w:bookmarkEnd w:id="26"/>
+    <w:bookmarkStart w:id="27" w:name="experimental-data---permanova-analysis"/>
+    <w:p>
+      <w:pPr>
+        <w:pStyle w:val="Heading3"/>
+      </w:pPr>
+      <w:r>
+        <w:t xml:space="preserve">Experimental data - PERMANOVA analysis</w:t>
+      </w:r>
+    </w:p>
+    <w:p>
+      <w:pPr>
+        <w:numPr>
+          <w:ilvl w:val="0"/>
+          <w:numId w:val="1011"/>
+        </w:numPr>
+        <w:pStyle w:val="Compact"/>
+      </w:pPr>
+      <w:r>
+        <w:t xml:space="preserve">RPCA was compared to Bray-Curtis and weighted UniFrac distances</w:t>
+      </w:r>
+    </w:p>
+    <w:p>
+      <w:pPr>
+        <w:numPr>
+          <w:ilvl w:val="1"/>
+          <w:numId w:val="1012"/>
+        </w:numPr>
+        <w:pStyle w:val="Compact"/>
+      </w:pPr>
+      <w:r>
+        <w:t xml:space="preserve">For BC and wU, euclidean distances were calculated from first two PCoA axes and used as input to PERMANOVA (</w:t>
+      </w:r>
+      <w:r>
+        <w:rPr>
+          <w:bCs/>
+          <w:b/>
+        </w:rPr>
+        <w:t xml:space="preserve">confirm?</w:t>
+      </w:r>
+      <w:r>
+        <w:t xml:space="preserve">). Analysis compared F statistics, which again are flawed, since so much noise was removed</w:t>
+      </w:r>
+    </w:p>
+    <w:p>
+      <w:pPr>
+        <w:numPr>
+          <w:ilvl w:val="1"/>
+          <w:numId w:val="1012"/>
+        </w:numPr>
+        <w:pStyle w:val="Compact"/>
+      </w:pPr>
+      <w:r>
+        <w:t xml:space="preserve">Sleep Apnea data analysis used three axes rather than two like the Sponge dataset</w:t>
+      </w:r>
+    </w:p>
+    <w:p>
+      <w:pPr>
+        <w:numPr>
+          <w:ilvl w:val="0"/>
+          <w:numId w:val="1011"/>
+        </w:numPr>
+        <w:pStyle w:val="Compact"/>
+      </w:pPr>
+      <w:r>
+        <w:t xml:space="preserve">RPCA not able to detect differences in CRC dataset</w:t>
+      </w:r>
+    </w:p>
+    <w:bookmarkEnd w:id="27"/>
+    <w:bookmarkStart w:id="28" w:name="experimental-data---knn-analysis"/>
+    <w:p>
+      <w:pPr>
+        <w:pStyle w:val="Heading3"/>
+      </w:pPr>
+      <w:r>
+        <w:t xml:space="preserve">Experimental data - KNN analysis</w:t>
+      </w:r>
+    </w:p>
+    <w:p>
+      <w:pPr>
+        <w:numPr>
+          <w:ilvl w:val="0"/>
+          <w:numId w:val="1013"/>
+        </w:numPr>
+        <w:pStyle w:val="Compact"/>
+      </w:pPr>
+      <w:r>
+        <w:t xml:space="preserve">Used 1st 2 axes of PCoA of Bray-Curtis distances to calcualte euclidean distances, which were then fed into kNN. Why not use the original Bray-Curtis distance matrix?</w:t>
+      </w:r>
+    </w:p>
+    <w:p>
+      <w:pPr>
+        <w:numPr>
+          <w:ilvl w:val="1"/>
+          <w:numId w:val="1014"/>
+        </w:numPr>
+        <w:pStyle w:val="Compact"/>
+      </w:pPr>
+      <w:r>
+        <w:t xml:space="preserve">1 60:40 split (said 10-fold, but repeated the same split 10 times)</w:t>
+      </w:r>
+    </w:p>
+    <w:p>
+      <w:pPr>
+        <w:numPr>
+          <w:ilvl w:val="1"/>
+          <w:numId w:val="1014"/>
+        </w:numPr>
+        <w:pStyle w:val="Compact"/>
+      </w:pPr>
+      <w:r>
+        <w:t xml:space="preserve">did not fit hyperparameter: choice for k in case studies was messed up, in some cases using a fraction of the number of columns in the metadata file</w:t>
+      </w:r>
+    </w:p>
+    <w:p>
+      <w:pPr>
+        <w:numPr>
+          <w:ilvl w:val="0"/>
+          <w:numId w:val="1013"/>
+        </w:numPr>
+        <w:pStyle w:val="Compact"/>
+      </w:pPr>
+      <w:r>
+        <w:t xml:space="preserve">I rewrote knn algorithm to use any distance matrix and to use 100 x 80:20 splits with search for optimal k value</w:t>
+      </w:r>
+    </w:p>
+    <w:p>
+      <w:pPr>
+        <w:numPr>
+          <w:ilvl w:val="0"/>
+          <w:numId w:val="1013"/>
+        </w:numPr>
+        <w:pStyle w:val="Compact"/>
+      </w:pPr>
+      <w:r>
+        <w:t xml:space="preserve">Bray-Curtis was similar to better than RPCA for each dataset; other compositional methods performed at least as well as RPCA and better than Bray-Curtis for Sleep Apnea dataset</w:t>
+      </w:r>
+    </w:p>
+    <w:bookmarkEnd w:id="28"/>
+    <w:bookmarkStart w:id="29" w:name="Xf0954c2286c6531201863608c794bbea5b44ece"/>
+    <w:p>
+      <w:pPr>
+        <w:pStyle w:val="Heading3"/>
+      </w:pPr>
+      <w:r>
+        <w:t xml:space="preserve">Sampling depth experiment with simulated and experimental data</w:t>
+      </w:r>
+    </w:p>
+    <w:p>
+      <w:pPr>
+        <w:numPr>
+          <w:ilvl w:val="0"/>
+          <w:numId w:val="1015"/>
+        </w:numPr>
+        <w:pStyle w:val="Compact"/>
+      </w:pPr>
+      <w:r>
+        <w:t xml:space="preserve">Buried in M&amp;M was the description of an analysis and its results where Martino et al. compared the clustering of samples in an ordination where samples were duplicated and subsampled to 500 and 100 sequences per sample. They calculated distances using Jaccard, Bray-Curtis, and RPCA. They found that</w:t>
       </w:r>
       <w:r>
         <w:t xml:space="preserve"> </w:t>
       </w:r>
       <w:r>
-        <w:t xml:space="preserve">better than other methods</w:t>
-      </w:r>
-    </w:p>
-    <w:p>
-      <w:pPr>
-        <w:numPr>
-          <w:ilvl w:val="1"/>
-          <w:numId w:val="1002"/>
-        </w:numPr>
-        <w:pStyle w:val="Compact"/>
-      </w:pPr>
-      <w:r>
-        <w:t xml:space="preserve">BUT - Confusion over difference between rarefaction and rarefying</w:t>
-      </w:r>
-    </w:p>
-    <w:p>
-      <w:pPr>
-        <w:numPr>
-          <w:ilvl w:val="1"/>
-          <w:numId w:val="1002"/>
-        </w:numPr>
-        <w:pStyle w:val="Compact"/>
-      </w:pPr>
-      <w:r>
-        <w:t xml:space="preserve">THEREFORE - Define rarefaction</w:t>
-      </w:r>
-    </w:p>
-    <w:p>
-      <w:pPr>
-        <w:numPr>
-          <w:ilvl w:val="0"/>
-          <w:numId w:val="1001"/>
-        </w:numPr>
-        <w:pStyle w:val="Compact"/>
-      </w:pPr>
-      <w:r>
-        <w:t xml:space="preserve">AND - Critiques against rarefaction include</w:t>
-      </w:r>
-    </w:p>
-    <w:p>
-      <w:pPr>
-        <w:numPr>
-          <w:ilvl w:val="1"/>
-          <w:numId w:val="1003"/>
-        </w:numPr>
-        <w:pStyle w:val="Compact"/>
-      </w:pPr>
-      <w:r>
-        <w:t xml:space="preserve">Compresses the alpha and beta diversity metrics</w:t>
-      </w:r>
-    </w:p>
-    <w:p>
-      <w:pPr>
-        <w:numPr>
-          <w:ilvl w:val="1"/>
-          <w:numId w:val="1003"/>
-        </w:numPr>
-        <w:pStyle w:val="Compact"/>
-      </w:pPr>
-      <w:r>
-        <w:t xml:space="preserve">Perceived as</w:t>
-      </w:r>
-      <w:r>
-        <w:t xml:space="preserve"> </w:t>
-      </w:r>
-      <w:r>
         <w:t xml:space="preserve">“</w:t>
       </w:r>
       <w:r>
-        <w:t xml:space="preserve">throwing away</w:t>
+        <w:t xml:space="preserve">RPCA alleviated the clustering by sequencing depth both qualitatively and quantitatively</w:t>
       </w:r>
       <w:r>
         <w:t xml:space="preserve">”</w:t>
       </w:r>
-      <w:r>
-        <w:t xml:space="preserve"> </w:t>
-      </w:r>
-      <w:r>
-        <w:t xml:space="preserve">data</w:t>
-      </w:r>
-    </w:p>
-    <w:p>
-      <w:pPr>
-        <w:numPr>
-          <w:ilvl w:val="1"/>
-          <w:numId w:val="1003"/>
-        </w:numPr>
-        <w:pStyle w:val="Compact"/>
-      </w:pPr>
-      <w:r>
-        <w:t xml:space="preserve">Arbitrary choice for rarefaction threshold</w:t>
-      </w:r>
-    </w:p>
-    <w:p>
-      <w:pPr>
-        <w:numPr>
-          <w:ilvl w:val="1"/>
-          <w:numId w:val="1003"/>
-        </w:numPr>
-        <w:pStyle w:val="Compact"/>
-      </w:pPr>
-      <w:r>
-        <w:t xml:space="preserve">BUT - these really aren’t problems; largely unavoidable</w:t>
-      </w:r>
-    </w:p>
-    <w:p>
-      <w:pPr>
-        <w:numPr>
-          <w:ilvl w:val="1"/>
-          <w:numId w:val="1003"/>
-        </w:numPr>
-        <w:pStyle w:val="Compact"/>
-      </w:pPr>
-      <w:r>
-        <w:t xml:space="preserve">THEREFORE - Use rarefaction</w:t>
-      </w:r>
-    </w:p>
-    <w:p>
-      <w:pPr>
-        <w:numPr>
-          <w:ilvl w:val="0"/>
-          <w:numId w:val="1001"/>
-        </w:numPr>
-        <w:pStyle w:val="Compact"/>
-      </w:pPr>
-      <w:r>
-        <w:t xml:space="preserve">AND - Additional problem with 16S rRNA gene sequencing is that the data are compositional</w:t>
-      </w:r>
-    </w:p>
-    <w:p>
-      <w:pPr>
-        <w:numPr>
-          <w:ilvl w:val="1"/>
-          <w:numId w:val="1004"/>
-        </w:numPr>
-        <w:pStyle w:val="Compact"/>
-      </w:pPr>
-      <w:r>
-        <w:t xml:space="preserve">Define compositionality</w:t>
-      </w:r>
-    </w:p>
-    <w:p>
-      <w:pPr>
-        <w:numPr>
-          <w:ilvl w:val="1"/>
-          <w:numId w:val="1004"/>
-        </w:numPr>
-        <w:pStyle w:val="Compact"/>
-      </w:pPr>
-      <w:r>
-        <w:t xml:space="preserve">Solutions to problem of compositionality</w:t>
-      </w:r>
-    </w:p>
-    <w:p>
-      <w:pPr>
-        <w:numPr>
-          <w:ilvl w:val="1"/>
-          <w:numId w:val="1004"/>
-        </w:numPr>
-        <w:pStyle w:val="Compact"/>
-      </w:pPr>
-      <w:r>
-        <w:t xml:space="preserve">BUT - Still have sensitivity to uneven sampling effort</w:t>
-      </w:r>
-    </w:p>
-    <w:p>
-      <w:pPr>
-        <w:numPr>
-          <w:ilvl w:val="1"/>
-          <w:numId w:val="1004"/>
-        </w:numPr>
-        <w:pStyle w:val="Compact"/>
-      </w:pPr>
-      <w:r>
-        <w:t xml:space="preserve">THEREFORE - Question of why I found different results from proponents of CLR-based methods</w:t>
-      </w:r>
-    </w:p>
-    <w:p>
-      <w:pPr>
-        <w:numPr>
-          <w:ilvl w:val="0"/>
-          <w:numId w:val="1001"/>
-        </w:numPr>
-        <w:pStyle w:val="Compact"/>
-      </w:pPr>
-      <w:r>
-        <w:t xml:space="preserve">AND - RPCA as a solution</w:t>
-      </w:r>
-    </w:p>
-    <w:p>
-      <w:pPr>
-        <w:numPr>
-          <w:ilvl w:val="1"/>
-          <w:numId w:val="1005"/>
-        </w:numPr>
-        <w:pStyle w:val="Compact"/>
-      </w:pPr>
-      <w:r>
-        <w:t xml:space="preserve">Describe RPCA</w:t>
-      </w:r>
-    </w:p>
-    <w:p>
-      <w:pPr>
-        <w:numPr>
-          <w:ilvl w:val="1"/>
-          <w:numId w:val="1005"/>
-        </w:numPr>
-        <w:pStyle w:val="Compact"/>
-      </w:pPr>
-      <w:r>
-        <w:t xml:space="preserve">Claims made by Martino</w:t>
-      </w:r>
-    </w:p>
-    <w:p>
-      <w:pPr>
-        <w:numPr>
-          <w:ilvl w:val="1"/>
-          <w:numId w:val="1005"/>
-        </w:numPr>
-        <w:pStyle w:val="Compact"/>
-      </w:pPr>
-      <w:r>
-        <w:t xml:space="preserve">Methods used in Martino</w:t>
-      </w:r>
-    </w:p>
-    <w:p>
-      <w:pPr>
-        <w:numPr>
-          <w:ilvl w:val="1"/>
-          <w:numId w:val="1005"/>
-        </w:numPr>
-        <w:pStyle w:val="Compact"/>
-      </w:pPr>
-      <w:r>
-        <w:t xml:space="preserve">BUT - Problems with analysis including not using rarefaction, arbitrary threshold selection, not using other CLR-based methods</w:t>
-      </w:r>
-    </w:p>
-    <w:p>
-      <w:pPr>
-        <w:numPr>
-          <w:ilvl w:val="1"/>
-          <w:numId w:val="1005"/>
-        </w:numPr>
-        <w:pStyle w:val="Compact"/>
-      </w:pPr>
-      <w:r>
-        <w:t xml:space="preserve">THEREFORE - The goal of this study was to reassess RPCA using the framework and methods used by Martino et al. alongside other methods commonly used by microbial ecologists</w:t>
-      </w:r>
-    </w:p>
-    <w:p>
-      <w:pPr>
-        <w:numPr>
-          <w:ilvl w:val="0"/>
-          <w:numId w:val="1001"/>
-        </w:numPr>
-        <w:pStyle w:val="Compact"/>
-      </w:pPr>
-      <w:r>
-        <w:t xml:space="preserve">Other…</w:t>
-      </w:r>
-    </w:p>
-    <w:p>
-      <w:pPr>
-        <w:numPr>
-          <w:ilvl w:val="1"/>
-          <w:numId w:val="1006"/>
-        </w:numPr>
-        <w:pStyle w:val="Compact"/>
-      </w:pPr>
-      <w:r>
-        <w:t xml:space="preserve">RPCA -&gt; deicode -&gt; gemelli</w:t>
-      </w:r>
-    </w:p>
-    <w:p>
-      <w:pPr>
-        <w:numPr>
-          <w:ilvl w:val="1"/>
-          <w:numId w:val="1006"/>
-        </w:numPr>
-        <w:pStyle w:val="Compact"/>
-      </w:pPr>
-      <w:r>
-        <w:t xml:space="preserve">Benchmarking data and code forked from deicode</w:t>
-      </w:r>
-    </w:p>
-    <w:p>
-      <w:pPr>
-        <w:numPr>
-          <w:ilvl w:val="0"/>
-          <w:numId w:val="1001"/>
-        </w:numPr>
-        <w:pStyle w:val="Compact"/>
-      </w:pPr>
-      <w:r>
-        <w:t xml:space="preserve">Problems with original analysis</w:t>
-      </w:r>
-    </w:p>
-    <w:p>
-      <w:pPr>
-        <w:numPr>
-          <w:ilvl w:val="1"/>
-          <w:numId w:val="1007"/>
-        </w:numPr>
-      </w:pPr>
-      <w:r>
-        <w:t xml:space="preserve">Simulation design</w:t>
-      </w:r>
-    </w:p>
-    <w:p>
-      <w:pPr>
-        <w:numPr>
-          <w:ilvl w:val="2"/>
-          <w:numId w:val="1008"/>
-        </w:numPr>
-        <w:pStyle w:val="Compact"/>
-      </w:pPr>
-      <w:r>
-        <w:t xml:space="preserve">1 seed to generate simulated communities</w:t>
-      </w:r>
-    </w:p>
-    <w:p>
-      <w:pPr>
-        <w:numPr>
-          <w:ilvl w:val="2"/>
-          <w:numId w:val="1008"/>
-        </w:numPr>
-        <w:pStyle w:val="Compact"/>
-      </w:pPr>
-      <w:r>
-        <w:t xml:space="preserve">Null model had no skew to it</w:t>
-      </w:r>
-    </w:p>
-    <w:p>
-      <w:pPr>
-        <w:numPr>
-          <w:ilvl w:val="2"/>
-          <w:numId w:val="1008"/>
-        </w:numPr>
-        <w:pStyle w:val="Compact"/>
-      </w:pPr>
-      <w:r>
-        <w:t xml:space="preserve">Simulated communities had uneven sampling effort</w:t>
-      </w:r>
-    </w:p>
-    <w:p>
-      <w:pPr>
-        <w:numPr>
-          <w:ilvl w:val="1"/>
-          <w:numId w:val="1007"/>
-        </w:numPr>
-      </w:pPr>
-      <w:r>
-        <w:t xml:space="preserve">Choice of distance metrics for comparison</w:t>
-      </w:r>
-    </w:p>
-    <w:p>
-      <w:pPr>
-        <w:numPr>
-          <w:ilvl w:val="2"/>
-          <w:numId w:val="1009"/>
-        </w:numPr>
-        <w:pStyle w:val="Compact"/>
-      </w:pPr>
-      <w:r>
-        <w:t xml:space="preserve">Compared RPCA to MatrixCompletion without using RCLR. Who would do this? Why not at least also compare to CLR w/ a pseudocount?</w:t>
-      </w:r>
-    </w:p>
-    <w:p>
-      <w:pPr>
-        <w:numPr>
-          <w:ilvl w:val="1"/>
-          <w:numId w:val="1007"/>
-        </w:numPr>
-      </w:pPr>
-      <w:r>
-        <w:t xml:space="preserve">kNN</w:t>
-      </w:r>
-    </w:p>
-    <w:p>
-      <w:pPr>
-        <w:numPr>
-          <w:ilvl w:val="2"/>
-          <w:numId w:val="1010"/>
-        </w:numPr>
-        <w:pStyle w:val="Compact"/>
-      </w:pPr>
-      <w:r>
-        <w:t xml:space="preserve">Used 1st 2 axes of PCoA of Bray-Curtis distances to calcualte euclidean distances, which were then fed into kNN. Why not use the original Bray-Curtis distance matrix?</w:t>
-      </w:r>
-    </w:p>
-    <w:p>
-      <w:pPr>
-        <w:numPr>
-          <w:ilvl w:val="2"/>
-          <w:numId w:val="1010"/>
-        </w:numPr>
-        <w:pStyle w:val="Compact"/>
-      </w:pPr>
-      <w:r>
-        <w:t xml:space="preserve">1 60:40 split (said 10-fold, but only repeated knn 10 times, not parititioning), did not fit hyperparameter; choice for case studies was messed up</w:t>
-      </w:r>
-    </w:p>
-    <w:p>
-      <w:pPr>
-        <w:numPr>
-          <w:ilvl w:val="1"/>
-          <w:numId w:val="1007"/>
-        </w:numPr>
-      </w:pPr>
-      <w:r>
-        <w:t xml:space="preserve">Comparison of PERMANOVA Fst values misleading since they removed all of the noise by only considering first two axes from RPCA and comparing to PERMANOVA on original Bray-Curtis distances</w:t>
-      </w:r>
-    </w:p>
-    <w:p>
-      <w:pPr>
-        <w:numPr>
-          <w:ilvl w:val="1"/>
-          <w:numId w:val="1007"/>
-        </w:numPr>
-      </w:pPr>
-      <w:r>
-        <w:t xml:space="preserve">Case study analysis</w:t>
-      </w:r>
-    </w:p>
-    <w:p>
-      <w:pPr>
-        <w:numPr>
-          <w:ilvl w:val="2"/>
-          <w:numId w:val="1011"/>
-        </w:numPr>
-        <w:pStyle w:val="Compact"/>
-      </w:pPr>
-      <w:r>
-        <w:t xml:space="preserve">Picked case studies with large effect sizes that are easily seen on PCoA/PCA; most microbiome studies are not so easy to differentiate</w:t>
-      </w:r>
-    </w:p>
-    <w:p>
-      <w:pPr>
-        <w:numPr>
-          <w:ilvl w:val="2"/>
-          <w:numId w:val="1011"/>
-        </w:numPr>
-        <w:pStyle w:val="Compact"/>
-      </w:pPr>
-      <w:r>
-        <w:t xml:space="preserve">Thresholds for subsampling case study datasets are arbitrary</w:t>
-      </w:r>
-    </w:p>
-    <w:p>
-      <w:pPr>
-        <w:numPr>
-          <w:ilvl w:val="1"/>
-          <w:numId w:val="1007"/>
-        </w:numPr>
+    </w:p>
+    <w:p>
+      <w:pPr>
+        <w:numPr>
+          <w:ilvl w:val="1"/>
+          <w:numId w:val="1016"/>
+        </w:numPr>
+        <w:pStyle w:val="Compact"/>
+      </w:pPr>
+      <w:r>
+        <w:t xml:space="preserve">The ordinations still showed clustering by sampling depth</w:t>
+      </w:r>
+    </w:p>
+    <w:p>
+      <w:pPr>
+        <w:numPr>
+          <w:ilvl w:val="1"/>
+          <w:numId w:val="1016"/>
+        </w:numPr>
+        <w:pStyle w:val="Compact"/>
+      </w:pPr>
+      <w:r>
+        <w:t xml:space="preserve">The Jaccard and Bray-Curtis distances were not calculated using rarefaction.</w:t>
+      </w:r>
+    </w:p>
+    <w:p>
+      <w:pPr>
+        <w:numPr>
+          <w:ilvl w:val="0"/>
+          <w:numId w:val="1015"/>
+        </w:numPr>
+        <w:pStyle w:val="Compact"/>
+      </w:pPr>
+      <w:r>
+        <w:t xml:space="preserve">Repeated analysis withe the simulated and experimental data by using 5000 and 10000 sequences per sample</w:t>
+      </w:r>
+    </w:p>
+    <w:p>
+      <w:pPr>
+        <w:numPr>
+          <w:ilvl w:val="0"/>
+          <w:numId w:val="1015"/>
+        </w:numPr>
+        <w:pStyle w:val="Compact"/>
+      </w:pPr>
+      <w:r>
+        <w:t xml:space="preserve">Analyzed distances usign PERMANOVA accounting for sampling depth -&gt; Rarefaction was only method that could reliably control for the uneven sampling effort</w:t>
+      </w:r>
+    </w:p>
+    <w:bookmarkEnd w:id="29"/>
+    <w:bookmarkEnd w:id="30"/>
+    <w:bookmarkStart w:id="31" w:name="discussion"/>
+    <w:p>
+      <w:pPr>
+        <w:pStyle w:val="Heading2"/>
+      </w:pPr>
+      <w:r>
+        <w:t xml:space="preserve">Discussion</w:t>
+      </w:r>
+    </w:p>
+    <w:p>
+      <w:pPr>
+        <w:numPr>
+          <w:ilvl w:val="0"/>
+          <w:numId w:val="1017"/>
+        </w:numPr>
+        <w:pStyle w:val="Compact"/>
       </w:pPr>
       <w:r>
         <w:t xml:space="preserve">Overall method problems</w:t>
@@ -633,110 +1012,241 @@
     <w:p>
       <w:pPr>
         <w:numPr>
-          <w:ilvl w:val="2"/>
-          <w:numId w:val="1012"/>
-        </w:numPr>
-        <w:pStyle w:val="Compact"/>
-      </w:pPr>
-      <w:r>
-        <w:t xml:space="preserve">Choice of number of partitions/axes seems arbitrary/no guidance. Controls and sponges used 2, sleep apnea used 3. Default is 3, also auto_rpca available within recent implementation</w:t>
-      </w:r>
-    </w:p>
-    <w:p>
-      <w:pPr>
-        <w:numPr>
-          <w:ilvl w:val="1"/>
-          <w:numId w:val="1007"/>
-        </w:numPr>
-      </w:pPr>
-      <w:r>
-        <w:t xml:space="preserve">Analysis of sequencing depth sensitivity was qualitative when quantitative methods are available</w:t>
-      </w:r>
-    </w:p>
-    <w:bookmarkEnd w:id="22"/>
-    <w:bookmarkStart w:id="23" w:name="results"/>
+          <w:ilvl w:val="1"/>
+          <w:numId w:val="1018"/>
+        </w:numPr>
+        <w:pStyle w:val="Compact"/>
+      </w:pPr>
+      <w:r>
+        <w:t xml:space="preserve">Choice of number of partitions/axes seems arbitrary/no guidance. Controls and sponges used 2, sleep apnea used 3. Default is 3</w:t>
+      </w:r>
+    </w:p>
+    <w:p>
+      <w:pPr>
+        <w:numPr>
+          <w:ilvl w:val="1"/>
+          <w:numId w:val="1018"/>
+        </w:numPr>
+        <w:pStyle w:val="Compact"/>
+      </w:pPr>
+      <w:r>
+        <w:t xml:space="preserve">auto_rpca available within recent implementation but has since been deprecated</w:t>
+      </w:r>
+    </w:p>
+    <w:p>
+      <w:pPr>
+        <w:numPr>
+          <w:ilvl w:val="0"/>
+          <w:numId w:val="1017"/>
+        </w:numPr>
+        <w:pStyle w:val="Compact"/>
+      </w:pPr>
+      <w:r>
+        <w:t xml:space="preserve">Benchmarking should use methods that are commonly used in the field. KNN was interesting, but not relevant. Who is using raw with matrix completion?</w:t>
+      </w:r>
+    </w:p>
+    <w:p>
+      <w:pPr>
+        <w:numPr>
+          <w:ilvl w:val="0"/>
+          <w:numId w:val="1017"/>
+        </w:numPr>
+        <w:pStyle w:val="Compact"/>
+      </w:pPr>
+      <w:r>
+        <w:t xml:space="preserve">Statistical modeling approach is appealing for building communities and treatment groups and nicely complements results found using simulations based on observed sequencing counts and sequencing depths</w:t>
+      </w:r>
+    </w:p>
+    <w:p>
+      <w:pPr>
+        <w:numPr>
+          <w:ilvl w:val="0"/>
+          <w:numId w:val="1017"/>
+        </w:numPr>
+        <w:pStyle w:val="Compact"/>
+      </w:pPr>
+      <w:r>
+        <w:t xml:space="preserve">Comment on problematic coding practices</w:t>
+      </w:r>
+    </w:p>
+    <w:p>
+      <w:pPr>
+        <w:numPr>
+          <w:ilvl w:val="0"/>
+          <w:numId w:val="1017"/>
+        </w:numPr>
+        <w:pStyle w:val="Compact"/>
+      </w:pPr>
+      <w:r>
+        <w:t xml:space="preserve">Use rarefaction</w:t>
+      </w:r>
+    </w:p>
+    <w:bookmarkEnd w:id="31"/>
+    <w:bookmarkStart w:id="32" w:name="materials-methods"/>
     <w:p>
       <w:pPr>
         <w:pStyle w:val="Heading2"/>
       </w:pPr>
       <w:r>
-        <w:t xml:space="preserve">Results</w:t>
-      </w:r>
-    </w:p>
-    <w:p>
-      <w:pPr>
-        <w:numPr>
-          <w:ilvl w:val="0"/>
-          <w:numId w:val="1013"/>
-        </w:numPr>
-      </w:pPr>
-      <w:r>
-        <w:t xml:space="preserve">Simulation</w:t>
-      </w:r>
-    </w:p>
-    <w:p>
-      <w:pPr>
-        <w:numPr>
-          <w:ilvl w:val="0"/>
-          <w:numId w:val="1013"/>
-        </w:numPr>
-      </w:pPr>
-      <w:r>
-        <w:t xml:space="preserve">Compositionality</w:t>
-      </w:r>
-    </w:p>
-    <w:bookmarkEnd w:id="23"/>
-    <w:bookmarkStart w:id="24" w:name="discussion"/>
+        <w:t xml:space="preserve">Materials &amp; Methods</w:t>
+      </w:r>
+    </w:p>
+    <w:p>
+      <w:pPr>
+        <w:numPr>
+          <w:ilvl w:val="0"/>
+          <w:numId w:val="1019"/>
+        </w:numPr>
+      </w:pPr>
+      <w:r>
+        <w:t xml:space="preserve">Deicode benchmarking data and code</w:t>
+      </w:r>
+    </w:p>
+    <w:p>
+      <w:pPr>
+        <w:numPr>
+          <w:ilvl w:val="0"/>
+          <w:numId w:val="1019"/>
+        </w:numPr>
+      </w:pPr>
+      <w:r>
+        <w:t xml:space="preserve">KNN analysis</w:t>
+      </w:r>
+    </w:p>
+    <w:p>
+      <w:pPr>
+        <w:numPr>
+          <w:ilvl w:val="0"/>
+          <w:numId w:val="1019"/>
+        </w:numPr>
+      </w:pPr>
+      <w:r>
+        <w:t xml:space="preserve">Description of Sampling depth experiment</w:t>
+      </w:r>
+    </w:p>
+    <w:p>
+      <w:pPr>
+        <w:numPr>
+          <w:ilvl w:val="1"/>
+          <w:numId w:val="1020"/>
+        </w:numPr>
+        <w:pStyle w:val="Compact"/>
+      </w:pPr>
+      <w:r>
+        <w:t xml:space="preserve">adonis2 model</w:t>
+      </w:r>
+    </w:p>
+    <w:p>
+      <w:pPr>
+        <w:numPr>
+          <w:ilvl w:val="0"/>
+          <w:numId w:val="1019"/>
+        </w:numPr>
+      </w:pPr>
+      <w:r>
+        <w:t xml:space="preserve">Workflow</w:t>
+      </w:r>
+    </w:p>
+    <w:p>
+      <w:pPr>
+        <w:numPr>
+          <w:ilvl w:val="1"/>
+          <w:numId w:val="1021"/>
+        </w:numPr>
+        <w:pStyle w:val="Compact"/>
+      </w:pPr>
+      <w:r>
+        <w:t xml:space="preserve">Snakemake</w:t>
+      </w:r>
+    </w:p>
+    <w:p>
+      <w:pPr>
+        <w:numPr>
+          <w:ilvl w:val="1"/>
+          <w:numId w:val="1021"/>
+        </w:numPr>
+        <w:pStyle w:val="Compact"/>
+      </w:pPr>
+      <w:r>
+        <w:t xml:space="preserve">Conda - Software versions</w:t>
+      </w:r>
+    </w:p>
+    <w:p>
+      <w:pPr>
+        <w:numPr>
+          <w:ilvl w:val="1"/>
+          <w:numId w:val="1021"/>
+        </w:numPr>
+        <w:pStyle w:val="Compact"/>
+      </w:pPr>
+      <w:r>
+        <w:t xml:space="preserve">GitHub</w:t>
+      </w:r>
+    </w:p>
+    <w:bookmarkEnd w:id="32"/>
+    <w:bookmarkStart w:id="33" w:name="acknowledgements"/>
     <w:p>
       <w:pPr>
         <w:pStyle w:val="Heading2"/>
       </w:pPr>
       <w:r>
-        <w:t xml:space="preserve">Discussion</w:t>
-      </w:r>
-    </w:p>
-    <w:p>
-      <w:pPr>
-        <w:pStyle w:val="FirstParagraph"/>
-      </w:pPr>
-      <w:r>
-        <w:t xml:space="preserve">Viral glossier taxidermy keytar celiac ethical. Next level knausgaard tousled palo santo photo booth kogi brunch wayfarers vice tilde squid. Marfa edison bulb fashion axe flannel. Shabby chic man bun heirloom kitsch DIY marfa ascot same migas. Venmo tacos chambray yr ramps green juice man bun fixie gastropub craft beer enamel pin. Ascot irony blog, pork belly microdosing tumblr cardigan shaman before they sold out hell of la croix grailed intelligentsia activated charcoal tumeric. Copper mug bicycle rights scenester 3 wolf moon whatever schlitz.</w:t>
-      </w:r>
-    </w:p>
-    <w:bookmarkEnd w:id="24"/>
-    <w:bookmarkStart w:id="25" w:name="materials-methods"/>
+        <w:t xml:space="preserve">Acknowledgements</w:t>
+      </w:r>
+    </w:p>
+    <w:p>
+      <w:pPr>
+        <w:numPr>
+          <w:ilvl w:val="0"/>
+          <w:numId w:val="1022"/>
+        </w:numPr>
+        <w:pStyle w:val="Compact"/>
+      </w:pPr>
+      <w:r>
+        <w:t xml:space="preserve">Thanks for making code publicly accessible!</w:t>
+      </w:r>
+    </w:p>
+    <w:p>
+      <w:pPr>
+        <w:numPr>
+          <w:ilvl w:val="0"/>
+          <w:numId w:val="1022"/>
+        </w:numPr>
+        <w:pStyle w:val="Compact"/>
+      </w:pPr>
+      <w:r>
+        <w:t xml:space="preserve">Funding agencies</w:t>
+      </w:r>
+    </w:p>
+    <w:p>
+      <w:r>
+        <w:br w:type="page"/>
+      </w:r>
+    </w:p>
+    <w:bookmarkEnd w:id="33"/>
+    <w:bookmarkStart w:id="35" w:name="references"/>
     <w:p>
       <w:pPr>
         <w:pStyle w:val="Heading2"/>
       </w:pPr>
       <w:r>
-        <w:t xml:space="preserve">Materials &amp; Methods</w:t>
-      </w:r>
-    </w:p>
-    <w:p>
-      <w:pPr>
-        <w:pStyle w:val="FirstParagraph"/>
-      </w:pPr>
-      <w:r>
-        <w:t xml:space="preserve">Viral glossier taxidermy keytar celiac ethical. Next level knausgaard tousled palo santo photo booth kogi brunch wayfarers vice tilde squid. Marfa edison bulb fashion axe flannel. Shabby chic man bun heirloom kitsch DIY marfa ascot same migas. Venmo tacos chambray yr ramps green juice man bun fixie gastropub craft beer enamel pin. Ascot irony blog, pork belly microdosing tumblr cardigan shaman before they sold out hell of la croix grailed intelligentsia activated charcoal tumeric. Copper mug bicycle rights scenester 3 wolf moon whatever schlitz.</w:t>
-      </w:r>
-    </w:p>
-    <w:bookmarkEnd w:id="25"/>
-    <w:bookmarkStart w:id="26" w:name="acknowledgements"/>
+        <w:t xml:space="preserve">References</w:t>
+      </w:r>
+    </w:p>
+    <w:bookmarkStart w:id="34" w:name="refs"/>
+    <w:bookmarkEnd w:id="34"/>
+    <w:p>
+      <w:r>
+        <w:br w:type="page"/>
+      </w:r>
+    </w:p>
+    <w:bookmarkEnd w:id="35"/>
+    <w:bookmarkStart w:id="36" w:name="figures"/>
     <w:p>
       <w:pPr>
         <w:pStyle w:val="Heading2"/>
       </w:pPr>
       <w:r>
-        <w:t xml:space="preserve">Acknowledgements</w:t>
-      </w:r>
-    </w:p>
-    <w:p>
-      <w:pPr>
-        <w:pStyle w:val="FirstParagraph"/>
-      </w:pPr>
-      <w:r>
-        <w:t xml:space="preserve">Viral glossier taxidermy keytar celiac ethical. Next level knausgaard tousled palo santo photo booth kogi brunch wayfarers vice tilde squid. Marfa edison bulb fashion axe flannel. Shabby chic man bun heirloom kitsch DIY marfa ascot same migas. Venmo tacos chambray yr ramps green juice man bun fixie gastropub craft beer enamel pin. Ascot irony blog, pork belly microdosing tumblr cardigan shaman before they sold out hell of la croix grailed intelligentsia activated charcoal tumeric. Copper mug bicycle rights scenester 3 wolf moon whatever schlitz.</w:t>
+        <w:t xml:space="preserve">Figures</w:t>
       </w:r>
     </w:p>
     <w:p>
@@ -744,50 +1254,18 @@
         <w:br w:type="page"/>
       </w:r>
     </w:p>
-    <w:bookmarkEnd w:id="26"/>
-    <w:bookmarkStart w:id="28" w:name="references"/>
+    <w:bookmarkEnd w:id="36"/>
+    <w:bookmarkStart w:id="37" w:name="supplemental-figures"/>
     <w:p>
       <w:pPr>
         <w:pStyle w:val="Heading2"/>
       </w:pPr>
       <w:r>
-        <w:t xml:space="preserve">References</w:t>
-      </w:r>
-    </w:p>
-    <w:bookmarkStart w:id="27" w:name="refs"/>
-    <w:bookmarkEnd w:id="27"/>
-    <w:p>
-      <w:r>
-        <w:br w:type="page"/>
-      </w:r>
-    </w:p>
-    <w:bookmarkEnd w:id="28"/>
-    <w:bookmarkStart w:id="29" w:name="figures"/>
-    <w:p>
-      <w:pPr>
-        <w:pStyle w:val="Heading2"/>
-      </w:pPr>
-      <w:r>
-        <w:t xml:space="preserve">Figures</w:t>
-      </w:r>
-    </w:p>
-    <w:p>
-      <w:r>
-        <w:br w:type="page"/>
-      </w:r>
-    </w:p>
-    <w:bookmarkEnd w:id="29"/>
-    <w:bookmarkStart w:id="30" w:name="supplemental-figures"/>
-    <w:p>
-      <w:pPr>
-        <w:pStyle w:val="Heading2"/>
-      </w:pPr>
-      <w:r>
         <w:t xml:space="preserve">Supplemental Figures</w:t>
       </w:r>
     </w:p>
-    <w:bookmarkEnd w:id="30"/>
-    <w:bookmarkEnd w:id="31"/>
+    <w:bookmarkEnd w:id="37"/>
+    <w:bookmarkEnd w:id="38"/>
     <w:sectPr/>
   </w:body>
 </w:document>
@@ -1010,6 +1488,33 @@
     <w:abstractNumId w:val="991"/>
   </w:num>
   <w:num w:numId="1013">
+    <w:abstractNumId w:val="991"/>
+  </w:num>
+  <w:num w:numId="1014">
+    <w:abstractNumId w:val="991"/>
+  </w:num>
+  <w:num w:numId="1015">
+    <w:abstractNumId w:val="991"/>
+  </w:num>
+  <w:num w:numId="1016">
+    <w:abstractNumId w:val="991"/>
+  </w:num>
+  <w:num w:numId="1017">
+    <w:abstractNumId w:val="991"/>
+  </w:num>
+  <w:num w:numId="1018">
+    <w:abstractNumId w:val="991"/>
+  </w:num>
+  <w:num w:numId="1019">
+    <w:abstractNumId w:val="991"/>
+  </w:num>
+  <w:num w:numId="1020">
+    <w:abstractNumId w:val="991"/>
+  </w:num>
+  <w:num w:numId="1021">
+    <w:abstractNumId w:val="991"/>
+  </w:num>
+  <w:num w:numId="1022">
     <w:abstractNumId w:val="991"/>
   </w:num>
 </w:numbering>

</xml_diff>

<commit_message>
Manuscript writing and figures through Martino simulation
</commit_message>
<xml_diff>
--- a/submission/manuscript.docx
+++ b/submission/manuscript.docx
@@ -2,7 +2,7 @@
 <file path=word/document.xml><?xml version="1.0" encoding="utf-8"?>
 <w:document xmlns:w="http://schemas.openxmlformats.org/wordprocessingml/2006/main" xmlns:m="http://schemas.openxmlformats.org/officeDocument/2006/math" xmlns:r="http://schemas.openxmlformats.org/officeDocument/2006/relationships" xmlns:o="urn:schemas-microsoft-com:office:office" xmlns:v="urn:schemas-microsoft-com:vml" xmlns:w10="urn:schemas-microsoft-com:office:word" xmlns:a="http://schemas.openxmlformats.org/drawingml/2006/main" xmlns:pic="http://schemas.openxmlformats.org/drawingml/2006/picture" xmlns:wp="http://schemas.openxmlformats.org/drawingml/2006/wordprocessingDrawing">
   <w:body>
-    <w:bookmarkStart w:id="38" w:name="lorem-ipsum"/>
+    <w:bookmarkStart w:id="63" w:name="lorem-ipsum"/>
     <w:p>
       <w:pPr>
         <w:pStyle w:val="Heading1"/>
@@ -17,8 +17,8 @@
       </w:pPr>
       <w:r>
         <w:rPr>
-          <w:bCs/>
-          <w:b/>
+          <w:b/>
+          <w:bCs/>
         </w:rPr>
         <w:t xml:space="preserve">Running title:</w:t>
       </w:r>
@@ -83,8 +83,8 @@
       </w:pPr>
       <w:r>
         <w:rPr>
-          <w:bCs/>
-          <w:b/>
+          <w:b/>
+          <w:bCs/>
         </w:rPr>
         <w:t xml:space="preserve">Research article</w:t>
       </w:r>
@@ -149,7 +149,65 @@
         <w:pStyle w:val="FirstParagraph"/>
       </w:pPr>
       <w:r>
-        <w:t xml:space="preserve">A persistent challenge in amplicon and shotgun metagenomic sequencing of microbial communities is the variation in the number of reads obtained across samples. This challenge is not unique to microbial communities and has long plagued ecologists, in general. The classical approach to control for uneven sampling is rarefaction. In rarefaction, a consistent number of individuals are randomly sampled from each sample. An alpha or beta diversity metric is then calculated from the sampling. The random subsampling and diversity measurement steps are repeated a large number of times (e.g., 100 or 1,000) and the measurements are averaged over the subsamples. Unfortunately, the term</w:t>
+        <w:t xml:space="preserve">(1, 2)</w:t>
+      </w:r>
+    </w:p>
+    <w:p>
+      <w:pPr>
+        <w:pStyle w:val="BodyText"/>
+      </w:pPr>
+      <w:r>
+        <w:t xml:space="preserve">A persistent challenge in amplicon and shotgun metagenomic sequencing of microbial communities is the variation in the number of reads obtained across samples [</w:t>
+      </w:r>
+      <w:r>
+        <w:rPr>
+          <w:b/>
+          <w:bCs/>
+        </w:rPr>
+        <w:t xml:space="preserve">XXXXX</w:t>
+      </w:r>
+      <w:r>
+        <w:t xml:space="preserve">]. The variation in the number of reads generally occurs because of an accumulation of sampling errors during library generation that includes attempts to pool equimolar amounts of DNA for subsequent sequencing. It is not uncommon to observe as much as 100-fold variation in sequencing depth [</w:t>
+      </w:r>
+      <w:r>
+        <w:rPr>
+          <w:b/>
+          <w:bCs/>
+        </w:rPr>
+        <w:t xml:space="preserve">XXXXX</w:t>
+      </w:r>
+      <w:r>
+        <w:t xml:space="preserve">]. This challenge is not unique to microbial ecologists and has long plagued landscape and animal ecologists [</w:t>
+      </w:r>
+      <w:r>
+        <w:rPr>
+          <w:b/>
+          <w:bCs/>
+        </w:rPr>
+        <w:t xml:space="preserve">XXXXX</w:t>
+      </w:r>
+      <w:r>
+        <w:t xml:space="preserve">]. The classical approach to control for uneven sampling has been rarefaction [</w:t>
+      </w:r>
+      <w:r>
+        <w:rPr>
+          <w:b/>
+          <w:bCs/>
+        </w:rPr>
+        <w:t xml:space="preserve">XXXXX</w:t>
+      </w:r>
+      <w:r>
+        <w:t xml:space="preserve">]. In rarefaction, a consistent number of individuals are randomly sampled from each sample. An alpha or beta diversity metric is then calculated from the sampling. The random subsampling and diversity measurement steps are repeated a large number of times (e.g., 100 or 1,000) and the measurements are averaged over the subsamples [</w:t>
+      </w:r>
+      <w:r>
+        <w:rPr>
+          <w:b/>
+          <w:bCs/>
+        </w:rPr>
+        <w:t xml:space="preserve">XXXXX</w:t>
+      </w:r>
+      <w:r>
+        <w:t xml:space="preserve">]. Unfortunately, the term</w:t>
       </w:r>
       <w:r>
         <w:t xml:space="preserve"> </w:t>
@@ -167,7 +225,67 @@
         <w:t xml:space="preserve"> </w:t>
       </w:r>
       <w:r>
-        <w:t xml:space="preserve">and occasionally rarefaction have been misdefined as a single subsampling step. Regardless, over the past 10 years, the process of rarefaction has become controversial because some view the choice of the sampling depth as arbitrary, the metrics can become more similar than they truly are, and because the practice of downsampling to a common number of sequences leaves the impression that good data are being unnecessarily discarded. Numerous alternatives have been proposed including calcuting the relative abundance of each taxon in in a community so that they sum to 1 within a sample, normalization of counts so that the total number of individuals sums to a user defined value, use of estimators of diversity that can extrapolate beyond the number of observed individuals, and the use of compositional statistics, which are based on a log ratio to a reference value.</w:t>
+        <w:t xml:space="preserve">and occasionally rarefaction have been misidentified as a single subsampling step [</w:t>
+      </w:r>
+      <w:r>
+        <w:rPr>
+          <w:b/>
+          <w:bCs/>
+        </w:rPr>
+        <w:t xml:space="preserve">XXXXX</w:t>
+      </w:r>
+      <w:r>
+        <w:t xml:space="preserve">]. Regardless, over the past 10 years, the process of rarefaction has become controversial because some view the choice of the sampling depth as arbitrary, the metrics can become more similar than they truly are, and because the practice of downsampling to a common number of sequences leaves the impression that good data are being unnecessarily discarded [</w:t>
+      </w:r>
+      <w:r>
+        <w:rPr>
+          <w:b/>
+          <w:bCs/>
+        </w:rPr>
+        <w:t xml:space="preserve">XXXXX</w:t>
+      </w:r>
+      <w:r>
+        <w:t xml:space="preserve">]. Numerous alternatives have been proposed including calculating the relative abundance of each taxon in a community so that they sum to 1 within a sample [</w:t>
+      </w:r>
+      <w:r>
+        <w:rPr>
+          <w:b/>
+          <w:bCs/>
+        </w:rPr>
+        <w:t xml:space="preserve">XXXXX</w:t>
+      </w:r>
+      <w:r>
+        <w:t xml:space="preserve">], normalization of counts so that the total number of individuals sums to a user defined value [</w:t>
+      </w:r>
+      <w:r>
+        <w:rPr>
+          <w:b/>
+          <w:bCs/>
+        </w:rPr>
+        <w:t xml:space="preserve">XXXXX</w:t>
+      </w:r>
+      <w:r>
+        <w:t xml:space="preserve">], use of estimators of diversity that can extrapolate beyond the number of observed individuals [</w:t>
+      </w:r>
+      <w:r>
+        <w:rPr>
+          <w:b/>
+          <w:bCs/>
+        </w:rPr>
+        <w:t xml:space="preserve">XXXXX</w:t>
+      </w:r>
+      <w:r>
+        <w:t xml:space="preserve">], and the use of compositional statistics, which are based on a log ratio of taxon counts to a reference value [</w:t>
+      </w:r>
+      <w:r>
+        <w:rPr>
+          <w:b/>
+          <w:bCs/>
+        </w:rPr>
+        <w:t xml:space="preserve">XXXXX</w:t>
+      </w:r>
+      <w:r>
+        <w:t xml:space="preserve">].</w:t>
       </w:r>
     </w:p>
     <w:p>
@@ -175,17 +293,57 @@
         <w:pStyle w:val="BodyText"/>
       </w:pPr>
       <w:r>
-        <w:t xml:space="preserve">Researchers have adopted compositional methods because the number of sequences obtained per sample is typically independent of the true number of individuals in a community and so the number of times each taxon is observed is not independent of the other taxa. The general approach is to calculate a centralized log ratio (i.e., CLR) where the abundance of each taxon within a sample is divided by the geometric mean abundance within the sample. This ratio is then used as the argument for the natural logrithm. These values are then used to calculate pairwise euclidean distances between samples resulting in so-called Aitchison distances. Aside from controlling for the compositional nature of sequence data, proponents of the Aitchison distance claim that the distances are insensitive to differences in sampling effort. A challenge of Aitchison distances is that because microbial communities are patchy a large number of features will have a frquency of zero in each sample. This will cause the geometric mean to be undefined. To overcome this challenge, factors are added to the data. Three approaches have been proposed: adding a pseudocount of 1 all frequency data (i.e., Nudge CLR), adding a pseudocount of 1 divided by the total number of individuals in the sample (i.e., Nudge CLR), and imputing zero values to be a random small value (i.e. Zero CLR). As an alternative to these transformations, Martino et al. [</w:t>
-      </w:r>
-      <w:r>
-        <w:rPr>
-          <w:bCs/>
-          <w:b/>
+        <w:t xml:space="preserve">Researchers have adopted compositional methods because the number of sequences obtained per sample is typically independent of the true number of individuals in a community and so the number of times each taxon is observed is not independent of the other taxa [</w:t>
+      </w:r>
+      <w:r>
+        <w:rPr>
+          <w:b/>
+          <w:bCs/>
         </w:rPr>
         <w:t xml:space="preserve">XXXXX</w:t>
       </w:r>
       <w:r>
-        <w:t xml:space="preserve">] proposed calculating CLR values for each sample after ignoring zero values followed by matrix completion or robust Principal Components Analysis (i.e., RPCA). The authors claim that the advantages of RPCA over the other CLR-based approaches is that it does not require imputing zero values and that the method is less sensitive to uneven sampling effort.</w:t>
+        <w:t xml:space="preserve">]. The general approach is to calculate a centralized log ratio (i.e., CLR) where the abundance of each taxon within a sample is divided by the geometric mean abundance within the sample, which is then used as the argument for the natural logarithm. These values are then used to calculate pairwise euclidean distances between samples resulting in so-called Aitchison distances [</w:t>
+      </w:r>
+      <w:r>
+        <w:rPr>
+          <w:b/>
+          <w:bCs/>
+        </w:rPr>
+        <w:t xml:space="preserve">XXXXX</w:t>
+      </w:r>
+      <w:r>
+        <w:t xml:space="preserve">]. Aside from controlling for the compositional nature of sequence data, proponents of the Aitchison distance claim that the distances are insensitive to differences in sampling effort [</w:t>
+      </w:r>
+      <w:r>
+        <w:rPr>
+          <w:b/>
+          <w:bCs/>
+        </w:rPr>
+        <w:t xml:space="preserve">XXXXX</w:t>
+      </w:r>
+      <w:r>
+        <w:t xml:space="preserve">]. A challenge of Aitchison distances is that because microbial communities are patchy a large number of features will have a frequency of zero in each sample. This will cause the geometric mean to be undefined. To overcome this challenge, factors are added to the data. Three approaches have been proposed: adding a pseudocount of 1 all frequency data (i.e., Nudge CLR), adding a pseudocount of 1 divided by the total number of individuals in the sample (i.e., Nudge CLR), and imputing zero values to be a random small value (i.e. Zero CLR) [</w:t>
+      </w:r>
+      <w:r>
+        <w:rPr>
+          <w:b/>
+          <w:bCs/>
+        </w:rPr>
+        <w:t xml:space="preserve">XXXXX</w:t>
+      </w:r>
+      <w:r>
+        <w:t xml:space="preserve">]. As an alternative to these transformations, Martino et al. [</w:t>
+      </w:r>
+      <w:r>
+        <w:rPr>
+          <w:b/>
+          <w:bCs/>
+        </w:rPr>
+        <w:t xml:space="preserve">XXXXX</w:t>
+      </w:r>
+      <w:r>
+        <w:t xml:space="preserve">] (i.e., Martino) proposed calculating CLR values for each sample after ignoring zero values followed by matrix completion or robust principal components analysis (i.e., RPCA). The authors claimed that the advantage of RPCA over the other CLR-based approaches was that it did not require imputing zero values and that the method was less sensitive to uneven sampling effort.</w:t>
       </w:r>
     </w:p>
     <w:p>
@@ -193,7 +351,17 @@
         <w:pStyle w:val="BodyText"/>
       </w:pPr>
       <w:r>
-        <w:t xml:space="preserve">In contrast to these claims, my previous work has shown that the output of RPCA and other alternatives to rarefaction are more sensitive to uneven sampling than rarefaction. Futhermore, use of these methods can inflate the false detection rate and decrease the statistical power to detect differences in alpha and beta diversity metrics. Given the near unanimous agreement over the past decade that rarefaction is</w:t>
+        <w:t xml:space="preserve">In contrast to these claims, I have shown that the output of RPCA and other alternatives to rarefaction are more sensitive to uneven sampling than rarefaction [</w:t>
+      </w:r>
+      <w:r>
+        <w:rPr>
+          <w:b/>
+          <w:bCs/>
+        </w:rPr>
+        <w:t xml:space="preserve">XXXXX</w:t>
+      </w:r>
+      <w:r>
+        <w:t xml:space="preserve">]. Furthermore, use of these methods can inflate the false detection rate and decrease the statistical power to detect differences in alpha and beta diversity metrics. Given the near unanimous agreement over the past decade that rarefaction is</w:t>
       </w:r>
       <w:r>
         <w:t xml:space="preserve"> </w:t>
@@ -211,7 +379,27 @@
         <w:t xml:space="preserve"> </w:t>
       </w:r>
       <w:r>
-        <w:t xml:space="preserve">and the development of alternatives to rarefaction, one might question why my results disagree so markedly with those of others. There are several possible reasons. First, researchers often propose new methods by demonstrating their method reveals new insights over old methods without actually benchmarking the method. Because one cannot know the true difference between samples, a positive or negative result with experimental data cannot be interpreted. Second, when bencharking tests are developed, researchers may inadvertantly select tests that favor the method they are developing. This was the case in my recent re-analysis of the original paper that called rarefaction into question. Therefore, it is necessary to use a comprehensive benchmarking test suite that allows one to compare diverse methods using inference methods that are commonly used by researchers. Third, the choice of how to simulate community data can indadvertantly favor the method being developed. A popular cliche states that</w:t>
+        <w:t xml:space="preserve">and the development of alternatives to rarefaction, one might question why my results disagree so markedly with those of others. There are several possible reasons. First, researchers often propose new methods by demonstrating their method reveals new insights over old methods without objectively benchmarking the method [</w:t>
+      </w:r>
+      <w:r>
+        <w:rPr>
+          <w:b/>
+          <w:bCs/>
+        </w:rPr>
+        <w:t xml:space="preserve">XXXXX</w:t>
+      </w:r>
+      <w:r>
+        <w:t xml:space="preserve">]. Because one cannot know the true difference between samples, a positive or negative result with experimental data cannot be interpreted. Second, when benchmarking tests are developed, researchers may inadvertently select tests that favor the method they are developing. This was the case in my recent re-analysis of the original paper that called rarefaction into question [</w:t>
+      </w:r>
+      <w:r>
+        <w:rPr>
+          <w:b/>
+          <w:bCs/>
+        </w:rPr>
+        <w:t xml:space="preserve">XXXXX</w:t>
+      </w:r>
+      <w:r>
+        <w:t xml:space="preserve">]. Therefore, it is necessary to use a comprehensive benchmarking test suite that allows one to compare diverse methods using inference methods that are commonly used by researchers. Third, the choice of how to simulate community data can inadvertently favor the method being developed. A popular cliché states that</w:t>
       </w:r>
       <w:r>
         <w:t xml:space="preserve"> </w:t>
@@ -226,7 +414,30 @@
         <w:t xml:space="preserve">”</w:t>
       </w:r>
       <w:r>
-        <w:t xml:space="preserve">. Similar to one’s choice of benchmarking tests, the modelling approach may favor some methods over others. For instance, I have critiqued how others have accounted for variation in sampling depth as being unlike what we see in experimental data.</w:t>
+        <w:t xml:space="preserve"> </w:t>
+      </w:r>
+      <w:r>
+        <w:t xml:space="preserve">[</w:t>
+      </w:r>
+      <w:r>
+        <w:rPr>
+          <w:b/>
+          <w:bCs/>
+        </w:rPr>
+        <w:t xml:space="preserve">XXXXX</w:t>
+      </w:r>
+      <w:r>
+        <w:t xml:space="preserve">]. Similar to one’s choice of benchmarking tests, the modelling approach may favor some methods over others. For instance, I have critiqued how others have accounted for variation in sampling depth as being unlike what we see in experimental data [</w:t>
+      </w:r>
+      <w:r>
+        <w:rPr>
+          <w:b/>
+          <w:bCs/>
+        </w:rPr>
+        <w:t xml:space="preserve">XXXXX</w:t>
+      </w:r>
+      <w:r>
+        <w:t xml:space="preserve">].</w:t>
       </w:r>
     </w:p>
     <w:p>
@@ -234,11 +445,39 @@
         <w:pStyle w:val="BodyText"/>
       </w:pPr>
       <w:r>
-        <w:t xml:space="preserve">Previously, I generated null community models and treatment groups with known effect sizes by creating taxon abundance distributions and sampling depths based on 12 published datasets. Alternatively, Martino et al. modelled communites with known effect sizes using a statistical model. This difference in modelling strategy has created an interesting opportunity to reframe the question of whether to use rarefaction and to reassess the performance of RPCA and other CLR-based approaches. Although Martino et al., used an interesing modelling approach, they did not compare RPCA to other CLR-based approaches or to rarefaction. Furthermore, they used benchmarking tests that did not reflect how researchers typically analyze microbial community data. Therefore, the goal of the current study was to reassess RPCA and other CLR-based methods to rarefaction using the modelling and benchmarking framework used by Martino et al.</w:t>
+        <w:t xml:space="preserve">In my previous analyses advocating for rarefaction, I generated null community models and treatment groups with known effect sizes by creating taxon abundance distributions and sampling depths based on 12 published datasets [</w:t>
+      </w:r>
+      <w:r>
+        <w:rPr>
+          <w:b/>
+          <w:bCs/>
+        </w:rPr>
+        <w:t xml:space="preserve">XXXXX</w:t>
+      </w:r>
+      <w:r>
+        <w:t xml:space="preserve">]. Alternatively, Martino modelled communities with known effect sizes using a statistical model that sought to mimic the diversity of communities described in a study comparing the microbial communities found on people’s fingertips and their computer keyboards [</w:t>
+      </w:r>
+      <w:r>
+        <w:rPr>
+          <w:b/>
+          <w:bCs/>
+        </w:rPr>
+        <w:t xml:space="preserve">XXXXX</w:t>
+      </w:r>
+      <w:r>
+        <w:t xml:space="preserve">]. As described in Martino, the overall simulation framework involved simulating two treatment groups each represented by 100 communities for a total of 200 communities. Each community contained as many as 1,000 taxa, which they referred to as features. For each treatment group they fit a normal distribution to the relative abundances of taxa from two individuals’ samples to obtain a mean and standard deviation for each taxon. The fraction of taxa that overlapped between treatment groups was also selected to mimic the overlap observed between the two individuals. The expected taxon relative abundances for each sample were the same across each sample within the same treatment group. Next, a common normal distribution with a single mean and standard deviation was used to generate noise (i.e., homoscedastic noise) that added to each relative abundance value to add variation across samples and features. Next, a random subset of sample-taxa combinations were selected for incorporation of additional noise (i.e., heteroscedastic noise). Finally, the sample-taxa combinations were randomly sampled using a Poisson-lognormal distribution to generate the simulated number of sequences for each sample-taxa combination so that the total number of sequences within a sample contained approximately 1,000, 2,000, 4,000, or 10,000 sequences per simulation. One set of 200 samples were simulated for each sequencing depth. In addition to the simulation where a subset of taxa was shared in both treatment groups, Martino created positive and negative control simulations. In the positive control simulation, there were no overlapping taxa resulting in two clearly defined groups of samples. In the negative control simulation all the taxa were shared in similar abundance so that the groups of samples could not be distinguished. Finally, they compared RPCA to other methods using two published datasets.</w:t>
+      </w:r>
+    </w:p>
+    <w:p>
+      <w:pPr>
+        <w:pStyle w:val="BodyText"/>
+      </w:pPr>
+      <w:r>
+        <w:t xml:space="preserve">This difference in modelling strategy has created an interesting opportunity to reframe whether to use rarefaction and to reassess the performance of RPCA and other CLR-based approaches. Although Martino used an interesting modelling approach, they did not compare RPCA to other CLR-based approaches or to rarefaction. Furthermore, they used benchmarking tests that did not reflect how researchers typically analyze microbial community data. Therefore, the goal of the current study was to benchmark RPCA and other CLR-based methods relative to rarefaction using the modelling framework used by Martino.</w:t>
       </w:r>
     </w:p>
     <w:bookmarkEnd w:id="22"/>
-    <w:bookmarkStart w:id="30" w:name="results"/>
+    <w:bookmarkStart w:id="31" w:name="results"/>
     <w:p>
       <w:pPr>
         <w:pStyle w:val="Heading2"/>
@@ -247,13 +486,363 @@
         <w:t xml:space="preserve">Results</w:t>
       </w:r>
     </w:p>
-    <w:bookmarkStart w:id="23" w:name="simulated-communities---overview"/>
+    <w:bookmarkStart w:id="23" w:name="description-of-simulated-communities"/>
     <w:p>
       <w:pPr>
         <w:pStyle w:val="Heading3"/>
       </w:pPr>
       <w:r>
-        <w:t xml:space="preserve">Simulated communities - Overview</w:t>
+        <w:t xml:space="preserve">Description of simulated communities</w:t>
+      </w:r>
+    </w:p>
+    <w:p>
+      <w:pPr>
+        <w:pStyle w:val="FirstParagraph"/>
+      </w:pPr>
+      <w:r>
+        <w:t xml:space="preserve">Martino made a git-based repository available on GitHub that includes the actual benchmarking code written in Python and the data used in their analysis (https://github.com/cameronmartino/deicode-benchmarking); the code and data from that repository are included in the repository for the current analysis (https://github.com/SchlossLab/Schloss_RPCA_XXXXXX_2024). To maintain a connection to the original simulations and implement a broader set of tests, several changes were necessary in the implementation of Martino’s code. First, because one goal of this study was to assess the impact of variation in sequencing effort on the performance of RPCA, I modified the parameters inputted to Martino’s code to produce more than the desired number of sequences per sample and then performed a single subsampling of the samples to 1,000, 2,000, 4,000, or 10,000 sequences per sample to have exactly the desired number of sequences per sample. Second, to account for the effect of the random number generator, instead of replicating each simulation condition only once as Martino did, I replicated each condition 10 or 100 times depending on the analysis. Third, Martino only considered the positive and negative controls with 4,000 sequences, my implementation of their simulations and subsequent tests incorporated the sequencing depths of 1,000, 2,000, and 10,000 that were used in the simulations with partially overlapping treatment groups. The regenerated heatmaps and principal coordinates analysis (PCoA) plots in</w:t>
+      </w:r>
+      <w:r>
+        <w:t xml:space="preserve"> </w:t>
+      </w:r>
+      <w:r>
+        <w:rPr>
+          <w:b/>
+          <w:bCs/>
+        </w:rPr>
+        <w:t xml:space="preserve">Figure 1</w:t>
+      </w:r>
+      <w:r>
+        <w:t xml:space="preserve"> </w:t>
+      </w:r>
+      <w:r>
+        <w:t xml:space="preserve">are qualitatively similar to those in Figure 3 of Martino. The most notable difference with Martino is that they inadvertently switched the labels of the axes and performed the OCLR transformation on features rather than samples (</w:t>
+      </w:r>
+      <w:r>
+        <w:rPr>
+          <w:b/>
+          <w:bCs/>
+        </w:rPr>
+        <w:t xml:space="preserve">Supplementary Text</w:t>
+      </w:r>
+      <w:r>
+        <w:t xml:space="preserve">). Replicating what Martino reported, the first two axes of the Bray-Curtis ordinations only explain a fraction of the total variation in the data while the RPCA ordinations explained all the variation. This was because RPCA is run by giving the algorithm a desired number of axes; in this case, 2 axes. The ratio of the fraction of the variation explained by the first two axes were similar between RPCA and PCoA with Bray-Curtis.</w:t>
+      </w:r>
+    </w:p>
+    <w:bookmarkEnd w:id="23"/>
+    <w:bookmarkStart w:id="24" w:name="X29bd8b525cf942fd3dbe5677167d8277d250525"/>
+    <w:p>
+      <w:pPr>
+        <w:pStyle w:val="Heading3"/>
+      </w:pPr>
+      <w:r>
+        <w:t xml:space="preserve">Comparison of simulated communities using PERMANOVA</w:t>
+      </w:r>
+    </w:p>
+    <w:p>
+      <w:pPr>
+        <w:pStyle w:val="FirstParagraph"/>
+      </w:pPr>
+      <w:r>
+        <w:t xml:space="preserve">Martino used the PERMANOVA F-statistic to compare the ability of RPCA to differentiate treatment groups when using raw counts and when removing zero values prior to calculating the CLR (RCLR). Using the partially overlapping treatment groups they found that the RCLR pretreatment yielded larger F-statistics than using raw counts. Repeating Martino’s PERMANOVA analysis, I replicated their results when using RPCA (</w:t>
+      </w:r>
+      <w:r>
+        <w:rPr>
+          <w:b/>
+          <w:bCs/>
+        </w:rPr>
+        <w:t xml:space="preserve">Figure 2</w:t>
+      </w:r>
+      <w:r>
+        <w:t xml:space="preserve">). However, by generating 10 replicate datasets (Martino only performed one), I was observed considerable variation across replicates for the F-statistics calculated using RPCA with raw counts. Unfortunately, Martino did not make any comparisons to other methods of calculating distances. Calculating Euclidean distance using other central log ratio and DeSeq2 transformations and Bray-Curtis distances using raw counts and CSS and SRS normalized data all resulted in small F-statistics. I suspected that the RPCA data generated relatively large F-statistics because the Euclidean distances calculated using RPCA was only done with the first two axes. This would have removed a considerable amount of variation that was embedded in the third and higher axes. The result would be elevated F-statistics. To test this hypothesis, I performed PCoA on Bray-Curtis distances, calculated Euclidean distances using the first two axes of the resulting PCoA, and subjected those distances to PERMANOVA (see</w:t>
+      </w:r>
+      <w:r>
+        <w:t xml:space="preserve"> </w:t>
+      </w:r>
+      <w:r>
+        <w:t xml:space="preserve">“</w:t>
+      </w:r>
+      <w:r>
+        <w:t xml:space="preserve">Bray-Curtis PCoA</w:t>
+      </w:r>
+      <w:r>
+        <w:t xml:space="preserve">”</w:t>
+      </w:r>
+      <w:r>
+        <w:t xml:space="preserve"> </w:t>
+      </w:r>
+      <w:r>
+        <w:t xml:space="preserve">data in the Euclidean distance section of</w:t>
+      </w:r>
+      <w:r>
+        <w:t xml:space="preserve"> </w:t>
+      </w:r>
+      <w:r>
+        <w:rPr>
+          <w:b/>
+          <w:bCs/>
+        </w:rPr>
+        <w:t xml:space="preserve">Figure2</w:t>
+      </w:r>
+      <w:r>
+        <w:t xml:space="preserve">). The calculated F-statistics were even larger than those generated by RPCA. This suggested that RPCA may make communities appear more similar than they are when differences are more pronounced in higher axes. Regardless of the relative scale of the F-statistics, the replicates for all approaches yielded significant p-values except for those generated using RPCA with raw counts.</w:t>
+      </w:r>
+    </w:p>
+    <w:bookmarkEnd w:id="24"/>
+    <w:bookmarkStart w:id="25" w:name="X6a0e02126e7ccffe5dc794c090e2115fb34838b"/>
+    <w:p>
+      <w:pPr>
+        <w:pStyle w:val="Heading3"/>
+      </w:pPr>
+      <w:r>
+        <w:t xml:space="preserve">Comparison of simulated communities using KNN Classification</w:t>
+      </w:r>
+    </w:p>
+    <w:p>
+      <w:pPr>
+        <w:pStyle w:val="FirstParagraph"/>
+      </w:pPr>
+      <w:r>
+        <w:t xml:space="preserve">In addition to comparing F-statistics from PERMANOVA, Martino used KNN classification to distinguish between the two partially overlapping treatment groups. Although Martino’s text indicated they used 40% of the samples in the training set and 60% in the testing set (i.e., a 40:60 cross validation split), their code indicates it was actually the opposite with 60% of the samples in the training set and the remaining in the testing set (</w:t>
+      </w:r>
+      <w:r>
+        <w:rPr>
+          <w:b/>
+          <w:bCs/>
+        </w:rPr>
+        <w:t xml:space="preserve">Supplemental Text</w:t>
+      </w:r>
+      <w:r>
+        <w:t xml:space="preserve">). To execute the KNN classification, Martino used the first two axes calculated from RPCA using raw counts and RCLR transformed data as the input to their KNN classification. Because I was interested in comparing other transformations and the use of Bray-Curtis distances, I wrote a KNN classification procedure that would allow me to input distance matrices. Furthermore, I replicated the 60-40 split 100 times for each of the 10 simulations reporting the median accuracy on the 40% testing data for each simulation. The original Martino data indicated that the accuracy of using raw counts with RPCA was near 0.5, indicating it did no better than randomly guessing. While the minimum values I observed across the 10 replicate simulations overlapped with these results, the median values were all better than random (</w:t>
+      </w:r>
+      <w:r>
+        <w:t xml:space="preserve">“</w:t>
+      </w:r>
+      <w:r>
+        <w:t xml:space="preserve">Raw + RPCA</w:t>
+      </w:r>
+      <w:r>
+        <w:t xml:space="preserve">”</w:t>
+      </w:r>
+      <w:r>
+        <w:t xml:space="preserve"> </w:t>
+      </w:r>
+      <w:r>
+        <w:t xml:space="preserve">in</w:t>
+      </w:r>
+      <w:r>
+        <w:t xml:space="preserve"> </w:t>
+      </w:r>
+      <w:r>
+        <w:rPr>
+          <w:b/>
+          <w:bCs/>
+        </w:rPr>
+        <w:t xml:space="preserve">Figure 2</w:t>
+      </w:r>
+      <w:r>
+        <w:t xml:space="preserve">). I replicated Martino’s result showing that using RCLR transformed counts as input to RPCA yielded higher accuracy than using raw counts.</w:t>
+      </w:r>
+    </w:p>
+    <w:p>
+      <w:pPr>
+        <w:pStyle w:val="BodyText"/>
+      </w:pPr>
+      <w:r>
+        <w:t xml:space="preserve">Next I sought to place the RPCA results in context with other methods. I genenerated Euclidean distance matrices using other central log ratio methods and DeSeq2. I also generated Bray-Curtis distance matrices using the raw counts and CSS and SRS Normalization. These methods all yielded similar results, likely because all of samples in the simulations had the same sequencing depth. Compared to these other approaches, RPCA was more sensitive to differences in sequencing depth. Although accuracy values across all methods were comparable at 4,000 and 10,000 sequences, the RPCA-based methods underperformed the others at 1,000 and 2,000 sequences.</w:t>
+      </w:r>
+    </w:p>
+    <w:p>
+      <w:pPr>
+        <w:pStyle w:val="BodyText"/>
+      </w:pPr>
+      <w:r>
+        <w:t xml:space="preserve">Martino did not report the classification accuracy for their positive and negative controls. As expected, the mean accuracy for classifying the treatment groups in the negative control model across each depth, transformation, and distance calculation was 0.50 (sd = 0.0085). Furthermore, the mean accuracy for classifying samples in the positive control was 0.99 (sd = 0.0086).</w:t>
+      </w:r>
+    </w:p>
+    <w:p>
+      <w:pPr>
+        <w:pStyle w:val="BodyText"/>
+      </w:pPr>
+      <w:r>
+        <w:t xml:space="preserve">Rather than using a training data set to identify an optimal number of neighbors (i.e., K), Martino used 13 neighbors. To assess whether the classification was sensitive to the number of neighbors, I split the 60% of samples in the training data into another 60-40 split to train and optimize the number of neighbors 1,000 times [</w:t>
+      </w:r>
+      <w:r>
+        <w:rPr>
+          <w:b/>
+          <w:bCs/>
+        </w:rPr>
+        <w:t xml:space="preserve">XXXXX</w:t>
+      </w:r>
+      <w:r>
+        <w:t xml:space="preserve">]. Across the various conditions, the median optimal number of neighbors was 33.00 (IQR=21.00 to 41.00). When I instead performed 1,000 80-20 splits on the full and training datasets, the median optimal number of neighbors was 58.00 (IQR=42.00 to 65.00). Regardless of finding that the optimal number of neighbors was consistently larger than the 13 that Martino used, the difference in accuracy values was only modestly better than the other fitting procedures when using 80-20 splits (</w:t>
+      </w:r>
+      <w:r>
+        <w:rPr>
+          <w:b/>
+          <w:bCs/>
+        </w:rPr>
+        <w:t xml:space="preserve">Figure S1</w:t>
+      </w:r>
+      <w:r>
+        <w:t xml:space="preserve">).</w:t>
+      </w:r>
+    </w:p>
+    <w:bookmarkEnd w:id="25"/>
+    <w:bookmarkStart w:id="26" w:name="Xb2acedad570e229b49bb29045ff8d51ff510536"/>
+    <w:p>
+      <w:pPr>
+        <w:pStyle w:val="Heading3"/>
+      </w:pPr>
+      <w:r>
+        <w:t xml:space="preserve">Comparing PERMANOVA and KNN Classification results with more similar treatment groups</w:t>
+      </w:r>
+    </w:p>
+    <w:p>
+      <w:pPr>
+        <w:pStyle w:val="FirstParagraph"/>
+      </w:pPr>
+      <w:r>
+        <w:t xml:space="preserve">Using the simulation where the treatment groups partially overlapped, the PERMANOVA analyses yielded significant P-values and KNN classification were effective at distinguishing between the groups for nearly all of the methods. Because it was not possible to easily differentiate between the methods, I created treatment groups that were more similar than those simulated by Martino. Unfortunately, in the process of modifying their code, I identified a number of incongruities between Martino’s written description and their code that limited my ability to reuse their code to simulate greater overlap between the treatment groups (</w:t>
+      </w:r>
+      <w:r>
+        <w:rPr>
+          <w:b/>
+          <w:bCs/>
+        </w:rPr>
+        <w:t xml:space="preserve">Supplemental Text</w:t>
+      </w:r>
+      <w:r>
+        <w:t xml:space="preserve">). These issues included: (i) samples rather than features were shared between treatment groups; (ii) among samples from the same treatment group, the relative abundance distributions for the features were uniform; (iii) the total number of individuals in the samples varied across the simulated datasets; (iv) the heteroscedastic source of noise was actually applied to all sample-feature combinations; (v) negative mean values were used when sampling normal distribution sampling functions when calculating the heteroscedastic noise; (vi) negative abundance values generated after applying the heteroscedastic noise were made positive; and (vii) setting the random number generator seed was unable to produce reproducible simulations. I rewrote the simulation code in the R programming language to correct these issues. To simulate a more nuanced difference in treatment groups, I increased the total number of features across all samples from 1,000 to 10,000 and set 12 features to be differentially abundant between the treatment groups; these values were selected to create conditions where approximately 50% of PERMANOVA tests using Bray-Curtis distances yielded P-values less than 0.05. Using the same number of features, I recreated negative and positive control simulations in which all features were shared or where the features were differentially represented between one of the two treatment groups. The resulting simulations provided more realistic benchmarking data than which was observed by Martino (</w:t>
+      </w:r>
+      <w:r>
+        <w:rPr>
+          <w:b/>
+          <w:bCs/>
+        </w:rPr>
+        <w:t xml:space="preserve">Figure 3</w:t>
+      </w:r>
+      <w:r>
+        <w:t xml:space="preserve">). The simulations were replicated 100 times to obtain greater precision in calculating the power to detect differences by PERMANOVA and the accuracy of KNN classification.</w:t>
+      </w:r>
+    </w:p>
+    <w:p>
+      <w:pPr>
+        <w:pStyle w:val="BodyText"/>
+      </w:pPr>
+      <w:r>
+        <w:t xml:space="preserve">Using the revised simulation data revealed a considerable difference in the PERMANOVA and KNN classification relative to the original simulation. Among the various methods, the RPCA-based methods performed the worst by both PERMANOVA and KNN classification (</w:t>
+      </w:r>
+      <w:r>
+        <w:rPr>
+          <w:b/>
+          <w:bCs/>
+        </w:rPr>
+        <w:t xml:space="preserve">Figure 4</w:t>
+      </w:r>
+      <w:r>
+        <w:t xml:space="preserve">). There was effectively no statistical power to detect differences using RPCA or to classify samples using KNN classification even at the largest sequencing depths. It was not possible to distinguish the performance between the various CLR and DeSeq2 methods using Euclidean distances or any of the methods when Bray-Curtis distances were calculated. Among these methods, the power to detect differences was routinely above 0.75 when 10,000 sequences were generated per sample. For these methods, there was a clear relationship between the number of sequences obtained from each sample and the observed power and accuracy. Similar to the earlier comparison of approaches for fitting the number of neighbors, the performance of KNN classification was modestly better using 80-20 splits with a grid-based search (</w:t>
+      </w:r>
+      <w:r>
+        <w:rPr>
+          <w:b/>
+          <w:bCs/>
+        </w:rPr>
+        <w:t xml:space="preserve">Figure S2</w:t>
+      </w:r>
+      <w:r>
+        <w:t xml:space="preserve">). From the revised simulations, it is evident that the performance of RCLR and RPCA was considerably worse than the other methods.</w:t>
+      </w:r>
+    </w:p>
+    <w:bookmarkEnd w:id="26"/>
+    <w:bookmarkStart w:id="27" w:name="description-of-case-study-datasets"/>
+    <w:p>
+      <w:pPr>
+        <w:pStyle w:val="Heading3"/>
+      </w:pPr>
+      <w:r>
+        <w:t xml:space="preserve">Description of case study datasets</w:t>
+      </w:r>
+    </w:p>
+    <w:p>
+      <w:pPr>
+        <w:pStyle w:val="FirstParagraph"/>
+      </w:pPr>
+      <w:r>
+        <w:t xml:space="preserve">After describing the results of their simulations, Martino and colleagues used two published datasets as case studies to evaluate RPCA and related methods. They evaluated RPCA relative to Bray-Curtis and weighted Unifrac distances using PERMANOVA, KNN, and ordinations. The two datasets were drawn from a natural study comparing healthy and stressed sponges [</w:t>
+      </w:r>
+      <w:r>
+        <w:rPr>
+          <w:b/>
+          <w:bCs/>
+        </w:rPr>
+        <w:t xml:space="preserve">XXXXX</w:t>
+      </w:r>
+      <w:r>
+        <w:t xml:space="preserve">] and from another study of a murine model of sleep apnea were mice were given air or intermittent hypoxia and hypercapnia (IHH) [</w:t>
+      </w:r>
+      <w:r>
+        <w:rPr>
+          <w:b/>
+          <w:bCs/>
+        </w:rPr>
+        <w:t xml:space="preserve">XXXXX</w:t>
+      </w:r>
+      <w:r>
+        <w:t xml:space="preserve">]. Both datasets were small. The sponge dataset had 133 healthy and 85 stressed samples and the sleep apnea dataset had 96 air treated and 93 IHH treated samples (</w:t>
+      </w:r>
+      <w:r>
+        <w:rPr>
+          <w:b/>
+          <w:bCs/>
+        </w:rPr>
+        <w:t xml:space="preserve">Figure 5</w:t>
+      </w:r>
+      <w:r>
+        <w:t xml:space="preserve">). The effect sizes for both studies were relatively large and could easily be differentiated by the first two PCoA axes. Similar to the results from the simulations, I wondered whether a difference was observed between the methods when there was a smaller effect size and when there was better control for differences in effect sizes. Therefore, I added a third dataset from a study that explored associations between the microbiome and colorectal cancer [</w:t>
+      </w:r>
+      <w:r>
+        <w:rPr>
+          <w:b/>
+          <w:bCs/>
+        </w:rPr>
+        <w:t xml:space="preserve">XXXXX</w:t>
+      </w:r>
+      <w:r>
+        <w:t xml:space="preserve">]. The differences between the two treatment groups were not so obvious by PCoA and there were more subjects. The colorectal cancer dataset included 261 subjects with healthy colons and 229 subjects with screen relevant colonic neoplasias (</w:t>
+      </w:r>
+      <w:r>
+        <w:rPr>
+          <w:b/>
+          <w:bCs/>
+        </w:rPr>
+        <w:t xml:space="preserve">Figure 5</w:t>
+      </w:r>
+      <w:r>
+        <w:t xml:space="preserve">). Sequences from the three datasets were processed in parallel using the same mothur-based sequence curation pipeline. After conducting an exhaustive review of the code they provided in their GitHub repository, I discovered several problems in the analysis that Martino and colleagues performed with the case study data. The details of this review can be found in the</w:t>
+      </w:r>
+      <w:r>
+        <w:t xml:space="preserve"> </w:t>
+      </w:r>
+      <w:r>
+        <w:rPr>
+          <w:b/>
+          <w:bCs/>
+        </w:rPr>
+        <w:t xml:space="preserve">Supplementary Text</w:t>
+      </w:r>
+      <w:r>
+        <w:t xml:space="preserve">. Solutions to the problems I identified are described below.</w:t>
+      </w:r>
+    </w:p>
+    <w:bookmarkEnd w:id="27"/>
+    <w:bookmarkStart w:id="28" w:name="X7884ee5a125db662529b6b4a02f6ef1a5ce97c0"/>
+    <w:p>
+      <w:pPr>
+        <w:pStyle w:val="Heading3"/>
+      </w:pPr>
+      <w:r>
+        <w:t xml:space="preserve">PERMANOVA analysis of case study datasets</w:t>
       </w:r>
     </w:p>
     <w:p>
@@ -262,10 +851,27 @@
           <w:ilvl w:val="0"/>
           <w:numId w:val="1001"/>
         </w:numPr>
+      </w:pPr>
+      <w:r>
+        <w:t xml:space="preserve">RPCA was compared to Bray-Curtis and weighted UniFrac distances</w:t>
+      </w:r>
+      <w:r>
+        <w:t xml:space="preserve"> </w:t>
+      </w:r>
+      <w:r>
+        <w:t xml:space="preserve">Analysis compared F statistics, which again are flawed, since so much noise was removed</w:t>
+      </w:r>
+    </w:p>
+    <w:p>
+      <w:pPr>
         <w:pStyle w:val="Compact"/>
-      </w:pPr>
-      <w:r>
-        <w:t xml:space="preserve">Used code for simulations found in the deicode benchmarking github repository</w:t>
+        <w:numPr>
+          <w:ilvl w:val="1"/>
+          <w:numId w:val="1002"/>
+        </w:numPr>
+      </w:pPr>
+      <w:r>
+        <w:t xml:space="preserve">Sleep Apnea data analysis used three axes rather than two like the Sponge dataset</w:t>
       </w:r>
     </w:p>
     <w:p>
@@ -274,448 +880,291 @@
           <w:ilvl w:val="0"/>
           <w:numId w:val="1001"/>
         </w:numPr>
+      </w:pPr>
+      <w:r>
+        <w:t xml:space="preserve">RPCA not able to detect differences in CRC dataset</w:t>
+      </w:r>
+    </w:p>
+    <w:p>
+      <w:pPr>
         <w:pStyle w:val="Compact"/>
-      </w:pPr>
-      <w:r>
-        <w:t xml:space="preserve">Describe simulations as indicated in paper</w:t>
-      </w:r>
-    </w:p>
-    <w:p>
-      <w:pPr>
-        <w:numPr>
-          <w:ilvl w:val="1"/>
-          <w:numId w:val="1002"/>
-        </w:numPr>
-        <w:pStyle w:val="Compact"/>
-      </w:pPr>
-      <w:r>
-        <w:t xml:space="preserve">Relative abundance of features described by following a normal distribution with mean and standard deviation determined by fitting data from a hand microbiome study</w:t>
-      </w:r>
-    </w:p>
-    <w:p>
-      <w:pPr>
-        <w:numPr>
-          <w:ilvl w:val="1"/>
-          <w:numId w:val="1002"/>
-        </w:numPr>
-        <w:pStyle w:val="Compact"/>
-      </w:pPr>
-      <w:r>
-        <w:t xml:space="preserve">Add random amount of noise to each relative abundance value</w:t>
-      </w:r>
-    </w:p>
-    <w:p>
-      <w:pPr>
-        <w:numPr>
-          <w:ilvl w:val="1"/>
-          <w:numId w:val="1002"/>
-        </w:numPr>
-        <w:pStyle w:val="Compact"/>
-      </w:pPr>
-      <w:r>
-        <w:t xml:space="preserve">Add random amount of noise to subset of relative abundance values</w:t>
-      </w:r>
-    </w:p>
-    <w:p>
-      <w:pPr>
-        <w:numPr>
-          <w:ilvl w:val="1"/>
-          <w:numId w:val="1002"/>
-        </w:numPr>
-        <w:pStyle w:val="Compact"/>
-      </w:pPr>
-      <w:r>
-        <w:t xml:space="preserve">Used Poisson-lognormal distribution to sample frequency of each feature in each sample to obtain overall desired level of sampling effort for each sample</w:t>
-      </w:r>
-    </w:p>
-    <w:p>
-      <w:pPr>
-        <w:numPr>
-          <w:ilvl w:val="0"/>
-          <w:numId w:val="1001"/>
-        </w:numPr>
-        <w:pStyle w:val="Compact"/>
-      </w:pPr>
-      <w:r>
-        <w:t xml:space="preserve">Found numerous problems with simulations as coded</w:t>
-      </w:r>
-    </w:p>
-    <w:p>
-      <w:pPr>
         <w:numPr>
           <w:ilvl w:val="1"/>
           <w:numId w:val="1003"/>
         </w:numPr>
+      </w:pPr>
+      <w:r>
+        <w:t xml:space="preserve">For BC and wU, euclidean distances were calculated from first two PCoA axes and used as input to PERMANOVA</w:t>
+      </w:r>
+    </w:p>
+    <w:p>
+      <w:pPr>
         <w:pStyle w:val="Compact"/>
-      </w:pPr>
-      <w:r>
-        <w:t xml:space="preserve">Only one replicate of each sequencing depth rather than 10 or 100</w:t>
-      </w:r>
-    </w:p>
-    <w:p>
-      <w:pPr>
         <w:numPr>
           <w:ilvl w:val="1"/>
           <w:numId w:val="1003"/>
         </w:numPr>
+      </w:pPr>
+      <w:r>
+        <w:t xml:space="preserve">when using RPCA all of the sequences in each sample were used but only 1,000 sequences per sample were used with the Bray-Curtis and weighted UniFrac distances (</w:t>
+      </w:r>
+      <w:r>
+        <w:rPr>
+          <w:b/>
+          <w:bCs/>
+        </w:rPr>
+        <w:t xml:space="preserve">Supplementary Text</w:t>
+      </w:r>
+      <w:r>
+        <w:t xml:space="preserve">).</w:t>
+      </w:r>
+    </w:p>
+    <w:bookmarkEnd w:id="28"/>
+    <w:bookmarkStart w:id="29" w:name="X89329465b068f28d56d02a6771da4ca182cbd3e"/>
+    <w:p>
+      <w:pPr>
+        <w:pStyle w:val="Heading3"/>
+      </w:pPr>
+      <w:r>
+        <w:t xml:space="preserve">KNN classification of case study datasets</w:t>
+      </w:r>
+    </w:p>
+    <w:p>
+      <w:pPr>
         <w:pStyle w:val="Compact"/>
-      </w:pPr>
-      <w:r>
-        <w:t xml:space="preserve">the axis labels in original heatmap (Fig 3DE) were switched</w:t>
-      </w:r>
-    </w:p>
-    <w:p>
-      <w:pPr>
-        <w:numPr>
-          <w:ilvl w:val="1"/>
-          <w:numId w:val="1003"/>
-        </w:numPr>
-        <w:pStyle w:val="Compact"/>
-      </w:pPr>
-      <w:r>
-        <w:t xml:space="preserve">Overlapped samples rather than features</w:t>
-      </w:r>
-    </w:p>
-    <w:p>
-      <w:pPr>
-        <w:numPr>
-          <w:ilvl w:val="1"/>
-          <w:numId w:val="1003"/>
-        </w:numPr>
-        <w:pStyle w:val="Compact"/>
-      </w:pPr>
-      <w:r>
-        <w:t xml:space="preserve">Variation in feature abundance was across samples rather than across features</w:t>
-      </w:r>
-    </w:p>
-    <w:p>
-      <w:pPr>
-        <w:numPr>
-          <w:ilvl w:val="1"/>
-          <w:numId w:val="1003"/>
-        </w:numPr>
-        <w:pStyle w:val="Compact"/>
-      </w:pPr>
-      <w:r>
-        <w:t xml:space="preserve">Homoscedastic and heteroscedastic variation and creating sparsity was screwed up - didn’t actually subsample, signs of negative values were removed</w:t>
-      </w:r>
-    </w:p>
-    <w:p>
-      <w:pPr>
         <w:numPr>
           <w:ilvl w:val="0"/>
-          <w:numId w:val="1001"/>
-        </w:numPr>
-        <w:pStyle w:val="Compact"/>
-      </w:pPr>
-      <w:r>
-        <w:t xml:space="preserve">Rewrote simulation code and analyzed original simulation data in parallel to revised data (except for PERMANOVA power analysis because it was not possible to get treatment groups to truly overlap with each other)</w:t>
-      </w:r>
-    </w:p>
-    <w:p>
-      <w:pPr>
-        <w:numPr>
-          <w:ilvl w:val="1"/>
           <w:numId w:val="1004"/>
         </w:numPr>
+      </w:pPr>
+      <w:r>
+        <w:t xml:space="preserve">Used 1st 2 axes of PCoA of Bray-Curtis distances to calculate euclidean distances, which were then fed into kNN. Why not use the original Bray-Curtis distance matrix?</w:t>
+      </w:r>
+      <w:r>
+        <w:t xml:space="preserve"> </w:t>
+      </w:r>
+    </w:p>
+    <w:p>
+      <w:pPr>
         <w:pStyle w:val="Compact"/>
-      </w:pPr>
-      <w:r>
-        <w:t xml:space="preserve">Simulated communitites had uneven sampling effort, increased sampling effort and then subsampled to correct depth</w:t>
-      </w:r>
-    </w:p>
-    <w:p>
-      <w:pPr>
         <w:numPr>
           <w:ilvl w:val="0"/>
-          <w:numId w:val="1001"/>
+          <w:numId w:val="1004"/>
         </w:numPr>
+      </w:pPr>
+      <w:r>
+        <w:t xml:space="preserve">I rewrote knn algorithm to use any distance matrix and to use 100 x 80:20 splits with search for optimal k value</w:t>
+      </w:r>
+    </w:p>
+    <w:p>
+      <w:pPr>
         <w:pStyle w:val="Compact"/>
-      </w:pPr>
-      <w:r>
-        <w:t xml:space="preserve">Qualitatively was able to reproduce the original results</w:t>
-      </w:r>
-    </w:p>
-    <w:bookmarkEnd w:id="23"/>
-    <w:bookmarkStart w:id="24" w:name="X7760e1757cabe5ee4c12a3c2b1e9d6ec07d1fc3"/>
+        <w:numPr>
+          <w:ilvl w:val="0"/>
+          <w:numId w:val="1004"/>
+        </w:numPr>
+      </w:pPr>
+      <w:r>
+        <w:t xml:space="preserve">Bray-Curtis was similar to better than RPCA for each dataset; other compositional methods performed at least as well as RPCA and better than Bray-Curtis for Sleep Apnea dataset</w:t>
+      </w:r>
+    </w:p>
+    <w:bookmarkEnd w:id="29"/>
+    <w:bookmarkStart w:id="30" w:name="Xf0954c2286c6531201863608c794bbea5b44ece"/>
     <w:p>
       <w:pPr>
         <w:pStyle w:val="Heading3"/>
       </w:pPr>
       <w:r>
-        <w:t xml:space="preserve">Simulated communities - PERMANOVA analysis</w:t>
-      </w:r>
-    </w:p>
-    <w:p>
-      <w:pPr>
+        <w:t xml:space="preserve">Sampling depth experiment with simulated and experimental data</w:t>
+      </w:r>
+    </w:p>
+    <w:p>
+      <w:pPr>
+        <w:pStyle w:val="Compact"/>
         <w:numPr>
           <w:ilvl w:val="0"/>
           <w:numId w:val="1005"/>
         </w:numPr>
+      </w:pPr>
+      <w:r>
+        <w:t xml:space="preserve">Buried in M&amp;M was the description of an analysis and its results where Martino et al. compared the clustering of samples in an ordination where samples were duplicated and subsampled to 500 and 100 sequences per sample. They calculated distances using Jaccard, Bray-Curtis, and RPCA. They found that</w:t>
+      </w:r>
+      <w:r>
+        <w:t xml:space="preserve"> </w:t>
+      </w:r>
+      <w:r>
+        <w:t xml:space="preserve">“</w:t>
+      </w:r>
+      <w:r>
+        <w:t xml:space="preserve">RPCA alleviated the clustering by sequencing depth both qualitatively and quantitatively</w:t>
+      </w:r>
+      <w:r>
+        <w:t xml:space="preserve">”</w:t>
+      </w:r>
+    </w:p>
+    <w:p>
+      <w:pPr>
         <w:pStyle w:val="Compact"/>
-      </w:pPr>
-      <w:r>
-        <w:t xml:space="preserve">Used PERMANOVA F-statistic rather than p-values (why?!), likely because even MatrixCompletionon raw counts was was significant</w:t>
-      </w:r>
-    </w:p>
-    <w:p>
-      <w:pPr>
+        <w:numPr>
+          <w:ilvl w:val="1"/>
+          <w:numId w:val="1006"/>
+        </w:numPr>
+      </w:pPr>
+      <w:r>
+        <w:t xml:space="preserve">The ordinations still showed clustering by sampling depth</w:t>
+      </w:r>
+    </w:p>
+    <w:p>
+      <w:pPr>
+        <w:pStyle w:val="Compact"/>
+        <w:numPr>
+          <w:ilvl w:val="1"/>
+          <w:numId w:val="1006"/>
+        </w:numPr>
+      </w:pPr>
+      <w:r>
+        <w:t xml:space="preserve">The Jaccard and Bray-Curtis distances were not calculated using rarefaction.</w:t>
+      </w:r>
+    </w:p>
+    <w:p>
+      <w:pPr>
+        <w:pStyle w:val="Compact"/>
         <w:numPr>
           <w:ilvl w:val="0"/>
           <w:numId w:val="1005"/>
         </w:numPr>
+      </w:pPr>
+      <w:r>
+        <w:t xml:space="preserve">Repeated analysis withe the simulated and experimental data by using 5000 and 10000 sequences per sample</w:t>
+      </w:r>
+    </w:p>
+    <w:p>
+      <w:pPr>
         <w:pStyle w:val="Compact"/>
-      </w:pPr>
-      <w:r>
-        <w:t xml:space="preserve">Using rclr transformed data outperformed raw data when followed by matrix completion</w:t>
-      </w:r>
-    </w:p>
-    <w:p>
-      <w:pPr>
         <w:numPr>
           <w:ilvl w:val="0"/>
           <w:numId w:val="1005"/>
         </w:numPr>
+      </w:pPr>
+      <w:r>
+        <w:t xml:space="preserve">Analyzed distances usign PERMANOVA accounting for sampling depth -&gt; Rarefaction was only method that could reliably control for the uneven sampling effort</w:t>
+      </w:r>
+    </w:p>
+    <w:bookmarkEnd w:id="30"/>
+    <w:bookmarkEnd w:id="31"/>
+    <w:bookmarkStart w:id="32" w:name="discussion"/>
+    <w:p>
+      <w:pPr>
+        <w:pStyle w:val="Heading2"/>
+      </w:pPr>
+      <w:r>
+        <w:t xml:space="preserve">Discussion</w:t>
+      </w:r>
+    </w:p>
+    <w:p>
+      <w:pPr>
         <w:pStyle w:val="Compact"/>
-      </w:pPr>
-      <w:r>
-        <w:t xml:space="preserve">F statistic values were inflated because they only used 2 dimensions, which artificailly cut out a lot of noise that would bring down the F statistic values</w:t>
-      </w:r>
-    </w:p>
-    <w:p>
-      <w:pPr>
-        <w:numPr>
-          <w:ilvl w:val="0"/>
-          <w:numId w:val="1005"/>
-        </w:numPr>
-        <w:pStyle w:val="Compact"/>
-      </w:pPr>
-      <w:r>
-        <w:t xml:space="preserve">Investigators compared results using overlapped community and found RPCA outperformed MatrixCompletion; didn’t compare to Bray-Curtis, rarefaction, other compositional methods</w:t>
-      </w:r>
-    </w:p>
-    <w:p>
-      <w:pPr>
-        <w:numPr>
-          <w:ilvl w:val="0"/>
-          <w:numId w:val="1005"/>
-        </w:numPr>
-        <w:pStyle w:val="Compact"/>
-      </w:pPr>
-      <w:r>
-        <w:t xml:space="preserve">Noted that they did not include other relevant comparisons such as using relative abundance, other compositional transformations, rarefaction, subsampling, etc. Expande workflow pipeline to include these other methods</w:t>
-      </w:r>
-    </w:p>
-    <w:p>
-      <w:pPr>
-        <w:numPr>
-          <w:ilvl w:val="0"/>
-          <w:numId w:val="1005"/>
-        </w:numPr>
-        <w:pStyle w:val="Compact"/>
-      </w:pPr>
-      <w:r>
-        <w:t xml:space="preserve">Found numerous problems with simulations</w:t>
-      </w:r>
-    </w:p>
-    <w:p>
-      <w:pPr>
-        <w:numPr>
-          <w:ilvl w:val="1"/>
-          <w:numId w:val="1006"/>
-        </w:numPr>
-        <w:pStyle w:val="Compact"/>
-      </w:pPr>
-      <w:r>
-        <w:t xml:space="preserve">Desired to increase number of replicate datasets from 10 to 100 to test statistical power</w:t>
-      </w:r>
-    </w:p>
-    <w:p>
-      <w:pPr>
-        <w:numPr>
-          <w:ilvl w:val="0"/>
-          <w:numId w:val="1005"/>
-        </w:numPr>
-        <w:pStyle w:val="Compact"/>
-      </w:pPr>
-      <w:r>
-        <w:t xml:space="preserve">Rewrote simulation code and selected a level of overlap and a total number of features so that approximately 50% of tests using 4000 sequences would have been significant when using rarefaction</w:t>
-      </w:r>
-    </w:p>
-    <w:p>
-      <w:pPr>
-        <w:numPr>
-          <w:ilvl w:val="0"/>
-          <w:numId w:val="1005"/>
-        </w:numPr>
-        <w:pStyle w:val="Compact"/>
-      </w:pPr>
-      <w:r>
-        <w:t xml:space="preserve">Bray-Curtis and OCLR did as well as each other; much better than RPCA and other methods</w:t>
-      </w:r>
-    </w:p>
-    <w:p>
-      <w:pPr>
-        <w:numPr>
-          <w:ilvl w:val="0"/>
-          <w:numId w:val="1005"/>
-        </w:numPr>
-        <w:pStyle w:val="Compact"/>
-      </w:pPr>
-      <w:r>
-        <w:t xml:space="preserve">Researchers used balanced designs with varying number of samples per treatment group. Unnecessary other than to show the change in power with sampling effort. Likely done because knn analysis is sensitive to uneven smapling effort. Regardless, the results did not change</w:t>
-      </w:r>
-    </w:p>
-    <w:bookmarkEnd w:id="24"/>
-    <w:bookmarkStart w:id="25" w:name="simulated-communities---knn-analysis"/>
-    <w:p>
-      <w:pPr>
-        <w:pStyle w:val="Heading3"/>
-      </w:pPr>
-      <w:r>
-        <w:t xml:space="preserve">Simulated communities - KNN analysis</w:t>
-      </w:r>
-    </w:p>
-    <w:p>
-      <w:pPr>
         <w:numPr>
           <w:ilvl w:val="0"/>
           <w:numId w:val="1007"/>
         </w:numPr>
+      </w:pPr>
+      <w:r>
+        <w:t xml:space="preserve">Overall method problems</w:t>
+      </w:r>
+    </w:p>
+    <w:p>
+      <w:pPr>
         <w:pStyle w:val="Compact"/>
-      </w:pPr>
-      <w:r>
-        <w:t xml:space="preserve">Unaware of researchers who have used KNN to differentiate communities. Far more likely that they would use PERMANOVA or another machine learning technique like logistic regresssion or random forest.</w:t>
-      </w:r>
-    </w:p>
-    <w:p>
-      <w:pPr>
+        <w:numPr>
+          <w:ilvl w:val="1"/>
+          <w:numId w:val="1008"/>
+        </w:numPr>
+      </w:pPr>
+      <w:r>
+        <w:t xml:space="preserve">Choice of number of partitions/axes seems arbitrary/no guidance. Controls and sponges used 2, sleep apnea used 3. Default is 3</w:t>
+      </w:r>
+    </w:p>
+    <w:p>
+      <w:pPr>
+        <w:pStyle w:val="Compact"/>
+        <w:numPr>
+          <w:ilvl w:val="1"/>
+          <w:numId w:val="1008"/>
+        </w:numPr>
+      </w:pPr>
+      <w:r>
+        <w:t xml:space="preserve">auto_rpca available within recent implementation but has since been deprecated</w:t>
+      </w:r>
+    </w:p>
+    <w:p>
+      <w:pPr>
+        <w:pStyle w:val="Compact"/>
+        <w:numPr>
+          <w:ilvl w:val="1"/>
+          <w:numId w:val="1008"/>
+        </w:numPr>
+      </w:pPr>
+      <w:r>
+        <w:t xml:space="preserve">Authors acknowledged that RPCA doesn’t work on time series datasets</w:t>
+      </w:r>
+    </w:p>
+    <w:p>
+      <w:pPr>
+        <w:pStyle w:val="Compact"/>
         <w:numPr>
           <w:ilvl w:val="0"/>
           <w:numId w:val="1007"/>
         </w:numPr>
+      </w:pPr>
+      <w:r>
+        <w:t xml:space="preserve">Benchmarking should use methods that are commonly used in the field. KNN was interesting, but not relevant. Who is using raw with matrix completion?</w:t>
+      </w:r>
+    </w:p>
+    <w:p>
+      <w:pPr>
         <w:pStyle w:val="Compact"/>
-      </w:pPr>
-      <w:r>
-        <w:t xml:space="preserve">Problems with analysis</w:t>
-      </w:r>
-    </w:p>
-    <w:p>
-      <w:pPr>
-        <w:numPr>
-          <w:ilvl w:val="1"/>
-          <w:numId w:val="1008"/>
-        </w:numPr>
-        <w:pStyle w:val="Compact"/>
-      </w:pPr>
-      <w:r>
-        <w:t xml:space="preserve">Only generated one simulation for each sequencing depth - would have done 10 to test sensitivity on RNG seed</w:t>
-      </w:r>
-    </w:p>
-    <w:p>
-      <w:pPr>
-        <w:numPr>
-          <w:ilvl w:val="1"/>
-          <w:numId w:val="1008"/>
-        </w:numPr>
-        <w:pStyle w:val="Compact"/>
-      </w:pPr>
-      <w:r>
-        <w:t xml:space="preserve">Did not run knn on negative and positive control samples - included all three simulation datasets</w:t>
-      </w:r>
-    </w:p>
-    <w:p>
-      <w:pPr>
-        <w:numPr>
-          <w:ilvl w:val="1"/>
-          <w:numId w:val="1008"/>
-        </w:numPr>
-        <w:pStyle w:val="Compact"/>
-      </w:pPr>
-      <w:r>
-        <w:t xml:space="preserve">Said they did 40:60 training-testing splits, but actually did 60:40 training-testing splits - would have prefered 80:20 training-testing splits</w:t>
-      </w:r>
-    </w:p>
-    <w:p>
-      <w:pPr>
-        <w:numPr>
-          <w:ilvl w:val="1"/>
-          <w:numId w:val="1008"/>
-        </w:numPr>
-        <w:pStyle w:val="Compact"/>
-      </w:pPr>
-      <w:r>
-        <w:t xml:space="preserve">Used a single seed per simulation replicate - modified to use 100 seeds to generate 100 80:20 splits (did they say they used 1 or 10; pretty sure code only was for 1 iteration)</w:t>
-      </w:r>
-    </w:p>
-    <w:p>
-      <w:pPr>
-        <w:numPr>
-          <w:ilvl w:val="1"/>
-          <w:numId w:val="1008"/>
-        </w:numPr>
-        <w:pStyle w:val="Compact"/>
-      </w:pPr>
-      <w:r>
-        <w:t xml:space="preserve">Hard coded k value - would have preferred to use a variety of values in the training with the optimal value selected for the testing phase</w:t>
-      </w:r>
-    </w:p>
-    <w:p>
-      <w:pPr>
-        <w:numPr>
-          <w:ilvl w:val="1"/>
-          <w:numId w:val="1008"/>
-        </w:numPr>
-        <w:pStyle w:val="Compact"/>
-      </w:pPr>
-      <w:r>
-        <w:t xml:space="preserve">Only used raw and rclr transformed data as input to matrix completion followed by PCA and used that as input to kNN. Later, they used weighted UniFrac and Bray-Curtis ordinations to generate distances - would have preferred to use the distances themselves as input</w:t>
-      </w:r>
-    </w:p>
-    <w:p>
-      <w:pPr>
         <w:numPr>
           <w:ilvl w:val="0"/>
           <w:numId w:val="1007"/>
         </w:numPr>
+      </w:pPr>
+      <w:r>
+        <w:t xml:space="preserve">Statistical modeling approach is appealing for building communities and treatment groups and nicely complements results found using simulations based on observed sequencing counts and sequencing depths</w:t>
+      </w:r>
+    </w:p>
+    <w:p>
+      <w:pPr>
         <w:pStyle w:val="Compact"/>
-      </w:pPr>
-      <w:r>
-        <w:t xml:space="preserve">Regardless of how the training-testing splits were generated or whether their simulated data or mine were used rarefaction performed as well or better than all other methods, including RPCA.</w:t>
-      </w:r>
-    </w:p>
-    <w:p>
-      <w:pPr>
         <w:numPr>
           <w:ilvl w:val="0"/>
           <w:numId w:val="1007"/>
         </w:numPr>
+      </w:pPr>
+      <w:r>
+        <w:t xml:space="preserve">Comment on problematic coding practices</w:t>
+      </w:r>
+    </w:p>
+    <w:p>
+      <w:pPr>
         <w:pStyle w:val="Compact"/>
-      </w:pPr>
-      <w:r>
-        <w:t xml:space="preserve">Across the board, as shown in original paper, the classification accuracy increased with sampling effort</w:t>
-      </w:r>
-    </w:p>
-    <w:p>
-      <w:pPr>
         <w:numPr>
           <w:ilvl w:val="0"/>
           <w:numId w:val="1007"/>
         </w:numPr>
-        <w:pStyle w:val="Compact"/>
-      </w:pPr>
-      <w:r>
-        <w:t xml:space="preserve">Median k values were…</w:t>
-      </w:r>
-    </w:p>
-    <w:bookmarkEnd w:id="25"/>
-    <w:bookmarkStart w:id="26" w:name="experimental-data---overview"/>
-    <w:p>
-      <w:pPr>
-        <w:pStyle w:val="Heading3"/>
-      </w:pPr>
-      <w:r>
-        <w:t xml:space="preserve">Experimental data - Overview</w:t>
+      </w:pPr>
+      <w:r>
+        <w:t xml:space="preserve">Use rarefaction</w:t>
+      </w:r>
+    </w:p>
+    <w:bookmarkEnd w:id="32"/>
+    <w:bookmarkStart w:id="33" w:name="materials-methods"/>
+    <w:p>
+      <w:pPr>
+        <w:pStyle w:val="Heading2"/>
+      </w:pPr>
+      <w:r>
+        <w:t xml:space="preserve">Materials &amp; Methods</w:t>
       </w:r>
     </w:p>
     <w:p>
@@ -724,34 +1173,43 @@
           <w:ilvl w:val="0"/>
           <w:numId w:val="1009"/>
         </w:numPr>
+      </w:pPr>
+      <w:r>
+        <w:t xml:space="preserve">Deicode benchmarking data and code</w:t>
+      </w:r>
+    </w:p>
+    <w:p>
+      <w:pPr>
+        <w:numPr>
+          <w:ilvl w:val="0"/>
+          <w:numId w:val="1009"/>
+        </w:numPr>
+      </w:pPr>
+      <w:r>
+        <w:t xml:space="preserve">KNN analysis</w:t>
+      </w:r>
+    </w:p>
+    <w:p>
+      <w:pPr>
+        <w:numPr>
+          <w:ilvl w:val="0"/>
+          <w:numId w:val="1009"/>
+        </w:numPr>
+      </w:pPr>
+      <w:r>
+        <w:t xml:space="preserve">Description of Sampling depth experiment</w:t>
+      </w:r>
+    </w:p>
+    <w:p>
+      <w:pPr>
         <w:pStyle w:val="Compact"/>
-      </w:pPr>
-      <w:r>
-        <w:t xml:space="preserve">Picked case studies with large effect sizes that were easily seen on PCoA/PCA; most microbiome studies are not so easy to differentiate</w:t>
-      </w:r>
-    </w:p>
-    <w:p>
-      <w:pPr>
         <w:numPr>
           <w:ilvl w:val="1"/>
           <w:numId w:val="1010"/>
         </w:numPr>
-        <w:pStyle w:val="Compact"/>
-      </w:pPr>
-      <w:r>
-        <w:t xml:space="preserve">Sleep apnea and sponge datasets - relatively small and had treatment groups that were highly distinct</w:t>
-      </w:r>
-    </w:p>
-    <w:p>
-      <w:pPr>
-        <w:numPr>
-          <w:ilvl w:val="1"/>
-          <w:numId w:val="1010"/>
-        </w:numPr>
-        <w:pStyle w:val="Compact"/>
-      </w:pPr>
-      <w:r>
-        <w:t xml:space="preserve">I added a third dataset - CRC, which was larger and had treatment groups that were more similar to each other</w:t>
+      </w:pPr>
+      <w:r>
+        <w:t xml:space="preserve">adonis2 model</w:t>
       </w:r>
     </w:p>
     <w:p>
@@ -760,461 +1218,633 @@
           <w:ilvl w:val="0"/>
           <w:numId w:val="1009"/>
         </w:numPr>
+      </w:pPr>
+      <w:r>
+        <w:t xml:space="preserve">Workflow</w:t>
+      </w:r>
+    </w:p>
+    <w:p>
+      <w:pPr>
         <w:pStyle w:val="Compact"/>
-      </w:pPr>
-      <w:r>
-        <w:t xml:space="preserve">All sequences were used for RPCA; only 1000 sequences per sample were used for Bray-Curtis and WUniFrac</w:t>
-      </w:r>
-    </w:p>
-    <w:bookmarkEnd w:id="26"/>
-    <w:bookmarkStart w:id="27" w:name="experimental-data---permanova-analysis"/>
-    <w:p>
-      <w:pPr>
-        <w:pStyle w:val="Heading3"/>
-      </w:pPr>
-      <w:r>
-        <w:t xml:space="preserve">Experimental data - PERMANOVA analysis</w:t>
-      </w:r>
-    </w:p>
-    <w:p>
-      <w:pPr>
+        <w:numPr>
+          <w:ilvl w:val="1"/>
+          <w:numId w:val="1011"/>
+        </w:numPr>
+      </w:pPr>
+      <w:r>
+        <w:t xml:space="preserve">Snakemake</w:t>
+      </w:r>
+    </w:p>
+    <w:p>
+      <w:pPr>
+        <w:pStyle w:val="Compact"/>
+        <w:numPr>
+          <w:ilvl w:val="1"/>
+          <w:numId w:val="1011"/>
+        </w:numPr>
+      </w:pPr>
+      <w:r>
+        <w:t xml:space="preserve">Conda - Software versions</w:t>
+      </w:r>
+    </w:p>
+    <w:p>
+      <w:pPr>
+        <w:pStyle w:val="Compact"/>
+        <w:numPr>
+          <w:ilvl w:val="1"/>
+          <w:numId w:val="1011"/>
+        </w:numPr>
+      </w:pPr>
+      <w:r>
+        <w:t xml:space="preserve">GitHub</w:t>
+      </w:r>
+    </w:p>
+    <w:bookmarkEnd w:id="33"/>
+    <w:bookmarkStart w:id="34" w:name="acknowledgements"/>
+    <w:p>
+      <w:pPr>
+        <w:pStyle w:val="Heading2"/>
+      </w:pPr>
+      <w:r>
+        <w:t xml:space="preserve">Acknowledgements</w:t>
+      </w:r>
+    </w:p>
+    <w:p>
+      <w:pPr>
+        <w:pStyle w:val="Compact"/>
         <w:numPr>
           <w:ilvl w:val="0"/>
-          <w:numId w:val="1011"/>
-        </w:numPr>
-        <w:pStyle w:val="Compact"/>
-      </w:pPr>
-      <w:r>
-        <w:t xml:space="preserve">RPCA was compared to Bray-Curtis and weighted UniFrac distances</w:t>
-      </w:r>
-    </w:p>
-    <w:p>
-      <w:pPr>
-        <w:numPr>
-          <w:ilvl w:val="1"/>
           <w:numId w:val="1012"/>
         </w:numPr>
+      </w:pPr>
+      <w:r>
+        <w:t xml:space="preserve">Thanks for making code publicly accessible!</w:t>
+      </w:r>
+    </w:p>
+    <w:p>
+      <w:pPr>
         <w:pStyle w:val="Compact"/>
-      </w:pPr>
-      <w:r>
-        <w:t xml:space="preserve">For BC and wU, euclidean distances were calculated from first two PCoA axes and used as input to PERMANOVA (</w:t>
-      </w:r>
-      <w:r>
-        <w:rPr>
-          <w:bCs/>
-          <w:b/>
-        </w:rPr>
-        <w:t xml:space="preserve">confirm?</w:t>
-      </w:r>
-      <w:r>
-        <w:t xml:space="preserve">). Analysis compared F statistics, which again are flawed, since so much noise was removed</w:t>
-      </w:r>
-    </w:p>
-    <w:p>
-      <w:pPr>
         <w:numPr>
-          <w:ilvl w:val="1"/>
+          <w:ilvl w:val="0"/>
           <w:numId w:val="1012"/>
         </w:numPr>
-        <w:pStyle w:val="Compact"/>
-      </w:pPr>
-      <w:r>
-        <w:t xml:space="preserve">Sleep Apnea data analysis used three axes rather than two like the Sponge dataset</w:t>
-      </w:r>
-    </w:p>
-    <w:p>
-      <w:pPr>
-        <w:numPr>
-          <w:ilvl w:val="0"/>
-          <w:numId w:val="1011"/>
-        </w:numPr>
-        <w:pStyle w:val="Compact"/>
-      </w:pPr>
-      <w:r>
-        <w:t xml:space="preserve">RPCA not able to detect differences in CRC dataset</w:t>
-      </w:r>
-    </w:p>
-    <w:bookmarkEnd w:id="27"/>
-    <w:bookmarkStart w:id="28" w:name="experimental-data---knn-analysis"/>
-    <w:p>
-      <w:pPr>
-        <w:pStyle w:val="Heading3"/>
-      </w:pPr>
-      <w:r>
-        <w:t xml:space="preserve">Experimental data - KNN analysis</w:t>
-      </w:r>
-    </w:p>
-    <w:p>
-      <w:pPr>
-        <w:numPr>
-          <w:ilvl w:val="0"/>
-          <w:numId w:val="1013"/>
-        </w:numPr>
-        <w:pStyle w:val="Compact"/>
-      </w:pPr>
-      <w:r>
-        <w:t xml:space="preserve">Used 1st 2 axes of PCoA of Bray-Curtis distances to calcualte euclidean distances, which were then fed into kNN. Why not use the original Bray-Curtis distance matrix?</w:t>
-      </w:r>
-    </w:p>
-    <w:p>
-      <w:pPr>
-        <w:numPr>
-          <w:ilvl w:val="1"/>
-          <w:numId w:val="1014"/>
-        </w:numPr>
-        <w:pStyle w:val="Compact"/>
-      </w:pPr>
-      <w:r>
-        <w:t xml:space="preserve">1 60:40 split (said 10-fold, but repeated the same split 10 times)</w:t>
-      </w:r>
-    </w:p>
-    <w:p>
-      <w:pPr>
-        <w:numPr>
-          <w:ilvl w:val="1"/>
-          <w:numId w:val="1014"/>
-        </w:numPr>
-        <w:pStyle w:val="Compact"/>
-      </w:pPr>
-      <w:r>
-        <w:t xml:space="preserve">did not fit hyperparameter: choice for k in case studies was messed up, in some cases using a fraction of the number of columns in the metadata file</w:t>
-      </w:r>
-    </w:p>
-    <w:p>
-      <w:pPr>
-        <w:numPr>
-          <w:ilvl w:val="0"/>
-          <w:numId w:val="1013"/>
-        </w:numPr>
-        <w:pStyle w:val="Compact"/>
-      </w:pPr>
-      <w:r>
-        <w:t xml:space="preserve">I rewrote knn algorithm to use any distance matrix and to use 100 x 80:20 splits with search for optimal k value</w:t>
-      </w:r>
-    </w:p>
-    <w:p>
-      <w:pPr>
-        <w:numPr>
-          <w:ilvl w:val="0"/>
-          <w:numId w:val="1013"/>
-        </w:numPr>
-        <w:pStyle w:val="Compact"/>
-      </w:pPr>
-      <w:r>
-        <w:t xml:space="preserve">Bray-Curtis was similar to better than RPCA for each dataset; other compositional methods performed at least as well as RPCA and better than Bray-Curtis for Sleep Apnea dataset</w:t>
-      </w:r>
-    </w:p>
-    <w:bookmarkEnd w:id="28"/>
-    <w:bookmarkStart w:id="29" w:name="Xf0954c2286c6531201863608c794bbea5b44ece"/>
-    <w:p>
-      <w:pPr>
-        <w:pStyle w:val="Heading3"/>
-      </w:pPr>
-      <w:r>
-        <w:t xml:space="preserve">Sampling depth experiment with simulated and experimental data</w:t>
-      </w:r>
-    </w:p>
-    <w:p>
-      <w:pPr>
-        <w:numPr>
-          <w:ilvl w:val="0"/>
-          <w:numId w:val="1015"/>
-        </w:numPr>
-        <w:pStyle w:val="Compact"/>
-      </w:pPr>
-      <w:r>
-        <w:t xml:space="preserve">Buried in M&amp;M was the description of an analysis and its results where Martino et al. compared the clustering of samples in an ordination where samples were duplicated and subsampled to 500 and 100 sequences per sample. They calculated distances using Jaccard, Bray-Curtis, and RPCA. They found that</w:t>
+      </w:pPr>
+      <w:r>
+        <w:t xml:space="preserve">Funding agencies</w:t>
+      </w:r>
+    </w:p>
+    <w:p>
+      <w:r>
+        <w:br w:type="page"/>
+      </w:r>
+    </w:p>
+    <w:bookmarkEnd w:id="34"/>
+    <w:bookmarkStart w:id="55" w:name="references"/>
+    <w:p>
+      <w:pPr>
+        <w:pStyle w:val="Heading2"/>
+      </w:pPr>
+      <w:r>
+        <w:t xml:space="preserve">References</w:t>
+      </w:r>
+    </w:p>
+    <w:bookmarkStart w:id="39" w:name="refs"/>
+    <w:bookmarkStart w:id="36" w:name="ref-Schloss2024a"/>
+    <w:p>
+      <w:pPr>
+        <w:pStyle w:val="Bibliography"/>
+      </w:pPr>
+      <w:r>
+        <w:t xml:space="preserve">1.</w:t>
       </w:r>
       <w:r>
         <w:t xml:space="preserve"> </w:t>
       </w:r>
       <w:r>
-        <w:t xml:space="preserve">“</w:t>
-      </w:r>
-      <w:r>
-        <w:t xml:space="preserve">RPCA alleviated the clustering by sequencing depth both qualitatively and quantitatively</w:t>
-      </w:r>
-      <w:r>
-        <w:t xml:space="preserve">”</w:t>
-      </w:r>
-    </w:p>
-    <w:p>
-      <w:pPr>
-        <w:numPr>
-          <w:ilvl w:val="1"/>
-          <w:numId w:val="1016"/>
-        </w:numPr>
-        <w:pStyle w:val="Compact"/>
-      </w:pPr>
-      <w:r>
-        <w:t xml:space="preserve">The ordinations still showed clustering by sampling depth</w:t>
-      </w:r>
-    </w:p>
-    <w:p>
-      <w:pPr>
-        <w:numPr>
-          <w:ilvl w:val="1"/>
-          <w:numId w:val="1016"/>
-        </w:numPr>
-        <w:pStyle w:val="Compact"/>
-      </w:pPr>
-      <w:r>
-        <w:t xml:space="preserve">The Jaccard and Bray-Curtis distances were not calculated using rarefaction.</w:t>
-      </w:r>
-    </w:p>
-    <w:p>
-      <w:pPr>
-        <w:numPr>
-          <w:ilvl w:val="0"/>
-          <w:numId w:val="1015"/>
-        </w:numPr>
-        <w:pStyle w:val="Compact"/>
-      </w:pPr>
-      <w:r>
-        <w:t xml:space="preserve">Repeated analysis withe the simulated and experimental data by using 5000 and 10000 sequences per sample</w:t>
-      </w:r>
-    </w:p>
-    <w:p>
-      <w:pPr>
-        <w:numPr>
-          <w:ilvl w:val="0"/>
-          <w:numId w:val="1015"/>
-        </w:numPr>
-        <w:pStyle w:val="Compact"/>
-      </w:pPr>
-      <w:r>
-        <w:t xml:space="preserve">Analyzed distances usign PERMANOVA accounting for sampling depth -&gt; Rarefaction was only method that could reliably control for the uneven sampling effort</w:t>
-      </w:r>
-    </w:p>
-    <w:bookmarkEnd w:id="29"/>
-    <w:bookmarkEnd w:id="30"/>
-    <w:bookmarkStart w:id="31" w:name="discussion"/>
+        <w:t xml:space="preserve">	</w:t>
+      </w:r>
+      <w:r>
+        <w:rPr>
+          <w:b/>
+          <w:bCs/>
+        </w:rPr>
+        <w:t xml:space="preserve">Schloss PD</w:t>
+      </w:r>
+      <w:r>
+        <w:t xml:space="preserve">. 2024. Waste not, want not: Revisiting the analysis that called into question the practice of rarefaction. mSphere</w:t>
+      </w:r>
+      <w:r>
+        <w:t xml:space="preserve"> </w:t>
+      </w:r>
+      <w:r>
+        <w:rPr>
+          <w:b/>
+          <w:bCs/>
+        </w:rPr>
+        <w:t xml:space="preserve">9</w:t>
+      </w:r>
+      <w:r>
+        <w:t xml:space="preserve">. doi:</w:t>
+      </w:r>
+      <w:hyperlink r:id="rId35">
+        <w:r>
+          <w:rPr>
+            <w:rStyle w:val="Hyperlink"/>
+          </w:rPr>
+          <w:t xml:space="preserve">10.1128/msphere.00355-23</w:t>
+        </w:r>
+      </w:hyperlink>
+      <w:r>
+        <w:t xml:space="preserve">.</w:t>
+      </w:r>
+    </w:p>
+    <w:bookmarkEnd w:id="36"/>
+    <w:bookmarkStart w:id="38" w:name="ref-Schloss2024b"/>
+    <w:p>
+      <w:pPr>
+        <w:pStyle w:val="Bibliography"/>
+      </w:pPr>
+      <w:r>
+        <w:t xml:space="preserve">2.</w:t>
+      </w:r>
+      <w:r>
+        <w:t xml:space="preserve"> </w:t>
+      </w:r>
+      <w:r>
+        <w:t xml:space="preserve">	</w:t>
+      </w:r>
+      <w:r>
+        <w:rPr>
+          <w:b/>
+          <w:bCs/>
+        </w:rPr>
+        <w:t xml:space="preserve">Schloss PD</w:t>
+      </w:r>
+      <w:r>
+        <w:t xml:space="preserve">. 2024. Rarefaction is currently the best approach to control for uneven sequencing effort in amplicon sequence analyses. mSphere</w:t>
+      </w:r>
+      <w:r>
+        <w:t xml:space="preserve"> </w:t>
+      </w:r>
+      <w:r>
+        <w:rPr>
+          <w:b/>
+          <w:bCs/>
+        </w:rPr>
+        <w:t xml:space="preserve">9</w:t>
+      </w:r>
+      <w:r>
+        <w:t xml:space="preserve">. doi:</w:t>
+      </w:r>
+      <w:hyperlink r:id="rId37">
+        <w:r>
+          <w:rPr>
+            <w:rStyle w:val="Hyperlink"/>
+          </w:rPr>
+          <w:t xml:space="preserve">10.1128/msphere.00354-23</w:t>
+        </w:r>
+      </w:hyperlink>
+      <w:r>
+        <w:t xml:space="preserve">.</w:t>
+      </w:r>
+    </w:p>
+    <w:bookmarkEnd w:id="38"/>
+    <w:bookmarkEnd w:id="39"/>
+    <w:p>
+      <w:r>
+        <w:br w:type="page"/>
+      </w:r>
+    </w:p>
+    <w:p>
+      <w:pPr>
+        <w:pStyle w:val="BodyText"/>
+      </w:pPr>
+      <w:r>
+        <w:drawing>
+          <wp:inline>
+            <wp:extent cx="4267200" cy="4267200"/>
+            <wp:effectExtent b="0" l="0" r="0" t="0"/>
+            <wp:docPr descr="" title="" id="41" name="Picture"/>
+            <a:graphic>
+              <a:graphicData uri="http://schemas.openxmlformats.org/drawingml/2006/picture">
+                <pic:pic>
+                  <pic:nvPicPr>
+                    <pic:cNvPr descr="../figures/heatmap_pcoa_martino.png" id="42" name="Picture"/>
+                    <pic:cNvPicPr>
+                      <a:picLocks noChangeArrowheads="1" noChangeAspect="1"/>
+                    </pic:cNvPicPr>
+                  </pic:nvPicPr>
+                  <pic:blipFill>
+                    <a:blip r:embed="rId40"/>
+                    <a:stretch>
+                      <a:fillRect/>
+                    </a:stretch>
+                  </pic:blipFill>
+                  <pic:spPr bwMode="auto">
+                    <a:xfrm>
+                      <a:off x="0" y="0"/>
+                      <a:ext cx="4267200" cy="4267200"/>
+                    </a:xfrm>
+                    <a:prstGeom prst="rect">
+                      <a:avLst/>
+                    </a:prstGeom>
+                    <a:noFill/>
+                    <a:ln w="9525">
+                      <a:noFill/>
+                      <a:headEnd/>
+                      <a:tailEnd/>
+                    </a:ln>
+                  </pic:spPr>
+                </pic:pic>
+              </a:graphicData>
+            </a:graphic>
+          </wp:inline>
+        </w:drawing>
+      </w:r>
+    </w:p>
+    <w:p>
+      <w:pPr>
+        <w:pStyle w:val="BodyText"/>
+      </w:pPr>
+      <w:r>
+        <w:rPr>
+          <w:b/>
+          <w:bCs/>
+        </w:rPr>
+        <w:t xml:space="preserve">Figure 1. Graphical representation of an example dataset comparing communities simulated using code adapted from Martino when 4,000 sequences were sampled from each sample.</w:t>
+      </w:r>
+      <w:r>
+        <w:t xml:space="preserve"> </w:t>
+      </w:r>
+      <w:r>
+        <w:t xml:space="preserve">This figure is analogous to Figure 3D of Martino with the inclusion of additional data from simulations where samples were shared between the two treatment groups and PCoA diagrams using Bray-Curtis distances in addition to RPCA. Heatmaps display the OCLR transformation of sequence counts. The numbers on the x and y axis of each ordination diagram represent the percent of the total variation that each axis explained.</w:t>
+      </w:r>
+    </w:p>
+    <w:p>
+      <w:r>
+        <w:br w:type="page"/>
+      </w:r>
+    </w:p>
+    <w:p>
+      <w:pPr>
+        <w:pStyle w:val="BodyText"/>
+      </w:pPr>
+      <w:r>
+        <w:drawing>
+          <wp:inline>
+            <wp:extent cx="4267200" cy="3556000"/>
+            <wp:effectExtent b="0" l="0" r="0" t="0"/>
+            <wp:docPr descr="" title="" id="44" name="Picture"/>
+            <a:graphic>
+              <a:graphicData uri="http://schemas.openxmlformats.org/drawingml/2006/picture">
+                <pic:pic>
+                  <pic:nvPicPr>
+                    <pic:cNvPr descr="../figures/fst_knn_martino.png" id="45" name="Picture"/>
+                    <pic:cNvPicPr>
+                      <a:picLocks noChangeArrowheads="1" noChangeAspect="1"/>
+                    </pic:cNvPicPr>
+                  </pic:nvPicPr>
+                  <pic:blipFill>
+                    <a:blip r:embed="rId43"/>
+                    <a:stretch>
+                      <a:fillRect/>
+                    </a:stretch>
+                  </pic:blipFill>
+                  <pic:spPr bwMode="auto">
+                    <a:xfrm>
+                      <a:off x="0" y="0"/>
+                      <a:ext cx="4267200" cy="3556000"/>
+                    </a:xfrm>
+                    <a:prstGeom prst="rect">
+                      <a:avLst/>
+                    </a:prstGeom>
+                    <a:noFill/>
+                    <a:ln w="9525">
+                      <a:noFill/>
+                      <a:headEnd/>
+                      <a:tailEnd/>
+                    </a:ln>
+                  </pic:spPr>
+                </pic:pic>
+              </a:graphicData>
+            </a:graphic>
+          </wp:inline>
+        </w:drawing>
+      </w:r>
+    </w:p>
+    <w:p>
+      <w:pPr>
+        <w:pStyle w:val="BodyText"/>
+      </w:pPr>
+      <w:r>
+        <w:rPr>
+          <w:b/>
+          <w:bCs/>
+        </w:rPr>
+        <w:t xml:space="preserve">Figure 2. Comparison of RPCA’s performance relative to other methods of comparing communities when using PERMANOVA and KNN classification to distinguish between overlapping treatment groups.</w:t>
+      </w:r>
+      <w:r>
+        <w:t xml:space="preserve"> </w:t>
+      </w:r>
+      <w:r>
+        <w:t xml:space="preserve">This figure is analogous to Figure 3BC of Martino with the inclusion of results when using additional data transformations, Bray-Curtis distances, and 10 instead of 1 replicate simulation. Each circle represents the median of ten replicate simulations and the confidence line indicates the range between the minimum and maximum values. The median KNN classification accuracy and range were the median of 10 median values each calculated across 100 training-testing splits using the fitted K value from 80-20 splits. The vertical gray line for KNN classification indicates the accuracy one would expect from randomly guessing the treatment group.</w:t>
+      </w:r>
+    </w:p>
+    <w:p>
+      <w:r>
+        <w:br w:type="page"/>
+      </w:r>
+    </w:p>
+    <w:p>
+      <w:pPr>
+        <w:pStyle w:val="BodyText"/>
+      </w:pPr>
+      <w:r>
+        <w:drawing>
+          <wp:inline>
+            <wp:extent cx="4267200" cy="3505200"/>
+            <wp:effectExtent b="0" l="0" r="0" t="0"/>
+            <wp:docPr descr="" title="" id="47" name="Picture"/>
+            <a:graphic>
+              <a:graphicData uri="http://schemas.openxmlformats.org/drawingml/2006/picture">
+                <pic:pic>
+                  <pic:nvPicPr>
+                    <pic:cNvPr descr="../figures/heatmap_pcoa_pds.png" id="48" name="Picture"/>
+                    <pic:cNvPicPr>
+                      <a:picLocks noChangeArrowheads="1" noChangeAspect="1"/>
+                    </pic:cNvPicPr>
+                  </pic:nvPicPr>
+                  <pic:blipFill>
+                    <a:blip r:embed="rId46"/>
+                    <a:stretch>
+                      <a:fillRect/>
+                    </a:stretch>
+                  </pic:blipFill>
+                  <pic:spPr bwMode="auto">
+                    <a:xfrm>
+                      <a:off x="0" y="0"/>
+                      <a:ext cx="4267200" cy="3505200"/>
+                    </a:xfrm>
+                    <a:prstGeom prst="rect">
+                      <a:avLst/>
+                    </a:prstGeom>
+                    <a:noFill/>
+                    <a:ln w="9525">
+                      <a:noFill/>
+                      <a:headEnd/>
+                      <a:tailEnd/>
+                    </a:ln>
+                  </pic:spPr>
+                </pic:pic>
+              </a:graphicData>
+            </a:graphic>
+          </wp:inline>
+        </w:drawing>
+      </w:r>
+    </w:p>
+    <w:p>
+      <w:pPr>
+        <w:pStyle w:val="BodyText"/>
+      </w:pPr>
+      <w:r>
+        <w:rPr>
+          <w:b/>
+          <w:bCs/>
+        </w:rPr>
+        <w:t xml:space="preserve">Figure 3. Graphical representation of an example dataset comparing communities simulated rewritten in R based on the description in Martino when 10,000 sequences were sampled from each sample.</w:t>
+      </w:r>
+      <w:r>
+        <w:t xml:space="preserve"> </w:t>
+      </w:r>
+      <w:r>
+        <w:t xml:space="preserve">This figure is analogous to Figure 1. To highlight differences in overlap simulation, only the first and last 20 features from each sample are shown. The vertical white band indicates the break in the data presentation. The yellow vertical lines on the heatmap indicate the 12 features that are differentially represented in the two treatment groups. The white diamonds indicate features that had significantly different relative abundances when tested by a Wilcoxon test with p-values corrected using a Benjamini-Hochberg correction. For this example, the differences between the positive control (P=0.001) and overlap dataset (P=0.018) were significant by PERMANOVA and non-significant for the negative control (0.50) using Bray-Curtis distances and significant for the positive control (0.001) and non-significant for the overlap dataset (0.11) and negative (P=0.49) control using RPCA.</w:t>
+      </w:r>
+    </w:p>
+    <w:p>
+      <w:r>
+        <w:br w:type="page"/>
+      </w:r>
+    </w:p>
+    <w:p>
+      <w:pPr>
+        <w:pStyle w:val="BodyText"/>
+      </w:pPr>
+      <w:r>
+        <w:drawing>
+          <wp:inline>
+            <wp:extent cx="4267200" cy="3556000"/>
+            <wp:effectExtent b="0" l="0" r="0" t="0"/>
+            <wp:docPr descr="" title="" id="50" name="Picture"/>
+            <a:graphic>
+              <a:graphicData uri="http://schemas.openxmlformats.org/drawingml/2006/picture">
+                <pic:pic>
+                  <pic:nvPicPr>
+                    <pic:cNvPr descr="../figures/fst_knn_pds.png" id="51" name="Picture"/>
+                    <pic:cNvPicPr>
+                      <a:picLocks noChangeArrowheads="1" noChangeAspect="1"/>
+                    </pic:cNvPicPr>
+                  </pic:nvPicPr>
+                  <pic:blipFill>
+                    <a:blip r:embed="rId49"/>
+                    <a:stretch>
+                      <a:fillRect/>
+                    </a:stretch>
+                  </pic:blipFill>
+                  <pic:spPr bwMode="auto">
+                    <a:xfrm>
+                      <a:off x="0" y="0"/>
+                      <a:ext cx="4267200" cy="3556000"/>
+                    </a:xfrm>
+                    <a:prstGeom prst="rect">
+                      <a:avLst/>
+                    </a:prstGeom>
+                    <a:noFill/>
+                    <a:ln w="9525">
+                      <a:noFill/>
+                      <a:headEnd/>
+                      <a:tailEnd/>
+                    </a:ln>
+                  </pic:spPr>
+                </pic:pic>
+              </a:graphicData>
+            </a:graphic>
+          </wp:inline>
+        </w:drawing>
+      </w:r>
+    </w:p>
+    <w:p>
+      <w:pPr>
+        <w:pStyle w:val="BodyText"/>
+      </w:pPr>
+      <w:r>
+        <w:rPr>
+          <w:b/>
+          <w:bCs/>
+        </w:rPr>
+        <w:t xml:space="preserve">Figure 4. Comparison of RPCA’s performance relative to other methods of comparing communities when using PERMANOVA and KNN classification with revised simulation approach to distinguish between similar treatment groups.</w:t>
+      </w:r>
+      <w:r>
+        <w:t xml:space="preserve"> </w:t>
+      </w:r>
+      <w:r>
+        <w:t xml:space="preserve">This figure is analogous to Figure 2 except that it uses 100 instead of 10 replicates and the power to detect differences by PERMANOVA is shown instead of the Fst statistic. Each circle represents the median of the 100 replicate simulations and the confidence line indicates the range between the minimum and maximum values. The median KNN classification accuracy and range were the median of 10 median values each calculated across 100 training-testing splits using the fitted K value from 80-20 splits. The vertical gray line for KNN classification indicates the accuracy one would expect from randomly guessing the treatment group. The power and accuracy values for 1,000 and 2,000 sequences per sample when using Zero CLR were not calculated since the data were too sparse for the imputation algorithm to complete.</w:t>
+      </w:r>
+    </w:p>
+    <w:p>
+      <w:r>
+        <w:br w:type="page"/>
+      </w:r>
+    </w:p>
+    <w:p>
+      <w:pPr>
+        <w:pStyle w:val="BodyText"/>
+      </w:pPr>
+      <w:r>
+        <w:drawing>
+          <wp:inline>
+            <wp:extent cx="4587290" cy="4587290"/>
+            <wp:effectExtent b="0" l="0" r="0" t="0"/>
+            <wp:docPr descr="" title="" id="53" name="Picture"/>
+            <a:graphic>
+              <a:graphicData uri="http://schemas.openxmlformats.org/drawingml/2006/picture">
+                <pic:pic>
+                  <pic:nvPicPr>
+                    <pic:cNvPr descr="../figures/cs_seq_depth.png" id="54" name="Picture"/>
+                    <pic:cNvPicPr>
+                      <a:picLocks noChangeArrowheads="1" noChangeAspect="1"/>
+                    </pic:cNvPicPr>
+                  </pic:nvPicPr>
+                  <pic:blipFill>
+                    <a:blip r:embed="rId52"/>
+                    <a:stretch>
+                      <a:fillRect/>
+                    </a:stretch>
+                  </pic:blipFill>
+                  <pic:spPr bwMode="auto">
+                    <a:xfrm>
+                      <a:off x="0" y="0"/>
+                      <a:ext cx="4587290" cy="4587290"/>
+                    </a:xfrm>
+                    <a:prstGeom prst="rect">
+                      <a:avLst/>
+                    </a:prstGeom>
+                    <a:noFill/>
+                    <a:ln w="9525">
+                      <a:noFill/>
+                      <a:headEnd/>
+                      <a:tailEnd/>
+                    </a:ln>
+                  </pic:spPr>
+                </pic:pic>
+              </a:graphicData>
+            </a:graphic>
+          </wp:inline>
+        </w:drawing>
+      </w:r>
+    </w:p>
+    <w:p>
+      <w:pPr>
+        <w:pStyle w:val="BodyText"/>
+      </w:pPr>
+      <w:r>
+        <w:rPr>
+          <w:b/>
+          <w:bCs/>
+        </w:rPr>
+        <w:t xml:space="preserve">Figure 5. Comparison of the number of samples and variation in sequencing depth used in the three case studies.</w:t>
+      </w:r>
+      <w:r>
+        <w:t xml:space="preserve"> </w:t>
+      </w:r>
+      <w:r>
+        <w:t xml:space="preserve">The vertical dashed line indicates the 1,000 sequence threshold, which was used by Martino and colleagues when calculating Bray-Curtis and weighted UniFrac distances. The vertical solid line indicates the higher threshold that was added in this study to explore the effects of sequencing depths. The higher threshold was 13755 sequences for the sponges dataset, 11,879 sequences for the sleep apnea dataset, and 10,439 sequences for the colorectal cancer dataset.</w:t>
+      </w:r>
+    </w:p>
+    <w:p>
+      <w:r>
+        <w:br w:type="page"/>
+      </w:r>
+    </w:p>
+    <w:bookmarkEnd w:id="55"/>
+    <w:bookmarkStart w:id="62" w:name="supplemental-figures"/>
     <w:p>
       <w:pPr>
         <w:pStyle w:val="Heading2"/>
       </w:pPr>
       <w:r>
-        <w:t xml:space="preserve">Discussion</w:t>
-      </w:r>
-    </w:p>
-    <w:p>
-      <w:pPr>
-        <w:numPr>
-          <w:ilvl w:val="0"/>
-          <w:numId w:val="1017"/>
-        </w:numPr>
-        <w:pStyle w:val="Compact"/>
-      </w:pPr>
-      <w:r>
-        <w:t xml:space="preserve">Overall method problems</w:t>
-      </w:r>
-    </w:p>
-    <w:p>
-      <w:pPr>
-        <w:numPr>
-          <w:ilvl w:val="1"/>
-          <w:numId w:val="1018"/>
-        </w:numPr>
-        <w:pStyle w:val="Compact"/>
-      </w:pPr>
-      <w:r>
-        <w:t xml:space="preserve">Choice of number of partitions/axes seems arbitrary/no guidance. Controls and sponges used 2, sleep apnea used 3. Default is 3</w:t>
-      </w:r>
-    </w:p>
-    <w:p>
-      <w:pPr>
-        <w:numPr>
-          <w:ilvl w:val="1"/>
-          <w:numId w:val="1018"/>
-        </w:numPr>
-        <w:pStyle w:val="Compact"/>
-      </w:pPr>
-      <w:r>
-        <w:t xml:space="preserve">auto_rpca available within recent implementation but has since been deprecated</w:t>
-      </w:r>
-    </w:p>
-    <w:p>
-      <w:pPr>
-        <w:numPr>
-          <w:ilvl w:val="0"/>
-          <w:numId w:val="1017"/>
-        </w:numPr>
-        <w:pStyle w:val="Compact"/>
-      </w:pPr>
-      <w:r>
-        <w:t xml:space="preserve">Benchmarking should use methods that are commonly used in the field. KNN was interesting, but not relevant. Who is using raw with matrix completion?</w:t>
-      </w:r>
-    </w:p>
-    <w:p>
-      <w:pPr>
-        <w:numPr>
-          <w:ilvl w:val="0"/>
-          <w:numId w:val="1017"/>
-        </w:numPr>
-        <w:pStyle w:val="Compact"/>
-      </w:pPr>
-      <w:r>
-        <w:t xml:space="preserve">Statistical modeling approach is appealing for building communities and treatment groups and nicely complements results found using simulations based on observed sequencing counts and sequencing depths</w:t>
-      </w:r>
-    </w:p>
-    <w:p>
-      <w:pPr>
-        <w:numPr>
-          <w:ilvl w:val="0"/>
-          <w:numId w:val="1017"/>
-        </w:numPr>
-        <w:pStyle w:val="Compact"/>
-      </w:pPr>
-      <w:r>
-        <w:t xml:space="preserve">Comment on problematic coding practices</w:t>
-      </w:r>
-    </w:p>
-    <w:p>
-      <w:pPr>
-        <w:numPr>
-          <w:ilvl w:val="0"/>
-          <w:numId w:val="1017"/>
-        </w:numPr>
-        <w:pStyle w:val="Compact"/>
-      </w:pPr>
-      <w:r>
-        <w:t xml:space="preserve">Use rarefaction</w:t>
-      </w:r>
-    </w:p>
-    <w:bookmarkEnd w:id="31"/>
-    <w:bookmarkStart w:id="32" w:name="materials-methods"/>
-    <w:p>
-      <w:pPr>
-        <w:pStyle w:val="Heading2"/>
-      </w:pPr>
-      <w:r>
-        <w:t xml:space="preserve">Materials &amp; Methods</w:t>
-      </w:r>
-    </w:p>
-    <w:p>
-      <w:pPr>
-        <w:numPr>
-          <w:ilvl w:val="0"/>
-          <w:numId w:val="1019"/>
-        </w:numPr>
-      </w:pPr>
-      <w:r>
-        <w:t xml:space="preserve">Deicode benchmarking data and code</w:t>
-      </w:r>
-    </w:p>
-    <w:p>
-      <w:pPr>
-        <w:numPr>
-          <w:ilvl w:val="0"/>
-          <w:numId w:val="1019"/>
-        </w:numPr>
-      </w:pPr>
-      <w:r>
-        <w:t xml:space="preserve">KNN analysis</w:t>
-      </w:r>
-    </w:p>
-    <w:p>
-      <w:pPr>
-        <w:numPr>
-          <w:ilvl w:val="0"/>
-          <w:numId w:val="1019"/>
-        </w:numPr>
-      </w:pPr>
-      <w:r>
-        <w:t xml:space="preserve">Description of Sampling depth experiment</w:t>
-      </w:r>
-    </w:p>
-    <w:p>
-      <w:pPr>
-        <w:numPr>
-          <w:ilvl w:val="1"/>
-          <w:numId w:val="1020"/>
-        </w:numPr>
-        <w:pStyle w:val="Compact"/>
-      </w:pPr>
-      <w:r>
-        <w:t xml:space="preserve">adonis2 model</w:t>
-      </w:r>
-    </w:p>
-    <w:p>
-      <w:pPr>
-        <w:numPr>
-          <w:ilvl w:val="0"/>
-          <w:numId w:val="1019"/>
-        </w:numPr>
-      </w:pPr>
-      <w:r>
-        <w:t xml:space="preserve">Workflow</w:t>
-      </w:r>
-    </w:p>
-    <w:p>
-      <w:pPr>
-        <w:numPr>
-          <w:ilvl w:val="1"/>
-          <w:numId w:val="1021"/>
-        </w:numPr>
-        <w:pStyle w:val="Compact"/>
-      </w:pPr>
-      <w:r>
-        <w:t xml:space="preserve">Snakemake</w:t>
-      </w:r>
-    </w:p>
-    <w:p>
-      <w:pPr>
-        <w:numPr>
-          <w:ilvl w:val="1"/>
-          <w:numId w:val="1021"/>
-        </w:numPr>
-        <w:pStyle w:val="Compact"/>
-      </w:pPr>
-      <w:r>
-        <w:t xml:space="preserve">Conda - Software versions</w:t>
-      </w:r>
-    </w:p>
-    <w:p>
-      <w:pPr>
-        <w:numPr>
-          <w:ilvl w:val="1"/>
-          <w:numId w:val="1021"/>
-        </w:numPr>
-        <w:pStyle w:val="Compact"/>
-      </w:pPr>
-      <w:r>
-        <w:t xml:space="preserve">GitHub</w:t>
-      </w:r>
-    </w:p>
-    <w:bookmarkEnd w:id="32"/>
-    <w:bookmarkStart w:id="33" w:name="acknowledgements"/>
-    <w:p>
-      <w:pPr>
-        <w:pStyle w:val="Heading2"/>
-      </w:pPr>
-      <w:r>
-        <w:t xml:space="preserve">Acknowledgements</w:t>
-      </w:r>
-    </w:p>
-    <w:p>
-      <w:pPr>
-        <w:numPr>
-          <w:ilvl w:val="0"/>
-          <w:numId w:val="1022"/>
-        </w:numPr>
-        <w:pStyle w:val="Compact"/>
-      </w:pPr>
-      <w:r>
-        <w:t xml:space="preserve">Thanks for making code publicly accessible!</w:t>
-      </w:r>
-    </w:p>
-    <w:p>
-      <w:pPr>
-        <w:numPr>
-          <w:ilvl w:val="0"/>
-          <w:numId w:val="1022"/>
-        </w:numPr>
-        <w:pStyle w:val="Compact"/>
-      </w:pPr>
-      <w:r>
-        <w:t xml:space="preserve">Funding agencies</w:t>
+        <w:t xml:space="preserve">Supplemental Figures</w:t>
+      </w:r>
+    </w:p>
+    <w:p>
+      <w:pPr>
+        <w:pStyle w:val="FirstParagraph"/>
+      </w:pPr>
+      <w:r>
+        <w:drawing>
+          <wp:inline>
+            <wp:extent cx="5334000" cy="3810000"/>
+            <wp:effectExtent b="0" l="0" r="0" t="0"/>
+            <wp:docPr descr="" title="" id="57" name="Picture"/>
+            <a:graphic>
+              <a:graphicData uri="http://schemas.openxmlformats.org/drawingml/2006/picture">
+                <pic:pic>
+                  <pic:nvPicPr>
+                    <pic:cNvPr descr="../figures/knn_methods_martino.png" id="58" name="Picture"/>
+                    <pic:cNvPicPr>
+                      <a:picLocks noChangeArrowheads="1" noChangeAspect="1"/>
+                    </pic:cNvPicPr>
+                  </pic:nvPicPr>
+                  <pic:blipFill>
+                    <a:blip r:embed="rId56"/>
+                    <a:stretch>
+                      <a:fillRect/>
+                    </a:stretch>
+                  </pic:blipFill>
+                  <pic:spPr bwMode="auto">
+                    <a:xfrm>
+                      <a:off x="0" y="0"/>
+                      <a:ext cx="5334000" cy="3810000"/>
+                    </a:xfrm>
+                    <a:prstGeom prst="rect">
+                      <a:avLst/>
+                    </a:prstGeom>
+                    <a:noFill/>
+                    <a:ln w="9525">
+                      <a:noFill/>
+                      <a:headEnd/>
+                      <a:tailEnd/>
+                    </a:ln>
+                  </pic:spPr>
+                </pic:pic>
+              </a:graphicData>
+            </a:graphic>
+          </wp:inline>
+        </w:drawing>
+      </w:r>
+    </w:p>
+    <w:p>
+      <w:pPr>
+        <w:pStyle w:val="BodyText"/>
+      </w:pPr>
+      <w:r>
+        <w:rPr>
+          <w:b/>
+          <w:bCs/>
+        </w:rPr>
+        <w:t xml:space="preserve">Figure S1. Differences in KNN classification accuracy for distinguishing between overlapping treatment groups using different approaches to optimize the number of neighbors was negligible</w:t>
+      </w:r>
+      <w:r>
+        <w:t xml:space="preserve">. Martino split 60% of their data into a training set using 13 neighbors and tested on the remaining 40%. Following Topcuoglu et al. [</w:t>
+      </w:r>
+      <w:r>
+        <w:rPr>
+          <w:b/>
+          <w:bCs/>
+        </w:rPr>
+        <w:t xml:space="preserve">XXXXX</w:t>
+      </w:r>
+      <w:r>
+        <w:t xml:space="preserve">], I optimized the number of neighbors using 60-40 and 80-20 training-testing splits.</w:t>
       </w:r>
     </w:p>
     <w:p>
@@ -1222,50 +1852,80 @@
         <w:br w:type="page"/>
       </w:r>
     </w:p>
-    <w:bookmarkEnd w:id="33"/>
-    <w:bookmarkStart w:id="35" w:name="references"/>
-    <w:p>
-      <w:pPr>
-        <w:pStyle w:val="Heading2"/>
-      </w:pPr>
-      <w:r>
-        <w:t xml:space="preserve">References</w:t>
-      </w:r>
-    </w:p>
-    <w:bookmarkStart w:id="34" w:name="refs"/>
-    <w:bookmarkEnd w:id="34"/>
-    <w:p>
-      <w:r>
-        <w:br w:type="page"/>
-      </w:r>
-    </w:p>
-    <w:bookmarkEnd w:id="35"/>
-    <w:bookmarkStart w:id="36" w:name="figures"/>
-    <w:p>
-      <w:pPr>
-        <w:pStyle w:val="Heading2"/>
-      </w:pPr>
-      <w:r>
-        <w:t xml:space="preserve">Figures</w:t>
-      </w:r>
-    </w:p>
-    <w:p>
-      <w:r>
-        <w:br w:type="page"/>
-      </w:r>
-    </w:p>
-    <w:bookmarkEnd w:id="36"/>
-    <w:bookmarkStart w:id="37" w:name="supplemental-figures"/>
-    <w:p>
-      <w:pPr>
-        <w:pStyle w:val="Heading2"/>
-      </w:pPr>
-      <w:r>
-        <w:t xml:space="preserve">Supplemental Figures</w:t>
-      </w:r>
-    </w:p>
-    <w:bookmarkEnd w:id="37"/>
-    <w:bookmarkEnd w:id="38"/>
+    <w:p>
+      <w:pPr>
+        <w:pStyle w:val="BodyText"/>
+      </w:pPr>
+      <w:r>
+        <w:drawing>
+          <wp:inline>
+            <wp:extent cx="5334000" cy="3810000"/>
+            <wp:effectExtent b="0" l="0" r="0" t="0"/>
+            <wp:docPr descr="" title="" id="60" name="Picture"/>
+            <a:graphic>
+              <a:graphicData uri="http://schemas.openxmlformats.org/drawingml/2006/picture">
+                <pic:pic>
+                  <pic:nvPicPr>
+                    <pic:cNvPr descr="../figures/knn_methods_pds.png" id="61" name="Picture"/>
+                    <pic:cNvPicPr>
+                      <a:picLocks noChangeArrowheads="1" noChangeAspect="1"/>
+                    </pic:cNvPicPr>
+                  </pic:nvPicPr>
+                  <pic:blipFill>
+                    <a:blip r:embed="rId59"/>
+                    <a:stretch>
+                      <a:fillRect/>
+                    </a:stretch>
+                  </pic:blipFill>
+                  <pic:spPr bwMode="auto">
+                    <a:xfrm>
+                      <a:off x="0" y="0"/>
+                      <a:ext cx="5334000" cy="3810000"/>
+                    </a:xfrm>
+                    <a:prstGeom prst="rect">
+                      <a:avLst/>
+                    </a:prstGeom>
+                    <a:noFill/>
+                    <a:ln w="9525">
+                      <a:noFill/>
+                      <a:headEnd/>
+                      <a:tailEnd/>
+                    </a:ln>
+                  </pic:spPr>
+                </pic:pic>
+              </a:graphicData>
+            </a:graphic>
+          </wp:inline>
+        </w:drawing>
+      </w:r>
+    </w:p>
+    <w:p>
+      <w:pPr>
+        <w:pStyle w:val="BodyText"/>
+      </w:pPr>
+      <w:r>
+        <w:rPr>
+          <w:b/>
+          <w:bCs/>
+        </w:rPr>
+        <w:t xml:space="preserve">Figure S1. Differences in KNN classification accuracy for distinguishing between overlapping treatment groups using the revised simulation data by different approaches to optimize the number of neighbors was negligible</w:t>
+      </w:r>
+      <w:r>
+        <w:t xml:space="preserve">. Martino split 60% of their data into a training set using 13 neighbors and tested on the remaining 40%. Following Topcuoglu et al. [</w:t>
+      </w:r>
+      <w:r>
+        <w:rPr>
+          <w:b/>
+          <w:bCs/>
+        </w:rPr>
+        <w:t xml:space="preserve">XXXXX</w:t>
+      </w:r>
+      <w:r>
+        <w:t xml:space="preserve">], I optimized the number of neighbors using 60-40 and 80-20 training-testing splits.</w:t>
+      </w:r>
+    </w:p>
+    <w:bookmarkEnd w:id="62"/>
+    <w:bookmarkEnd w:id="63"/>
     <w:sectPr/>
   </w:body>
 </w:document>
@@ -1297,7 +1957,7 @@
 <file path=word/numbering.xml><?xml version="1.0" encoding="utf-8"?>
 <w:numbering xmlns:w="http://schemas.openxmlformats.org/wordprocessingml/2006/main">
   <w:abstractNum w:abstractNumId="990">
-    <w:nsid w:val="A990"/>
+    <w:nsid w:val="0000A990"/>
     <w:multiLevelType w:val="multilevel"/>
     <w:lvl w:ilvl="0">
       <w:numFmt w:val="bullet"/>
@@ -1373,7 +2033,7 @@
     </w:lvl>
   </w:abstractNum>
   <w:abstractNum w:abstractNumId="991">
-    <w:nsid w:val="A991"/>
+    <w:nsid w:val="0000A991"/>
     <w:multiLevelType w:val="multilevel"/>
     <w:lvl w:ilvl="0">
       <w:numFmt w:val="bullet"/>
@@ -1487,36 +2147,6 @@
   <w:num w:numId="1012">
     <w:abstractNumId w:val="991"/>
   </w:num>
-  <w:num w:numId="1013">
-    <w:abstractNumId w:val="991"/>
-  </w:num>
-  <w:num w:numId="1014">
-    <w:abstractNumId w:val="991"/>
-  </w:num>
-  <w:num w:numId="1015">
-    <w:abstractNumId w:val="991"/>
-  </w:num>
-  <w:num w:numId="1016">
-    <w:abstractNumId w:val="991"/>
-  </w:num>
-  <w:num w:numId="1017">
-    <w:abstractNumId w:val="991"/>
-  </w:num>
-  <w:num w:numId="1018">
-    <w:abstractNumId w:val="991"/>
-  </w:num>
-  <w:num w:numId="1019">
-    <w:abstractNumId w:val="991"/>
-  </w:num>
-  <w:num w:numId="1020">
-    <w:abstractNumId w:val="991"/>
-  </w:num>
-  <w:num w:numId="1021">
-    <w:abstractNumId w:val="991"/>
-  </w:num>
-  <w:num w:numId="1022">
-    <w:abstractNumId w:val="991"/>
-  </w:num>
 </w:numbering>
 </file>
 
@@ -1546,10 +2176,10 @@
     <w:name w:val="Body Text"/>
     <w:basedOn w:val="Normal"/>
     <w:link w:val="BodyTextChar"/>
+    <w:qFormat/>
     <w:pPr>
       <w:spacing w:after="180" w:before="180"/>
     </w:pPr>
-    <w:qFormat/>
   </w:style>
   <w:style w:customStyle="1" w:styleId="FirstParagraph" w:type="paragraph">
     <w:name w:val="First Paragraph"/>
@@ -1621,6 +2251,24 @@
       <w:jc w:val="center"/>
     </w:pPr>
   </w:style>
+  <w:style w:customStyle="1" w:styleId="AbstractTitle" w:type="paragraph">
+    <w:name w:val="Abstract Title"/>
+    <w:basedOn w:val="Normal"/>
+    <w:next w:val="Abstract"/>
+    <w:qFormat/>
+    <w:pPr>
+      <w:keepNext/>
+      <w:keepLines/>
+      <w:spacing w:after="0" w:before="300"/>
+      <w:jc w:val="center"/>
+    </w:pPr>
+    <w:rPr>
+      <w:b/>
+      <w:color w:val="345A8A"/>
+      <w:sz w:val="20"/>
+      <w:szCs w:val="20"/>
+    </w:rPr>
+  </w:style>
   <w:style w:customStyle="1" w:styleId="Abstract" w:type="paragraph">
     <w:name w:val="Abstract"/>
     <w:basedOn w:val="Normal"/>
@@ -1629,7 +2277,7 @@
     <w:pPr>
       <w:keepNext/>
       <w:keepLines/>
-      <w:spacing w:after="300" w:before="300"/>
+      <w:spacing w:after="300" w:before="100"/>
     </w:pPr>
     <w:rPr>
       <w:sz w:val="20"/>
@@ -1724,8 +2372,8 @@
     </w:pPr>
     <w:rPr>
       <w:rFonts w:asciiTheme="majorHAnsi" w:cstheme="majorBidi" w:eastAsiaTheme="majorEastAsia" w:hAnsiTheme="majorHAnsi"/>
+      <w:bCs/>
       <w:i/>
-      <w:bCs/>
       <w:color w:themeColor="accent1" w:val="4F81BD"/>
       <w:sz w:val="24"/>
       <w:szCs w:val="24"/>
@@ -1851,6 +2499,18 @@
     <w:uiPriority w:val="9"/>
     <w:unhideWhenUsed/>
     <w:qFormat/>
+  </w:style>
+  <w:style w:styleId="FootnoteBlockText" w:type="paragraph">
+    <w:name w:val="Footnote Block Text"/>
+    <w:basedOn w:val="Footnote Text"/>
+    <w:next w:val="Footnote Text"/>
+    <w:uiPriority w:val="9"/>
+    <w:unhideWhenUsed/>
+    <w:qFormat/>
+    <w:pPr>
+      <w:spacing w:after="100" w:before="100"/>
+      <w:ind w:firstLine="0" w:left="480" w:right="480"/>
+    </w:pPr>
   </w:style>
   <w:style w:default="1" w:styleId="DefaultParagraphFont" w:type="character">
     <w:name w:val="Default Paragraph Font"/>
@@ -1881,10 +2541,10 @@
         <w:jc w:val="left"/>
       </w:trPr>
       <w:tcPr>
-        <w:vAlign w:val="bottom"/>
         <w:tcBorders>
           <w:bottom w:val="single"/>
         </w:tcBorders>
+        <w:vAlign w:val="bottom"/>
       </w:tcPr>
     </w:tblStylePr>
   </w:style>
@@ -2104,9 +2764,9 @@
     <w:name w:val="DocumentationTok"/>
     <w:basedOn w:val="VerbatimChar"/>
     <w:rPr>
+      <w:i/>
       <w:color w:val="5e5e5e"/>
       <w:shd w:val="clear" w:fill="f1f3f5"/>
-      <w:i/>
     </w:rPr>
   </w:style>
   <w:style w:type="character" w:customStyle="1" w:styleId="AnnotationTok">
@@ -2121,9 +2781,9 @@
     <w:name w:val="CommentVarTok"/>
     <w:basedOn w:val="VerbatimChar"/>
     <w:rPr>
+      <w:i/>
       <w:color w:val="5e5e5e"/>
       <w:shd w:val="clear" w:fill="f1f3f5"/>
-      <w:i/>
     </w:rPr>
   </w:style>
   <w:style w:type="character" w:customStyle="1" w:styleId="OtherTok">
@@ -2218,9 +2878,9 @@
     <w:name w:val="WarningTok"/>
     <w:basedOn w:val="VerbatimChar"/>
     <w:rPr>
+      <w:i/>
       <w:color w:val="5e5e5e"/>
       <w:shd w:val="clear" w:fill="f1f3f5"/>
-      <w:i/>
     </w:rPr>
   </w:style>
   <w:style w:type="character" w:customStyle="1" w:styleId="AlertTok">

</xml_diff>

<commit_message>
First full draft of Results
</commit_message>
<xml_diff>
--- a/submission/manuscript.docx
+++ b/submission/manuscript.docx
@@ -2,7 +2,7 @@
 <file path=word/document.xml><?xml version="1.0" encoding="utf-8"?>
 <w:document xmlns:w="http://schemas.openxmlformats.org/wordprocessingml/2006/main" xmlns:m="http://schemas.openxmlformats.org/officeDocument/2006/math" xmlns:r="http://schemas.openxmlformats.org/officeDocument/2006/relationships" xmlns:o="urn:schemas-microsoft-com:office:office" xmlns:v="urn:schemas-microsoft-com:vml" xmlns:w10="urn:schemas-microsoft-com:office:word" xmlns:a="http://schemas.openxmlformats.org/drawingml/2006/main" xmlns:pic="http://schemas.openxmlformats.org/drawingml/2006/picture" xmlns:wp="http://schemas.openxmlformats.org/drawingml/2006/wordprocessingDrawing">
   <w:body>
-    <w:bookmarkStart w:id="63" w:name="lorem-ipsum"/>
+    <w:bookmarkStart w:id="75" w:name="lorem-ipsum"/>
     <w:p>
       <w:pPr>
         <w:pStyle w:val="Heading1"/>
@@ -500,7 +500,25 @@
         <w:pStyle w:val="FirstParagraph"/>
       </w:pPr>
       <w:r>
-        <w:t xml:space="preserve">Martino made a git-based repository available on GitHub that includes the actual benchmarking code written in Python and the data used in their analysis (https://github.com/cameronmartino/deicode-benchmarking); the code and data from that repository are included in the repository for the current analysis (https://github.com/SchlossLab/Schloss_RPCA_XXXXXX_2024). To maintain a connection to the original simulations and implement a broader set of tests, several changes were necessary in the implementation of Martino’s code. First, because one goal of this study was to assess the impact of variation in sequencing effort on the performance of RPCA, I modified the parameters inputted to Martino’s code to produce more than the desired number of sequences per sample and then performed a single subsampling of the samples to 1,000, 2,000, 4,000, or 10,000 sequences per sample to have exactly the desired number of sequences per sample. Second, to account for the effect of the random number generator, instead of replicating each simulation condition only once as Martino did, I replicated each condition 10 or 100 times depending on the analysis. Third, Martino only considered the positive and negative controls with 4,000 sequences, my implementation of their simulations and subsequent tests incorporated the sequencing depths of 1,000, 2,000, and 10,000 that were used in the simulations with partially overlapping treatment groups. The regenerated heatmaps and principal coordinates analysis (PCoA) plots in</w:t>
+        <w:t xml:space="preserve">Martino made a git-based repository available on GitHub that includes the actual benchmarking code written in Python and the data used in their analysis (https://github.com/cameronmartino/deicode-benchmarking); the code and data from that repository are included as the directory</w:t>
+      </w:r>
+      <w:r>
+        <w:t xml:space="preserve"> </w:t>
+      </w:r>
+      <w:r>
+        <w:t xml:space="preserve">“</w:t>
+      </w:r>
+      <w:r>
+        <w:t xml:space="preserve">deicode_benchmarking</w:t>
+      </w:r>
+      <w:r>
+        <w:t xml:space="preserve">”</w:t>
+      </w:r>
+      <w:r>
+        <w:t xml:space="preserve"> </w:t>
+      </w:r>
+      <w:r>
+        <w:t xml:space="preserve">within repository for the current analysis (https://github.com/SchlossLab/Schloss_RPCA_mSystems_2025). To maintain a connection to the original simulations and implement a broader set of tests, several changes were necessary in the implementation of Martino’s code. First, because one goal of this study was to assess the effect of variation in sequencing effort on the performance of RPCA, I modified the parameters inputted to Martino’s code to produce more than the desired number of sequences per sample and then performed a single subsampling of the samples to 1,000, 2,000, 4,000, or 10,000 sequences per sample to have exactly the desired number of sequences per sample. Second, to account for the effect of the random number generator, instead of replicating each simulation condition only once as Martino did, I replicated each condition 10 or 100 times depending on the analysis. Third, Martino only analyzed their positive and negative control simulations with 4,000 sequences. My implementation of their simulations and subsequent tests added the sequencing depths of 1,000, 2,000, and 10,000 sequences for the positive and negative controls and for the simulations with partially overlapping treatment groups. The regenerated heatmaps and principal coordinates analysis (PCoA) plots in</w:t>
       </w:r>
       <w:r>
         <w:t xml:space="preserve"> </w:t>
@@ -582,10 +600,10 @@
           <w:b/>
           <w:bCs/>
         </w:rPr>
-        <w:t xml:space="preserve">Figure2</w:t>
-      </w:r>
-      <w:r>
-        <w:t xml:space="preserve">). The calculated F-statistics were even larger than those generated by RPCA. This suggested that RPCA may make communities appear more similar than they are when differences are more pronounced in higher axes. Regardless of the relative scale of the F-statistics, the replicates for all approaches yielded significant p-values except for those generated using RPCA with raw counts.</w:t>
+        <w:t xml:space="preserve">Figure 2</w:t>
+      </w:r>
+      <w:r>
+        <w:t xml:space="preserve">). The calculated F-statistics were even larger than those generated by RPCA. This suggested that RPCA may make communities appear more similar than they are when differences are more pronounced in higher axes. Regardless of the relative scale of the F-statistics, the replicates for all approaches yielded significant P-values except for those generated using RPCA with raw counts.</w:t>
       </w:r>
     </w:p>
     <w:bookmarkEnd w:id="24"/>
@@ -649,15 +667,15 @@
         <w:pStyle w:val="BodyText"/>
       </w:pPr>
       <w:r>
-        <w:t xml:space="preserve">Next I sought to place the RPCA results in context with other methods. I genenerated Euclidean distance matrices using other central log ratio methods and DeSeq2. I also generated Bray-Curtis distance matrices using the raw counts and CSS and SRS Normalization. These methods all yielded similar results, likely because all of samples in the simulations had the same sequencing depth. Compared to these other approaches, RPCA was more sensitive to differences in sequencing depth. Although accuracy values across all methods were comparable at 4,000 and 10,000 sequences, the RPCA-based methods underperformed the others at 1,000 and 2,000 sequences.</w:t>
-      </w:r>
-    </w:p>
-    <w:p>
-      <w:pPr>
-        <w:pStyle w:val="BodyText"/>
-      </w:pPr>
-      <w:r>
-        <w:t xml:space="preserve">Martino did not report the classification accuracy for their positive and negative controls. As expected, the mean accuracy for classifying the treatment groups in the negative control model across each depth, transformation, and distance calculation was 0.50 (sd = 0.0085). Furthermore, the mean accuracy for classifying samples in the positive control was 0.99 (sd = 0.0086).</w:t>
+        <w:t xml:space="preserve">Next I sought to place the RPCA results in context with other methods. I generated Euclidean distance matrices using other central log ratio methods and DeSeq2. I also generated Bray-Curtis distance matrices using the raw counts and CSS and SRS Normalization. These methods all yielded similar results, likely because all of samples in the simulations had the same sequencing depth. Compared to these other approaches, RPCA was more sensitive to differences in sequencing depth. Although accuracy values across all methods were comparable at 4,000 and 10,000 sequences, the RPCA-based methods underperformed the others at 1,000 and 2,000 sequences.</w:t>
+      </w:r>
+    </w:p>
+    <w:p>
+      <w:pPr>
+        <w:pStyle w:val="BodyText"/>
+      </w:pPr>
+      <w:r>
+        <w:t xml:space="preserve">Martino did not report the classification accuracy for their positive and negative controls. As would be expected, the mean accuracy for classifying the treatment groups in the negative control model across each depth, transformation, and distance calculation was 0.50 (sd = 0.01). Furthermore, the mean accuracy for classifying samples in the positive control was 0.99 (sd = 0.01).</w:t>
       </w:r>
     </w:p>
     <w:p>
@@ -675,7 +693,7 @@
         <w:t xml:space="preserve">XXXXX</w:t>
       </w:r>
       <w:r>
-        <w:t xml:space="preserve">]. Across the various conditions, the median optimal number of neighbors was 33.00 (IQR=21.00 to 41.00). When I instead performed 1,000 80-20 splits on the full and training datasets, the median optimal number of neighbors was 58.00 (IQR=42.00 to 65.00). Regardless of finding that the optimal number of neighbors was consistently larger than the 13 that Martino used, the difference in accuracy values was only modestly better than the other fitting procedures when using 80-20 splits (</w:t>
+        <w:t xml:space="preserve">]. Across the various conditions, the median optimal number of neighbors was 33 (IQR=21 to 41). When I instead performed 1,000 80-20 splits on the full and training datasets, the median optimal number of neighbors was 58 (IQR=42 to 65). Regardless of finding that the optimal number of neighbors was consistently larger than the 13 that Martino used, the difference in accuracy values was only modestly better than the other fitting procedures when using 80-20 splits (</w:t>
       </w:r>
       <w:r>
         <w:rPr>
@@ -703,7 +721,7 @@
         <w:pStyle w:val="FirstParagraph"/>
       </w:pPr>
       <w:r>
-        <w:t xml:space="preserve">Using the simulation where the treatment groups partially overlapped, the PERMANOVA analyses yielded significant P-values and KNN classification were effective at distinguishing between the groups for nearly all of the methods. Because it was not possible to easily differentiate between the methods, I created treatment groups that were more similar than those simulated by Martino. Unfortunately, in the process of modifying their code, I identified a number of incongruities between Martino’s written description and their code that limited my ability to reuse their code to simulate greater overlap between the treatment groups (</w:t>
+        <w:t xml:space="preserve">Using the simulation where the treatment groups partially overlapped, the PERMANOVA analyses yielded significant P-values and KNN classification were effective at distinguishing between the groups for nearly all of the methods. Because the simulated effect size was so large, it was not possible to easily differentiate between the methods’ performance. Therefore, I created treatment groups that were more similar than those simulated by Martino. Unfortunately, in the process of modifying their code, I identified a number of incongruities between Martino’s written description and their code. This limited my ability to reuse their code to simulate greater overlap between the treatment groups (</w:t>
       </w:r>
       <w:r>
         <w:rPr>
@@ -731,7 +749,7 @@
         <w:pStyle w:val="BodyText"/>
       </w:pPr>
       <w:r>
-        <w:t xml:space="preserve">Using the revised simulation data revealed a considerable difference in the PERMANOVA and KNN classification relative to the original simulation. Among the various methods, the RPCA-based methods performed the worst by both PERMANOVA and KNN classification (</w:t>
+        <w:t xml:space="preserve">Using the revised simulation data revealed a considerable difference in the performance of PERMANOVA and KNN classification relative to the original simulation. Among the various methods, the RPCA-based methods performed the worst by both PERMANOVA and KNN classification (</w:t>
       </w:r>
       <w:r>
         <w:rPr>
@@ -769,7 +787,7 @@
         <w:pStyle w:val="FirstParagraph"/>
       </w:pPr>
       <w:r>
-        <w:t xml:space="preserve">After describing the results of their simulations, Martino and colleagues used two published datasets as case studies to evaluate RPCA and related methods. They evaluated RPCA relative to Bray-Curtis and weighted Unifrac distances using PERMANOVA, KNN, and ordinations. The two datasets were drawn from a natural study comparing healthy and stressed sponges [</w:t>
+        <w:t xml:space="preserve">After describing the results of their simulations, Martino and colleagues used two published datasets as case studies to evaluate RPCA and related methods. They evaluated RPCA relative to Bray-Curtis and weighted UniFrac distances using PERMANOVA, KNN, and ordinations. The two datasets were drawn from a natural study comparing healthy and stressed sponges [</w:t>
       </w:r>
       <w:r>
         <w:rPr>
@@ -799,7 +817,7 @@
         <w:t xml:space="preserve">Figure 5</w:t>
       </w:r>
       <w:r>
-        <w:t xml:space="preserve">). Also, the effect sizes for both studies were relatively large and could easily be differentiated by the first two PCoA axes. Similar to the results from the simulations, I wondered whether a difference was observed between the methods when there was a smaller effect size and when there was better control for differences in effect sizes. Therefore, I added a third dataset from a study that explored associations between the microbiome and colorectal cancer [</w:t>
+        <w:t xml:space="preserve">). Also, the effect sizes in both studies were relatively large and could easily be differentiated by the first two PCoA axes. Similar to the results from the simulations, I wondered whether differences between the methods would be observed when there was a smaller effect size. Therefore, I added a third dataset from a study that explored associations between the microbiome and colorectal cancer [</w:t>
       </w:r>
       <w:r>
         <w:rPr>
@@ -809,7 +827,7 @@
         <w:t xml:space="preserve">XXXXX</w:t>
       </w:r>
       <w:r>
-        <w:t xml:space="preserve">]. The differences between the two treatment groups were not so obvious by PCoA and the study included more subjects. The colorectal cancer dataset included 261 subjects with healthy colons and 229 subjects with screen relevant colonic neoplasias (</w:t>
+        <w:t xml:space="preserve">]. The differences between healthy individuals and those with screen relevant colonic neoplasias were not obvious by PCoA and the study included more subjects. The colorectal cancer dataset included 261 subjects with healthy colons and 229 subjects with screen relevant colonic neoplasias (</w:t>
       </w:r>
       <w:r>
         <w:rPr>
@@ -827,7 +845,7 @@
         <w:pStyle w:val="BodyText"/>
       </w:pPr>
       <w:r>
-        <w:t xml:space="preserve">After conducting an exhaustive review of the code they provided in their GitHub repository, I discovered several problems in the analysis that Martino and colleagues performed with the case study data. The details of this review can be found in the</w:t>
+        <w:t xml:space="preserve">After conducting an exhaustive review of the code that Martino and colleagues provided in their GitHub repository, I discovered several problems in the original analysis of the case studies. The details of this review can be found in the</w:t>
       </w:r>
       <w:r>
         <w:t xml:space="preserve"> </w:t>
@@ -840,7 +858,7 @@
         <w:t xml:space="preserve">Supplementary Text</w:t>
       </w:r>
       <w:r>
-        <w:t xml:space="preserve">. Aside from the selection of datasets with large effect sizes that were visible using the first two PCoA axes, the principle problems included (i) performing a single subsampling the samples in each data to an artificially low number of sequences (i.e., 1,000) for the Bray-Curtis and weighted Unifrac distance calculations; (ii) performing 9 rather than 10 random subsamples of the datasets when generating balanced designs; (iii) running RPCA with a rank of 3 for the Sleep Apnea dataset rather than 2 as was described in the manuscript; (iv) significant problems in the training and testing of the KNN classification to the data including the selection of the hyperparameter, lack of balance design in the stratifications, and only performing a single iteration; and (v) not using the actual Bray-Curtis and weighted UniFrac distances or more PCoA axes in the KNN classification. The details to these problems are described in the</w:t>
+        <w:t xml:space="preserve">. Aside from the selection of datasets with large effect sizes that were visible using the first two PCoA axes, the principle problems included (i) performing a single subsampling the samples in each data to an artificially low number of sequences (i.e., 1,000) for the Bray-Curtis and weighted UniFrac distance calculations; (ii) when generating balanced designs of the data sets, they performed 9 rather than the 10 random subsamples of the datasets as was described in the manuscript; (iii) running RPCA with a rank of 3 for the Sleep Apnea dataset rather than 2 as was described in the manuscript; (iv) significant problems in the training and testing of the KNN classification to the data including the selection of the hyperparameter, lack of balance design in the stratifications, and only performing a single iteration; and (v) not using the actual Bray-Curtis and weighted UniFrac distances or more PCoA axes in the KNN classification. The following analyses used the remedies as described in the</w:t>
       </w:r>
       <w:r>
         <w:t xml:space="preserve"> </w:t>
@@ -853,7 +871,15 @@
         <w:t xml:space="preserve">Supplementary Text</w:t>
       </w:r>
       <w:r>
-        <w:t xml:space="preserve">. The following analyses uese the solutions that are described in that text. My analysis did not include the weighted UniFrac distances since reliable trees are difficult to generate for large datasets and because previous experience has demonstrated that results of Bray-Curtis and weighted UniFrac distances rarely disagree.</w:t>
+        <w:t xml:space="preserve">.</w:t>
+      </w:r>
+    </w:p>
+    <w:p>
+      <w:pPr>
+        <w:pStyle w:val="BodyText"/>
+      </w:pPr>
+      <w:r>
+        <w:t xml:space="preserve">Similar to the analysis of the simulated datasets, pairwise Euclidean distances were calculated based on using 2 or 3 RPCA axes, Nudge, One, and Zero CLR transformed data, OptSpace and DeSeq2 transformed data, raw counts, relative abundance data, a single subsampling, with rarefaction, and based on the first two PCoA axes using Bray-Curtis distances. Pairwise Bray-Curtis distances were calculated using raw counts, relative abundance data, SRS and CSS normalized data, a single subsampling, and with rarefaction. My analysis did not include the weighted UniFrac distances since reliable trees are difficult to generate for large datasets and because previous experience has demonstrated that results of Bray-Curtis and weighted UniFrac distances rarely disagree.</w:t>
       </w:r>
     </w:p>
     <w:bookmarkEnd w:id="27"/>
@@ -871,7 +897,7 @@
         <w:pStyle w:val="FirstParagraph"/>
       </w:pPr>
       <w:r>
-        <w:t xml:space="preserve">I performed PERMANOVA to test whether the average beta-diversity was significantly different between the two treatment groups within each of the three case studies. In separate analyses, each sample was either subsampled to 1,000 sequences or to a higher threshold based on the identification of natural breaks in the data (</w:t>
+        <w:t xml:space="preserve">I repeated Martino’s PERMANOVA analysis to test whether the average beta-diversity was significantly different between the two treatment groups within each of the three case studies. Their analysis varied the number of samples per treatment group to maintain a balanced design. This choice was odd since PERMANOVA is not sensitive to unbalanced sampling. When I used all of the samples available and performed the PERMANOVA analysis, the only dataset and methods that did not yield a significant result was for the CRC dataset using RPCA with 2 or 3 axes (P = 0.11 and 0.07, respectively). A second odd choice was to subsample the number of sequences to 1,000 sequences per sample when calculating Bray-Curtis distances and use all of the sequences with RPCA. They could have increased the number of sequences by more than ten-fold without adversely impacting the number of samples in their analysis (</w:t>
       </w:r>
       <w:r>
         <w:rPr>
@@ -881,40 +907,187 @@
         <w:t xml:space="preserve">Figure 5</w:t>
       </w:r>
       <w:r>
-        <w:t xml:space="preserve">). These were 11879 sequences for the sleep apnea dataset, 13755 sequences for the sponges dataset, and 10439 sequences for the CRC dataset. Pairwise euclidean distances were calculated based on using 2 or 3 RPCA axes, Nudge, One, and Zero CLR transformed data,</w:t>
-      </w:r>
-      <w:r>
-        <w:t xml:space="preserve"> </w:t>
-      </w:r>
-      <w:r>
-        <w:rPr>
-          <w:b/>
-          <w:bCs/>
-        </w:rPr>
-        <w:t xml:space="preserve">OptSpace</w:t>
-      </w:r>
-      <w:r>
-        <w:t xml:space="preserve"> </w:t>
-      </w:r>
-      <w:r>
-        <w:t xml:space="preserve">and DeSeq2 transformed data, raw counts, relative abundance data, a single subsampling, with rarefaction, and based on the first two PCoA axes using Bray-Curtis distances. Pairwise Bray-Curtis distances were calcualted using raw counts, relative abundance data, SRS and CSS normalized data, a single subsampling, and with rarefaction.</w:t>
-      </w:r>
-    </w:p>
-    <w:p>
-      <w:pPr>
+        <w:t xml:space="preserve">). Acceptable thresholds could have been 11,879 sequences for the sleep apnea dataset, 13,755 sequences for the sponge dataset, and 10,439 sequences for the CRC dataset. Overall, using the higher sequence count thresholds did not drastically alter the results of the analyses; however, it typically resulted in larger PERMANOVA F statistics (</w:t>
+      </w:r>
+      <w:r>
+        <w:rPr>
+          <w:b/>
+          <w:bCs/>
+        </w:rPr>
+        <w:t xml:space="preserve">Figure 6</w:t>
+      </w:r>
+      <w:r>
+        <w:t xml:space="preserve">). For the remainder of the PERMANOVA analysis, I have used the larger number of sequences instead of 1,000 sequences.</w:t>
+      </w:r>
+    </w:p>
+    <w:p>
+      <w:pPr>
+        <w:pStyle w:val="BodyText"/>
+      </w:pPr>
+      <w:r>
+        <w:t xml:space="preserve">The results of my reanalysis of the sponge and sleep apnea datasets using PERMANOVA replicated what was observed in the original study (</w:t>
+      </w:r>
+      <w:r>
+        <w:rPr>
+          <w:b/>
+          <w:bCs/>
+        </w:rPr>
+        <w:t xml:space="preserve">Figure 7</w:t>
+      </w:r>
+      <w:r>
+        <w:t xml:space="preserve">). Across the various transformations and sample sizes, at least 9 of the 10 replicates yielded significant differences between the treatment groups. For the colorectal cancer dataset the results were more varied. The most striking result was that RPCA with 2 or 3 axes only yielded significant results in 2 or 3 of the 10 replicates. When 5 or 9 axes were used, the tests were more frequently significant. With the exception of Zero CLR and using distances extracted from Bray-Curtis PCoA, the other transformations consistently yielded significant results. Across all methods, the fraction of significant tests increased with the number of samples in each group. The inclusion of the colorectal cancer dataset, which had a smaller effect size than the sponge and sleep apnea datasets helped to highlight the shortcomings of RPCA.</w:t>
+      </w:r>
+    </w:p>
+    <w:bookmarkEnd w:id="28"/>
+    <w:bookmarkStart w:id="29" w:name="X89329465b068f28d56d02a6771da4ca182cbd3e"/>
+    <w:p>
+      <w:pPr>
+        <w:pStyle w:val="Heading3"/>
+      </w:pPr>
+      <w:r>
+        <w:t xml:space="preserve">KNN classification of case study datasets</w:t>
+      </w:r>
+    </w:p>
+    <w:p>
+      <w:pPr>
+        <w:pStyle w:val="FirstParagraph"/>
+      </w:pPr>
+      <w:r>
+        <w:t xml:space="preserve">I repeated Martino’s KNN-based analysis using the remedies described in the</w:t>
+      </w:r>
+      <w:r>
+        <w:t xml:space="preserve"> </w:t>
+      </w:r>
+      <w:r>
+        <w:rPr>
+          <w:b/>
+          <w:bCs/>
+        </w:rPr>
+        <w:t xml:space="preserve">Supplementary Text</w:t>
+      </w:r>
+      <w:r>
+        <w:t xml:space="preserve"> </w:t>
+      </w:r>
+      <w:r>
+        <w:t xml:space="preserve">on all three datasets with each of the methods for correcting for uneven sampling effort (</w:t>
+      </w:r>
+      <w:r>
+        <w:rPr>
+          <w:b/>
+          <w:bCs/>
+        </w:rPr>
+        <w:t xml:space="preserve">Figure 8</w:t>
+      </w:r>
+      <w:r>
+        <w:t xml:space="preserve">). Rather than using their strategy of using a fixed number of nearest neighbors, I repeatedly fit the hyperparameter using cross validation training and testing datasets. Overall, using the higher sequence count threshold did not dramatically alter the results of the analyses; however, it typically resulted in higher accuracy to classify samples into the treatment groups for the sleep apnea dataset, which had fewer samples (</w:t>
+      </w:r>
+      <w:r>
+        <w:rPr>
+          <w:b/>
+          <w:bCs/>
+        </w:rPr>
+        <w:t xml:space="preserve">Figure 6</w:t>
+      </w:r>
+      <w:r>
+        <w:t xml:space="preserve">). For the remainder of this analysis, I will describe the results using the larger number of sequence.</w:t>
+      </w:r>
+    </w:p>
+    <w:p>
+      <w:pPr>
+        <w:pStyle w:val="BodyText"/>
+      </w:pPr>
+      <w:r>
+        <w:t xml:space="preserve">Similar to the PERMANOVA analysis, my KNN classification results largely replicated those observed for the sleep apnea and sponge datasets. In general, using RPCA with any number of axes resulted in median accuracies greater than 0.90 for these datasets. When using RPCA with the colorectal cancer dataset the accuracy increased modestly with the number of axes and the effect of the number of samples per group did not have a consistent effect on classification accuracy. Caution should be used in interpreting such results as there is no</w:t>
+      </w:r>
+      <w:r>
+        <w:t xml:space="preserve"> </w:t>
+      </w:r>
+      <w:r>
+        <w:rPr>
+          <w:i/>
+          <w:iCs/>
+        </w:rPr>
+        <w:t xml:space="preserve">a priori</w:t>
+      </w:r>
+      <w:r>
+        <w:t xml:space="preserve"> </w:t>
+      </w:r>
+      <w:r>
+        <w:t xml:space="preserve">reason to use more than 2 axes. Within the sponge dataset there was little variation in the classification accuracy with most methods yielding values between 0.94 and 1.00; the worst performer was using raw abundances as input to RPCA with two axes (accuracy = 0.88). Within the sleep apnea dataset the CLR-based methods and DeSeq2 transformed data outperformed the RPCA methods, which outperformed the other Euclidean-distance methods; accuracies calculated using KNN with Bray-Curtis distances performed similar to the RPCA-based methods. Finally, within the colorectal cancer dataset, KNN classification using Bray-Curtis distances outperformed the Euclidean-based distances for all transformations except when RPCA was used with 5 or 9 axes. These results again demonstrate that RPCA-based methods performed worse than other methods when the effect size was small. Even for the sponge and sleep apnea datasets the differences in accuracy were negligible relative to other methods.</w:t>
+      </w:r>
+    </w:p>
+    <w:bookmarkEnd w:id="29"/>
+    <w:bookmarkStart w:id="30" w:name="Xf0954c2286c6531201863608c794bbea5b44ece"/>
+    <w:p>
+      <w:pPr>
+        <w:pStyle w:val="Heading3"/>
+      </w:pPr>
+      <w:r>
+        <w:t xml:space="preserve">Sampling depth experiment with simulated and experimental data</w:t>
+      </w:r>
+    </w:p>
+    <w:p>
+      <w:pPr>
+        <w:pStyle w:val="FirstParagraph"/>
+      </w:pPr>
+      <w:r>
+        <w:t xml:space="preserve">To test the sensitivity of various methods to uneven sequencing effort Martino generated duplicated each of the case study samples by subsampling one copy to 500 sequences per sample and subsampling the other copy to 100 sequences per sample. They calculated distances using Jaccard, Bray-Curtis, and RPCA and then visualized the distances using ordination. Martino stated that</w:t>
+      </w:r>
+      <w:r>
+        <w:t xml:space="preserve"> </w:t>
+      </w:r>
+      <w:r>
+        <w:t xml:space="preserve">“</w:t>
+      </w:r>
+      <w:r>
+        <w:t xml:space="preserve">RPCA alleviated the clustering by sequencing depth both qualitatively and quantitatively</w:t>
+      </w:r>
+      <w:r>
+        <w:t xml:space="preserve">”</w:t>
+      </w:r>
+      <w:r>
+        <w:t xml:space="preserve">. However, in the original analysis presented in their supplementary materials, the ordinations still showed clustering by sampling depth for RPCA. Furthermore, the Jaccard and Bray-Curtis distances were not calculated using rarefaction, which is the typical strategy to control for such uneven sampling with these metrics. To reassess the sensitivity of RPCA and other methods to uneven sequencing effort, I repeated their analysis with the simulated datasets generated using the original and revised code and the case study datasets. Instead of using 100 and 500 sequences per sample, I used 5,000 and 10,000 sequences per sample. A two factor PERMANOVA design (i.e., depth and treatment group) was used to test for significant differences in the level of sequencing effort. The results of this analysis were consistent with other analyses in this and other studies (</w:t>
+      </w:r>
+      <w:r>
+        <w:rPr>
+          <w:b/>
+          <w:bCs/>
+        </w:rPr>
+        <w:t xml:space="preserve">Figure 9</w:t>
+      </w:r>
+      <w:r>
+        <w:t xml:space="preserve">). Raw counts, relative abundances, RPCA-based distances, CLR-transformed counts, DeSeq2, and CSS normalized data yielded significant differences between the number of sequences per sample. They were not able to control for uneven sampling effort. In contrast, SRA normalization, subsampling, and rarefaction consistently controlled for the effects of uneven sampling effort across the simulations.</w:t>
+      </w:r>
+    </w:p>
+    <w:bookmarkEnd w:id="30"/>
+    <w:bookmarkEnd w:id="31"/>
+    <w:bookmarkStart w:id="32" w:name="discussion"/>
+    <w:p>
+      <w:pPr>
+        <w:pStyle w:val="Heading2"/>
+      </w:pPr>
+      <w:r>
+        <w:t xml:space="preserve">Discussion</w:t>
+      </w:r>
+    </w:p>
+    <w:p>
+      <w:pPr>
+        <w:pStyle w:val="FirstParagraph"/>
+      </w:pPr>
+      <w:r>
+        <w:t xml:space="preserve">A frequent challenge in benchmarking data analysis methods is that investigators often obtain different results for the same method.</w:t>
+      </w:r>
+    </w:p>
+    <w:p>
+      <w:pPr>
+        <w:pStyle w:val="Compact"/>
         <w:numPr>
           <w:ilvl w:val="0"/>
           <w:numId w:val="1001"/>
         </w:numPr>
       </w:pPr>
       <w:r>
-        <w:t xml:space="preserve">RPCA was compared to Bray-Curtis and weighted UniFrac distances</w:t>
-      </w:r>
-      <w:r>
-        <w:t xml:space="preserve"> </w:t>
-      </w:r>
-      <w:r>
-        <w:t xml:space="preserve">Analysis compared F statistics, which again are flawed, since so much noise was removed</w:t>
+        <w:t xml:space="preserve">Overall method problems`</w:t>
       </w:r>
     </w:p>
     <w:p>
@@ -926,18 +1099,110 @@
         </w:numPr>
       </w:pPr>
       <w:r>
-        <w:t xml:space="preserve">Sleep Apnea data analysis used three axes rather than two like the Sponge dataset</w:t>
-      </w:r>
-    </w:p>
-    <w:p>
-      <w:pPr>
+        <w:t xml:space="preserve">Choice of number of partitions/axes seems arbitrary/no guidance. Controls and sponges used 2, sleep apnea used 3. Default is 3</w:t>
+      </w:r>
+    </w:p>
+    <w:p>
+      <w:pPr>
+        <w:pStyle w:val="Compact"/>
+        <w:numPr>
+          <w:ilvl w:val="1"/>
+          <w:numId w:val="1002"/>
+        </w:numPr>
+      </w:pPr>
+      <w:r>
+        <w:t xml:space="preserve">Authors acknowledged that RPCA doesn’t work on time series datasets</w:t>
+      </w:r>
+    </w:p>
+    <w:p>
+      <w:pPr>
+        <w:pStyle w:val="Compact"/>
         <w:numPr>
           <w:ilvl w:val="0"/>
           <w:numId w:val="1001"/>
         </w:numPr>
       </w:pPr>
       <w:r>
-        <w:t xml:space="preserve">RPCA not able to detect differences in CRC dataset</w:t>
+        <w:t xml:space="preserve">Benchmarking should use methods that are commonly used in the field. KNN was interesting, but not relevant. Who is using raw with matrix completion?</w:t>
+      </w:r>
+    </w:p>
+    <w:p>
+      <w:pPr>
+        <w:pStyle w:val="Compact"/>
+        <w:numPr>
+          <w:ilvl w:val="0"/>
+          <w:numId w:val="1001"/>
+        </w:numPr>
+      </w:pPr>
+      <w:r>
+        <w:t xml:space="preserve">Statistical modeling approach is appealing for building communities and treatment groups and nicely complements results found using simulations based on observed sequencing counts and sequencing depths</w:t>
+      </w:r>
+    </w:p>
+    <w:p>
+      <w:pPr>
+        <w:pStyle w:val="Compact"/>
+        <w:numPr>
+          <w:ilvl w:val="0"/>
+          <w:numId w:val="1001"/>
+        </w:numPr>
+      </w:pPr>
+      <w:r>
+        <w:t xml:space="preserve">Comment on problematic coding practices</w:t>
+      </w:r>
+    </w:p>
+    <w:p>
+      <w:pPr>
+        <w:pStyle w:val="Compact"/>
+        <w:numPr>
+          <w:ilvl w:val="0"/>
+          <w:numId w:val="1001"/>
+        </w:numPr>
+      </w:pPr>
+      <w:r>
+        <w:t xml:space="preserve">Use rarefaction</w:t>
+      </w:r>
+    </w:p>
+    <w:bookmarkEnd w:id="32"/>
+    <w:bookmarkStart w:id="33" w:name="materials-methods"/>
+    <w:p>
+      <w:pPr>
+        <w:pStyle w:val="Heading2"/>
+      </w:pPr>
+      <w:r>
+        <w:t xml:space="preserve">Materials &amp; Methods</w:t>
+      </w:r>
+    </w:p>
+    <w:p>
+      <w:pPr>
+        <w:numPr>
+          <w:ilvl w:val="0"/>
+          <w:numId w:val="1003"/>
+        </w:numPr>
+      </w:pPr>
+      <w:r>
+        <w:t xml:space="preserve">Deicode benchmarking data and code</w:t>
+      </w:r>
+    </w:p>
+    <w:p>
+      <w:pPr>
+        <w:numPr>
+          <w:ilvl w:val="0"/>
+          <w:numId w:val="1003"/>
+        </w:numPr>
+      </w:pPr>
+      <w:r>
+        <w:t xml:space="preserve">KNN analysis</w:t>
+      </w:r>
+    </w:p>
+    <w:p>
+      <w:pPr>
+        <w:numPr>
+          <w:ilvl w:val="0"/>
+          <w:numId w:val="1003"/>
+        </w:numPr>
+      </w:pPr>
+      <w:r>
+        <w:t xml:space="preserve">Description of Sampling depth experiment</w:t>
       </w:r>
     </w:p>
     <w:p>
@@ -945,11 +1210,22 @@
         <w:pStyle w:val="Compact"/>
         <w:numPr>
           <w:ilvl w:val="1"/>
+          <w:numId w:val="1004"/>
+        </w:numPr>
+      </w:pPr>
+      <w:r>
+        <w:t xml:space="preserve">adonis2 model</w:t>
+      </w:r>
+    </w:p>
+    <w:p>
+      <w:pPr>
+        <w:numPr>
+          <w:ilvl w:val="0"/>
           <w:numId w:val="1003"/>
         </w:numPr>
       </w:pPr>
       <w:r>
-        <w:t xml:space="preserve">For BC and wU, euclidean distances were calculated from first two PCoA axes and used as input to PERMANOVA</w:t>
+        <w:t xml:space="preserve">Workflow</w:t>
       </w:r>
     </w:p>
     <w:p>
@@ -957,31 +1233,45 @@
         <w:pStyle w:val="Compact"/>
         <w:numPr>
           <w:ilvl w:val="1"/>
-          <w:numId w:val="1003"/>
+          <w:numId w:val="1005"/>
         </w:numPr>
       </w:pPr>
       <w:r>
-        <w:t xml:space="preserve">when using RPCA all of the sequences in each sample were used but only 1,000 sequences per sample were used with the Bray-Curtis and weighted UniFrac distances (</w:t>
-      </w:r>
-      <w:r>
-        <w:rPr>
-          <w:b/>
-          <w:bCs/>
-        </w:rPr>
-        <w:t xml:space="preserve">Supplementary Text</w:t>
-      </w:r>
-      <w:r>
-        <w:t xml:space="preserve">).</w:t>
-      </w:r>
-    </w:p>
-    <w:bookmarkEnd w:id="28"/>
-    <w:bookmarkStart w:id="29" w:name="X89329465b068f28d56d02a6771da4ca182cbd3e"/>
-    <w:p>
-      <w:pPr>
-        <w:pStyle w:val="Heading3"/>
-      </w:pPr>
-      <w:r>
-        <w:t xml:space="preserve">KNN classification of case study datasets</w:t>
+        <w:t xml:space="preserve">Snakemake</w:t>
+      </w:r>
+    </w:p>
+    <w:p>
+      <w:pPr>
+        <w:pStyle w:val="Compact"/>
+        <w:numPr>
+          <w:ilvl w:val="1"/>
+          <w:numId w:val="1005"/>
+        </w:numPr>
+      </w:pPr>
+      <w:r>
+        <w:t xml:space="preserve">Conda - Software versions</w:t>
+      </w:r>
+    </w:p>
+    <w:p>
+      <w:pPr>
+        <w:pStyle w:val="Compact"/>
+        <w:numPr>
+          <w:ilvl w:val="1"/>
+          <w:numId w:val="1005"/>
+        </w:numPr>
+      </w:pPr>
+      <w:r>
+        <w:t xml:space="preserve">GitHub</w:t>
+      </w:r>
+    </w:p>
+    <w:bookmarkEnd w:id="33"/>
+    <w:bookmarkStart w:id="34" w:name="acknowledgements"/>
+    <w:p>
+      <w:pPr>
+        <w:pStyle w:val="Heading2"/>
+      </w:pPr>
+      <w:r>
+        <w:t xml:space="preserve">Acknowledgements</w:t>
       </w:r>
     </w:p>
     <w:p>
@@ -989,14 +1279,11 @@
         <w:pStyle w:val="Compact"/>
         <w:numPr>
           <w:ilvl w:val="0"/>
-          <w:numId w:val="1004"/>
+          <w:numId w:val="1006"/>
         </w:numPr>
       </w:pPr>
       <w:r>
-        <w:t xml:space="preserve">Used 1st 2 axes of PCoA of Bray-Curtis distances to calculate euclidean distances, which were then fed into kNN. Why not use the original Bray-Curtis distance matrix?</w:t>
-      </w:r>
-      <w:r>
-        <w:t xml:space="preserve"> </w:t>
+        <w:t xml:space="preserve">Thanks for making code publicly accessible!</w:t>
       </w:r>
     </w:p>
     <w:p>
@@ -1004,347 +1291,10 @@
         <w:pStyle w:val="Compact"/>
         <w:numPr>
           <w:ilvl w:val="0"/>
-          <w:numId w:val="1004"/>
-        </w:numPr>
-      </w:pPr>
-      <w:r>
-        <w:t xml:space="preserve">I rewrote knn algorithm to use any distance matrix and to use 100 x 80:20 splits with search for optimal k value</w:t>
-      </w:r>
-    </w:p>
-    <w:p>
-      <w:pPr>
-        <w:pStyle w:val="Compact"/>
-        <w:numPr>
-          <w:ilvl w:val="0"/>
-          <w:numId w:val="1004"/>
-        </w:numPr>
-      </w:pPr>
-      <w:r>
-        <w:t xml:space="preserve">Bray-Curtis was similar to better than RPCA for each dataset; other compositional methods performed at least as well as RPCA and better than Bray-Curtis for Sleep Apnea dataset</w:t>
-      </w:r>
-    </w:p>
-    <w:bookmarkEnd w:id="29"/>
-    <w:bookmarkStart w:id="30" w:name="Xf0954c2286c6531201863608c794bbea5b44ece"/>
-    <w:p>
-      <w:pPr>
-        <w:pStyle w:val="Heading3"/>
-      </w:pPr>
-      <w:r>
-        <w:t xml:space="preserve">Sampling depth experiment with simulated and experimental data</w:t>
-      </w:r>
-    </w:p>
-    <w:p>
-      <w:pPr>
-        <w:pStyle w:val="Compact"/>
-        <w:numPr>
-          <w:ilvl w:val="0"/>
-          <w:numId w:val="1005"/>
-        </w:numPr>
-      </w:pPr>
-      <w:r>
-        <w:t xml:space="preserve">Buried in M&amp;M was the description of an analysis and its results where Martino et al. compared the clustering of samples in an ordination where samples were duplicated and subsampled to 500 and 100 sequences per sample. They calculated distances using Jaccard, Bray-Curtis, and RPCA. They found that</w:t>
-      </w:r>
-      <w:r>
-        <w:t xml:space="preserve"> </w:t>
-      </w:r>
-      <w:r>
-        <w:t xml:space="preserve">“</w:t>
-      </w:r>
-      <w:r>
-        <w:t xml:space="preserve">RPCA alleviated the clustering by sequencing depth both qualitatively and quantitatively</w:t>
-      </w:r>
-      <w:r>
-        <w:t xml:space="preserve">”</w:t>
-      </w:r>
-    </w:p>
-    <w:p>
-      <w:pPr>
-        <w:pStyle w:val="Compact"/>
-        <w:numPr>
-          <w:ilvl w:val="1"/>
           <w:numId w:val="1006"/>
         </w:numPr>
       </w:pPr>
       <w:r>
-        <w:t xml:space="preserve">The ordinations still showed clustering by sampling depth</w:t>
-      </w:r>
-    </w:p>
-    <w:p>
-      <w:pPr>
-        <w:pStyle w:val="Compact"/>
-        <w:numPr>
-          <w:ilvl w:val="1"/>
-          <w:numId w:val="1006"/>
-        </w:numPr>
-      </w:pPr>
-      <w:r>
-        <w:t xml:space="preserve">The Jaccard and Bray-Curtis distances were not calculated using rarefaction.</w:t>
-      </w:r>
-    </w:p>
-    <w:p>
-      <w:pPr>
-        <w:pStyle w:val="Compact"/>
-        <w:numPr>
-          <w:ilvl w:val="0"/>
-          <w:numId w:val="1005"/>
-        </w:numPr>
-      </w:pPr>
-      <w:r>
-        <w:t xml:space="preserve">Repeated analysis withe the simulated and experimental data by using 5000 and 10000 sequences per sample</w:t>
-      </w:r>
-    </w:p>
-    <w:p>
-      <w:pPr>
-        <w:pStyle w:val="Compact"/>
-        <w:numPr>
-          <w:ilvl w:val="0"/>
-          <w:numId w:val="1005"/>
-        </w:numPr>
-      </w:pPr>
-      <w:r>
-        <w:t xml:space="preserve">Analyzed distances usign PERMANOVA accounting for sampling depth -&gt; Rarefaction was only method that could reliably control for the uneven sampling effort</w:t>
-      </w:r>
-    </w:p>
-    <w:bookmarkEnd w:id="30"/>
-    <w:bookmarkEnd w:id="31"/>
-    <w:bookmarkStart w:id="32" w:name="discussion"/>
-    <w:p>
-      <w:pPr>
-        <w:pStyle w:val="Heading2"/>
-      </w:pPr>
-      <w:r>
-        <w:t xml:space="preserve">Discussion</w:t>
-      </w:r>
-    </w:p>
-    <w:p>
-      <w:pPr>
-        <w:pStyle w:val="Compact"/>
-        <w:numPr>
-          <w:ilvl w:val="0"/>
-          <w:numId w:val="1007"/>
-        </w:numPr>
-      </w:pPr>
-      <w:r>
-        <w:t xml:space="preserve">Overall method problems</w:t>
-      </w:r>
-    </w:p>
-    <w:p>
-      <w:pPr>
-        <w:pStyle w:val="Compact"/>
-        <w:numPr>
-          <w:ilvl w:val="1"/>
-          <w:numId w:val="1008"/>
-        </w:numPr>
-      </w:pPr>
-      <w:r>
-        <w:t xml:space="preserve">Choice of number of partitions/axes seems arbitrary/no guidance. Controls and sponges used 2, sleep apnea used 3. Default is 3</w:t>
-      </w:r>
-    </w:p>
-    <w:p>
-      <w:pPr>
-        <w:pStyle w:val="Compact"/>
-        <w:numPr>
-          <w:ilvl w:val="1"/>
-          <w:numId w:val="1008"/>
-        </w:numPr>
-      </w:pPr>
-      <w:r>
-        <w:t xml:space="preserve">auto_rpca available within recent implementation but has since been deprecated</w:t>
-      </w:r>
-    </w:p>
-    <w:p>
-      <w:pPr>
-        <w:pStyle w:val="Compact"/>
-        <w:numPr>
-          <w:ilvl w:val="1"/>
-          <w:numId w:val="1008"/>
-        </w:numPr>
-      </w:pPr>
-      <w:r>
-        <w:t xml:space="preserve">Authors acknowledged that RPCA doesn’t work on time series datasets</w:t>
-      </w:r>
-    </w:p>
-    <w:p>
-      <w:pPr>
-        <w:pStyle w:val="Compact"/>
-        <w:numPr>
-          <w:ilvl w:val="0"/>
-          <w:numId w:val="1007"/>
-        </w:numPr>
-      </w:pPr>
-      <w:r>
-        <w:t xml:space="preserve">Benchmarking should use methods that are commonly used in the field. KNN was interesting, but not relevant. Who is using raw with matrix completion?</w:t>
-      </w:r>
-    </w:p>
-    <w:p>
-      <w:pPr>
-        <w:pStyle w:val="Compact"/>
-        <w:numPr>
-          <w:ilvl w:val="0"/>
-          <w:numId w:val="1007"/>
-        </w:numPr>
-      </w:pPr>
-      <w:r>
-        <w:t xml:space="preserve">Statistical modeling approach is appealing for building communities and treatment groups and nicely complements results found using simulations based on observed sequencing counts and sequencing depths</w:t>
-      </w:r>
-    </w:p>
-    <w:p>
-      <w:pPr>
-        <w:pStyle w:val="Compact"/>
-        <w:numPr>
-          <w:ilvl w:val="0"/>
-          <w:numId w:val="1007"/>
-        </w:numPr>
-      </w:pPr>
-      <w:r>
-        <w:t xml:space="preserve">Comment on problematic coding practices</w:t>
-      </w:r>
-    </w:p>
-    <w:p>
-      <w:pPr>
-        <w:pStyle w:val="Compact"/>
-        <w:numPr>
-          <w:ilvl w:val="0"/>
-          <w:numId w:val="1007"/>
-        </w:numPr>
-      </w:pPr>
-      <w:r>
-        <w:t xml:space="preserve">Use rarefaction</w:t>
-      </w:r>
-    </w:p>
-    <w:bookmarkEnd w:id="32"/>
-    <w:bookmarkStart w:id="33" w:name="materials-methods"/>
-    <w:p>
-      <w:pPr>
-        <w:pStyle w:val="Heading2"/>
-      </w:pPr>
-      <w:r>
-        <w:t xml:space="preserve">Materials &amp; Methods</w:t>
-      </w:r>
-    </w:p>
-    <w:p>
-      <w:pPr>
-        <w:numPr>
-          <w:ilvl w:val="0"/>
-          <w:numId w:val="1009"/>
-        </w:numPr>
-      </w:pPr>
-      <w:r>
-        <w:t xml:space="preserve">Deicode benchmarking data and code</w:t>
-      </w:r>
-    </w:p>
-    <w:p>
-      <w:pPr>
-        <w:numPr>
-          <w:ilvl w:val="0"/>
-          <w:numId w:val="1009"/>
-        </w:numPr>
-      </w:pPr>
-      <w:r>
-        <w:t xml:space="preserve">KNN analysis</w:t>
-      </w:r>
-    </w:p>
-    <w:p>
-      <w:pPr>
-        <w:numPr>
-          <w:ilvl w:val="0"/>
-          <w:numId w:val="1009"/>
-        </w:numPr>
-      </w:pPr>
-      <w:r>
-        <w:t xml:space="preserve">Description of Sampling depth experiment</w:t>
-      </w:r>
-    </w:p>
-    <w:p>
-      <w:pPr>
-        <w:pStyle w:val="Compact"/>
-        <w:numPr>
-          <w:ilvl w:val="1"/>
-          <w:numId w:val="1010"/>
-        </w:numPr>
-      </w:pPr>
-      <w:r>
-        <w:t xml:space="preserve">adonis2 model</w:t>
-      </w:r>
-    </w:p>
-    <w:p>
-      <w:pPr>
-        <w:numPr>
-          <w:ilvl w:val="0"/>
-          <w:numId w:val="1009"/>
-        </w:numPr>
-      </w:pPr>
-      <w:r>
-        <w:t xml:space="preserve">Workflow</w:t>
-      </w:r>
-    </w:p>
-    <w:p>
-      <w:pPr>
-        <w:pStyle w:val="Compact"/>
-        <w:numPr>
-          <w:ilvl w:val="1"/>
-          <w:numId w:val="1011"/>
-        </w:numPr>
-      </w:pPr>
-      <w:r>
-        <w:t xml:space="preserve">Snakemake</w:t>
-      </w:r>
-    </w:p>
-    <w:p>
-      <w:pPr>
-        <w:pStyle w:val="Compact"/>
-        <w:numPr>
-          <w:ilvl w:val="1"/>
-          <w:numId w:val="1011"/>
-        </w:numPr>
-      </w:pPr>
-      <w:r>
-        <w:t xml:space="preserve">Conda - Software versions</w:t>
-      </w:r>
-    </w:p>
-    <w:p>
-      <w:pPr>
-        <w:pStyle w:val="Compact"/>
-        <w:numPr>
-          <w:ilvl w:val="1"/>
-          <w:numId w:val="1011"/>
-        </w:numPr>
-      </w:pPr>
-      <w:r>
-        <w:t xml:space="preserve">GitHub</w:t>
-      </w:r>
-    </w:p>
-    <w:bookmarkEnd w:id="33"/>
-    <w:bookmarkStart w:id="34" w:name="acknowledgements"/>
-    <w:p>
-      <w:pPr>
-        <w:pStyle w:val="Heading2"/>
-      </w:pPr>
-      <w:r>
-        <w:t xml:space="preserve">Acknowledgements</w:t>
-      </w:r>
-    </w:p>
-    <w:p>
-      <w:pPr>
-        <w:pStyle w:val="Compact"/>
-        <w:numPr>
-          <w:ilvl w:val="0"/>
-          <w:numId w:val="1012"/>
-        </w:numPr>
-      </w:pPr>
-      <w:r>
-        <w:t xml:space="preserve">Thanks for making code publicly accessible!</w:t>
-      </w:r>
-    </w:p>
-    <w:p>
-      <w:pPr>
-        <w:pStyle w:val="Compact"/>
-        <w:numPr>
-          <w:ilvl w:val="0"/>
-          <w:numId w:val="1012"/>
-        </w:numPr>
-      </w:pPr>
-      <w:r>
         <w:t xml:space="preserve">Funding agencies</w:t>
       </w:r>
     </w:p>
@@ -1354,7 +1304,7 @@
       </w:r>
     </w:p>
     <w:bookmarkEnd w:id="34"/>
-    <w:bookmarkStart w:id="55" w:name="references"/>
+    <w:bookmarkStart w:id="67" w:name="references"/>
     <w:p>
       <w:pPr>
         <w:pStyle w:val="Heading2"/>
@@ -1526,13 +1476,25 @@
           <w:b/>
           <w:bCs/>
         </w:rPr>
-        <w:t xml:space="preserve">Figure 1. Graphical representation of an example dataset comparing communities simulated using code adapted from Martino when 4,000 sequences were sampled from each sample.</w:t>
-      </w:r>
-      <w:r>
-        <w:t xml:space="preserve"> </w:t>
-      </w:r>
-      <w:r>
-        <w:t xml:space="preserve">This figure is analogous to Figure 3D of Martino with the inclusion of additional data from simulations where samples were shared between the two treatment groups and PCoA diagrams using Bray-Curtis distances in addition to RPCA. Heatmaps display the OCLR transformation of sequence counts. The numbers on the x and y axis of each ordination diagram represent the percent of the total variation that each axis explained.</w:t>
+        <w:t xml:space="preserve">Figure 1. Rerunning the original Martino code in my computational environment produced qualitatively similar results to what the originally reported when 4,000 sequences were sampled from each sample.</w:t>
+      </w:r>
+      <w:r>
+        <w:t xml:space="preserve"> </w:t>
+      </w:r>
+      <w:r>
+        <w:t xml:space="preserve">This figure is analogous to Figure 3DE of Martino with the inclusion of additional data from simulations where there was partial overlap between the two treatment groups (</w:t>
+      </w:r>
+      <w:r>
+        <w:t xml:space="preserve">“</w:t>
+      </w:r>
+      <w:r>
+        <w:t xml:space="preserve">Overlap</w:t>
+      </w:r>
+      <w:r>
+        <w:t xml:space="preserve">”</w:t>
+      </w:r>
+      <w:r>
+        <w:t xml:space="preserve">). The red and blue bars on the left edge of the heatmap indicate the treatment group that each sample belonged to. The heatmaps display the OCLR transformation of sequence counts. In addition to the RPCA output, I also provide the PCoA diagrams using Bray-Curtis distances. The numbers on the x and y axis of each ordination diagram represent the percent of the total variation that each axis explained.</w:t>
       </w:r>
     </w:p>
     <w:p>
@@ -1596,13 +1558,13 @@
           <w:b/>
           <w:bCs/>
         </w:rPr>
-        <w:t xml:space="preserve">Figure 2. Comparison of RPCA’s performance relative to other methods of comparing communities when using PERMANOVA and KNN classification to distinguish between overlapping treatment groups.</w:t>
-      </w:r>
-      <w:r>
-        <w:t xml:space="preserve"> </w:t>
-      </w:r>
-      <w:r>
-        <w:t xml:space="preserve">This figure is analogous to Figure 3BC of Martino with the inclusion of results when using additional data transformations, Bray-Curtis distances, and 10 instead of 1 replicate simulation. Each circle represents the median of ten replicate simulations and the confidence line indicates the range between the minimum and maximum values. The median KNN classification accuracy and range were the median of 10 median values each calculated across 100 training-testing splits using the fitted K value from 80-20 splits. The vertical gray line for KNN classification indicates the accuracy one would expect from randomly guessing the treatment group.</w:t>
+        <w:t xml:space="preserve">Figure 2. RPCA-based methods did not consistently perform as well as other methods by PERMANOVA or KNN classification when attempting to distinguish between overlapping communities.</w:t>
+      </w:r>
+      <w:r>
+        <w:t xml:space="preserve"> </w:t>
+      </w:r>
+      <w:r>
+        <w:t xml:space="preserve">This figure includes data that was shown in in Figure 3BC of Martino with the inclusion of results when using additional data transformations, Bray-Curtis distances, and I used 10 instead of 1 replicate simulation. Each circle represents the median of ten replicate simulations and the confidence line indicates the range between the minimum and maximum values. The median KNN classification accuracy and range were the median of 10 median values each calculated across 100 training-testing splits using the fitted K value from 80-20 splits. The vertical gray line for KNN classification indicates the accuracy one would expect from randomly guessing the treatment group.</w:t>
       </w:r>
     </w:p>
     <w:p>
@@ -1672,7 +1634,7 @@
         <w:t xml:space="preserve"> </w:t>
       </w:r>
       <w:r>
-        <w:t xml:space="preserve">This figure is analogous to Figure 1. To highlight differences in overlap simulation, only the first and last 20 features from each sample are shown. The vertical white band indicates the break in the data presentation. The yellow vertical lines on the heatmap indicate the 12 features that are differentially represented in the two treatment groups. The white diamonds indicate features that had significantly different relative abundances when tested by a Wilcoxon test with p-values corrected using a Benjamini-Hochberg correction. For this example, the differences between the positive control (P=0.001) and overlap dataset (P=0.018) were significant by PERMANOVA and non-significant for the negative control (0.50) using Bray-Curtis distances and significant for the positive control (0.001) and non-significant for the overlap dataset (0.11) and negative (P=0.49) control using RPCA.</w:t>
+        <w:t xml:space="preserve">This figure is analogous to Figure 1. To highlight differences in overlap simulation, only the first and last 20 features from each sample are shown. The vertical white band indicates the break in the data presentation. The yellow vertical lines on the heatmap indicate the 12 features that were differentially represented in the two treatment groups. The white diamonds indicate features that had significantly different relative abundances when tested by a Wilcoxon test with P-values corrected using a Benjamini-Hochberg correction. For this example, the differences between the positive control (P=0.001) and overlap dataset (P=0.018) were significant by PERMANOVA and non-significant for the negative control (0.50) using Bray-Curtis distances and significant for the positive control (0.001) and non-significant for the overlap dataset (0.11) and negative (P=0.49) control using RPCA.</w:t>
       </w:r>
     </w:p>
     <w:p>
@@ -1736,7 +1698,7 @@
           <w:b/>
           <w:bCs/>
         </w:rPr>
-        <w:t xml:space="preserve">Figure 4. Comparison of RPCA’s performance relative to other methods of comparing communities when using PERMANOVA and KNN classification with revised simulation approach to distinguish between similar treatment groups.</w:t>
+        <w:t xml:space="preserve">Figure 4. Relative to other methods, RPCA-based methods were not as effective at differentiating between groups of communities using PERMANOVA and KNN classification when using a revised simulation approach.</w:t>
       </w:r>
       <w:r>
         <w:t xml:space="preserve"> </w:t>
@@ -1806,13 +1768,13 @@
           <w:b/>
           <w:bCs/>
         </w:rPr>
-        <w:t xml:space="preserve">Figure 5. Comparison of the number of samples and variation in sequencing depth used in the three case studies.</w:t>
-      </w:r>
-      <w:r>
-        <w:t xml:space="preserve"> </w:t>
-      </w:r>
-      <w:r>
-        <w:t xml:space="preserve">The vertical dashed line indicates the 1,000 sequence threshold, which was used by Martino and colleagues when calculating Bray-Curtis and weighted UniFrac distances. The vertical solid line indicates the higher threshold that was added in this study to explore the effects of sequencing depths. The higher threshold was 11879 sequences for the sleep apnea dataset, 13755 sequences for the sponges dataset, and 10439 sequences for the CRC dataset.</w:t>
+        <w:t xml:space="preserve">Figure 5. Martino selected an arbitrarily small number of sequences and a pair of datasets that were small relative to other available datasets.</w:t>
+      </w:r>
+      <w:r>
+        <w:t xml:space="preserve"> </w:t>
+      </w:r>
+      <w:r>
+        <w:t xml:space="preserve">The vertical dashed line indicates the 1,000 sequence threshold, which was used by Martino and colleagues when calculating Bray-Curtis and weighted UniFrac distances. The vertical solid line indicates the higher threshold that was added in this study to explore the effects of sequencing depths. The higher threshold was 11,879 sequences for the sleep apnea dataset, 13,755 sequences for the sponges dataset, and 10,439 sequences for the CRC dataset.</w:t>
       </w:r>
     </w:p>
     <w:p>
@@ -1820,37 +1782,312 @@
         <w:br w:type="page"/>
       </w:r>
     </w:p>
-    <w:bookmarkEnd w:id="55"/>
-    <w:bookmarkStart w:id="62" w:name="supplemental-figures"/>
-    <w:p>
-      <w:pPr>
-        <w:pStyle w:val="Heading2"/>
-      </w:pPr>
-      <w:r>
-        <w:t xml:space="preserve">Supplemental Figures</w:t>
-      </w:r>
-    </w:p>
-    <w:p>
-      <w:pPr>
-        <w:pStyle w:val="FirstParagraph"/>
+    <w:p>
+      <w:pPr>
+        <w:pStyle w:val="BodyText"/>
       </w:pPr>
       <w:r>
         <w:drawing>
           <wp:inline>
-            <wp:extent cx="5334000" cy="3810000"/>
+            <wp:extent cx="5334000" cy="4572000"/>
             <wp:effectExtent b="0" l="0" r="0" t="0"/>
-            <wp:docPr descr="" title="" id="57" name="Picture"/>
+            <wp:docPr descr="" title="" id="56" name="Picture"/>
             <a:graphic>
               <a:graphicData uri="http://schemas.openxmlformats.org/drawingml/2006/picture">
                 <pic:pic>
                   <pic:nvPicPr>
-                    <pic:cNvPr descr="../figures/knn_methods_martino.png" id="58" name="Picture"/>
+                    <pic:cNvPr descr="../figures/fst_knn_depth_diff_cs.png" id="57" name="Picture"/>
                     <pic:cNvPicPr>
                       <a:picLocks noChangeArrowheads="1" noChangeAspect="1"/>
                     </pic:cNvPicPr>
                   </pic:nvPicPr>
                   <pic:blipFill>
-                    <a:blip r:embed="rId56"/>
+                    <a:blip r:embed="rId55"/>
+                    <a:stretch>
+                      <a:fillRect/>
+                    </a:stretch>
+                  </pic:blipFill>
+                  <pic:spPr bwMode="auto">
+                    <a:xfrm>
+                      <a:off x="0" y="0"/>
+                      <a:ext cx="5334000" cy="4572000"/>
+                    </a:xfrm>
+                    <a:prstGeom prst="rect">
+                      <a:avLst/>
+                    </a:prstGeom>
+                    <a:noFill/>
+                    <a:ln w="9525">
+                      <a:noFill/>
+                      <a:headEnd/>
+                      <a:tailEnd/>
+                    </a:ln>
+                  </pic:spPr>
+                </pic:pic>
+              </a:graphicData>
+            </a:graphic>
+          </wp:inline>
+        </w:drawing>
+      </w:r>
+    </w:p>
+    <w:p>
+      <w:pPr>
+        <w:pStyle w:val="BodyText"/>
+      </w:pPr>
+      <w:r>
+        <w:rPr>
+          <w:b/>
+          <w:bCs/>
+        </w:rPr>
+        <w:t xml:space="preserve">Figure 6. Increasing the minimum number of sequences per sample from 1,000 to more than 10,000 resulted in larger PERMANOVA Fst test statistics and KNN accuracies.</w:t>
+      </w:r>
+      <w:r>
+        <w:t xml:space="preserve"> </w:t>
+      </w:r>
+      <w:r>
+        <w:t xml:space="preserve">Calculation of the difference in Fst was performed using values obtained when running PERMANOVA with all available samples. The difference in Bray-Curtis PCoA values was 220% and is not shown for the sleep apnea dataset because it was so much larger than the other values. Calculation of the difference in classification accuracy was performed using the largest possible balanced design, which included 78 samples for the sponges dataset, 87 samples for the sleep apnea dataset, and 229 samples for the CRC dataset. Because 10 iterations of the sample subsampling were performed we measured the difference in accuracy for each iteration. Each point represents the median difference and the confidence intervals represent the range. The vertical gray lines indicate where the Fst or accuracy was not different between using 1,000 sequences and the number of sequences indicated for that dataset in the legend.</w:t>
+      </w:r>
+    </w:p>
+    <w:p>
+      <w:r>
+        <w:br w:type="page"/>
+      </w:r>
+    </w:p>
+    <w:p>
+      <w:pPr>
+        <w:pStyle w:val="BodyText"/>
+      </w:pPr>
+      <w:r>
+        <w:drawing>
+          <wp:inline>
+            <wp:extent cx="5334000" cy="3333749"/>
+            <wp:effectExtent b="0" l="0" r="0" t="0"/>
+            <wp:docPr descr="" title="" id="59" name="Picture"/>
+            <a:graphic>
+              <a:graphicData uri="http://schemas.openxmlformats.org/drawingml/2006/picture">
+                <pic:pic>
+                  <pic:nvPicPr>
+                    <pic:cNvPr descr="../figures/heatmap_permanova_sig_cs.png" id="60" name="Picture"/>
+                    <pic:cNvPicPr>
+                      <a:picLocks noChangeArrowheads="1" noChangeAspect="1"/>
+                    </pic:cNvPicPr>
+                  </pic:nvPicPr>
+                  <pic:blipFill>
+                    <a:blip r:embed="rId58"/>
+                    <a:stretch>
+                      <a:fillRect/>
+                    </a:stretch>
+                  </pic:blipFill>
+                  <pic:spPr bwMode="auto">
+                    <a:xfrm>
+                      <a:off x="0" y="0"/>
+                      <a:ext cx="5334000" cy="3333749"/>
+                    </a:xfrm>
+                    <a:prstGeom prst="rect">
+                      <a:avLst/>
+                    </a:prstGeom>
+                    <a:noFill/>
+                    <a:ln w="9525">
+                      <a:noFill/>
+                      <a:headEnd/>
+                      <a:tailEnd/>
+                    </a:ln>
+                  </pic:spPr>
+                </pic:pic>
+              </a:graphicData>
+            </a:graphic>
+          </wp:inline>
+        </w:drawing>
+      </w:r>
+    </w:p>
+    <w:p>
+      <w:pPr>
+        <w:pStyle w:val="BodyText"/>
+      </w:pPr>
+      <w:r>
+        <w:rPr>
+          <w:b/>
+          <w:bCs/>
+        </w:rPr>
+        <w:t xml:space="preserve">Figure 7. Although all methods perform well on datasets with a large effect size between treatment groups, the RPCA-based methods suffer relative to the others when the effect size is smaller.</w:t>
+      </w:r>
+      <w:r>
+        <w:t xml:space="preserve"> </w:t>
+      </w:r>
+      <w:r>
+        <w:t xml:space="preserve">Each dataset was subsampled to the indicated number of samples per treatment group. For each of ten subsamplings, PERMANOVA was used to differentiate between the treatment groups. The number in the tile indicates the number of subsamplings that yielded a P-value less than 0.05. The blue tiles without numbers indicate those conditions where all 10 subsamplings yielded a significant result.</w:t>
+      </w:r>
+    </w:p>
+    <w:p>
+      <w:r>
+        <w:br w:type="page"/>
+      </w:r>
+    </w:p>
+    <w:p>
+      <w:pPr>
+        <w:pStyle w:val="BodyText"/>
+      </w:pPr>
+      <w:r>
+        <w:drawing>
+          <wp:inline>
+            <wp:extent cx="5334000" cy="3333749"/>
+            <wp:effectExtent b="0" l="0" r="0" t="0"/>
+            <wp:docPr descr="" title="" id="62" name="Picture"/>
+            <a:graphic>
+              <a:graphicData uri="http://schemas.openxmlformats.org/drawingml/2006/picture">
+                <pic:pic>
+                  <pic:nvPicPr>
+                    <pic:cNvPr descr="../figures/heatmap_knn_cs.png" id="63" name="Picture"/>
+                    <pic:cNvPicPr>
+                      <a:picLocks noChangeArrowheads="1" noChangeAspect="1"/>
+                    </pic:cNvPicPr>
+                  </pic:nvPicPr>
+                  <pic:blipFill>
+                    <a:blip r:embed="rId61"/>
+                    <a:stretch>
+                      <a:fillRect/>
+                    </a:stretch>
+                  </pic:blipFill>
+                  <pic:spPr bwMode="auto">
+                    <a:xfrm>
+                      <a:off x="0" y="0"/>
+                      <a:ext cx="5334000" cy="3333749"/>
+                    </a:xfrm>
+                    <a:prstGeom prst="rect">
+                      <a:avLst/>
+                    </a:prstGeom>
+                    <a:noFill/>
+                    <a:ln w="9525">
+                      <a:noFill/>
+                      <a:headEnd/>
+                      <a:tailEnd/>
+                    </a:ln>
+                  </pic:spPr>
+                </pic:pic>
+              </a:graphicData>
+            </a:graphic>
+          </wp:inline>
+        </w:drawing>
+      </w:r>
+    </w:p>
+    <w:p>
+      <w:pPr>
+        <w:pStyle w:val="BodyText"/>
+      </w:pPr>
+      <w:r>
+        <w:rPr>
+          <w:b/>
+          <w:bCs/>
+        </w:rPr>
+        <w:t xml:space="preserve">Figure 8. The RPCA-based methods performed worse or at best, no better, than other methods for classifying samples when using KNN classification.</w:t>
+      </w:r>
+      <w:r>
+        <w:t xml:space="preserve"> </w:t>
+      </w:r>
+      <w:r>
+        <w:t xml:space="preserve">Each dataset was subsampled to the indicated number of samples per treatment group 10 times and was used to train and test a KNN classifier. The value in each cell is the median accuracy amongst those subsamplings.</w:t>
+      </w:r>
+    </w:p>
+    <w:p>
+      <w:r>
+        <w:br w:type="page"/>
+      </w:r>
+    </w:p>
+    <w:p>
+      <w:pPr>
+        <w:pStyle w:val="BodyText"/>
+      </w:pPr>
+      <w:r>
+        <w:drawing>
+          <wp:inline>
+            <wp:extent cx="5334000" cy="3333749"/>
+            <wp:effectExtent b="0" l="0" r="0" t="0"/>
+            <wp:docPr descr="" title="" id="65" name="Picture"/>
+            <a:graphic>
+              <a:graphicData uri="http://schemas.openxmlformats.org/drawingml/2006/picture">
+                <pic:pic>
+                  <pic:nvPicPr>
+                    <pic:cNvPr descr="../figures/heatmap_depth_sig.png" id="66" name="Picture"/>
+                    <pic:cNvPicPr>
+                      <a:picLocks noChangeArrowheads="1" noChangeAspect="1"/>
+                    </pic:cNvPicPr>
+                  </pic:nvPicPr>
+                  <pic:blipFill>
+                    <a:blip r:embed="rId64"/>
+                    <a:stretch>
+                      <a:fillRect/>
+                    </a:stretch>
+                  </pic:blipFill>
+                  <pic:spPr bwMode="auto">
+                    <a:xfrm>
+                      <a:off x="0" y="0"/>
+                      <a:ext cx="5334000" cy="3333749"/>
+                    </a:xfrm>
+                    <a:prstGeom prst="rect">
+                      <a:avLst/>
+                    </a:prstGeom>
+                    <a:noFill/>
+                    <a:ln w="9525">
+                      <a:noFill/>
+                      <a:headEnd/>
+                      <a:tailEnd/>
+                    </a:ln>
+                  </pic:spPr>
+                </pic:pic>
+              </a:graphicData>
+            </a:graphic>
+          </wp:inline>
+        </w:drawing>
+      </w:r>
+    </w:p>
+    <w:p>
+      <w:pPr>
+        <w:pStyle w:val="BodyText"/>
+      </w:pPr>
+      <w:r>
+        <w:rPr>
+          <w:b/>
+          <w:bCs/>
+        </w:rPr>
+        <w:t xml:space="preserve">Figure 9. RPCA did not alleviate clustering of samples by sequencing depth; rarefaction and subsampling did.</w:t>
+      </w:r>
+      <w:r>
+        <w:t xml:space="preserve"> </w:t>
+      </w:r>
+      <w:r>
+        <w:t xml:space="preserve">The numbers within each cell indicate the number of simulations out of 10 that falsely gave a significant P-value for the comparison of sequencing depth. Cells without a number had no falsely significant P-values. Synthetic versions of each dataset were generated where each sample was subsampled to 5,000 and 10,000 sequences, combined, processed, and analyzed by a two-factor PERMANOVA. Each simulation was repeated 10 times.</w:t>
+      </w:r>
+    </w:p>
+    <w:bookmarkEnd w:id="67"/>
+    <w:bookmarkStart w:id="74" w:name="supplemental-figures"/>
+    <w:p>
+      <w:pPr>
+        <w:pStyle w:val="Heading2"/>
+      </w:pPr>
+      <w:r>
+        <w:t xml:space="preserve">Supplemental Figures</w:t>
+      </w:r>
+    </w:p>
+    <w:p>
+      <w:pPr>
+        <w:pStyle w:val="FirstParagraph"/>
+      </w:pPr>
+      <w:r>
+        <w:drawing>
+          <wp:inline>
+            <wp:extent cx="5334000" cy="3810000"/>
+            <wp:effectExtent b="0" l="0" r="0" t="0"/>
+            <wp:docPr descr="" title="" id="69" name="Picture"/>
+            <a:graphic>
+              <a:graphicData uri="http://schemas.openxmlformats.org/drawingml/2006/picture">
+                <pic:pic>
+                  <pic:nvPicPr>
+                    <pic:cNvPr descr="../figures/knn_methods_martino.png" id="70" name="Picture"/>
+                    <pic:cNvPicPr>
+                      <a:picLocks noChangeArrowheads="1" noChangeAspect="1"/>
+                    </pic:cNvPicPr>
+                  </pic:nvPicPr>
+                  <pic:blipFill>
+                    <a:blip r:embed="rId68"/>
                     <a:stretch>
                       <a:fillRect/>
                     </a:stretch>
@@ -1886,10 +2123,13 @@
           <w:b/>
           <w:bCs/>
         </w:rPr>
-        <w:t xml:space="preserve">Figure S1. Differences in KNN classification accuracy for distinguishing between overlapping treatment groups using different approaches to optimize the number of neighbors was negligible</w:t>
-      </w:r>
-      <w:r>
-        <w:t xml:space="preserve">. Martino split 60% of their data into a training set using 13 neighbors and tested on the remaining 40%. Following Topcuoglu et al. [</w:t>
+        <w:t xml:space="preserve">Figure S1. The choice of K and the size of the training and testing data sets had a minimal effect on KNN classification accuracy when using the original Martino overlap simulation data.</w:t>
+      </w:r>
+      <w:r>
+        <w:t xml:space="preserve"> </w:t>
+      </w:r>
+      <w:r>
+        <w:t xml:space="preserve">Martino split 60% of their data into a training set using 13 neighbors and tested on the remaining 40%. Following Topcuoglu et al. [</w:t>
       </w:r>
       <w:r>
         <w:rPr>
@@ -1899,7 +2139,7 @@
         <w:t xml:space="preserve">XXXXX</w:t>
       </w:r>
       <w:r>
-        <w:t xml:space="preserve">], I optimized the number of neighbors using 60-40 and 80-20 training-testing splits.</w:t>
+        <w:t xml:space="preserve">], I optimized the number of neighbors using 60-40 and 80-20 training-testing splits. The 80-20 data were used in this analysis.</w:t>
       </w:r>
     </w:p>
     <w:p>
@@ -1916,18 +2156,18 @@
           <wp:inline>
             <wp:extent cx="5334000" cy="3810000"/>
             <wp:effectExtent b="0" l="0" r="0" t="0"/>
-            <wp:docPr descr="" title="" id="60" name="Picture"/>
+            <wp:docPr descr="" title="" id="72" name="Picture"/>
             <a:graphic>
               <a:graphicData uri="http://schemas.openxmlformats.org/drawingml/2006/picture">
                 <pic:pic>
                   <pic:nvPicPr>
-                    <pic:cNvPr descr="../figures/knn_methods_pds.png" id="61" name="Picture"/>
+                    <pic:cNvPr descr="../figures/knn_methods_pds.png" id="73" name="Picture"/>
                     <pic:cNvPicPr>
                       <a:picLocks noChangeArrowheads="1" noChangeAspect="1"/>
                     </pic:cNvPicPr>
                   </pic:nvPicPr>
                   <pic:blipFill>
-                    <a:blip r:embed="rId59"/>
+                    <a:blip r:embed="rId71"/>
                     <a:stretch>
                       <a:fillRect/>
                     </a:stretch>
@@ -1963,10 +2203,13 @@
           <w:b/>
           <w:bCs/>
         </w:rPr>
-        <w:t xml:space="preserve">Figure S2. Differences in KNN classification accuracy for distinguishing between overlapping treatment groups using the revised simulation data by different approaches to optimize the number of neighbors was negligible</w:t>
-      </w:r>
-      <w:r>
-        <w:t xml:space="preserve">. Martino split 60% of their data into a training set using 13 neighbors and tested on the remaining 40%. Following Topcuoglu et al. [</w:t>
+        <w:t xml:space="preserve">Figure S1. The choice of K and the size of the training and testing data sets had a minimal effect on KNN classification accuracy when using the data generated by the revised simulation code.</w:t>
+      </w:r>
+      <w:r>
+        <w:t xml:space="preserve"> </w:t>
+      </w:r>
+      <w:r>
+        <w:t xml:space="preserve">Martino split 60% of their data into a training set using 13 neighbors and tested on the remaining 40%. Following Topcuoglu et al. [</w:t>
       </w:r>
       <w:r>
         <w:rPr>
@@ -1976,11 +2219,11 @@
         <w:t xml:space="preserve">XXXXX</w:t>
       </w:r>
       <w:r>
-        <w:t xml:space="preserve">], I optimized the number of neighbors using 60-40 and 80-20 training-testing splits.</w:t>
-      </w:r>
-    </w:p>
-    <w:bookmarkEnd w:id="62"/>
-    <w:bookmarkEnd w:id="63"/>
+        <w:t xml:space="preserve">], I optimized the number of neighbors using 60-40 and 80-20 training-testing splits. The 80-20 data were used in this analysis.</w:t>
+      </w:r>
+    </w:p>
+    <w:bookmarkEnd w:id="74"/>
+    <w:bookmarkEnd w:id="75"/>
     <w:sectPr/>
   </w:body>
 </w:document>
@@ -2182,24 +2425,6 @@
     <w:abstractNumId w:val="991"/>
   </w:num>
   <w:num w:numId="1006">
-    <w:abstractNumId w:val="991"/>
-  </w:num>
-  <w:num w:numId="1007">
-    <w:abstractNumId w:val="991"/>
-  </w:num>
-  <w:num w:numId="1008">
-    <w:abstractNumId w:val="991"/>
-  </w:num>
-  <w:num w:numId="1009">
-    <w:abstractNumId w:val="991"/>
-  </w:num>
-  <w:num w:numId="1010">
-    <w:abstractNumId w:val="991"/>
-  </w:num>
-  <w:num w:numId="1011">
-    <w:abstractNumId w:val="991"/>
-  </w:num>
-  <w:num w:numId="1012">
     <w:abstractNumId w:val="991"/>
   </w:num>
 </w:numbering>

</xml_diff>

<commit_message>
First draft of discussion
</commit_message>
<xml_diff>
--- a/submission/manuscript.docx
+++ b/submission/manuscript.docx
@@ -1075,19 +1075,156 @@
         <w:pStyle w:val="FirstParagraph"/>
       </w:pPr>
       <w:r>
-        <w:t xml:space="preserve">A frequent challenge in benchmarking data analysis methods is that investigators often obtain different results for the same method.</w:t>
-      </w:r>
-    </w:p>
-    <w:p>
-      <w:pPr>
-        <w:pStyle w:val="Compact"/>
+        <w:t xml:space="preserve">Results using simulated and real datasets can complement each other in studies evaluating bioinformatics tools when the true difference between treatment groups cannot be known. The simulation approach described by Martino offered a novel approach to studying the performance of various methods for controlling uneven sampling effort. Unfortunately, the simulation code had critical errors that made it impossible to meaningfully compare overlapping treatment groups. When the code was corrected and a smaller effect size was applied, the limitations of RPCA relative to other methods became clear. Because simulated data does not not always depict the complexity of real data, real datasets can be useful for demonstrating the utility of these methods. The datasets selected by Martino had large effect sizes, which limited the ability to detect variation in performance since the differences were relatively easy to detect. For example, significant P-values and median classification accuracies above 0.90 were common regardless of the method. By incorporating the colorectal cancer dataset with a smaller effect size there was more variation in the power to detect differences and classification accuracy. Under more nuanced conditions RPCA was no better than rarefaction and was often worse.</w:t>
+      </w:r>
+    </w:p>
+    <w:p>
+      <w:pPr>
+        <w:pStyle w:val="BodyText"/>
+      </w:pPr>
+      <w:r>
+        <w:t xml:space="preserve">Martino also implemented methods for evaluating RPCA relative to other strategies of controlling for uneven sampling effort that would not normally be used in a typical microbiome analysis. First, Martino benchmarked RPCA by comparing the method’s performance using raw counts or RCLR-transformed data. Missing from their benchmarking was a comparison to Bray-Curtis or UniFrac distances or use of other methods of controlling for uneven sampling effort. The result was a</w:t>
+      </w:r>
+      <w:r>
+        <w:t xml:space="preserve"> </w:t>
+      </w:r>
+      <w:r>
+        <w:t xml:space="preserve">“</w:t>
+      </w:r>
+      <w:r>
+        <w:t xml:space="preserve">straw man</w:t>
+      </w:r>
+      <w:r>
+        <w:t xml:space="preserve">”</w:t>
+      </w:r>
+      <w:r>
+        <w:t xml:space="preserve"> </w:t>
+      </w:r>
+      <w:r>
+        <w:t xml:space="preserve">comparison that made their new method appear considerably better than a method that no one would think to use. Second, they used of KNN as a classification tool rather than using logistic regression or random forest. I am unaware of other studies that have used KNN with microbiome data. When they used KNN they did so based on distances from the first two or three axes of a PCoA using a Bray-Curtis distance matrix rather than the Bray-Curtis distances themselves. The effect was a loss of information stored in higher dimensions. Even with the limitations of KNN (e.g., requirement of balanced design, distances), RPCA was outperformed by the other methods.</w:t>
+      </w:r>
+    </w:p>
+    <w:p>
+      <w:pPr>
+        <w:pStyle w:val="BodyText"/>
+      </w:pPr>
+      <w:r>
+        <w:t xml:space="preserve">Even if RPCA’s performance were better, there are several limitations inherent in the method. First, there is no guidance on selecting the number of axes one should use with RPCA. They used 2 axes with their simulated data and with the sponges dataset and used 3 axes with the sleep apnea dataset; 3 is the default value in their publicly released gemelli software for running RPCA. As I showed with the real datasets, increasing the number of axes increased the power to detect differences and the classification accuracy. This creates a scenario where users could select a number of axes to fit their expected results (aka,</w:t>
+      </w:r>
+      <w:r>
+        <w:t xml:space="preserve"> </w:t>
+      </w:r>
+      <w:r>
+        <w:t xml:space="preserve">“</w:t>
+      </w:r>
+      <w:r>
+        <w:t xml:space="preserve">P-hacking</w:t>
+      </w:r>
+      <w:r>
+        <w:t xml:space="preserve">”</w:t>
+      </w:r>
+      <w:r>
+        <w:t xml:space="preserve">). Second, as Martino indicated the method does not perform well with time series data or where there is considerable variation between the samples. This is likely when effect sizes between treatment groups are small.</w:t>
+      </w:r>
+    </w:p>
+    <w:p>
+      <w:pPr>
+        <w:pStyle w:val="BodyText"/>
+      </w:pPr>
+      <w:r>
+        <w:t xml:space="preserve">Martino made the claim that Aitchison distances calculated using RPCA are insensitive to uneven sequencing effort. The only data they provide to support this claim was found in their paper’s</w:t>
+      </w:r>
+      <w:r>
+        <w:t xml:space="preserve"> </w:t>
+      </w:r>
+      <w:r>
+        <w:t xml:space="preserve">“</w:t>
+      </w:r>
+      <w:r>
+        <w:t xml:space="preserve">Materials and Methods</w:t>
+      </w:r>
+      <w:r>
+        <w:t xml:space="preserve">”</w:t>
+      </w:r>
+      <w:r>
+        <w:t xml:space="preserve"> </w:t>
+      </w:r>
+      <w:r>
+        <w:t xml:space="preserve">section, which references their supplemental Figure 3 and supplemental Table 2. Yet, their figure shows that the RPCA ordination still clusters by sequencing depth. Unfortunately, they did not rarefy the Jaccard or Bray-Curtis distances to a common number of sequences as one would do in a real analysis. I replicated this analysis, but with a larger number of sequences per sample, with the simulated and real datasets, and using a two-factor PERMANOVA analysis. These results (</w:t>
+      </w:r>
+      <w:r>
+        <w:rPr>
+          <w:b/>
+          <w:bCs/>
+        </w:rPr>
+        <w:t xml:space="preserve">Figure 9</w:t>
+      </w:r>
+      <w:r>
+        <w:t xml:space="preserve">) confirmed that RPCA, the other CLR-based methods, using raw counts, DeSeq2, CSS normalization, and relative abundance were unable to control for uneven sampling effort in this analysis. Only rarefaction, subsampling, and SRS normalization were able to control for uneven sampling effort.</w:t>
+      </w:r>
+    </w:p>
+    <w:p>
+      <w:pPr>
+        <w:pStyle w:val="BodyText"/>
+      </w:pPr>
+      <w:r>
+        <w:t xml:space="preserve">This is my third analysis describing the effects of uneven sequencing effort and comparing the methods to control for those negative effects</w:t>
+      </w:r>
+      <w:r>
+        <w:t xml:space="preserve"> </w:t>
+      </w:r>
+      <w:r>
+        <w:rPr>
+          <w:b/>
+          <w:bCs/>
+        </w:rPr>
+        <w:t xml:space="preserve">[XXXXXXX; XXXXXXX]</w:t>
+      </w:r>
+      <w:r>
+        <w:t xml:space="preserve">. My results in this study confirm what I previously reported. The primary difference is that subsampling and SRS normalization performed as well as rarefaction. It is worth noting that in a previous analysis where I correlated sequencing depth with multiple alpha and beta diversity metrics the correlations for SRS normalization varied widely across 12 different real datasets. The benefit of rarefaction over subsampling include basing an analysis on a large number of iterations (e.g. 100 or 1,000) rather than only one. Until it is possible to obtain a uniform number of sequence reads per sample, rarefaction should be used to control for uneven sampling effort.</w:t>
+      </w:r>
+    </w:p>
+    <w:bookmarkEnd w:id="32"/>
+    <w:bookmarkStart w:id="33" w:name="materials-methods"/>
+    <w:p>
+      <w:pPr>
+        <w:pStyle w:val="Heading2"/>
+      </w:pPr>
+      <w:r>
+        <w:t xml:space="preserve">Materials &amp; Methods</w:t>
+      </w:r>
+    </w:p>
+    <w:p>
+      <w:pPr>
         <w:numPr>
           <w:ilvl w:val="0"/>
           <w:numId w:val="1001"/>
         </w:numPr>
       </w:pPr>
       <w:r>
-        <w:t xml:space="preserve">Overall method problems`</w:t>
+        <w:t xml:space="preserve">Deicode benchmarking data and code</w:t>
+      </w:r>
+    </w:p>
+    <w:p>
+      <w:pPr>
+        <w:numPr>
+          <w:ilvl w:val="0"/>
+          <w:numId w:val="1001"/>
+        </w:numPr>
+      </w:pPr>
+      <w:r>
+        <w:t xml:space="preserve">KNN analysis</w:t>
+      </w:r>
+    </w:p>
+    <w:p>
+      <w:pPr>
+        <w:numPr>
+          <w:ilvl w:val="0"/>
+          <w:numId w:val="1001"/>
+        </w:numPr>
+      </w:pPr>
+      <w:r>
+        <w:t xml:space="preserve">Description of Sampling depth experiment</w:t>
       </w:r>
     </w:p>
     <w:p>
@@ -1099,31 +1236,64 @@
         </w:numPr>
       </w:pPr>
       <w:r>
-        <w:t xml:space="preserve">Choice of number of partitions/axes seems arbitrary/no guidance. Controls and sponges used 2, sleep apnea used 3. Default is 3</w:t>
-      </w:r>
-    </w:p>
-    <w:p>
-      <w:pPr>
-        <w:pStyle w:val="Compact"/>
-        <w:numPr>
-          <w:ilvl w:val="1"/>
-          <w:numId w:val="1002"/>
-        </w:numPr>
-      </w:pPr>
-      <w:r>
-        <w:t xml:space="preserve">Authors acknowledged that RPCA doesn’t work on time series datasets</w:t>
-      </w:r>
-    </w:p>
-    <w:p>
-      <w:pPr>
-        <w:pStyle w:val="Compact"/>
+        <w:t xml:space="preserve">adonis2 model</w:t>
+      </w:r>
+    </w:p>
+    <w:p>
+      <w:pPr>
         <w:numPr>
           <w:ilvl w:val="0"/>
           <w:numId w:val="1001"/>
         </w:numPr>
       </w:pPr>
       <w:r>
-        <w:t xml:space="preserve">Benchmarking should use methods that are commonly used in the field. KNN was interesting, but not relevant. Who is using raw with matrix completion?</w:t>
+        <w:t xml:space="preserve">Workflow</w:t>
+      </w:r>
+    </w:p>
+    <w:p>
+      <w:pPr>
+        <w:pStyle w:val="Compact"/>
+        <w:numPr>
+          <w:ilvl w:val="1"/>
+          <w:numId w:val="1003"/>
+        </w:numPr>
+      </w:pPr>
+      <w:r>
+        <w:t xml:space="preserve">Snakemake</w:t>
+      </w:r>
+    </w:p>
+    <w:p>
+      <w:pPr>
+        <w:pStyle w:val="Compact"/>
+        <w:numPr>
+          <w:ilvl w:val="1"/>
+          <w:numId w:val="1003"/>
+        </w:numPr>
+      </w:pPr>
+      <w:r>
+        <w:t xml:space="preserve">Conda - Software versions</w:t>
+      </w:r>
+    </w:p>
+    <w:p>
+      <w:pPr>
+        <w:pStyle w:val="Compact"/>
+        <w:numPr>
+          <w:ilvl w:val="1"/>
+          <w:numId w:val="1003"/>
+        </w:numPr>
+      </w:pPr>
+      <w:r>
+        <w:t xml:space="preserve">GitHub</w:t>
+      </w:r>
+    </w:p>
+    <w:bookmarkEnd w:id="33"/>
+    <w:bookmarkStart w:id="34" w:name="acknowledgements"/>
+    <w:p>
+      <w:pPr>
+        <w:pStyle w:val="Heading2"/>
+      </w:pPr>
+      <w:r>
+        <w:t xml:space="preserve">Acknowledgements</w:t>
       </w:r>
     </w:p>
     <w:p>
@@ -1131,11 +1301,11 @@
         <w:pStyle w:val="Compact"/>
         <w:numPr>
           <w:ilvl w:val="0"/>
-          <w:numId w:val="1001"/>
+          <w:numId w:val="1004"/>
         </w:numPr>
       </w:pPr>
       <w:r>
-        <w:t xml:space="preserve">Statistical modeling approach is appealing for building communities and treatment groups and nicely complements results found using simulations based on observed sequencing counts and sequencing depths</w:t>
+        <w:t xml:space="preserve">Thanks for making code publicly accessible!</w:t>
       </w:r>
     </w:p>
     <w:p>
@@ -1143,155 +1313,7 @@
         <w:pStyle w:val="Compact"/>
         <w:numPr>
           <w:ilvl w:val="0"/>
-          <w:numId w:val="1001"/>
-        </w:numPr>
-      </w:pPr>
-      <w:r>
-        <w:t xml:space="preserve">Comment on problematic coding practices</w:t>
-      </w:r>
-    </w:p>
-    <w:p>
-      <w:pPr>
-        <w:pStyle w:val="Compact"/>
-        <w:numPr>
-          <w:ilvl w:val="0"/>
-          <w:numId w:val="1001"/>
-        </w:numPr>
-      </w:pPr>
-      <w:r>
-        <w:t xml:space="preserve">Use rarefaction</w:t>
-      </w:r>
-    </w:p>
-    <w:bookmarkEnd w:id="32"/>
-    <w:bookmarkStart w:id="33" w:name="materials-methods"/>
-    <w:p>
-      <w:pPr>
-        <w:pStyle w:val="Heading2"/>
-      </w:pPr>
-      <w:r>
-        <w:t xml:space="preserve">Materials &amp; Methods</w:t>
-      </w:r>
-    </w:p>
-    <w:p>
-      <w:pPr>
-        <w:numPr>
-          <w:ilvl w:val="0"/>
-          <w:numId w:val="1003"/>
-        </w:numPr>
-      </w:pPr>
-      <w:r>
-        <w:t xml:space="preserve">Deicode benchmarking data and code</w:t>
-      </w:r>
-    </w:p>
-    <w:p>
-      <w:pPr>
-        <w:numPr>
-          <w:ilvl w:val="0"/>
-          <w:numId w:val="1003"/>
-        </w:numPr>
-      </w:pPr>
-      <w:r>
-        <w:t xml:space="preserve">KNN analysis</w:t>
-      </w:r>
-    </w:p>
-    <w:p>
-      <w:pPr>
-        <w:numPr>
-          <w:ilvl w:val="0"/>
-          <w:numId w:val="1003"/>
-        </w:numPr>
-      </w:pPr>
-      <w:r>
-        <w:t xml:space="preserve">Description of Sampling depth experiment</w:t>
-      </w:r>
-    </w:p>
-    <w:p>
-      <w:pPr>
-        <w:pStyle w:val="Compact"/>
-        <w:numPr>
-          <w:ilvl w:val="1"/>
           <w:numId w:val="1004"/>
-        </w:numPr>
-      </w:pPr>
-      <w:r>
-        <w:t xml:space="preserve">adonis2 model</w:t>
-      </w:r>
-    </w:p>
-    <w:p>
-      <w:pPr>
-        <w:numPr>
-          <w:ilvl w:val="0"/>
-          <w:numId w:val="1003"/>
-        </w:numPr>
-      </w:pPr>
-      <w:r>
-        <w:t xml:space="preserve">Workflow</w:t>
-      </w:r>
-    </w:p>
-    <w:p>
-      <w:pPr>
-        <w:pStyle w:val="Compact"/>
-        <w:numPr>
-          <w:ilvl w:val="1"/>
-          <w:numId w:val="1005"/>
-        </w:numPr>
-      </w:pPr>
-      <w:r>
-        <w:t xml:space="preserve">Snakemake</w:t>
-      </w:r>
-    </w:p>
-    <w:p>
-      <w:pPr>
-        <w:pStyle w:val="Compact"/>
-        <w:numPr>
-          <w:ilvl w:val="1"/>
-          <w:numId w:val="1005"/>
-        </w:numPr>
-      </w:pPr>
-      <w:r>
-        <w:t xml:space="preserve">Conda - Software versions</w:t>
-      </w:r>
-    </w:p>
-    <w:p>
-      <w:pPr>
-        <w:pStyle w:val="Compact"/>
-        <w:numPr>
-          <w:ilvl w:val="1"/>
-          <w:numId w:val="1005"/>
-        </w:numPr>
-      </w:pPr>
-      <w:r>
-        <w:t xml:space="preserve">GitHub</w:t>
-      </w:r>
-    </w:p>
-    <w:bookmarkEnd w:id="33"/>
-    <w:bookmarkStart w:id="34" w:name="acknowledgements"/>
-    <w:p>
-      <w:pPr>
-        <w:pStyle w:val="Heading2"/>
-      </w:pPr>
-      <w:r>
-        <w:t xml:space="preserve">Acknowledgements</w:t>
-      </w:r>
-    </w:p>
-    <w:p>
-      <w:pPr>
-        <w:pStyle w:val="Compact"/>
-        <w:numPr>
-          <w:ilvl w:val="0"/>
-          <w:numId w:val="1006"/>
-        </w:numPr>
-      </w:pPr>
-      <w:r>
-        <w:t xml:space="preserve">Thanks for making code publicly accessible!</w:t>
-      </w:r>
-    </w:p>
-    <w:p>
-      <w:pPr>
-        <w:pStyle w:val="Compact"/>
-        <w:numPr>
-          <w:ilvl w:val="0"/>
-          <w:numId w:val="1006"/>
         </w:numPr>
       </w:pPr>
       <w:r>
@@ -2419,12 +2441,6 @@
     <w:abstractNumId w:val="991"/>
   </w:num>
   <w:num w:numId="1004">
-    <w:abstractNumId w:val="991"/>
-  </w:num>
-  <w:num w:numId="1005">
-    <w:abstractNumId w:val="991"/>
-  </w:num>
-  <w:num w:numId="1006">
     <w:abstractNumId w:val="991"/>
   </w:num>
 </w:numbering>

</xml_diff>

<commit_message>
First draft of M&M section
</commit_message>
<xml_diff>
--- a/submission/manuscript.docx
+++ b/submission/manuscript.docx
@@ -2,7 +2,7 @@
 <file path=word/document.xml><?xml version="1.0" encoding="utf-8"?>
 <w:document xmlns:w="http://schemas.openxmlformats.org/wordprocessingml/2006/main" xmlns:m="http://schemas.openxmlformats.org/officeDocument/2006/math" xmlns:r="http://schemas.openxmlformats.org/officeDocument/2006/relationships" xmlns:o="urn:schemas-microsoft-com:office:office" xmlns:v="urn:schemas-microsoft-com:vml" xmlns:w10="urn:schemas-microsoft-com:office:word" xmlns:a="http://schemas.openxmlformats.org/drawingml/2006/main" xmlns:pic="http://schemas.openxmlformats.org/drawingml/2006/picture" xmlns:wp="http://schemas.openxmlformats.org/drawingml/2006/wordprocessingDrawing">
   <w:body>
-    <w:bookmarkStart w:id="75" w:name="lorem-ipsum"/>
+    <w:bookmarkStart w:id="83" w:name="lorem-ipsum"/>
     <w:p>
       <w:pPr>
         <w:pStyle w:val="Heading1"/>
@@ -500,25 +500,7 @@
         <w:pStyle w:val="FirstParagraph"/>
       </w:pPr>
       <w:r>
-        <w:t xml:space="preserve">Martino made a git-based repository available on GitHub that includes the actual benchmarking code written in Python and the data used in their analysis (https://github.com/cameronmartino/deicode-benchmarking); the code and data from that repository are included as the directory</w:t>
-      </w:r>
-      <w:r>
-        <w:t xml:space="preserve"> </w:t>
-      </w:r>
-      <w:r>
-        <w:t xml:space="preserve">“</w:t>
-      </w:r>
-      <w:r>
-        <w:t xml:space="preserve">deicode_benchmarking</w:t>
-      </w:r>
-      <w:r>
-        <w:t xml:space="preserve">”</w:t>
-      </w:r>
-      <w:r>
-        <w:t xml:space="preserve"> </w:t>
-      </w:r>
-      <w:r>
-        <w:t xml:space="preserve">within repository for the current analysis (https://github.com/SchlossLab/Schloss_RPCA_mSystems_2025). To maintain a connection to the original simulations and implement a broader set of tests, several changes were necessary in the implementation of Martino’s code. First, because one goal of this study was to assess the effect of variation in sequencing effort on the performance of RPCA, I modified the parameters inputted to Martino’s code to produce more than the desired number of sequences per sample and then performed a single subsampling of the samples to 1,000, 2,000, 4,000, or 10,000 sequences per sample to have exactly the desired number of sequences per sample. Second, to account for the effect of the random number generator, instead of replicating each simulation condition only once as Martino did, I replicated each condition 10 or 100 times depending on the analysis. Third, Martino only analyzed their positive and negative control simulations with 4,000 sequences. My implementation of their simulations and subsequent tests added the sequencing depths of 1,000, 2,000, and 10,000 sequences for the positive and negative controls and for the simulations with partially overlapping treatment groups. The regenerated heatmaps and principal coordinates analysis (PCoA) plots in</w:t>
+        <w:t xml:space="preserve">To maintain a connection to Martino’s original simulations and implement a broader set of tests, several changes were necessary in the implementation of Martino’s code. First, because one goal of this study was to assess the effect of variation in sequencing effort on the performance of RPCA, I modified the parameters inputted to Martino’s code to produce more than the desired number of sequences per sample and then performed a single subsampling of the samples to 1,000, 2,000, 4,000, or 10,000 sequences per sample to have exactly the desired number of sequences per sample. Second, to account for the effect of the random number generator, instead of replicating each simulation condition only once as Martino did, I replicated each condition 10 or 100 times depending on the analysis. Third, Martino only analyzed their positive and negative control simulations with 4,000 sequences. My implementation of their simulations and subsequent tests added the sequencing depths of 1,000, 2,000, and 10,000 sequences for the positive and negative controls and for the simulations with partially overlapping treatment groups. The regenerated heatmaps and principal coordinates analysis (PCoA) plots in</w:t>
       </w:r>
       <w:r>
         <w:t xml:space="preserve"> </w:t>
@@ -1075,15 +1057,15 @@
         <w:pStyle w:val="FirstParagraph"/>
       </w:pPr>
       <w:r>
-        <w:t xml:space="preserve">Results using simulated and real datasets can complement each other in studies evaluating bioinformatics tools when the true difference between treatment groups cannot be known. The simulation approach described by Martino offered a novel approach to studying the performance of various methods for controlling uneven sampling effort. Unfortunately, the simulation code had critical errors that made it impossible to meaningfully compare overlapping treatment groups. When the code was corrected and a smaller effect size was applied, the limitations of RPCA relative to other methods became clear. Because simulated data does not not always depict the complexity of real data, real datasets can be useful for demonstrating the utility of these methods. The datasets selected by Martino had large effect sizes, which limited the ability to detect variation in performance since the differences were relatively easy to detect. For example, significant P-values and median classification accuracies above 0.90 were common regardless of the method. By incorporating the colorectal cancer dataset with a smaller effect size there was more variation in the power to detect differences and classification accuracy. Under more nuanced conditions RPCA was no better than rarefaction and was often worse.</w:t>
-      </w:r>
-    </w:p>
-    <w:p>
-      <w:pPr>
-        <w:pStyle w:val="BodyText"/>
-      </w:pPr>
-      <w:r>
-        <w:t xml:space="preserve">Martino also implemented methods for evaluating RPCA relative to other strategies of controlling for uneven sampling effort that would not normally be used in a typical microbiome analysis. First, Martino benchmarked RPCA by comparing the method’s performance using raw counts or RCLR-transformed data. Missing from their benchmarking was a comparison to Bray-Curtis or UniFrac distances or use of other methods of controlling for uneven sampling effort. The result was a</w:t>
+        <w:t xml:space="preserve">When evaluating bioinformatics tools, simulated datasets are useful when a true difference between treatment groups in a real dataset cannot be established. The simulation approach described by Martino offered a novel approach to studying the performance of various methods for controlling uneven sampling effort. Unfortunately, the simulation code had critical errors that made it impossible to meaningfully compare overlapping treatment groups. When the code was corrected and a smaller effect size was applied, the limitations of RPCA relative to other methods became clear. Because simulated data does not not always depict the complexity of real data, real datasets can be useful for demonstrating the utility of these methods. The datasets selected by Martino had large effect sizes, which limited the ability to detect variation in performance since the differences were relatively easy to detect. For example, significant P-values and median classification accuracies above 0.90 were common regardless of the method. By incorporating the colorectal cancer dataset, which had a small effect size, there was more variation in the power to detect differences and classification accuracy. Under more nuanced conditions RPCA was no better than rarefaction and was often worse.</w:t>
+      </w:r>
+    </w:p>
+    <w:p>
+      <w:pPr>
+        <w:pStyle w:val="BodyText"/>
+      </w:pPr>
+      <w:r>
+        <w:t xml:space="preserve">Martino implemented methods for evaluating RPCA relative to other strategies of controlling for uneven sampling effort that would not normally be used in a typical microbiome analysis. First, Martino benchmarked RPCA by comparing the method’s performance using raw counts or RCLR-transformed data. Missing from their benchmarking was a comparison to Bray-Curtis or UniFrac distances or use of other methods of controlling for uneven sampling effort. The result was a</w:t>
       </w:r>
       <w:r>
         <w:t xml:space="preserve"> </w:t>
@@ -1101,15 +1083,15 @@
         <w:t xml:space="preserve"> </w:t>
       </w:r>
       <w:r>
-        <w:t xml:space="preserve">comparison that made their new method appear considerably better than a method that no one would think to use. Second, they used of KNN as a classification tool rather than using logistic regression or random forest. I am unaware of other studies that have used KNN with microbiome data. When they used KNN they did so based on distances from the first two or three axes of a PCoA using a Bray-Curtis distance matrix rather than the Bray-Curtis distances themselves. The effect was a loss of information stored in higher dimensions. Even with the limitations of KNN (e.g., requirement of balanced design, distances), RPCA was outperformed by the other methods.</w:t>
-      </w:r>
-    </w:p>
-    <w:p>
-      <w:pPr>
-        <w:pStyle w:val="BodyText"/>
-      </w:pPr>
-      <w:r>
-        <w:t xml:space="preserve">Even if RPCA’s performance were better, there are several limitations inherent in the method. First, there is no guidance on selecting the number of axes one should use with RPCA. They used 2 axes with their simulated data and with the sponges dataset and used 3 axes with the sleep apnea dataset; 3 is the default value in their publicly released gemelli software for running RPCA. As I showed with the real datasets, increasing the number of axes increased the power to detect differences and the classification accuracy. This creates a scenario where users could select a number of axes to fit their expected results (aka,</w:t>
+        <w:t xml:space="preserve">comparison that made their new method appear considerably better than a method that no one would think to use. Second, they used of KNN as a classification tool rather than using logistic regression or random forest. KNN is simply not used for classifying microbiome data. Compounding the problem of using KNN was that they did so based on distances from the first two or three axes of a PCoA using a Bray-Curtis distance matrix rather than directly using the Bray-Curtis distances themselves. The effect was a loss of information stored in higher dimensions. Even with the limitations of KNN (e.g., requirement of balanced design, distances), RPCA was outperformed by the other methods.</w:t>
+      </w:r>
+    </w:p>
+    <w:p>
+      <w:pPr>
+        <w:pStyle w:val="BodyText"/>
+      </w:pPr>
+      <w:r>
+        <w:t xml:space="preserve">Even if RPCA’s performance were better, there are several limitations inherent in the method. First, there is no guidance on selecting the number of axes one should use with RPCA. They used 2 axes with their simulated data and with the sponges dataset and used 3 axes with the sleep apnea dataset; 3 is the default value in their publicly released gemelli software for running RPCA. As I showed with the real datasets, increasing the number of axes increased the power to detect differences and the classification accuracy. This creates a scenario where users could select a number of axes to fit their expected results (i.e.,</w:t>
       </w:r>
       <w:r>
         <w:t xml:space="preserve"> </w:t>
@@ -1124,15 +1106,73 @@
         <w:t xml:space="preserve">”</w:t>
       </w:r>
       <w:r>
-        <w:t xml:space="preserve">). Second, as Martino indicated the method does not perform well with time series data or where there is considerable variation between the samples. This is likely when effect sizes between treatment groups are small.</w:t>
-      </w:r>
-    </w:p>
-    <w:p>
-      <w:pPr>
-        <w:pStyle w:val="BodyText"/>
-      </w:pPr>
-      <w:r>
-        <w:t xml:space="preserve">Martino made the claim that Aitchison distances calculated using RPCA are insensitive to uneven sequencing effort. The only data they provide to support this claim was found in their paper’s</w:t>
+        <w:t xml:space="preserve">). Second, as Martino indicated the method does not perform well with time series data or where there is considerable variation between the samples. This is likely when effect sizes between treatment groups are small as is typical in most microbiome analyses.</w:t>
+      </w:r>
+    </w:p>
+    <w:p>
+      <w:pPr>
+        <w:pStyle w:val="BodyText"/>
+      </w:pPr>
+      <w:r>
+        <w:t xml:space="preserve">Martino made the claim in their paper’s Discussion section that Aitchison distances calculated using RPCA are insensitive to uneven sequencing effort. The only data they provide to support this claim was found in their paper’s Materials and Methods section, which references their supplemental Figure 3 and supplemental Table 2. Yet, that figure shows that the RPCA ordination still clustered by sequencing depth. Unfortunately, they did not rarefy the Jaccard or Bray-Curtis distances to a common number of sequences as one would do in a real analysis. I replicated this analysis, but with a larger number of sequences per sample, with the simulated and real datasets, and using a two-factor PERMANOVA analysis. These results (</w:t>
+      </w:r>
+      <w:r>
+        <w:rPr>
+          <w:b/>
+          <w:bCs/>
+        </w:rPr>
+        <w:t xml:space="preserve">Figure 9</w:t>
+      </w:r>
+      <w:r>
+        <w:t xml:space="preserve">) confirmed that RPCA, the other CLR-based methods, using raw counts, DeSeq2, CSS normalization, and relative abundance were unable to control for uneven sampling effort in this analysis. Only rarefaction, subsampling, and SRS normalization were able to control for uneven sampling effort.</w:t>
+      </w:r>
+    </w:p>
+    <w:p>
+      <w:pPr>
+        <w:pStyle w:val="BodyText"/>
+      </w:pPr>
+      <w:r>
+        <w:t xml:space="preserve">This is my third analysis describing the effects of uneven sequencing effort and comparing the methods to control for those negative effects</w:t>
+      </w:r>
+      <w:r>
+        <w:t xml:space="preserve"> </w:t>
+      </w:r>
+      <w:r>
+        <w:rPr>
+          <w:b/>
+          <w:bCs/>
+        </w:rPr>
+        <w:t xml:space="preserve">[XXXXXXX; XXXXXXX]</w:t>
+      </w:r>
+      <w:r>
+        <w:t xml:space="preserve">. My results in this study confirm what I previously reported. The primary difference is that subsampling and SRS normalization performed as well as rarefaction. It is worth noting that in a previous analysis where I correlated sequencing depth with multiple alpha and beta diversity metrics the correlations for SRS normalization varied widely across 12 different real datasets. The benefit of rarefaction over subsampling include basing an analysis on a large number of iterations (e.g. 100 or 1,000) rather than only one. Until it is possible to obtain a uniform number of sequence reads per sample, rarefaction should be used to control for uneven sampling effort.</w:t>
+      </w:r>
+    </w:p>
+    <w:bookmarkEnd w:id="32"/>
+    <w:bookmarkStart w:id="41" w:name="materials-methods"/>
+    <w:p>
+      <w:pPr>
+        <w:pStyle w:val="Heading2"/>
+      </w:pPr>
+      <w:r>
+        <w:t xml:space="preserve">Materials &amp; Methods</w:t>
+      </w:r>
+    </w:p>
+    <w:bookmarkStart w:id="33" w:name="deicode-benchmarking-data-and-code"/>
+    <w:p>
+      <w:pPr>
+        <w:pStyle w:val="Heading3"/>
+      </w:pPr>
+      <w:r>
+        <w:t xml:space="preserve">Deicode benchmarking data and code</w:t>
+      </w:r>
+    </w:p>
+    <w:p>
+      <w:pPr>
+        <w:pStyle w:val="FirstParagraph"/>
+      </w:pPr>
+      <w:r>
+        <w:t xml:space="preserve">Martino made a git-based repository available on GitHub that includes the actual benchmarking code written in Python and the data used in their analysis (https://github.com/cameronmartino/deicode-benchmarking). Deicode was the original name of the package that implemented RPCA. That functionality is now available as part of the Gemelli package. The code and data from their benchmarking repository are included as the directory</w:t>
       </w:r>
       <w:r>
         <w:t xml:space="preserve"> </w:t>
@@ -1141,7 +1181,7 @@
         <w:t xml:space="preserve">“</w:t>
       </w:r>
       <w:r>
-        <w:t xml:space="preserve">Materials and Methods</w:t>
+        <w:t xml:space="preserve">deicode_benchmarking</w:t>
       </w:r>
       <w:r>
         <w:t xml:space="preserve">”</w:t>
@@ -1150,25 +1190,61 @@
         <w:t xml:space="preserve"> </w:t>
       </w:r>
       <w:r>
-        <w:t xml:space="preserve">section, which references their supplemental Figure 3 and supplemental Table 2. Yet, their figure shows that the RPCA ordination still clusters by sequencing depth. Unfortunately, they did not rarefy the Jaccard or Bray-Curtis distances to a common number of sequences as one would do in a real analysis. I replicated this analysis, but with a larger number of sequences per sample, with the simulated and real datasets, and using a two-factor PERMANOVA analysis. These results (</w:t>
-      </w:r>
-      <w:r>
-        <w:rPr>
-          <w:b/>
-          <w:bCs/>
-        </w:rPr>
-        <w:t xml:space="preserve">Figure 9</w:t>
-      </w:r>
-      <w:r>
-        <w:t xml:space="preserve">) confirmed that RPCA, the other CLR-based methods, using raw counts, DeSeq2, CSS normalization, and relative abundance were unable to control for uneven sampling effort in this analysis. Only rarefaction, subsampling, and SRS normalization were able to control for uneven sampling effort.</w:t>
-      </w:r>
-    </w:p>
-    <w:p>
-      <w:pPr>
-        <w:pStyle w:val="BodyText"/>
-      </w:pPr>
-      <w:r>
-        <w:t xml:space="preserve">This is my third analysis describing the effects of uneven sequencing effort and comparing the methods to control for those negative effects</w:t>
+        <w:t xml:space="preserve">within repository for the current analysis (https://github.com/SchlossLab/Schloss_RPCA_mSystems_2025). A conda virtual environment was created to mimic the versions of the tools used the original simulation. The environment file is available within the current project’s repository as workflow/envs/rpca.yml</w:t>
+      </w:r>
+    </w:p>
+    <w:bookmarkEnd w:id="33"/>
+    <w:bookmarkStart w:id="34" w:name="revised-simulation-code"/>
+    <w:p>
+      <w:pPr>
+        <w:pStyle w:val="Heading3"/>
+      </w:pPr>
+      <w:r>
+        <w:t xml:space="preserve">Revised simulation code</w:t>
+      </w:r>
+    </w:p>
+    <w:p>
+      <w:pPr>
+        <w:pStyle w:val="FirstParagraph"/>
+      </w:pPr>
+      <w:r>
+        <w:t xml:space="preserve">A revised version of the simulation code was written in R as described in the Results section. The code I generated uses functions from base R and the tidyverse metapackage. The script that implements the simulation is available in the repository as workflow/scripts/simulations.R. Similar to Martino’s original Python implementation, the simulation code takes the number of samples, OTUs, treatment groups, OTUs shared between the treatment groups, and sequences to generate the simulated communities. A driver script subsampled the data to the desired number of sequences and formatted the data for downstream analysis.</w:t>
+      </w:r>
+    </w:p>
+    <w:bookmarkEnd w:id="34"/>
+    <w:bookmarkStart w:id="35" w:name="case-study-data"/>
+    <w:p>
+      <w:pPr>
+        <w:pStyle w:val="Heading3"/>
+      </w:pPr>
+      <w:r>
+        <w:t xml:space="preserve">Case study data</w:t>
+      </w:r>
+    </w:p>
+    <w:p>
+      <w:pPr>
+        <w:pStyle w:val="FirstParagraph"/>
+      </w:pPr>
+      <w:r>
+        <w:t xml:space="preserve">The operational taxonomic unit (OTU) count data and metadata for the sponges and sleep apnea datasets were obtained from the Deicode benchmarking repository. The OTU count data and metadata for the colorectal cancer dataset were obtained from a previous study where it was referred to as the</w:t>
+      </w:r>
+      <w:r>
+        <w:t xml:space="preserve"> </w:t>
+      </w:r>
+      <w:r>
+        <w:t xml:space="preserve">“</w:t>
+      </w:r>
+      <w:r>
+        <w:t xml:space="preserve">Human</w:t>
+      </w:r>
+      <w:r>
+        <w:t xml:space="preserve">”</w:t>
+      </w:r>
+      <w:r>
+        <w:t xml:space="preserve"> </w:t>
+      </w:r>
+      <w:r>
+        <w:t xml:space="preserve">dataset. Those data were generated by obtaining sequence data and metadata from the Sequence Read Archive. The sequence data was processed using the mothur software program</w:t>
       </w:r>
       <w:r>
         <w:t xml:space="preserve"> </w:t>
@@ -1181,162 +1257,356 @@
         <w:t xml:space="preserve">[XXXXXXX; XXXXXXX]</w:t>
       </w:r>
       <w:r>
-        <w:t xml:space="preserve">. My results in this study confirm what I previously reported. The primary difference is that subsampling and SRS normalization performed as well as rarefaction. It is worth noting that in a previous analysis where I correlated sequencing depth with multiple alpha and beta diversity metrics the correlations for SRS normalization varied widely across 12 different real datasets. The benefit of rarefaction over subsampling include basing an analysis on a large number of iterations (e.g. 100 or 1,000) rather than only one. Until it is possible to obtain a uniform number of sequence reads per sample, rarefaction should be used to control for uneven sampling effort.</w:t>
-      </w:r>
-    </w:p>
-    <w:bookmarkEnd w:id="32"/>
-    <w:bookmarkStart w:id="33" w:name="materials-methods"/>
+        <w:t xml:space="preserve">. This included assembling the paired reads that covered the V4 region of the 16S rRNA gene using a quality score-aware method</w:t>
+      </w:r>
+      <w:r>
+        <w:t xml:space="preserve"> </w:t>
+      </w:r>
+      <w:r>
+        <w:rPr>
+          <w:b/>
+          <w:bCs/>
+        </w:rPr>
+        <w:t xml:space="preserve">[XXXXXXX]</w:t>
+      </w:r>
+      <w:r>
+        <w:t xml:space="preserve">, aligning the assembled contig to a SILVA reference alignment</w:t>
+      </w:r>
+      <w:r>
+        <w:t xml:space="preserve"> </w:t>
+      </w:r>
+      <w:r>
+        <w:rPr>
+          <w:b/>
+          <w:bCs/>
+        </w:rPr>
+        <w:t xml:space="preserve">[XXXXXXX]</w:t>
+      </w:r>
+      <w:r>
+        <w:t xml:space="preserve">, pre-clustering to remove residual sequencing errors</w:t>
+      </w:r>
+      <w:r>
+        <w:t xml:space="preserve"> </w:t>
+      </w:r>
+      <w:r>
+        <w:rPr>
+          <w:b/>
+          <w:bCs/>
+        </w:rPr>
+        <w:t xml:space="preserve">[XXXXXXX]</w:t>
+      </w:r>
+      <w:r>
+        <w:t xml:space="preserve">, chimera checking and removal</w:t>
+      </w:r>
+      <w:r>
+        <w:t xml:space="preserve"> </w:t>
+      </w:r>
+      <w:r>
+        <w:rPr>
+          <w:b/>
+          <w:bCs/>
+        </w:rPr>
+        <w:t xml:space="preserve">[XXXXXXX]</w:t>
+      </w:r>
+      <w:r>
+        <w:t xml:space="preserve">, and clustering of sequences into OTUs using the OptiClust algorithm</w:t>
+      </w:r>
+      <w:r>
+        <w:t xml:space="preserve"> </w:t>
+      </w:r>
+      <w:r>
+        <w:rPr>
+          <w:b/>
+          <w:bCs/>
+        </w:rPr>
+        <w:t xml:space="preserve">[XXXXXXX]</w:t>
+      </w:r>
+      <w:r>
+        <w:t xml:space="preserve">; OTUs were defined a group of sequences not more than than 3% different from each other.</w:t>
+      </w:r>
+    </w:p>
+    <w:bookmarkEnd w:id="35"/>
+    <w:bookmarkStart w:id="36" w:name="X251eeaa0909877cea9d2eb29d6c13b91c9770ed"/>
+    <w:p>
+      <w:pPr>
+        <w:pStyle w:val="Heading3"/>
+      </w:pPr>
+      <w:r>
+        <w:t xml:space="preserve">Distance-based K Nearest Neighbor (KNN) classification</w:t>
+      </w:r>
+    </w:p>
+    <w:p>
+      <w:pPr>
+        <w:pStyle w:val="FirstParagraph"/>
+      </w:pPr>
+      <w:r>
+        <w:t xml:space="preserve">Martino’s KNN classification analysis used the KNeighborsClassifier function from scikit-learn</w:t>
+      </w:r>
+      <w:r>
+        <w:t xml:space="preserve"> </w:t>
+      </w:r>
+      <w:r>
+        <w:rPr>
+          <w:b/>
+          <w:bCs/>
+        </w:rPr>
+        <w:t xml:space="preserve">[XXXXXXX]</w:t>
+      </w:r>
+      <w:r>
+        <w:t xml:space="preserve">. Although that function can take a pre-computed distance matrix as input, the default was used by Martino, which is to calculate the Euclidean distance between samples in an ordination. I reimplemented an R-based version of the KNN classification method as workflow/scripts/test_train_knn.R. This method implements the training-testing framework described by Topcuoglu et al. </w:t>
+      </w:r>
+      <w:r>
+        <w:rPr>
+          <w:b/>
+          <w:bCs/>
+        </w:rPr>
+        <w:t xml:space="preserve">[XXXXXXX]</w:t>
+      </w:r>
+      <w:r>
+        <w:t xml:space="preserve"> </w:t>
+      </w:r>
+      <w:r>
+        <w:t xml:space="preserve">to fit the number of neighbors hyperparameter (i.e., K). My R script takes as input a distance matrix, a design file that assigns samples to treatment groups, the fractions of data to be used for training and testing, the number of inner and outer loops, and the hyperparameter grid for fitting K.</w:t>
+      </w:r>
+    </w:p>
+    <w:bookmarkEnd w:id="36"/>
+    <w:bookmarkStart w:id="37" w:name="X3dbde2323508f838e7799124a243e175c600604"/>
+    <w:p>
+      <w:pPr>
+        <w:pStyle w:val="Heading3"/>
+      </w:pPr>
+      <w:r>
+        <w:t xml:space="preserve">Methods of controlling for uneven sampling effort</w:t>
+      </w:r>
+    </w:p>
+    <w:p>
+      <w:pPr>
+        <w:pStyle w:val="FirstParagraph"/>
+      </w:pPr>
+      <w:r>
+        <w:t xml:space="preserve">I evaluated twelve methods for controlling for uneven sampling effort. These included using: (i) raw counts, which were the number of sequences in each OTU; (ii) the OptSpace algorithm performed on raw counts as implemented in Deicode (v.0.1.5)</w:t>
+      </w:r>
+      <w:r>
+        <w:t xml:space="preserve"> </w:t>
+      </w:r>
+      <w:r>
+        <w:rPr>
+          <w:b/>
+          <w:bCs/>
+        </w:rPr>
+        <w:t xml:space="preserve">[XXXXXXX]</w:t>
+      </w:r>
+      <w:r>
+        <w:t xml:space="preserve">; (iii) the full RCLR algorithm performed using Gemelli (v.0.0.9) with 2, 3, 5, and 9 components</w:t>
+      </w:r>
+      <w:r>
+        <w:t xml:space="preserve"> </w:t>
+      </w:r>
+      <w:r>
+        <w:rPr>
+          <w:b/>
+          <w:bCs/>
+        </w:rPr>
+        <w:t xml:space="preserve">[XXXXXXX]</w:t>
+      </w:r>
+      <w:r>
+        <w:t xml:space="preserve">; (iv) Zero CLR, which calculated the center log ratio (CLR) after imputing teh of zero counts using the zCompositions (v.1.4.0.1) R package</w:t>
+      </w:r>
+      <w:r>
+        <w:t xml:space="preserve"> </w:t>
+      </w:r>
+      <w:r>
+        <w:rPr>
+          <w:b/>
+          <w:bCs/>
+        </w:rPr>
+        <w:t xml:space="preserve">XX(49)XX</w:t>
+      </w:r>
+      <w:r>
+        <w:t xml:space="preserve">; (v) Nudge CLR, which calculated the CLR after adding a pseudo-count of 1 divided by the total number of sequences in a sample to the abundance of each OTU in the sample</w:t>
+      </w:r>
+      <w:r>
+        <w:t xml:space="preserve"> </w:t>
+      </w:r>
+      <w:r>
+        <w:rPr>
+          <w:b/>
+          <w:bCs/>
+        </w:rPr>
+        <w:t xml:space="preserve">XX(19, 24)XX</w:t>
+      </w:r>
+      <w:r>
+        <w:t xml:space="preserve">; (vi) One CLR, which calculated the CLR after adding a pseudo-count of 1 to the abundance of all of the OTUs</w:t>
+      </w:r>
+      <w:r>
+        <w:t xml:space="preserve"> </w:t>
+      </w:r>
+      <w:r>
+        <w:rPr>
+          <w:b/>
+          <w:bCs/>
+        </w:rPr>
+        <w:t xml:space="preserve">XX(19, 21)XX</w:t>
+      </w:r>
+      <w:r>
+        <w:t xml:space="preserve">; (vii) the DESeq2 R package (v.1.34.0), which was used to implement the variance stabilizing transformation to normalize the OTU counts [</w:t>
+      </w:r>
+      <w:r>
+        <w:rPr>
+          <w:b/>
+          <w:bCs/>
+        </w:rPr>
+        <w:t xml:space="preserve">(11, 48)</w:t>
+      </w:r>
+      <w:r>
+        <w:t xml:space="preserve">]; (viii) the SRS R package (v.0.2.3), which was used to normalize OTU counts using the scaled ranked subsampling algorithm [</w:t>
+      </w:r>
+      <w:r>
+        <w:rPr>
+          <w:b/>
+          <w:bCs/>
+        </w:rPr>
+        <w:t xml:space="preserve">(20)</w:t>
+      </w:r>
+      <w:r>
+        <w:t xml:space="preserve">]; (ix) the metagenomeSeq R package (v.1.36.0), which was used to normalize OTU accounts using the cumulative sum scaling (CSS) algorithm; (x) relative abundances, which were calculated as the abundance of each OTU in a sample divided by the total number of sequences in the sample; (xi) subsampling, which involved randomly selecting a specified number of sequences from each sample and removing any samples that had fewer than the desired number of sequences; (xii) rarefaction, which involved repeating subsampling 100 times and calculating a distance matrix after each iteration followed by calculating the mean distance matrix.</w:t>
+      </w:r>
+    </w:p>
+    <w:bookmarkEnd w:id="37"/>
+    <w:bookmarkStart w:id="38" w:name="Xc3e902d49a617bd15c39572934684a8a523d27e"/>
+    <w:p>
+      <w:pPr>
+        <w:pStyle w:val="Heading3"/>
+      </w:pPr>
+      <w:r>
+        <w:t xml:space="preserve">Methods for calculating distances between communities</w:t>
+      </w:r>
+    </w:p>
+    <w:p>
+      <w:pPr>
+        <w:pStyle w:val="FirstParagraph"/>
+      </w:pPr>
+      <w:r>
+        <w:t xml:space="preserve">The vegan R package (v.2.6_4) was used to calculate ecological distances matrices using the Euclidean and Bray-Curtis formulations</w:t>
+      </w:r>
+      <w:r>
+        <w:t xml:space="preserve"> </w:t>
+      </w:r>
+      <w:r>
+        <w:rPr>
+          <w:b/>
+          <w:bCs/>
+        </w:rPr>
+        <w:t xml:space="preserve">[XXXXXXX]</w:t>
+      </w:r>
+      <w:r>
+        <w:t xml:space="preserve">. Euclidean distances are not typically used in microbiome analyses because they inflate the similarity of communities. However, they are used with CLR transformed data resulting in so-called Aitchison distances. The OptSpace and RCLR algorithms outputted Euclidean distances directly from the Deicode and Gemelli software. Euclidean distances were calculated for raw counts, and data transformed by the CLR-based methods, DeSeq2, relative abundance, subsampling, and rarefaction using the vegdist function in vegan. Because OptSpace, CLR-based methods, and DeSeq2 outputted negative values, it was not possible to calculate the popular Bray-Curtis distances on those data. Bray-Curtis distances were calculated using raw counts, relative abundances, and subsampled data using the vegdist function in vegan; rarefaction was performed using vegan’s avgdist function.</w:t>
+      </w:r>
+    </w:p>
+    <w:bookmarkEnd w:id="38"/>
+    <w:bookmarkStart w:id="39" w:name="sampling-depth-simulation"/>
+    <w:p>
+      <w:pPr>
+        <w:pStyle w:val="Heading3"/>
+      </w:pPr>
+      <w:r>
+        <w:t xml:space="preserve">Sampling depth simulation</w:t>
+      </w:r>
+    </w:p>
+    <w:p>
+      <w:pPr>
+        <w:pStyle w:val="FirstParagraph"/>
+      </w:pPr>
+      <w:r>
+        <w:t xml:space="preserve">Following the approach described by Martino to assess the sensitivity of the different methods to uneven sequencing I randomly sampled 5,000 and 10,000 sequences from each of the simulation and case study datasets. These data were pooled so that each sample was represented at each of the sequencing levels. A sequencing depth variable was added to the treatment group label. Each dataset was replicated 10 times with a different random number generator seed. To test the effects of sequencing depth, I used the adonis2 function from the vegan R package (v.2.6_4)</w:t>
+      </w:r>
+      <w:r>
+        <w:t xml:space="preserve"> </w:t>
+      </w:r>
+      <w:r>
+        <w:rPr>
+          <w:b/>
+          <w:bCs/>
+        </w:rPr>
+        <w:t xml:space="preserve">[XXXXXXX]</w:t>
+      </w:r>
+      <w:r>
+        <w:t xml:space="preserve"> </w:t>
+      </w:r>
+      <w:r>
+        <w:t xml:space="preserve">to test the model:</w:t>
+      </w:r>
+    </w:p>
+    <w:p>
+      <w:pPr>
+        <w:pStyle w:val="BodyText"/>
+      </w:pPr>
+      <w:r>
+        <w:t xml:space="preserve">Distance ~ Treatment + Sequencing Depth + Treatment x Sequencing Depth</w:t>
+      </w:r>
+    </w:p>
+    <w:p>
+      <w:pPr>
+        <w:pStyle w:val="BodyText"/>
+      </w:pPr>
+      <w:r>
+        <w:t xml:space="preserve">Although this model tests for a treatment effect, it’s P-value will be biased downward. This is because every sample was artificially duplicated, which makes each treatment look more similar to itself than it really is leading to reduced the intra-treatment variation. The result is a larger F statistic and smaller P-value for the treatment effect. My analysis of this simulation focused on the significance of the sequencing depth effect.</w:t>
+      </w:r>
+    </w:p>
+    <w:bookmarkEnd w:id="39"/>
+    <w:bookmarkStart w:id="40" w:name="data-availability"/>
+    <w:p>
+      <w:pPr>
+        <w:pStyle w:val="Heading3"/>
+      </w:pPr>
+      <w:r>
+        <w:t xml:space="preserve">Data availability</w:t>
+      </w:r>
+    </w:p>
+    <w:p>
+      <w:pPr>
+        <w:pStyle w:val="FirstParagraph"/>
+      </w:pPr>
+      <w:r>
+        <w:t xml:space="preserve">No new biological data were generated in this study. The entire codebase for my analysis is available as a GitHub repository at https://github.com/SchlossLab/Schloss_RPCA_mSystems_2025. The repository includes a copy of Martino’s benchmarking repository. My repository includes a Snakemake-based workflow (v.7.32.4) includes all of the steps in the analyses described in this manuscript. The workflow uses R (v.4.3.3) and Python (v.3.11.14) packages and code. Notable R packages not already indicated included tidyverse (v.2.0.0), data.table (v.1.14.8), ggh4x (v.0.2.6), ggtext (v.0.1.2), patchwork (v.1.1.3), and quarto (v.1.4.550), Notable Python packages not already indicated included matplotlib (v.3.8.1), numpy (v.1.12.1), pandas (v.2.1.3), scikit-bio (v.0.5.9), scikit-learn (v.1.3.2), and scipy (v.1.10.0).</w:t>
+      </w:r>
+    </w:p>
+    <w:bookmarkEnd w:id="40"/>
+    <w:bookmarkEnd w:id="41"/>
+    <w:bookmarkStart w:id="42" w:name="acknowledgements"/>
     <w:p>
       <w:pPr>
         <w:pStyle w:val="Heading2"/>
       </w:pPr>
       <w:r>
-        <w:t xml:space="preserve">Materials &amp; Methods</w:t>
-      </w:r>
-    </w:p>
-    <w:p>
-      <w:pPr>
-        <w:numPr>
-          <w:ilvl w:val="0"/>
-          <w:numId w:val="1001"/>
-        </w:numPr>
-      </w:pPr>
-      <w:r>
-        <w:t xml:space="preserve">Deicode benchmarking data and code</w:t>
-      </w:r>
-    </w:p>
-    <w:p>
-      <w:pPr>
-        <w:numPr>
-          <w:ilvl w:val="0"/>
-          <w:numId w:val="1001"/>
-        </w:numPr>
-      </w:pPr>
-      <w:r>
-        <w:t xml:space="preserve">KNN analysis</w:t>
-      </w:r>
-    </w:p>
-    <w:p>
-      <w:pPr>
-        <w:numPr>
-          <w:ilvl w:val="0"/>
-          <w:numId w:val="1001"/>
-        </w:numPr>
-      </w:pPr>
-      <w:r>
-        <w:t xml:space="preserve">Description of Sampling depth experiment</w:t>
-      </w:r>
-    </w:p>
-    <w:p>
-      <w:pPr>
-        <w:pStyle w:val="Compact"/>
-        <w:numPr>
-          <w:ilvl w:val="1"/>
-          <w:numId w:val="1002"/>
-        </w:numPr>
-      </w:pPr>
-      <w:r>
-        <w:t xml:space="preserve">adonis2 model</w:t>
-      </w:r>
-    </w:p>
-    <w:p>
-      <w:pPr>
-        <w:numPr>
-          <w:ilvl w:val="0"/>
-          <w:numId w:val="1001"/>
-        </w:numPr>
-      </w:pPr>
-      <w:r>
-        <w:t xml:space="preserve">Workflow</w:t>
-      </w:r>
-    </w:p>
-    <w:p>
-      <w:pPr>
-        <w:pStyle w:val="Compact"/>
-        <w:numPr>
-          <w:ilvl w:val="1"/>
-          <w:numId w:val="1003"/>
-        </w:numPr>
-      </w:pPr>
-      <w:r>
-        <w:t xml:space="preserve">Snakemake</w:t>
-      </w:r>
-    </w:p>
-    <w:p>
-      <w:pPr>
-        <w:pStyle w:val="Compact"/>
-        <w:numPr>
-          <w:ilvl w:val="1"/>
-          <w:numId w:val="1003"/>
-        </w:numPr>
-      </w:pPr>
-      <w:r>
-        <w:t xml:space="preserve">Conda - Software versions</w:t>
-      </w:r>
-    </w:p>
-    <w:p>
-      <w:pPr>
-        <w:pStyle w:val="Compact"/>
-        <w:numPr>
-          <w:ilvl w:val="1"/>
-          <w:numId w:val="1003"/>
-        </w:numPr>
-      </w:pPr>
-      <w:r>
-        <w:t xml:space="preserve">GitHub</w:t>
-      </w:r>
-    </w:p>
-    <w:bookmarkEnd w:id="33"/>
-    <w:bookmarkStart w:id="34" w:name="acknowledgements"/>
+        <w:t xml:space="preserve">Acknowledgements</w:t>
+      </w:r>
+    </w:p>
+    <w:p>
+      <w:pPr>
+        <w:pStyle w:val="FirstParagraph"/>
+      </w:pPr>
+      <w:r>
+        <w:t xml:space="preserve">I am grateful to the reviewers of the papers describing my previous analyses who raised the question of why I saw different results from other developers who had developed methods of controlling for uneven sampling effort. I appreciate that Martino and colleagues made their benchmarking code and data publicly accessible. This study would not have been possibly without their commendable transparency.</w:t>
+      </w:r>
+    </w:p>
+    <w:p>
+      <w:r>
+        <w:br w:type="page"/>
+      </w:r>
+    </w:p>
+    <w:bookmarkEnd w:id="42"/>
+    <w:bookmarkStart w:id="75" w:name="references"/>
     <w:p>
       <w:pPr>
         <w:pStyle w:val="Heading2"/>
       </w:pPr>
       <w:r>
-        <w:t xml:space="preserve">Acknowledgements</w:t>
-      </w:r>
-    </w:p>
-    <w:p>
-      <w:pPr>
-        <w:pStyle w:val="Compact"/>
-        <w:numPr>
-          <w:ilvl w:val="0"/>
-          <w:numId w:val="1004"/>
-        </w:numPr>
-      </w:pPr>
-      <w:r>
-        <w:t xml:space="preserve">Thanks for making code publicly accessible!</w:t>
-      </w:r>
-    </w:p>
-    <w:p>
-      <w:pPr>
-        <w:pStyle w:val="Compact"/>
-        <w:numPr>
-          <w:ilvl w:val="0"/>
-          <w:numId w:val="1004"/>
-        </w:numPr>
-      </w:pPr>
-      <w:r>
-        <w:t xml:space="preserve">Funding agencies</w:t>
-      </w:r>
-    </w:p>
-    <w:p>
-      <w:r>
-        <w:br w:type="page"/>
-      </w:r>
-    </w:p>
-    <w:bookmarkEnd w:id="34"/>
-    <w:bookmarkStart w:id="67" w:name="references"/>
-    <w:p>
-      <w:pPr>
-        <w:pStyle w:val="Heading2"/>
-      </w:pPr>
-      <w:r>
         <w:t xml:space="preserve">References</w:t>
       </w:r>
     </w:p>
-    <w:bookmarkStart w:id="39" w:name="refs"/>
-    <w:bookmarkStart w:id="36" w:name="ref-Schloss2024a"/>
+    <w:bookmarkStart w:id="47" w:name="refs"/>
+    <w:bookmarkStart w:id="44" w:name="ref-Schloss2024a"/>
     <w:p>
       <w:pPr>
         <w:pStyle w:val="Bibliography"/>
@@ -1373,7 +1643,7 @@
       <w:r>
         <w:t xml:space="preserve">. doi:</w:t>
       </w:r>
-      <w:hyperlink r:id="rId35">
+      <w:hyperlink r:id="rId43">
         <w:r>
           <w:rPr>
             <w:rStyle w:val="Hyperlink"/>
@@ -1385,8 +1655,8 @@
         <w:t xml:space="preserve">.</w:t>
       </w:r>
     </w:p>
-    <w:bookmarkEnd w:id="36"/>
-    <w:bookmarkStart w:id="38" w:name="ref-Schloss2024b"/>
+    <w:bookmarkEnd w:id="44"/>
+    <w:bookmarkStart w:id="46" w:name="ref-Schloss2024b"/>
     <w:p>
       <w:pPr>
         <w:pStyle w:val="Bibliography"/>
@@ -1423,7 +1693,7 @@
       <w:r>
         <w:t xml:space="preserve">. doi:</w:t>
       </w:r>
-      <w:hyperlink r:id="rId37">
+      <w:hyperlink r:id="rId45">
         <w:r>
           <w:rPr>
             <w:rStyle w:val="Hyperlink"/>
@@ -1435,8 +1705,8 @@
         <w:t xml:space="preserve">.</w:t>
       </w:r>
     </w:p>
-    <w:bookmarkEnd w:id="38"/>
-    <w:bookmarkEnd w:id="39"/>
+    <w:bookmarkEnd w:id="46"/>
+    <w:bookmarkEnd w:id="47"/>
     <w:p>
       <w:r>
         <w:br w:type="page"/>
@@ -1451,18 +1721,18 @@
           <wp:inline>
             <wp:extent cx="4267200" cy="4267200"/>
             <wp:effectExtent b="0" l="0" r="0" t="0"/>
-            <wp:docPr descr="" title="" id="41" name="Picture"/>
+            <wp:docPr descr="" title="" id="49" name="Picture"/>
             <a:graphic>
               <a:graphicData uri="http://schemas.openxmlformats.org/drawingml/2006/picture">
                 <pic:pic>
                   <pic:nvPicPr>
-                    <pic:cNvPr descr="../figures/heatmap_pcoa_martino.png" id="42" name="Picture"/>
+                    <pic:cNvPr descr="../figures/heatmap_pcoa_martino.png" id="50" name="Picture"/>
                     <pic:cNvPicPr>
                       <a:picLocks noChangeArrowheads="1" noChangeAspect="1"/>
                     </pic:cNvPicPr>
                   </pic:nvPicPr>
                   <pic:blipFill>
-                    <a:blip r:embed="rId40"/>
+                    <a:blip r:embed="rId48"/>
                     <a:stretch>
                       <a:fillRect/>
                     </a:stretch>
@@ -1533,18 +1803,18 @@
           <wp:inline>
             <wp:extent cx="4267200" cy="3556000"/>
             <wp:effectExtent b="0" l="0" r="0" t="0"/>
-            <wp:docPr descr="" title="" id="44" name="Picture"/>
+            <wp:docPr descr="" title="" id="52" name="Picture"/>
             <a:graphic>
               <a:graphicData uri="http://schemas.openxmlformats.org/drawingml/2006/picture">
                 <pic:pic>
                   <pic:nvPicPr>
-                    <pic:cNvPr descr="../figures/fst_knn_martino.png" id="45" name="Picture"/>
+                    <pic:cNvPr descr="../figures/fst_knn_martino.png" id="53" name="Picture"/>
                     <pic:cNvPicPr>
                       <a:picLocks noChangeArrowheads="1" noChangeAspect="1"/>
                     </pic:cNvPicPr>
                   </pic:nvPicPr>
                   <pic:blipFill>
-                    <a:blip r:embed="rId43"/>
+                    <a:blip r:embed="rId51"/>
                     <a:stretch>
                       <a:fillRect/>
                     </a:stretch>
@@ -1603,18 +1873,18 @@
           <wp:inline>
             <wp:extent cx="4267200" cy="3505200"/>
             <wp:effectExtent b="0" l="0" r="0" t="0"/>
-            <wp:docPr descr="" title="" id="47" name="Picture"/>
+            <wp:docPr descr="" title="" id="55" name="Picture"/>
             <a:graphic>
               <a:graphicData uri="http://schemas.openxmlformats.org/drawingml/2006/picture">
                 <pic:pic>
                   <pic:nvPicPr>
-                    <pic:cNvPr descr="../figures/heatmap_pcoa_pds.png" id="48" name="Picture"/>
+                    <pic:cNvPr descr="../figures/heatmap_pcoa_pds.png" id="56" name="Picture"/>
                     <pic:cNvPicPr>
                       <a:picLocks noChangeArrowheads="1" noChangeAspect="1"/>
                     </pic:cNvPicPr>
                   </pic:nvPicPr>
                   <pic:blipFill>
-                    <a:blip r:embed="rId46"/>
+                    <a:blip r:embed="rId54"/>
                     <a:stretch>
                       <a:fillRect/>
                     </a:stretch>
@@ -1673,18 +1943,18 @@
           <wp:inline>
             <wp:extent cx="4267200" cy="3556000"/>
             <wp:effectExtent b="0" l="0" r="0" t="0"/>
-            <wp:docPr descr="" title="" id="50" name="Picture"/>
+            <wp:docPr descr="" title="" id="58" name="Picture"/>
             <a:graphic>
               <a:graphicData uri="http://schemas.openxmlformats.org/drawingml/2006/picture">
                 <pic:pic>
                   <pic:nvPicPr>
-                    <pic:cNvPr descr="../figures/fst_knn_pds.png" id="51" name="Picture"/>
+                    <pic:cNvPr descr="../figures/fst_knn_pds.png" id="59" name="Picture"/>
                     <pic:cNvPicPr>
                       <a:picLocks noChangeArrowheads="1" noChangeAspect="1"/>
                     </pic:cNvPicPr>
                   </pic:nvPicPr>
                   <pic:blipFill>
-                    <a:blip r:embed="rId49"/>
+                    <a:blip r:embed="rId57"/>
                     <a:stretch>
                       <a:fillRect/>
                     </a:stretch>
@@ -1743,18 +2013,18 @@
           <wp:inline>
             <wp:extent cx="4587290" cy="4587290"/>
             <wp:effectExtent b="0" l="0" r="0" t="0"/>
-            <wp:docPr descr="" title="" id="53" name="Picture"/>
+            <wp:docPr descr="" title="" id="61" name="Picture"/>
             <a:graphic>
               <a:graphicData uri="http://schemas.openxmlformats.org/drawingml/2006/picture">
                 <pic:pic>
                   <pic:nvPicPr>
-                    <pic:cNvPr descr="../figures/cs_seq_depth.png" id="54" name="Picture"/>
+                    <pic:cNvPr descr="../figures/cs_seq_depth.png" id="62" name="Picture"/>
                     <pic:cNvPicPr>
                       <a:picLocks noChangeArrowheads="1" noChangeAspect="1"/>
                     </pic:cNvPicPr>
                   </pic:nvPicPr>
                   <pic:blipFill>
-                    <a:blip r:embed="rId52"/>
+                    <a:blip r:embed="rId60"/>
                     <a:stretch>
                       <a:fillRect/>
                     </a:stretch>
@@ -1813,18 +2083,18 @@
           <wp:inline>
             <wp:extent cx="5334000" cy="4572000"/>
             <wp:effectExtent b="0" l="0" r="0" t="0"/>
-            <wp:docPr descr="" title="" id="56" name="Picture"/>
+            <wp:docPr descr="" title="" id="64" name="Picture"/>
             <a:graphic>
               <a:graphicData uri="http://schemas.openxmlformats.org/drawingml/2006/picture">
                 <pic:pic>
                   <pic:nvPicPr>
-                    <pic:cNvPr descr="../figures/fst_knn_depth_diff_cs.png" id="57" name="Picture"/>
+                    <pic:cNvPr descr="../figures/fst_knn_depth_diff_cs.png" id="65" name="Picture"/>
                     <pic:cNvPicPr>
                       <a:picLocks noChangeArrowheads="1" noChangeAspect="1"/>
                     </pic:cNvPicPr>
                   </pic:nvPicPr>
                   <pic:blipFill>
-                    <a:blip r:embed="rId55"/>
+                    <a:blip r:embed="rId63"/>
                     <a:stretch>
                       <a:fillRect/>
                     </a:stretch>
@@ -1883,18 +2153,18 @@
           <wp:inline>
             <wp:extent cx="5334000" cy="3333749"/>
             <wp:effectExtent b="0" l="0" r="0" t="0"/>
-            <wp:docPr descr="" title="" id="59" name="Picture"/>
+            <wp:docPr descr="" title="" id="67" name="Picture"/>
             <a:graphic>
               <a:graphicData uri="http://schemas.openxmlformats.org/drawingml/2006/picture">
                 <pic:pic>
                   <pic:nvPicPr>
-                    <pic:cNvPr descr="../figures/heatmap_permanova_sig_cs.png" id="60" name="Picture"/>
+                    <pic:cNvPr descr="../figures/heatmap_permanova_sig_cs.png" id="68" name="Picture"/>
                     <pic:cNvPicPr>
                       <a:picLocks noChangeArrowheads="1" noChangeAspect="1"/>
                     </pic:cNvPicPr>
                   </pic:nvPicPr>
                   <pic:blipFill>
-                    <a:blip r:embed="rId58"/>
+                    <a:blip r:embed="rId66"/>
                     <a:stretch>
                       <a:fillRect/>
                     </a:stretch>
@@ -1953,18 +2223,18 @@
           <wp:inline>
             <wp:extent cx="5334000" cy="3333749"/>
             <wp:effectExtent b="0" l="0" r="0" t="0"/>
-            <wp:docPr descr="" title="" id="62" name="Picture"/>
+            <wp:docPr descr="" title="" id="70" name="Picture"/>
             <a:graphic>
               <a:graphicData uri="http://schemas.openxmlformats.org/drawingml/2006/picture">
                 <pic:pic>
                   <pic:nvPicPr>
-                    <pic:cNvPr descr="../figures/heatmap_knn_cs.png" id="63" name="Picture"/>
+                    <pic:cNvPr descr="../figures/heatmap_knn_cs.png" id="71" name="Picture"/>
                     <pic:cNvPicPr>
                       <a:picLocks noChangeArrowheads="1" noChangeAspect="1"/>
                     </pic:cNvPicPr>
                   </pic:nvPicPr>
                   <pic:blipFill>
-                    <a:blip r:embed="rId61"/>
+                    <a:blip r:embed="rId69"/>
                     <a:stretch>
                       <a:fillRect/>
                     </a:stretch>
@@ -2023,18 +2293,18 @@
           <wp:inline>
             <wp:extent cx="5334000" cy="3333749"/>
             <wp:effectExtent b="0" l="0" r="0" t="0"/>
-            <wp:docPr descr="" title="" id="65" name="Picture"/>
+            <wp:docPr descr="" title="" id="73" name="Picture"/>
             <a:graphic>
               <a:graphicData uri="http://schemas.openxmlformats.org/drawingml/2006/picture">
                 <pic:pic>
                   <pic:nvPicPr>
-                    <pic:cNvPr descr="../figures/heatmap_depth_sig.png" id="66" name="Picture"/>
+                    <pic:cNvPr descr="../figures/heatmap_depth_sig.png" id="74" name="Picture"/>
                     <pic:cNvPicPr>
                       <a:picLocks noChangeArrowheads="1" noChangeAspect="1"/>
                     </pic:cNvPicPr>
                   </pic:nvPicPr>
                   <pic:blipFill>
-                    <a:blip r:embed="rId64"/>
+                    <a:blip r:embed="rId72"/>
                     <a:stretch>
                       <a:fillRect/>
                     </a:stretch>
@@ -2079,8 +2349,8 @@
         <w:t xml:space="preserve">The numbers within each cell indicate the number of simulations out of 10 that falsely gave a significant P-value for the comparison of sequencing depth. Cells without a number had no falsely significant P-values. Synthetic versions of each dataset were generated where each sample was subsampled to 5,000 and 10,000 sequences, combined, processed, and analyzed by a two-factor PERMANOVA. Each simulation was repeated 10 times.</w:t>
       </w:r>
     </w:p>
-    <w:bookmarkEnd w:id="67"/>
-    <w:bookmarkStart w:id="74" w:name="supplemental-figures"/>
+    <w:bookmarkEnd w:id="75"/>
+    <w:bookmarkStart w:id="82" w:name="supplemental-figures"/>
     <w:p>
       <w:pPr>
         <w:pStyle w:val="Heading2"/>
@@ -2098,18 +2368,18 @@
           <wp:inline>
             <wp:extent cx="5334000" cy="3810000"/>
             <wp:effectExtent b="0" l="0" r="0" t="0"/>
-            <wp:docPr descr="" title="" id="69" name="Picture"/>
+            <wp:docPr descr="" title="" id="77" name="Picture"/>
             <a:graphic>
               <a:graphicData uri="http://schemas.openxmlformats.org/drawingml/2006/picture">
                 <pic:pic>
                   <pic:nvPicPr>
-                    <pic:cNvPr descr="../figures/knn_methods_martino.png" id="70" name="Picture"/>
+                    <pic:cNvPr descr="../figures/knn_methods_martino.png" id="78" name="Picture"/>
                     <pic:cNvPicPr>
                       <a:picLocks noChangeArrowheads="1" noChangeAspect="1"/>
                     </pic:cNvPicPr>
                   </pic:nvPicPr>
                   <pic:blipFill>
-                    <a:blip r:embed="rId68"/>
+                    <a:blip r:embed="rId76"/>
                     <a:stretch>
                       <a:fillRect/>
                     </a:stretch>
@@ -2178,18 +2448,18 @@
           <wp:inline>
             <wp:extent cx="5334000" cy="3810000"/>
             <wp:effectExtent b="0" l="0" r="0" t="0"/>
-            <wp:docPr descr="" title="" id="72" name="Picture"/>
+            <wp:docPr descr="" title="" id="80" name="Picture"/>
             <a:graphic>
               <a:graphicData uri="http://schemas.openxmlformats.org/drawingml/2006/picture">
                 <pic:pic>
                   <pic:nvPicPr>
-                    <pic:cNvPr descr="../figures/knn_methods_pds.png" id="73" name="Picture"/>
+                    <pic:cNvPr descr="../figures/knn_methods_pds.png" id="81" name="Picture"/>
                     <pic:cNvPicPr>
                       <a:picLocks noChangeArrowheads="1" noChangeAspect="1"/>
                     </pic:cNvPicPr>
                   </pic:nvPicPr>
                   <pic:blipFill>
-                    <a:blip r:embed="rId71"/>
+                    <a:blip r:embed="rId79"/>
                     <a:stretch>
                       <a:fillRect/>
                     </a:stretch>
@@ -2244,8 +2514,8 @@
         <w:t xml:space="preserve">], I optimized the number of neighbors using 60-40 and 80-20 training-testing splits. The 80-20 data were used in this analysis.</w:t>
       </w:r>
     </w:p>
-    <w:bookmarkEnd w:id="74"/>
-    <w:bookmarkEnd w:id="75"/>
+    <w:bookmarkEnd w:id="82"/>
+    <w:bookmarkEnd w:id="83"/>
     <w:sectPr/>
   </w:body>
 </w:document>
@@ -2352,96 +2622,8 @@
       </w:pPr>
     </w:lvl>
   </w:abstractNum>
-  <w:abstractNum w:abstractNumId="991">
-    <w:nsid w:val="0000A991"/>
-    <w:multiLevelType w:val="multilevel"/>
-    <w:lvl w:ilvl="0">
-      <w:numFmt w:val="bullet"/>
-      <w:lvlText w:val="•"/>
-      <w:lvlJc w:val="left"/>
-      <w:pPr>
-        <w:ind w:left="720" w:hanging="480"/>
-      </w:pPr>
-    </w:lvl>
-    <w:lvl w:ilvl="1">
-      <w:numFmt w:val="bullet"/>
-      <w:lvlText w:val="–"/>
-      <w:lvlJc w:val="left"/>
-      <w:pPr>
-        <w:ind w:left="1440" w:hanging="480"/>
-      </w:pPr>
-    </w:lvl>
-    <w:lvl w:ilvl="2">
-      <w:numFmt w:val="bullet"/>
-      <w:lvlText w:val="•"/>
-      <w:lvlJc w:val="left"/>
-      <w:pPr>
-        <w:ind w:left="2160" w:hanging="480"/>
-      </w:pPr>
-    </w:lvl>
-    <w:lvl w:ilvl="3">
-      <w:numFmt w:val="bullet"/>
-      <w:lvlText w:val="–"/>
-      <w:lvlJc w:val="left"/>
-      <w:pPr>
-        <w:ind w:left="2880" w:hanging="480"/>
-      </w:pPr>
-    </w:lvl>
-    <w:lvl w:ilvl="4">
-      <w:numFmt w:val="bullet"/>
-      <w:lvlText w:val="•"/>
-      <w:lvlJc w:val="left"/>
-      <w:pPr>
-        <w:ind w:left="3600" w:hanging="480"/>
-      </w:pPr>
-    </w:lvl>
-    <w:lvl w:ilvl="5">
-      <w:numFmt w:val="bullet"/>
-      <w:lvlText w:val="–"/>
-      <w:lvlJc w:val="left"/>
-      <w:pPr>
-        <w:ind w:left="4320" w:hanging="480"/>
-      </w:pPr>
-    </w:lvl>
-    <w:lvl w:ilvl="6">
-      <w:numFmt w:val="bullet"/>
-      <w:lvlText w:val="•"/>
-      <w:lvlJc w:val="left"/>
-      <w:pPr>
-        <w:ind w:left="5040" w:hanging="480"/>
-      </w:pPr>
-    </w:lvl>
-    <w:lvl w:ilvl="7">
-      <w:numFmt w:val="bullet"/>
-      <w:lvlText w:val="–"/>
-      <w:lvlJc w:val="left"/>
-      <w:pPr>
-        <w:ind w:left="5760" w:hanging="480"/>
-      </w:pPr>
-    </w:lvl>
-    <w:lvl w:ilvl="8">
-      <w:numFmt w:val="bullet"/>
-      <w:lvlText w:val="•"/>
-      <w:lvlJc w:val="left"/>
-      <w:pPr>
-        <w:ind w:left="6480" w:hanging="480"/>
-      </w:pPr>
-    </w:lvl>
-  </w:abstractNum>
   <w:num w:numId="1000">
     <w:abstractNumId w:val="990"/>
-  </w:num>
-  <w:num w:numId="1001">
-    <w:abstractNumId w:val="991"/>
-  </w:num>
-  <w:num w:numId="1002">
-    <w:abstractNumId w:val="991"/>
-  </w:num>
-  <w:num w:numId="1003">
-    <w:abstractNumId w:val="991"/>
-  </w:num>
-  <w:num w:numId="1004">
-    <w:abstractNumId w:val="991"/>
   </w:num>
 </w:numbering>
 </file>

</xml_diff>

<commit_message>
Incorporate weighted UniFrac results
</commit_message>
<xml_diff>
--- a/submission/manuscript.docx
+++ b/submission/manuscript.docx
@@ -2,7 +2,7 @@
 <file path=word/document.xml><?xml version="1.0" encoding="utf-8"?>
 <w:document xmlns:w="http://schemas.openxmlformats.org/wordprocessingml/2006/main" xmlns:m="http://schemas.openxmlformats.org/officeDocument/2006/math" xmlns:r="http://schemas.openxmlformats.org/officeDocument/2006/relationships" xmlns:o="urn:schemas-microsoft-com:office:office" xmlns:v="urn:schemas-microsoft-com:vml" xmlns:w10="urn:schemas-microsoft-com:office:word" xmlns:a="http://schemas.openxmlformats.org/drawingml/2006/main" xmlns:pic="http://schemas.openxmlformats.org/drawingml/2006/picture" xmlns:wp="http://schemas.openxmlformats.org/drawingml/2006/wordprocessingDrawing">
   <w:body>
-    <w:bookmarkStart w:id="157" w:name="Xbf73aabfc4f0f0b9a786df1d6b09b19feeb724b"/>
+    <w:bookmarkStart w:id="128" w:name="Xbf73aabfc4f0f0b9a786df1d6b09b19feeb724b"/>
     <w:p>
       <w:pPr>
         <w:pStyle w:val="Heading1"/>
@@ -799,7 +799,7 @@
         <w:t xml:space="preserve">Supplementary Text</w:t>
       </w:r>
       <w:r>
-        <w:t xml:space="preserve">. Aside from the selection of datasets with large effect sizes that were visible using the first two PCoA axes, the principle problems included (i) performing a single subsampling the samples in each data to an artificially low number of sequences (i.e., 1,000) for the Bray-Curtis and weighted UniFrac distance calculations; (ii) they performed 9 rather than the 10 random subsamples of the datasets when generating balanced designs of the data sets, as was described in the manuscript; (iii) running RPCA with a rank of 3 for the sleep apnea dataset rather than 2 as was described in the manuscript; (iv) significant problems in the training and testing of the KNN classification to the data including the selection of the hyperparameter, lack of balance design in the stratifications, and only performing a single iteration; and (v) only using two PCoA axes rather than the actual Bray-Curtis and weighted UniFrac distances in the KNN classification. The following analyses used the remedies as described in the</w:t>
+        <w:t xml:space="preserve">. Aside from the selection of datasets with large effect sizes that were visible using the first two PCoA axes, the principle problems included (i) performing a single subsampling the samples in each data to an artificially low number of sequences (i.e., 1,000) for the Bray-Curtis and weighted UniFrac distance calculations; (ii) removal of sequences for the Bray-Curtis and weighted UniFrac distance calculations prior to subsampling that weren’t removed from the RPCA analysis because the trees were missing sequences; (iii) they performed 9 rather than the 10 random subsamples of the datasets when generating balanced designs of the data sets, as was described in the manuscript; (iv) running RPCA with a rank of 3 for the sleep apnea dataset rather than 2 as was described in the manuscript; (v) significant problems in the training and testing of the KNN classification to the data including the selection of the hyperparameter, lack of balance design in the stratifications, and only performing a single iteration; and (vi) only using two PCoA axes rather than the actual Bray-Curtis and weighted UniFrac distances in the KNN classification. The following analyses used the remedies as described in the</w:t>
       </w:r>
       <w:r>
         <w:t xml:space="preserve"> </w:t>
@@ -820,7 +820,7 @@
         <w:pStyle w:val="BodyText"/>
       </w:pPr>
       <w:r>
-        <w:t xml:space="preserve">Similar to the analysis of the simulated datasets, pairwise Euclidean distances were calculated using 2 or 3 RPCA axes, Nudge, One, and Zero CLR transformed data, PCA and DeSeq2 transformed raw counts, raw counts, relative abundance data, single subsampling, rarefaction, and based on the first two PCoA axes using Bray-Curtis distances. Pairwise Bray-Curtis distances were calculated using raw counts, relative abundance data, SRS and CSS normalized data, single subsampling, and rarefaction. My analysis did not include the weighted UniFrac distances since reliable trees are difficult to generate for large datasets and because previous experience has demonstrated that results of Bray-Curtis and weighted UniFrac distances rarely disagree.</w:t>
+        <w:t xml:space="preserve">Similar to the analysis of the simulated datasets, pairwise Euclidean distances were calculated using 2 or 3 RPCA axes, Nudge, One, and Zero CLR transformed data, PCA and DeSeq2 transformed raw counts, raw counts, relative abundance data, single subsampling, rarefaction, and based on the first two PCoA axes using Bray-Curtis distances. Pairwise Bray-Curtis distances were calculated using raw counts, relative abundance data, SRS and CSS normalized data, single subsampling, and rarefaction. Pairwise weighted UniFrac distances were calculated using raw counts, SRS, single subsampling, and rarefaction. To generate the trees needed to calculate the weighted UniFrac distances I used the mothur software package to align the sequences, calculate pairwise distances, and generate a neighbor joining phylogenetic tree.</w:t>
       </w:r>
     </w:p>
     <w:bookmarkEnd w:id="27"/>
@@ -838,7 +838,7 @@
         <w:pStyle w:val="FirstParagraph"/>
       </w:pPr>
       <w:r>
-        <w:t xml:space="preserve">I repeated Martino’s PERMANOVA analysis to test whether the average beta-diversity was significantly different between the two treatment groups within each of the three case studies. Their analysis varied the number of samples per treatment group to maintain a balanced design. This choice was peculiar since PERMANOVA is not sensitive to unbalanced sampling. When I used all of the samples available and performed the PERMANOVA analysis, the only dataset and methods that did not yield a significant result was for the colorectal cancer dataset using RPCA with 2 or 3 axes (P = 0.11 and 0.07, respectively). A second peculiar choice was to subsample the number of sequences to 1,000 sequences per sample when calculating Bray-Curtis distances but to use all of the sequences with RPCA. They could have increased the number of sequences by more than ten-fold without adversely impacting the number of samples in their analysis (</w:t>
+        <w:t xml:space="preserve">I repeated Martino’s PERMANOVA analysis to test whether the average beta-diversity was significantly different between the two treatment groups within each of the three case studies. Their analysis varied the number of samples per treatment group to maintain a balanced design. This choice was peculiar since PERMANOVA is not sensitive to unbalanced sampling. When I used all of the samples available and performed the PERMANOVA analysis, the only dataset and methods that did not yield a significant result was for the colorectal cancer dataset using RPCA with 2 or 3 axes (P = 0.09 and 0.06, respectively). A second peculiar choice was to subsample the number of sequences to 1,000 sequences per sample when calculating Bray-Curtis distances but to use all of the sequences with RPCA. They could have increased the number of sequences by more than ten-fold without adversely impacting the number of samples in their analysis (</w:t>
       </w:r>
       <w:r>
         <w:rPr>
@@ -1018,19 +1018,7 @@
         <w:pStyle w:val="BodyText"/>
       </w:pPr>
       <w:r>
-        <w:t xml:space="preserve">Martino implemented methods for evaluating RPCA relative to other strategies of controlling for uneven sampling effort that would not normally be used in a typical microbiome analysis. First, Martino benchmarked RPCA by comparing the method’s performance using raw counts or RCLR-transformed data. Missing from their benchmarking was a comparison to Bray-Curtis or UniFrac distances or use of other methods of controlling for uneven sampling effort. The result was a</w:t>
-      </w:r>
-      <w:r>
-        <w:t xml:space="preserve"> </w:t>
-      </w:r>
-      <w:r>
-        <w:t xml:space="preserve">“straw man”</w:t>
-      </w:r>
-      <w:r>
-        <w:t xml:space="preserve"> </w:t>
-      </w:r>
-      <w:r>
-        <w:t xml:space="preserve">comparison that made their new method appear considerably better than a method that no one else has used in a published microbiome analysis. Second, they used KNN as a classification tool rather than using logistic regression or random forest. KNN is simply not used for classifying microbiome data. Compounding the problem of using KNN was that they did so based on distances from the first two or three axes of a PCoA using a Bray-Curtis or weighted UniFrac distance matrices rather than directly using the ecological distances themselves. The effect was a loss of information stored in higher dimensions. Even with the limitations of KNN (e.g., requirement of balanced design), RPCA was outperformed by the other methods.</w:t>
+        <w:t xml:space="preserve">Martino implemented methods for evaluating RPCA relative to other strategies of controlling for uneven sampling effort that would not normally be used in a typical microbiome analysis. First, Martino benchmarked RPCA by comparing the method’s performance using raw counts or RCLR-transformed data. Missing from their benchmarking was a comparison to Bray-Curtis or UniFrac distances or use of other methods of controlling for uneven sampling effort. The result was a comparison that made their new method appear considerably better than a method that no one else has used in a published microbiome analysis. Second, they used KNN as a classification tool rather than using logistic regression or random forest. KNN is simply not used for classifying microbiome data. Compounding the problem of using KNN was that they did so based on distances from the first two or three axes of a PCoA using a Bray-Curtis or weighted UniFrac distance matrices rather than directly using the ecological distances themselves. The effect was a loss of information stored in higher dimensions. Even with the limitations of KNN (e.g., requirement of balanced design), RPCA was outperformed by the other methods.</w:t>
       </w:r>
     </w:p>
     <w:p>
@@ -1157,7 +1145,37 @@
         <w:pStyle w:val="FirstParagraph"/>
       </w:pPr>
       <w:r>
-        <w:t xml:space="preserve">The operational taxonomic unit (OTU) count data and metadata for the sponges and sleep apnea datasets were obtained from the Deicode benchmarking repository. The OTU count data and metadata for the colorectal cancer dataset were obtained from a previous study where it was referred to as the</w:t>
+        <w:t xml:space="preserve">The operational taxonomic unit (OTU) count data and metadata for the sponges and sleep apnea datasets were obtained from the Deicode benchmarking repository. Because the trees that were included with the benchmarking repository did not contain all of the sequences contained within the OTU tables, I generated new trees. The OTU identifiers in the count data were the DNA sequences. I aligned the sequences to the NR v138.2 SILVA reference alignment</w:t>
+      </w:r>
+      <w:r>
+        <w:t xml:space="preserve"> </w:t>
+      </w:r>
+      <w:r>
+        <w:t xml:space="preserve">(29, 30)</w:t>
+      </w:r>
+      <w:r>
+        <w:t xml:space="preserve"> </w:t>
+      </w:r>
+      <w:r>
+        <w:t xml:space="preserve">and calculated pairwise distances</w:t>
+      </w:r>
+      <w:r>
+        <w:t xml:space="preserve"> </w:t>
+      </w:r>
+      <w:r>
+        <w:t xml:space="preserve">(31)</w:t>
+      </w:r>
+      <w:r>
+        <w:t xml:space="preserve">. These distances were used as input to generate traditional neighbor joining trees</w:t>
+      </w:r>
+      <w:r>
+        <w:t xml:space="preserve"> </w:t>
+      </w:r>
+      <w:r>
+        <w:t xml:space="preserve">(32)</w:t>
+      </w:r>
+      <w:r>
+        <w:t xml:space="preserve">. The OTU count data and metadata for the colorectal cancer dataset were obtained from a previous study where it was referred to as the</w:t>
       </w:r>
       <w:r>
         <w:t xml:space="preserve"> </w:t>
@@ -1184,7 +1202,7 @@
         <w:t xml:space="preserve"> </w:t>
       </w:r>
       <w:r>
-        <w:t xml:space="preserve">(29)</w:t>
+        <w:t xml:space="preserve">(33)</w:t>
       </w:r>
       <w:r>
         <w:t xml:space="preserve">. This included assembling the paired reads that covered the V4 region of the 16S rRNA gene using a quality score-aware method</w:t>
@@ -1193,7 +1211,7 @@
         <w:t xml:space="preserve"> </w:t>
       </w:r>
       <w:r>
-        <w:t xml:space="preserve">(30)</w:t>
+        <w:t xml:space="preserve">(34)</w:t>
       </w:r>
       <w:r>
         <w:t xml:space="preserve">, aligning the assembled contig to a SILVA reference alignment</w:t>
@@ -1202,7 +1220,7 @@
         <w:t xml:space="preserve"> </w:t>
       </w:r>
       <w:r>
-        <w:t xml:space="preserve">(31, 32)</w:t>
+        <w:t xml:space="preserve">(29, 30)</w:t>
       </w:r>
       <w:r>
         <w:t xml:space="preserve">, pre-clustering to remove residual sequencing errors</w:t>
@@ -1211,7 +1229,7 @@
         <w:t xml:space="preserve"> </w:t>
       </w:r>
       <w:r>
-        <w:t xml:space="preserve">(33)</w:t>
+        <w:t xml:space="preserve">(35)</w:t>
       </w:r>
       <w:r>
         <w:t xml:space="preserve"> </w:t>
@@ -1223,7 +1241,7 @@
         <w:t xml:space="preserve"> </w:t>
       </w:r>
       <w:r>
-        <w:t xml:space="preserve">(34)</w:t>
+        <w:t xml:space="preserve">(36)</w:t>
       </w:r>
       <w:r>
         <w:t xml:space="preserve">, and clustering of sequences into OTUs using the OptiClust algorithm</w:t>
@@ -1232,10 +1250,10 @@
         <w:t xml:space="preserve"> </w:t>
       </w:r>
       <w:r>
-        <w:t xml:space="preserve">(35)</w:t>
-      </w:r>
-      <w:r>
-        <w:t xml:space="preserve">. OTUs were defined a group of sequences not more than than 3% different from each other.</w:t>
+        <w:t xml:space="preserve">(37)</w:t>
+      </w:r>
+      <w:r>
+        <w:t xml:space="preserve">. OTUs were defined a group of sequences not more than than 3% different from each other. Representative sequences from each OTU were used to generate traditional neighbor joining trees as described for the sponges and sleep apnea datasets.</w:t>
       </w:r>
     </w:p>
     <w:bookmarkEnd w:id="35"/>
@@ -1259,7 +1277,7 @@
         <w:t xml:space="preserve"> </w:t>
       </w:r>
       <w:r>
-        <w:t xml:space="preserve">(36)</w:t>
+        <w:t xml:space="preserve">(38)</w:t>
       </w:r>
       <w:r>
         <w:t xml:space="preserve">. Although that function could have taken a pre-computed distance matrix as input in the version of scikit-learn that Martino used (v.0.5.9), they gave the function the ordination results with the desired number of axes. I reimplemented an R-based version of the KNN classification method as workflow/scripts/test_train_knn.R. This method implemented the training-testing framework described by Topcuoglu et al.</w:t>
@@ -1388,10 +1406,10 @@
         <w:t xml:space="preserve"> </w:t>
       </w:r>
       <w:r>
-        <w:t xml:space="preserve">(37, 38)</w:t>
-      </w:r>
-      <w:r>
-        <w:t xml:space="preserve">. Euclidean distances are not typically used in microbiome analyses because they inflate the similarity of communities. However, they are used with CLR transformed data resulting in so-called Aitchison distances. The OptSpace and RPCA algorithms outputted Euclidean distances directly from the Deicode and gemelli software. Euclidean distances were calculated for raw counts, and data transformed by the CLR-based methods, DeSeq2, relative abundance, subsampling, and rarefaction using the vegdist function in vegan. Because OptSpace, CLR-based methods, and DeSeq2 outputted negative values, it was not possible to calculate Bray-Curtis distances on those data. Bray-Curtis distances were calculated using raw counts, relative abundances, and subsampled data using the vegdist function in vegan; rarefaction was performed using vegan’s avgdist function.</w:t>
+        <w:t xml:space="preserve">(39, 40)</w:t>
+      </w:r>
+      <w:r>
+        <w:t xml:space="preserve">. Euclidean distances are not typically used in microbiome analyses because they inflate the similarity of communities. However, they are used with CLR transformed data resulting in so-called Aitchison distances. The OptSpace and RPCA algorithms outputted Euclidean distances directly from the Deicode and gemelli software. Euclidean distances were calculated for raw counts, and data transformed by the CLR-based methods, DeSeq2, relative abundance, subsampling, and rarefaction using the vegdist function in vegan. Because OptSpace, CLR-based methods, and DeSeq2 outputted negative values, it was not possible to calculate Bray-Curtis distances on those data. Bray-Curtis distances were calculated using raw counts, CSS and SRS normalized counts, relative abundances, and subsampled data using the vegdist function in vegan; rarefaction was performed using vegan’s avgdist function. The mothur package (v.1.48.5) was used to generate weighted UniFrac distances using raw counts, SRS normalized counts, subsampled data, and rarefaction. The weighted UniFrac algorithm calculates relative abundances from the inputted counts and is not amenable to non-count data such as CSS normalized counts.</w:t>
       </w:r>
     </w:p>
     <w:bookmarkEnd w:id="38"/>
@@ -1415,7 +1433,7 @@
         <w:t xml:space="preserve"> </w:t>
       </w:r>
       <w:r>
-        <w:t xml:space="preserve">(37, 39)</w:t>
+        <w:t xml:space="preserve">(39, 41)</w:t>
       </w:r>
       <w:r>
         <w:t xml:space="preserve">. Euclidean or Bray-Curtis distance matrices and a map indicating which group each sample belonged to were used as input to the function. Except for the simulation measuring the ability of the various methods to control the effects of sampling depth a single classification design was used in adonis2 to test the model, Distance ~ Treatment</w:t>
@@ -1442,7 +1460,7 @@
         <w:t xml:space="preserve"> </w:t>
       </w:r>
       <w:r>
-        <w:t xml:space="preserve">(37)</w:t>
+        <w:t xml:space="preserve">(39)</w:t>
       </w:r>
       <w:r>
         <w:t xml:space="preserve"> </w:t>
@@ -1494,7 +1512,7 @@
       </w:r>
     </w:p>
     <w:bookmarkEnd w:id="43"/>
-    <w:bookmarkStart w:id="149" w:name="references"/>
+    <w:bookmarkStart w:id="126" w:name="references"/>
     <w:p>
       <w:pPr>
         <w:pStyle w:val="Heading2"/>
@@ -1503,7 +1521,7 @@
         <w:t xml:space="preserve">References</w:t>
       </w:r>
     </w:p>
-    <w:bookmarkStart w:id="121" w:name="refs"/>
+    <w:bookmarkStart w:id="125" w:name="refs"/>
     <w:bookmarkStart w:id="45" w:name="ref-MoitinhoSilva2017"/>
     <w:p>
       <w:pPr>
@@ -4425,7 +4443,7 @@
       </w:r>
     </w:p>
     <w:bookmarkEnd w:id="99"/>
-    <w:bookmarkStart w:id="101" w:name="ref-Schloss2009a"/>
+    <w:bookmarkStart w:id="101" w:name="ref-Schloss2009b"/>
     <w:p>
       <w:pPr>
         <w:pStyle w:val="Bibliography"/>
@@ -4447,6 +4465,310 @@
         <w:t xml:space="preserve">Schloss PD</w:t>
       </w:r>
       <w:r>
+        <w:t xml:space="preserve">. 2009. A high-throughput DNA sequence aligner for microbial ecology studies. PLoS ONE</w:t>
+      </w:r>
+      <w:r>
+        <w:t xml:space="preserve"> </w:t>
+      </w:r>
+      <w:r>
+        <w:rPr>
+          <w:b/>
+          <w:bCs/>
+        </w:rPr>
+        <w:t xml:space="preserve">4</w:t>
+      </w:r>
+      <w:r>
+        <w:t xml:space="preserve">:e8230. doi:</w:t>
+      </w:r>
+      <w:hyperlink r:id="rId100">
+        <w:r>
+          <w:rPr>
+            <w:rStyle w:val="Hyperlink"/>
+          </w:rPr>
+          <w:t xml:space="preserve">10.1371/journal.pone.0008230</w:t>
+        </w:r>
+      </w:hyperlink>
+      <w:r>
+        <w:t xml:space="preserve">.</w:t>
+      </w:r>
+    </w:p>
+    <w:bookmarkEnd w:id="101"/>
+    <w:bookmarkStart w:id="103" w:name="ref-Pruesse2007"/>
+    <w:p>
+      <w:pPr>
+        <w:pStyle w:val="Bibliography"/>
+      </w:pPr>
+      <w:r>
+        <w:t xml:space="preserve">30.</w:t>
+      </w:r>
+      <w:r>
+        <w:t xml:space="preserve"> </w:t>
+      </w:r>
+      <w:r>
+        <w:t xml:space="preserve">	</w:t>
+      </w:r>
+      <w:r>
+        <w:rPr>
+          <w:b/>
+          <w:bCs/>
+        </w:rPr>
+        <w:t xml:space="preserve">Pruesse E</w:t>
+      </w:r>
+      <w:r>
+        <w:t xml:space="preserve">,</w:t>
+      </w:r>
+      <w:r>
+        <w:t xml:space="preserve"> </w:t>
+      </w:r>
+      <w:r>
+        <w:rPr>
+          <w:b/>
+          <w:bCs/>
+        </w:rPr>
+        <w:t xml:space="preserve">Quast C</w:t>
+      </w:r>
+      <w:r>
+        <w:t xml:space="preserve">,</w:t>
+      </w:r>
+      <w:r>
+        <w:t xml:space="preserve"> </w:t>
+      </w:r>
+      <w:r>
+        <w:rPr>
+          <w:b/>
+          <w:bCs/>
+        </w:rPr>
+        <w:t xml:space="preserve">Knittel K</w:t>
+      </w:r>
+      <w:r>
+        <w:t xml:space="preserve">,</w:t>
+      </w:r>
+      <w:r>
+        <w:t xml:space="preserve"> </w:t>
+      </w:r>
+      <w:r>
+        <w:rPr>
+          <w:b/>
+          <w:bCs/>
+        </w:rPr>
+        <w:t xml:space="preserve">Fuchs BM</w:t>
+      </w:r>
+      <w:r>
+        <w:t xml:space="preserve">,</w:t>
+      </w:r>
+      <w:r>
+        <w:t xml:space="preserve"> </w:t>
+      </w:r>
+      <w:r>
+        <w:rPr>
+          <w:b/>
+          <w:bCs/>
+        </w:rPr>
+        <w:t xml:space="preserve">Ludwig W</w:t>
+      </w:r>
+      <w:r>
+        <w:t xml:space="preserve">,</w:t>
+      </w:r>
+      <w:r>
+        <w:t xml:space="preserve"> </w:t>
+      </w:r>
+      <w:r>
+        <w:rPr>
+          <w:b/>
+          <w:bCs/>
+        </w:rPr>
+        <w:t xml:space="preserve">Peplies J</w:t>
+      </w:r>
+      <w:r>
+        <w:t xml:space="preserve">,</w:t>
+      </w:r>
+      <w:r>
+        <w:t xml:space="preserve"> </w:t>
+      </w:r>
+      <w:r>
+        <w:rPr>
+          <w:b/>
+          <w:bCs/>
+        </w:rPr>
+        <w:t xml:space="preserve">Glockner FO</w:t>
+      </w:r>
+      <w:r>
+        <w:t xml:space="preserve">. 2007. SILVA: A comprehensive online resource for quality checked and aligned ribosomal RNA sequence data compatible with ARB. Nucleic Acids Research</w:t>
+      </w:r>
+      <w:r>
+        <w:t xml:space="preserve"> </w:t>
+      </w:r>
+      <w:r>
+        <w:rPr>
+          <w:b/>
+          <w:bCs/>
+        </w:rPr>
+        <w:t xml:space="preserve">35</w:t>
+      </w:r>
+      <w:r>
+        <w:t xml:space="preserve">:7188–7196. doi:</w:t>
+      </w:r>
+      <w:hyperlink r:id="rId102">
+        <w:r>
+          <w:rPr>
+            <w:rStyle w:val="Hyperlink"/>
+          </w:rPr>
+          <w:t xml:space="preserve">10.1093/nar/gkm864</w:t>
+        </w:r>
+      </w:hyperlink>
+      <w:r>
+        <w:t xml:space="preserve">.</w:t>
+      </w:r>
+    </w:p>
+    <w:bookmarkEnd w:id="103"/>
+    <w:bookmarkStart w:id="105" w:name="ref-Schloss2010"/>
+    <w:p>
+      <w:pPr>
+        <w:pStyle w:val="Bibliography"/>
+      </w:pPr>
+      <w:r>
+        <w:t xml:space="preserve">31.</w:t>
+      </w:r>
+      <w:r>
+        <w:t xml:space="preserve"> </w:t>
+      </w:r>
+      <w:r>
+        <w:t xml:space="preserve">	</w:t>
+      </w:r>
+      <w:r>
+        <w:rPr>
+          <w:b/>
+          <w:bCs/>
+        </w:rPr>
+        <w:t xml:space="preserve">Schloss PD</w:t>
+      </w:r>
+      <w:r>
+        <w:t xml:space="preserve">. 2010. The effects of alignment quality, distance calculation method, sequence filtering, and region on the analysis of 16S rRNA gene-based studies. PLoS Computational Biology</w:t>
+      </w:r>
+      <w:r>
+        <w:t xml:space="preserve"> </w:t>
+      </w:r>
+      <w:r>
+        <w:rPr>
+          <w:b/>
+          <w:bCs/>
+        </w:rPr>
+        <w:t xml:space="preserve">6</w:t>
+      </w:r>
+      <w:r>
+        <w:t xml:space="preserve">:e1000844. doi:</w:t>
+      </w:r>
+      <w:hyperlink r:id="rId104">
+        <w:r>
+          <w:rPr>
+            <w:rStyle w:val="Hyperlink"/>
+          </w:rPr>
+          <w:t xml:space="preserve">10.1371/journal.pcbi.1000844</w:t>
+        </w:r>
+      </w:hyperlink>
+      <w:r>
+        <w:t xml:space="preserve">.</w:t>
+      </w:r>
+    </w:p>
+    <w:bookmarkEnd w:id="105"/>
+    <w:bookmarkStart w:id="107" w:name="ref-Sheneman2006"/>
+    <w:p>
+      <w:pPr>
+        <w:pStyle w:val="Bibliography"/>
+      </w:pPr>
+      <w:r>
+        <w:t xml:space="preserve">32.</w:t>
+      </w:r>
+      <w:r>
+        <w:t xml:space="preserve"> </w:t>
+      </w:r>
+      <w:r>
+        <w:t xml:space="preserve">	</w:t>
+      </w:r>
+      <w:r>
+        <w:rPr>
+          <w:b/>
+          <w:bCs/>
+        </w:rPr>
+        <w:t xml:space="preserve">Sheneman L</w:t>
+      </w:r>
+      <w:r>
+        <w:t xml:space="preserve">,</w:t>
+      </w:r>
+      <w:r>
+        <w:t xml:space="preserve"> </w:t>
+      </w:r>
+      <w:r>
+        <w:rPr>
+          <w:b/>
+          <w:bCs/>
+        </w:rPr>
+        <w:t xml:space="preserve">Evans J</w:t>
+      </w:r>
+      <w:r>
+        <w:t xml:space="preserve">,</w:t>
+      </w:r>
+      <w:r>
+        <w:t xml:space="preserve"> </w:t>
+      </w:r>
+      <w:r>
+        <w:rPr>
+          <w:b/>
+          <w:bCs/>
+        </w:rPr>
+        <w:t xml:space="preserve">Foster JA</w:t>
+      </w:r>
+      <w:r>
+        <w:t xml:space="preserve">. 2006. Clearcut: A fast implementation of relaxed neighbor joining. Bioinformatics</w:t>
+      </w:r>
+      <w:r>
+        <w:t xml:space="preserve"> </w:t>
+      </w:r>
+      <w:r>
+        <w:rPr>
+          <w:b/>
+          <w:bCs/>
+        </w:rPr>
+        <w:t xml:space="preserve">22</w:t>
+      </w:r>
+      <w:r>
+        <w:t xml:space="preserve">:2823–2824. doi:</w:t>
+      </w:r>
+      <w:hyperlink r:id="rId106">
+        <w:r>
+          <w:rPr>
+            <w:rStyle w:val="Hyperlink"/>
+          </w:rPr>
+          <w:t xml:space="preserve">10.1093/bioinformatics/btl478</w:t>
+        </w:r>
+      </w:hyperlink>
+      <w:r>
+        <w:t xml:space="preserve">.</w:t>
+      </w:r>
+    </w:p>
+    <w:bookmarkEnd w:id="107"/>
+    <w:bookmarkStart w:id="109" w:name="ref-Schloss2009a"/>
+    <w:p>
+      <w:pPr>
+        <w:pStyle w:val="Bibliography"/>
+      </w:pPr>
+      <w:r>
+        <w:t xml:space="preserve">33.</w:t>
+      </w:r>
+      <w:r>
+        <w:t xml:space="preserve"> </w:t>
+      </w:r>
+      <w:r>
+        <w:t xml:space="preserve">	</w:t>
+      </w:r>
+      <w:r>
+        <w:rPr>
+          <w:b/>
+          <w:bCs/>
+        </w:rPr>
+        <w:t xml:space="preserve">Schloss PD</w:t>
+      </w:r>
+      <w:r>
         <w:t xml:space="preserve">,</w:t>
       </w:r>
       <w:r>
@@ -4644,7 +4966,7 @@
       <w:r>
         <w:t xml:space="preserve">:7537–7541. doi:</w:t>
       </w:r>
-      <w:hyperlink r:id="rId100">
+      <w:hyperlink r:id="rId108">
         <w:r>
           <w:rPr>
             <w:rStyle w:val="Hyperlink"/>
@@ -4656,14 +4978,14 @@
         <w:t xml:space="preserve">.</w:t>
       </w:r>
     </w:p>
-    <w:bookmarkEnd w:id="101"/>
-    <w:bookmarkStart w:id="103" w:name="ref-Kozich2013"/>
+    <w:bookmarkEnd w:id="109"/>
+    <w:bookmarkStart w:id="111" w:name="ref-Kozich2013"/>
     <w:p>
       <w:pPr>
         <w:pStyle w:val="Bibliography"/>
       </w:pPr>
       <w:r>
-        <w:t xml:space="preserve">30.</w:t>
+        <w:t xml:space="preserve">34.</w:t>
       </w:r>
       <w:r>
         <w:t xml:space="preserve"> </w:t>
@@ -4758,7 +5080,7 @@
       <w:r>
         <w:t xml:space="preserve">:5112–5120. doi:</w:t>
       </w:r>
-      <w:hyperlink r:id="rId102">
+      <w:hyperlink r:id="rId110">
         <w:r>
           <w:rPr>
             <w:rStyle w:val="Hyperlink"/>
@@ -4770,14 +5092,14 @@
         <w:t xml:space="preserve">.</w:t>
       </w:r>
     </w:p>
-    <w:bookmarkEnd w:id="103"/>
-    <w:bookmarkStart w:id="105" w:name="ref-Schloss2009b"/>
+    <w:bookmarkEnd w:id="111"/>
+    <w:bookmarkStart w:id="113" w:name="ref-Schloss2011"/>
     <w:p>
       <w:pPr>
         <w:pStyle w:val="Bibliography"/>
       </w:pPr>
       <w:r>
-        <w:t xml:space="preserve">31.</w:t>
+        <w:t xml:space="preserve">35.</w:t>
       </w:r>
       <w:r>
         <w:t xml:space="preserve"> </w:t>
@@ -4793,184 +5115,6 @@
         <w:t xml:space="preserve">Schloss PD</w:t>
       </w:r>
       <w:r>
-        <w:t xml:space="preserve">. 2009. A high-throughput DNA sequence aligner for microbial ecology studies. PLoS ONE</w:t>
-      </w:r>
-      <w:r>
-        <w:t xml:space="preserve"> </w:t>
-      </w:r>
-      <w:r>
-        <w:rPr>
-          <w:b/>
-          <w:bCs/>
-        </w:rPr>
-        <w:t xml:space="preserve">4</w:t>
-      </w:r>
-      <w:r>
-        <w:t xml:space="preserve">:e8230. doi:</w:t>
-      </w:r>
-      <w:hyperlink r:id="rId104">
-        <w:r>
-          <w:rPr>
-            <w:rStyle w:val="Hyperlink"/>
-          </w:rPr>
-          <w:t xml:space="preserve">10.1371/journal.pone.0008230</w:t>
-        </w:r>
-      </w:hyperlink>
-      <w:r>
-        <w:t xml:space="preserve">.</w:t>
-      </w:r>
-    </w:p>
-    <w:bookmarkEnd w:id="105"/>
-    <w:bookmarkStart w:id="107" w:name="ref-Pruesse2007"/>
-    <w:p>
-      <w:pPr>
-        <w:pStyle w:val="Bibliography"/>
-      </w:pPr>
-      <w:r>
-        <w:t xml:space="preserve">32.</w:t>
-      </w:r>
-      <w:r>
-        <w:t xml:space="preserve"> </w:t>
-      </w:r>
-      <w:r>
-        <w:t xml:space="preserve">	</w:t>
-      </w:r>
-      <w:r>
-        <w:rPr>
-          <w:b/>
-          <w:bCs/>
-        </w:rPr>
-        <w:t xml:space="preserve">Pruesse E</w:t>
-      </w:r>
-      <w:r>
-        <w:t xml:space="preserve">,</w:t>
-      </w:r>
-      <w:r>
-        <w:t xml:space="preserve"> </w:t>
-      </w:r>
-      <w:r>
-        <w:rPr>
-          <w:b/>
-          <w:bCs/>
-        </w:rPr>
-        <w:t xml:space="preserve">Quast C</w:t>
-      </w:r>
-      <w:r>
-        <w:t xml:space="preserve">,</w:t>
-      </w:r>
-      <w:r>
-        <w:t xml:space="preserve"> </w:t>
-      </w:r>
-      <w:r>
-        <w:rPr>
-          <w:b/>
-          <w:bCs/>
-        </w:rPr>
-        <w:t xml:space="preserve">Knittel K</w:t>
-      </w:r>
-      <w:r>
-        <w:t xml:space="preserve">,</w:t>
-      </w:r>
-      <w:r>
-        <w:t xml:space="preserve"> </w:t>
-      </w:r>
-      <w:r>
-        <w:rPr>
-          <w:b/>
-          <w:bCs/>
-        </w:rPr>
-        <w:t xml:space="preserve">Fuchs BM</w:t>
-      </w:r>
-      <w:r>
-        <w:t xml:space="preserve">,</w:t>
-      </w:r>
-      <w:r>
-        <w:t xml:space="preserve"> </w:t>
-      </w:r>
-      <w:r>
-        <w:rPr>
-          <w:b/>
-          <w:bCs/>
-        </w:rPr>
-        <w:t xml:space="preserve">Ludwig W</w:t>
-      </w:r>
-      <w:r>
-        <w:t xml:space="preserve">,</w:t>
-      </w:r>
-      <w:r>
-        <w:t xml:space="preserve"> </w:t>
-      </w:r>
-      <w:r>
-        <w:rPr>
-          <w:b/>
-          <w:bCs/>
-        </w:rPr>
-        <w:t xml:space="preserve">Peplies J</w:t>
-      </w:r>
-      <w:r>
-        <w:t xml:space="preserve">,</w:t>
-      </w:r>
-      <w:r>
-        <w:t xml:space="preserve"> </w:t>
-      </w:r>
-      <w:r>
-        <w:rPr>
-          <w:b/>
-          <w:bCs/>
-        </w:rPr>
-        <w:t xml:space="preserve">Glockner FO</w:t>
-      </w:r>
-      <w:r>
-        <w:t xml:space="preserve">. 2007. SILVA: A comprehensive online resource for quality checked and aligned ribosomal RNA sequence data compatible with ARB. Nucleic Acids Research</w:t>
-      </w:r>
-      <w:r>
-        <w:t xml:space="preserve"> </w:t>
-      </w:r>
-      <w:r>
-        <w:rPr>
-          <w:b/>
-          <w:bCs/>
-        </w:rPr>
-        <w:t xml:space="preserve">35</w:t>
-      </w:r>
-      <w:r>
-        <w:t xml:space="preserve">:7188–7196. doi:</w:t>
-      </w:r>
-      <w:hyperlink r:id="rId106">
-        <w:r>
-          <w:rPr>
-            <w:rStyle w:val="Hyperlink"/>
-          </w:rPr>
-          <w:t xml:space="preserve">10.1093/nar/gkm864</w:t>
-        </w:r>
-      </w:hyperlink>
-      <w:r>
-        <w:t xml:space="preserve">.</w:t>
-      </w:r>
-    </w:p>
-    <w:bookmarkEnd w:id="107"/>
-    <w:bookmarkStart w:id="109" w:name="ref-Schloss2011"/>
-    <w:p>
-      <w:pPr>
-        <w:pStyle w:val="Bibliography"/>
-      </w:pPr>
-      <w:r>
-        <w:t xml:space="preserve">33.</w:t>
-      </w:r>
-      <w:r>
-        <w:t xml:space="preserve"> </w:t>
-      </w:r>
-      <w:r>
-        <w:t xml:space="preserve">	</w:t>
-      </w:r>
-      <w:r>
-        <w:rPr>
-          <w:b/>
-          <w:bCs/>
-        </w:rPr>
-        <w:t xml:space="preserve">Schloss PD</w:t>
-      </w:r>
-      <w:r>
         <w:t xml:space="preserve">,</w:t>
       </w:r>
       <w:r>
@@ -5012,7 +5156,7 @@
       <w:r>
         <w:t xml:space="preserve">:e27310. doi:</w:t>
       </w:r>
-      <w:hyperlink r:id="rId108">
+      <w:hyperlink r:id="rId112">
         <w:r>
           <w:rPr>
             <w:rStyle w:val="Hyperlink"/>
@@ -5024,14 +5168,14 @@
         <w:t xml:space="preserve">.</w:t>
       </w:r>
     </w:p>
-    <w:bookmarkEnd w:id="109"/>
-    <w:bookmarkStart w:id="111" w:name="ref-Edgar2011"/>
+    <w:bookmarkEnd w:id="113"/>
+    <w:bookmarkStart w:id="115" w:name="ref-Edgar2011"/>
     <w:p>
       <w:pPr>
         <w:pStyle w:val="Bibliography"/>
       </w:pPr>
       <w:r>
-        <w:t xml:space="preserve">34.</w:t>
+        <w:t xml:space="preserve">36.</w:t>
       </w:r>
       <w:r>
         <w:t xml:space="preserve"> </w:t>
@@ -5126,7 +5270,7 @@
       <w:r>
         <w:t xml:space="preserve">:2194–2200. doi:</w:t>
       </w:r>
-      <w:hyperlink r:id="rId110">
+      <w:hyperlink r:id="rId114">
         <w:r>
           <w:rPr>
             <w:rStyle w:val="Hyperlink"/>
@@ -5138,14 +5282,14 @@
         <w:t xml:space="preserve">.</w:t>
       </w:r>
     </w:p>
-    <w:bookmarkEnd w:id="111"/>
-    <w:bookmarkStart w:id="113" w:name="ref-Westcott2017"/>
+    <w:bookmarkEnd w:id="115"/>
+    <w:bookmarkStart w:id="117" w:name="ref-Westcott2017"/>
     <w:p>
       <w:pPr>
         <w:pStyle w:val="Bibliography"/>
       </w:pPr>
       <w:r>
-        <w:t xml:space="preserve">35.</w:t>
+        <w:t xml:space="preserve">37.</w:t>
       </w:r>
       <w:r>
         <w:t xml:space="preserve"> </w:t>
@@ -5204,7 +5348,7 @@
       <w:r>
         <w:t xml:space="preserve">:e00073–17. doi:</w:t>
       </w:r>
-      <w:hyperlink r:id="rId112">
+      <w:hyperlink r:id="rId116">
         <w:r>
           <w:rPr>
             <w:rStyle w:val="Hyperlink"/>
@@ -5216,14 +5360,14 @@
         <w:t xml:space="preserve">.</w:t>
       </w:r>
     </w:p>
-    <w:bookmarkEnd w:id="113"/>
-    <w:bookmarkStart w:id="114" w:name="ref-Pedregosa2011"/>
+    <w:bookmarkEnd w:id="117"/>
+    <w:bookmarkStart w:id="118" w:name="ref-Pedregosa2011"/>
     <w:p>
       <w:pPr>
         <w:pStyle w:val="Bibliography"/>
       </w:pPr>
       <w:r>
-        <w:t xml:space="preserve">36.</w:t>
+        <w:t xml:space="preserve">38.</w:t>
       </w:r>
       <w:r>
         <w:t xml:space="preserve"> </w:t>
@@ -5459,14 +5603,14 @@
         <w:t xml:space="preserve">:2825–2830.</w:t>
       </w:r>
     </w:p>
-    <w:bookmarkEnd w:id="114"/>
-    <w:bookmarkStart w:id="116" w:name="ref-Dixon2003"/>
+    <w:bookmarkEnd w:id="118"/>
+    <w:bookmarkStart w:id="120" w:name="ref-Dixon2003"/>
     <w:p>
       <w:pPr>
         <w:pStyle w:val="Bibliography"/>
       </w:pPr>
       <w:r>
-        <w:t xml:space="preserve">37.</w:t>
+        <w:t xml:space="preserve">39.</w:t>
       </w:r>
       <w:r>
         <w:t xml:space="preserve"> </w:t>
@@ -5506,7 +5650,7 @@
       <w:r>
         <w:t xml:space="preserve">:927–930. doi:</w:t>
       </w:r>
-      <w:hyperlink r:id="rId115">
+      <w:hyperlink r:id="rId119">
         <w:r>
           <w:rPr>
             <w:rStyle w:val="Hyperlink"/>
@@ -5518,14 +5662,14 @@
         <w:t xml:space="preserve">.</w:t>
       </w:r>
     </w:p>
-    <w:bookmarkEnd w:id="116"/>
-    <w:bookmarkStart w:id="118" w:name="ref-Magurran2004"/>
+    <w:bookmarkEnd w:id="120"/>
+    <w:bookmarkStart w:id="122" w:name="ref-Magurran2004"/>
     <w:p>
       <w:pPr>
         <w:pStyle w:val="Bibliography"/>
       </w:pPr>
       <w:r>
-        <w:t xml:space="preserve">38.</w:t>
+        <w:t xml:space="preserve">40.</w:t>
       </w:r>
       <w:r>
         <w:t xml:space="preserve"> </w:t>
@@ -5546,7 +5690,7 @@
       <w:r>
         <w:t xml:space="preserve"> </w:t>
       </w:r>
-      <w:hyperlink r:id="rId117">
+      <w:hyperlink r:id="rId121">
         <w:r>
           <w:rPr>
             <w:rStyle w:val="Hyperlink"/>
@@ -5558,14 +5702,14 @@
         <w:t xml:space="preserve">. Wiley.</w:t>
       </w:r>
     </w:p>
-    <w:bookmarkEnd w:id="118"/>
-    <w:bookmarkStart w:id="120" w:name="ref-Anderson2001"/>
+    <w:bookmarkEnd w:id="122"/>
+    <w:bookmarkStart w:id="124" w:name="ref-Anderson2001"/>
     <w:p>
       <w:pPr>
         <w:pStyle w:val="Bibliography"/>
       </w:pPr>
       <w:r>
-        <w:t xml:space="preserve">39.</w:t>
+        <w:t xml:space="preserve">41.</w:t>
       </w:r>
       <w:r>
         <w:t xml:space="preserve"> </w:t>
@@ -5596,7 +5740,7 @@
       <w:r>
         <w:t xml:space="preserve">:32–46. doi:</w:t>
       </w:r>
-      <w:hyperlink r:id="rId119">
+      <w:hyperlink r:id="rId123">
         <w:r>
           <w:rPr>
             <w:rStyle w:val="Hyperlink"/>
@@ -5608,8 +5752,8 @@
         <w:t xml:space="preserve">.</w:t>
       </w:r>
     </w:p>
-    <w:bookmarkEnd w:id="120"/>
-    <w:bookmarkEnd w:id="121"/>
+    <w:bookmarkEnd w:id="124"/>
+    <w:bookmarkEnd w:id="125"/>
     <w:p>
       <w:r>
         <w:br w:type="page"/>
@@ -5620,46 +5764,23 @@
         <w:pStyle w:val="BodyText"/>
       </w:pPr>
       <w:r>
-        <w:drawing>
-          <wp:inline>
-            <wp:extent cx="4267200" cy="4267200"/>
-            <wp:effectExtent b="0" l="0" r="0" t="0"/>
-            <wp:docPr descr="" title="" id="123" name="Picture"/>
-            <a:graphic>
-              <a:graphicData uri="http://schemas.openxmlformats.org/drawingml/2006/picture">
-                <pic:pic>
-                  <pic:nvPicPr>
-                    <pic:cNvPr descr="../figures/heatmap_pcoa_martino.png" id="124" name="Picture"/>
-                    <pic:cNvPicPr>
-                      <a:picLocks noChangeArrowheads="1" noChangeAspect="1"/>
-                    </pic:cNvPicPr>
-                  </pic:nvPicPr>
-                  <pic:blipFill>
-                    <a:blip r:embed="rId122"/>
-                    <a:stretch>
-                      <a:fillRect/>
-                    </a:stretch>
-                  </pic:blipFill>
-                  <pic:spPr bwMode="auto">
-                    <a:xfrm>
-                      <a:off x="0" y="0"/>
-                      <a:ext cx="4267200" cy="4267200"/>
-                    </a:xfrm>
-                    <a:prstGeom prst="rect">
-                      <a:avLst/>
-                    </a:prstGeom>
-                    <a:noFill/>
-                    <a:ln w="9525">
-                      <a:noFill/>
-                      <a:headEnd/>
-                      <a:tailEnd/>
-                    </a:ln>
-                  </pic:spPr>
-                </pic:pic>
-              </a:graphicData>
-            </a:graphic>
-          </wp:inline>
-        </w:drawing>
+        <w:rPr>
+          <w:b/>
+          <w:bCs/>
+        </w:rPr>
+        <w:t xml:space="preserve">Figure 1. Rerunning the original Martino code in my computational environment produced qualitatively similar heatmaps (A) and ordination diagrams (B) to what they originally reported when 4,000 sequences were sampled from each sample.</w:t>
+      </w:r>
+      <w:r>
+        <w:t xml:space="preserve"> </w:t>
+      </w:r>
+      <w:r>
+        <w:t xml:space="preserve">This figure is analogous to Figure 3DE of Martino with the inclusion of additional data from simulations where there was partial overlap between the two treatment groups (</w:t>
+      </w:r>
+      <w:r>
+        <w:t xml:space="preserve">“Overlap”</w:t>
+      </w:r>
+      <w:r>
+        <w:t xml:space="preserve">). The red and blue bars on the left edge of the heatmaps in panel A indicate the treatment group that each sample belonged to. The heatmaps display the One CLR transformation of sequence counts. The PCoA diagrams in panel B were generated using Bray-Curtis distances. The numbers on the x and y axis of each ordination diagram indicate the percent of the total variation that each axis explained.</w:t>
       </w:r>
     </w:p>
     <w:p>
@@ -5671,24 +5792,13 @@
           <w:b/>
           <w:bCs/>
         </w:rPr>
-        <w:t xml:space="preserve">Figure 1. Rerunning the original Martino code in my computational environment produced qualitatively similar results to what they originally reported when 4,000 sequences were sampled from each sample.</w:t>
-      </w:r>
-      <w:r>
-        <w:t xml:space="preserve"> </w:t>
-      </w:r>
-      <w:r>
-        <w:t xml:space="preserve">This figure is analogous to Figure 3DE of Martino with the inclusion of additional data from simulations where there was partial overlap between the two treatment groups (</w:t>
-      </w:r>
-      <w:r>
-        <w:t xml:space="preserve">“Overlap”</w:t>
-      </w:r>
-      <w:r>
-        <w:t xml:space="preserve">). The red and blue bars on the left edge of the heatmap indicate the treatment group that each sample belonged to. The heatmaps display the One CLR transformation of sequence counts. In addition to the RPCA output, I also provide the PCoA diagrams using Bray-Curtis distances. The numbers on the x and y axis of each ordination diagram indicate the percent of the total variation that each axis explained.</w:t>
-      </w:r>
-    </w:p>
-    <w:p>
-      <w:r>
-        <w:br w:type="page"/>
+        <w:t xml:space="preserve">Figure 2. RPCA-based methods did not consistently perform as well as other methods by PERMANOVA or KNN classification when attempting to distinguish between overlapping communities.</w:t>
+      </w:r>
+      <w:r>
+        <w:t xml:space="preserve"> </w:t>
+      </w:r>
+      <w:r>
+        <w:t xml:space="preserve">This figure includes data that was shown in in Figure 3BC of Martino with the inclusion of results when using additional data transformations, Bray-Curtis distances, and I used 10 instead of 1 replicate simulation. Each circle represents the median of ten replicate simulations and the confidence line indicates the range between the minimum and maximum values. The median KNN classification accuracy and range were the median of 10 median values each calculated across 100 training-testing splits using the fitted K value from 80:20 splits. The vertical gray line for KNN classification indicates the accuracy one would expect from randomly guessing the treatment group.</w:t>
       </w:r>
     </w:p>
     <w:p>
@@ -5696,46 +5806,17 @@
         <w:pStyle w:val="BodyText"/>
       </w:pPr>
       <w:r>
-        <w:drawing>
-          <wp:inline>
-            <wp:extent cx="4267200" cy="3556000"/>
-            <wp:effectExtent b="0" l="0" r="0" t="0"/>
-            <wp:docPr descr="" title="" id="126" name="Picture"/>
-            <a:graphic>
-              <a:graphicData uri="http://schemas.openxmlformats.org/drawingml/2006/picture">
-                <pic:pic>
-                  <pic:nvPicPr>
-                    <pic:cNvPr descr="../figures/fst_knn_martino.png" id="127" name="Picture"/>
-                    <pic:cNvPicPr>
-                      <a:picLocks noChangeArrowheads="1" noChangeAspect="1"/>
-                    </pic:cNvPicPr>
-                  </pic:nvPicPr>
-                  <pic:blipFill>
-                    <a:blip r:embed="rId125"/>
-                    <a:stretch>
-                      <a:fillRect/>
-                    </a:stretch>
-                  </pic:blipFill>
-                  <pic:spPr bwMode="auto">
-                    <a:xfrm>
-                      <a:off x="0" y="0"/>
-                      <a:ext cx="4267200" cy="3556000"/>
-                    </a:xfrm>
-                    <a:prstGeom prst="rect">
-                      <a:avLst/>
-                    </a:prstGeom>
-                    <a:noFill/>
-                    <a:ln w="9525">
-                      <a:noFill/>
-                      <a:headEnd/>
-                      <a:tailEnd/>
-                    </a:ln>
-                  </pic:spPr>
-                </pic:pic>
-              </a:graphicData>
-            </a:graphic>
-          </wp:inline>
-        </w:drawing>
+        <w:rPr>
+          <w:b/>
+          <w:bCs/>
+        </w:rPr>
+        <w:t xml:space="preserve">Figure 3. Heatmaps (A) and ordinations (B) of an example dataset comparing communities simulated rewritten in R based on the description in Martino when 10,000 sequences were sampled from each sample.</w:t>
+      </w:r>
+      <w:r>
+        <w:t xml:space="preserve"> </w:t>
+      </w:r>
+      <w:r>
+        <w:t xml:space="preserve">This figure is analogous to Figure 1. To highlight differences in overlap simulation, only the first and last 20 features from each sample are shown in the heatmaps of panel A. The vertical white band indicates the break in the data presentation. The yellow vertical lines on the heatmap indicate the 12 features that were differentially represented in the two treatment groups. The white diamonds indicate features that had significantly different relative abundances when tested by a Wilcoxon test with P-values corrected using a Benjamini-Hochberg correction. For this example, the differences between the positive control (P=0.001) and overlap dataset (P=0.018) were significant by PERMANOVA and non-significant for the negative control (P=0.50) using Bray-Curtis distances and significant for the positive control (P=0.001) and non-significant for the overlap dataset (P=0.11) and negative (P=0.49) control using RPCA.</w:t>
       </w:r>
     </w:p>
     <w:p>
@@ -5747,18 +5828,13 @@
           <w:b/>
           <w:bCs/>
         </w:rPr>
-        <w:t xml:space="preserve">Figure 2. RPCA-based methods did not consistently perform as well as other methods by PERMANOVA or KNN classification when attempting to distinguish between overlapping communities.</w:t>
-      </w:r>
-      <w:r>
-        <w:t xml:space="preserve"> </w:t>
-      </w:r>
-      <w:r>
-        <w:t xml:space="preserve">This figure includes data that was shown in in Figure 3BC of Martino with the inclusion of results when using additional data transformations, Bray-Curtis distances, and I used 10 instead of 1 replicate simulation. Each circle represents the median of ten replicate simulations and the confidence line indicates the range between the minimum and maximum values. The median KNN classification accuracy and range were the median of 10 median values each calculated across 100 training-testing splits using the fitted K value from 80:20 splits. The vertical gray line for KNN classification indicates the accuracy one would expect from randomly guessing the treatment group.</w:t>
-      </w:r>
-    </w:p>
-    <w:p>
-      <w:r>
-        <w:br w:type="page"/>
+        <w:t xml:space="preserve">Figure 4. Relative to other methods, RPCA-based methods were not as effective at differentiating between groups of communities using PERMANOVA and KNN classification when using a revised simulation approach.</w:t>
+      </w:r>
+      <w:r>
+        <w:t xml:space="preserve"> </w:t>
+      </w:r>
+      <w:r>
+        <w:t xml:space="preserve">This figure is analogous to Figure 2 except that it uses 100 instead of 10 replicates and the power to detect differences by PERMANOVA is shown instead of the F statistic. Each circle represents the median of the 100 replicate simulations and the confidence line indicates the range between the minimum and maximum values. The median KNN classification accuracy and range were the median of 10 median values each calculated across 100 training-testing splits using the fitted K value from 80:20 splits. The vertical gray line for KNN classification indicates the accuracy one would expect from randomly guessing the treatment group. The power and accuracy values for 1,000 and 2,000 sequences per sample when using Zero CLR were not calculated since the data were too sparse for the imputation algorithm to complete.</w:t>
       </w:r>
     </w:p>
     <w:p>
@@ -5766,46 +5842,17 @@
         <w:pStyle w:val="BodyText"/>
       </w:pPr>
       <w:r>
-        <w:drawing>
-          <wp:inline>
-            <wp:extent cx="4267200" cy="3505200"/>
-            <wp:effectExtent b="0" l="0" r="0" t="0"/>
-            <wp:docPr descr="" title="" id="129" name="Picture"/>
-            <a:graphic>
-              <a:graphicData uri="http://schemas.openxmlformats.org/drawingml/2006/picture">
-                <pic:pic>
-                  <pic:nvPicPr>
-                    <pic:cNvPr descr="../figures/heatmap_pcoa_pds.png" id="130" name="Picture"/>
-                    <pic:cNvPicPr>
-                      <a:picLocks noChangeArrowheads="1" noChangeAspect="1"/>
-                    </pic:cNvPicPr>
-                  </pic:nvPicPr>
-                  <pic:blipFill>
-                    <a:blip r:embed="rId128"/>
-                    <a:stretch>
-                      <a:fillRect/>
-                    </a:stretch>
-                  </pic:blipFill>
-                  <pic:spPr bwMode="auto">
-                    <a:xfrm>
-                      <a:off x="0" y="0"/>
-                      <a:ext cx="4267200" cy="3505200"/>
-                    </a:xfrm>
-                    <a:prstGeom prst="rect">
-                      <a:avLst/>
-                    </a:prstGeom>
-                    <a:noFill/>
-                    <a:ln w="9525">
-                      <a:noFill/>
-                      <a:headEnd/>
-                      <a:tailEnd/>
-                    </a:ln>
-                  </pic:spPr>
-                </pic:pic>
-              </a:graphicData>
-            </a:graphic>
-          </wp:inline>
-        </w:drawing>
+        <w:rPr>
+          <w:b/>
+          <w:bCs/>
+        </w:rPr>
+        <w:t xml:space="preserve">Figure 5. Martino selected an arbitrarily small number of sequences and a pair of datasets that were small relative to other available datasets.</w:t>
+      </w:r>
+      <w:r>
+        <w:t xml:space="preserve"> </w:t>
+      </w:r>
+      <w:r>
+        <w:t xml:space="preserve">The vertical dashed line indicates the 1,000 sequence threshold, which was used by Martino and colleagues when calculating Bray-Curtis and weighted UniFrac distances. The vertical solid line indicates the higher threshold that was added in this study to explore the effects of sequencing depths. The higher threshold was 11,879 sequences for the sleep apnea dataset, 13,755 sequences for the sponges dataset, and 10,439 sequences for the colorectal cancer dataset.</w:t>
       </w:r>
     </w:p>
     <w:p>
@@ -5817,18 +5864,13 @@
           <w:b/>
           <w:bCs/>
         </w:rPr>
-        <w:t xml:space="preserve">Figure 3. Graphical representation of an example dataset comparing communities simulated rewritten in R based on the description in Martino when 10,000 sequences were sampled from each sample.</w:t>
-      </w:r>
-      <w:r>
-        <w:t xml:space="preserve"> </w:t>
-      </w:r>
-      <w:r>
-        <w:t xml:space="preserve">This figure is analogous to Figure 1. To highlight differences in overlap simulation, only the first and last 20 features from each sample are shown. The vertical white band indicates the break in the data presentation. The yellow vertical lines on the heatmap indicate the 12 features that were differentially represented in the two treatment groups. The white diamonds indicate features that had significantly different relative abundances when tested by a Wilcoxon test with P-values corrected using a Benjamini-Hochberg correction. For this example, the differences between the positive control (P=0.001) and overlap dataset (P=0.018) were significant by PERMANOVA and non-significant for the negative control (P=0.50) using Bray-Curtis distances and significant for the positive control (P=0.001) and non-significant for the overlap dataset (P=0.11) and negative (P=0.49) control using RPCA.</w:t>
-      </w:r>
-    </w:p>
-    <w:p>
-      <w:r>
-        <w:br w:type="page"/>
+        <w:t xml:space="preserve">Figure 6. Increasing the minimum number of sequences per sample from 1,000 to more than 10,000 resulted in larger PERMANOVA F statistics and KNN accuracies.</w:t>
+      </w:r>
+      <w:r>
+        <w:t xml:space="preserve"> </w:t>
+      </w:r>
+      <w:r>
+        <w:t xml:space="preserve">Calculation of the difference in F statistic was performed using values obtained when running PERMANOVA with all available samples. The difference in Bray-Curtis PCoA values was 220% and is not shown for the sleep apnea dataset because it was so much larger than the other values. Calculation of the difference in classification accuracy was performed using the largest possible balanced design, which included 78 samples for the sponges dataset, 87 samples for the sleep apnea dataset, and 229 samples for the colorectal cancer dataset. Because 10 iterations of the sample subsampling were performed we measured the difference in accuracy for each iteration. Each point represents the median difference and the confidence intervals represent the range. The vertical gray lines indicate where the F statistic or accuracy was not different between using 1,000 sequences and the number of sequences indicated for that dataset in the legend.</w:t>
       </w:r>
     </w:p>
     <w:p>
@@ -5836,46 +5878,17 @@
         <w:pStyle w:val="BodyText"/>
       </w:pPr>
       <w:r>
-        <w:drawing>
-          <wp:inline>
-            <wp:extent cx="4267200" cy="3556000"/>
-            <wp:effectExtent b="0" l="0" r="0" t="0"/>
-            <wp:docPr descr="" title="" id="132" name="Picture"/>
-            <a:graphic>
-              <a:graphicData uri="http://schemas.openxmlformats.org/drawingml/2006/picture">
-                <pic:pic>
-                  <pic:nvPicPr>
-                    <pic:cNvPr descr="../figures/fst_knn_pds.png" id="133" name="Picture"/>
-                    <pic:cNvPicPr>
-                      <a:picLocks noChangeArrowheads="1" noChangeAspect="1"/>
-                    </pic:cNvPicPr>
-                  </pic:nvPicPr>
-                  <pic:blipFill>
-                    <a:blip r:embed="rId131"/>
-                    <a:stretch>
-                      <a:fillRect/>
-                    </a:stretch>
-                  </pic:blipFill>
-                  <pic:spPr bwMode="auto">
-                    <a:xfrm>
-                      <a:off x="0" y="0"/>
-                      <a:ext cx="4267200" cy="3556000"/>
-                    </a:xfrm>
-                    <a:prstGeom prst="rect">
-                      <a:avLst/>
-                    </a:prstGeom>
-                    <a:noFill/>
-                    <a:ln w="9525">
-                      <a:noFill/>
-                      <a:headEnd/>
-                      <a:tailEnd/>
-                    </a:ln>
-                  </pic:spPr>
-                </pic:pic>
-              </a:graphicData>
-            </a:graphic>
-          </wp:inline>
-        </w:drawing>
+        <w:rPr>
+          <w:b/>
+          <w:bCs/>
+        </w:rPr>
+        <w:t xml:space="preserve">Figure 7. Although all methods perform well on datasets with a large effect size between treatment groups, the RPCA-based methods suffer relative to the others when the effect size is smaller.</w:t>
+      </w:r>
+      <w:r>
+        <w:t xml:space="preserve"> </w:t>
+      </w:r>
+      <w:r>
+        <w:t xml:space="preserve">Each dataset was subsampled to the indicated number of samples per treatment group. For each of ten subsamplings, PERMANOVA was used to differentiate between the treatment groups. The numbers in each tile indicate the number of subsamplings that yielded a P-value less than 0.05. The blue tiles without numbers indicate those conditions where all 10 subsamplings yielded a significant result.</w:t>
       </w:r>
     </w:p>
     <w:p>
@@ -5887,18 +5900,13 @@
           <w:b/>
           <w:bCs/>
         </w:rPr>
-        <w:t xml:space="preserve">Figure 4. Relative to other methods, RPCA-based methods were not as effective at differentiating between groups of communities using PERMANOVA and KNN classification when using a revised simulation approach.</w:t>
-      </w:r>
-      <w:r>
-        <w:t xml:space="preserve"> </w:t>
-      </w:r>
-      <w:r>
-        <w:t xml:space="preserve">This figure is analogous to Figure 2 except that it uses 100 instead of 10 replicates and the power to detect differences by PERMANOVA is shown instead of the F statistic. Each circle represents the median of the 100 replicate simulations and the confidence line indicates the range between the minimum and maximum values. The median KNN classification accuracy and range were the median of 10 median values each calculated across 100 training-testing splits using the fitted K value from 80:20 splits. The vertical gray line for KNN classification indicates the accuracy one would expect from randomly guessing the treatment group. The power and accuracy values for 1,000 and 2,000 sequences per sample when using Zero CLR were not calculated since the data were too sparse for the imputation algorithm to complete.</w:t>
-      </w:r>
-    </w:p>
-    <w:p>
-      <w:r>
-        <w:br w:type="page"/>
+        <w:t xml:space="preserve">Figure 8. The RPCA-based methods performed worse or at best, no better, than other methods for classifying samples when using KNN classification.</w:t>
+      </w:r>
+      <w:r>
+        <w:t xml:space="preserve"> </w:t>
+      </w:r>
+      <w:r>
+        <w:t xml:space="preserve">Each dataset was subsampled to the indicated number of samples per treatment group 10 times and was used to train and test a KNN classifier. The value in each cell is the median accuracy amongst those subsamplings.</w:t>
       </w:r>
     </w:p>
     <w:p>
@@ -5906,46 +5914,54 @@
         <w:pStyle w:val="BodyText"/>
       </w:pPr>
       <w:r>
-        <w:drawing>
-          <wp:inline>
-            <wp:extent cx="4587290" cy="4587290"/>
-            <wp:effectExtent b="0" l="0" r="0" t="0"/>
-            <wp:docPr descr="" title="" id="135" name="Picture"/>
-            <a:graphic>
-              <a:graphicData uri="http://schemas.openxmlformats.org/drawingml/2006/picture">
-                <pic:pic>
-                  <pic:nvPicPr>
-                    <pic:cNvPr descr="../figures/cs_seq_depth.png" id="136" name="Picture"/>
-                    <pic:cNvPicPr>
-                      <a:picLocks noChangeArrowheads="1" noChangeAspect="1"/>
-                    </pic:cNvPicPr>
-                  </pic:nvPicPr>
-                  <pic:blipFill>
-                    <a:blip r:embed="rId134"/>
-                    <a:stretch>
-                      <a:fillRect/>
-                    </a:stretch>
-                  </pic:blipFill>
-                  <pic:spPr bwMode="auto">
-                    <a:xfrm>
-                      <a:off x="0" y="0"/>
-                      <a:ext cx="4587290" cy="4587290"/>
-                    </a:xfrm>
-                    <a:prstGeom prst="rect">
-                      <a:avLst/>
-                    </a:prstGeom>
-                    <a:noFill/>
-                    <a:ln w="9525">
-                      <a:noFill/>
-                      <a:headEnd/>
-                      <a:tailEnd/>
-                    </a:ln>
-                  </pic:spPr>
-                </pic:pic>
-              </a:graphicData>
-            </a:graphic>
-          </wp:inline>
-        </w:drawing>
+        <w:rPr>
+          <w:b/>
+          <w:bCs/>
+        </w:rPr>
+        <w:t xml:space="preserve">Figure 9. RPCA did not alleviate clustering of samples by sequencing depth; rarefaction and subsampling did.</w:t>
+      </w:r>
+      <w:r>
+        <w:t xml:space="preserve"> </w:t>
+      </w:r>
+      <w:r>
+        <w:t xml:space="preserve">The numbers within each cell indicate the number of simulations out of 10 that falsely gave a significant P-value for the comparison of sequencing depth. White cells without a number had no falsely significant P-values. Data are not provided for the simulations analyzed with Weighted UniFrac distances since there were no trees. Synthetic versions of each dataset were generated where each sample was subsampled to 5,000 and 10,000 sequences, combined, processed, and analyzed by a two-factor PERMANOVA. Each simulation was repeated 10 times.</w:t>
+      </w:r>
+    </w:p>
+    <w:bookmarkEnd w:id="126"/>
+    <w:bookmarkStart w:id="127" w:name="supplemental-figures"/>
+    <w:p>
+      <w:pPr>
+        <w:pStyle w:val="Heading2"/>
+      </w:pPr>
+      <w:r>
+        <w:t xml:space="preserve">Supplemental Figures</w:t>
+      </w:r>
+    </w:p>
+    <w:p>
+      <w:pPr>
+        <w:pStyle w:val="FirstParagraph"/>
+      </w:pPr>
+      <w:r>
+        <w:rPr>
+          <w:b/>
+          <w:bCs/>
+        </w:rPr>
+        <w:t xml:space="preserve">Figure S1. The choice of K and the size of the training and testing data sets had a minimal effect on KNN classification accuracy when using the original Martino overlap simulation data.</w:t>
+      </w:r>
+      <w:r>
+        <w:t xml:space="preserve"> </w:t>
+      </w:r>
+      <w:r>
+        <w:t xml:space="preserve">Martino split 60% of their data into a training set using 13 neighbors and tested on the remaining 40%. Following Topcuoglu et al.</w:t>
+      </w:r>
+      <w:r>
+        <w:t xml:space="preserve"> </w:t>
+      </w:r>
+      <w:r>
+        <w:t xml:space="preserve">(28)</w:t>
+      </w:r>
+      <w:r>
+        <w:t xml:space="preserve">, I optimized the number of neighbors using 60:40 and 80:20 training-testing splits. The 80:20 data were used in the Results section.</w:t>
       </w:r>
     </w:p>
     <w:p>
@@ -5957,362 +5973,7 @@
           <w:b/>
           <w:bCs/>
         </w:rPr>
-        <w:t xml:space="preserve">Figure 5. Martino selected an arbitrarily small number of sequences and a pair of datasets that were small relative to other available datasets.</w:t>
-      </w:r>
-      <w:r>
-        <w:t xml:space="preserve"> </w:t>
-      </w:r>
-      <w:r>
-        <w:t xml:space="preserve">The vertical dashed line indicates the 1,000 sequence threshold, which was used by Martino and colleagues when calculating Bray-Curtis and weighted UniFrac distances. The vertical solid line indicates the higher threshold that was added in this study to explore the effects of sequencing depths. The higher threshold was 11,879 sequences for the sleep apnea dataset, 13,755 sequences for the sponges dataset, and 10,439 sequences for the colorectal cancer dataset.</w:t>
-      </w:r>
-    </w:p>
-    <w:p>
-      <w:r>
-        <w:br w:type="page"/>
-      </w:r>
-    </w:p>
-    <w:p>
-      <w:pPr>
-        <w:pStyle w:val="BodyText"/>
-      </w:pPr>
-      <w:r>
-        <w:drawing>
-          <wp:inline>
-            <wp:extent cx="4267200" cy="3657600"/>
-            <wp:effectExtent b="0" l="0" r="0" t="0"/>
-            <wp:docPr descr="" title="" id="138" name="Picture"/>
-            <a:graphic>
-              <a:graphicData uri="http://schemas.openxmlformats.org/drawingml/2006/picture">
-                <pic:pic>
-                  <pic:nvPicPr>
-                    <pic:cNvPr descr="../figures/fst_knn_depth_diff_cs.png" id="139" name="Picture"/>
-                    <pic:cNvPicPr>
-                      <a:picLocks noChangeArrowheads="1" noChangeAspect="1"/>
-                    </pic:cNvPicPr>
-                  </pic:nvPicPr>
-                  <pic:blipFill>
-                    <a:blip r:embed="rId137"/>
-                    <a:stretch>
-                      <a:fillRect/>
-                    </a:stretch>
-                  </pic:blipFill>
-                  <pic:spPr bwMode="auto">
-                    <a:xfrm>
-                      <a:off x="0" y="0"/>
-                      <a:ext cx="4267200" cy="3657600"/>
-                    </a:xfrm>
-                    <a:prstGeom prst="rect">
-                      <a:avLst/>
-                    </a:prstGeom>
-                    <a:noFill/>
-                    <a:ln w="9525">
-                      <a:noFill/>
-                      <a:headEnd/>
-                      <a:tailEnd/>
-                    </a:ln>
-                  </pic:spPr>
-                </pic:pic>
-              </a:graphicData>
-            </a:graphic>
-          </wp:inline>
-        </w:drawing>
-      </w:r>
-    </w:p>
-    <w:p>
-      <w:pPr>
-        <w:pStyle w:val="BodyText"/>
-      </w:pPr>
-      <w:r>
-        <w:rPr>
-          <w:b/>
-          <w:bCs/>
-        </w:rPr>
-        <w:t xml:space="preserve">Figure 6. Increasing the minimum number of sequences per sample from 1,000 to more than 10,000 resulted in larger PERMANOVA F statistics and KNN accuracies.</w:t>
-      </w:r>
-      <w:r>
-        <w:t xml:space="preserve"> </w:t>
-      </w:r>
-      <w:r>
-        <w:t xml:space="preserve">Calculation of the difference in F statistic was performed using values obtained when running PERMANOVA with all available samples. The difference in Bray-Curtis PCoA values was 220% and is not shown for the sleep apnea dataset because it was so much larger than the other values. Calculation of the difference in classification accuracy was performed using the largest possible balanced design, which included 78 samples for the sponges dataset, 87 samples for the sleep apnea dataset, and 229 samples for the colorectal cancer dataset. Because 10 iterations of the sample subsampling were performed we measured the difference in accuracy for each iteration. Each point represents the median difference and the confidence intervals represent the range. The vertical gray lines indicate where the F statistic or accuracy was not different between using 1,000 sequences and the number of sequences indicated for that dataset in the legend.</w:t>
-      </w:r>
-    </w:p>
-    <w:p>
-      <w:r>
-        <w:br w:type="page"/>
-      </w:r>
-    </w:p>
-    <w:p>
-      <w:pPr>
-        <w:pStyle w:val="BodyText"/>
-      </w:pPr>
-      <w:r>
-        <w:drawing>
-          <wp:inline>
-            <wp:extent cx="5334000" cy="3333749"/>
-            <wp:effectExtent b="0" l="0" r="0" t="0"/>
-            <wp:docPr descr="" title="" id="141" name="Picture"/>
-            <a:graphic>
-              <a:graphicData uri="http://schemas.openxmlformats.org/drawingml/2006/picture">
-                <pic:pic>
-                  <pic:nvPicPr>
-                    <pic:cNvPr descr="../figures/heatmap_permanova_sig_cs.png" id="142" name="Picture"/>
-                    <pic:cNvPicPr>
-                      <a:picLocks noChangeArrowheads="1" noChangeAspect="1"/>
-                    </pic:cNvPicPr>
-                  </pic:nvPicPr>
-                  <pic:blipFill>
-                    <a:blip r:embed="rId140"/>
-                    <a:stretch>
-                      <a:fillRect/>
-                    </a:stretch>
-                  </pic:blipFill>
-                  <pic:spPr bwMode="auto">
-                    <a:xfrm>
-                      <a:off x="0" y="0"/>
-                      <a:ext cx="5334000" cy="3333749"/>
-                    </a:xfrm>
-                    <a:prstGeom prst="rect">
-                      <a:avLst/>
-                    </a:prstGeom>
-                    <a:noFill/>
-                    <a:ln w="9525">
-                      <a:noFill/>
-                      <a:headEnd/>
-                      <a:tailEnd/>
-                    </a:ln>
-                  </pic:spPr>
-                </pic:pic>
-              </a:graphicData>
-            </a:graphic>
-          </wp:inline>
-        </w:drawing>
-      </w:r>
-    </w:p>
-    <w:p>
-      <w:pPr>
-        <w:pStyle w:val="BodyText"/>
-      </w:pPr>
-      <w:r>
-        <w:rPr>
-          <w:b/>
-          <w:bCs/>
-        </w:rPr>
-        <w:t xml:space="preserve">Figure 7. Although all methods perform well on datasets with a large effect size between treatment groups, the RPCA-based methods suffer relative to the others when the effect size is smaller.</w:t>
-      </w:r>
-      <w:r>
-        <w:t xml:space="preserve"> </w:t>
-      </w:r>
-      <w:r>
-        <w:t xml:space="preserve">Each dataset was subsampled to the indicated number of samples per treatment group. For each of ten subsamplings, PERMANOVA was used to differentiate between the treatment groups. The numbers in each tile indicate the number of subsamplings that yielded a P-value less than 0.05. The blue tiles without numbers indicate those conditions where all 10 subsamplings yielded a significant result.</w:t>
-      </w:r>
-    </w:p>
-    <w:p>
-      <w:r>
-        <w:br w:type="page"/>
-      </w:r>
-    </w:p>
-    <w:p>
-      <w:pPr>
-        <w:pStyle w:val="BodyText"/>
-      </w:pPr>
-      <w:r>
-        <w:drawing>
-          <wp:inline>
-            <wp:extent cx="5334000" cy="3333749"/>
-            <wp:effectExtent b="0" l="0" r="0" t="0"/>
-            <wp:docPr descr="" title="" id="144" name="Picture"/>
-            <a:graphic>
-              <a:graphicData uri="http://schemas.openxmlformats.org/drawingml/2006/picture">
-                <pic:pic>
-                  <pic:nvPicPr>
-                    <pic:cNvPr descr="../figures/heatmap_knn_cs.png" id="145" name="Picture"/>
-                    <pic:cNvPicPr>
-                      <a:picLocks noChangeArrowheads="1" noChangeAspect="1"/>
-                    </pic:cNvPicPr>
-                  </pic:nvPicPr>
-                  <pic:blipFill>
-                    <a:blip r:embed="rId143"/>
-                    <a:stretch>
-                      <a:fillRect/>
-                    </a:stretch>
-                  </pic:blipFill>
-                  <pic:spPr bwMode="auto">
-                    <a:xfrm>
-                      <a:off x="0" y="0"/>
-                      <a:ext cx="5334000" cy="3333749"/>
-                    </a:xfrm>
-                    <a:prstGeom prst="rect">
-                      <a:avLst/>
-                    </a:prstGeom>
-                    <a:noFill/>
-                    <a:ln w="9525">
-                      <a:noFill/>
-                      <a:headEnd/>
-                      <a:tailEnd/>
-                    </a:ln>
-                  </pic:spPr>
-                </pic:pic>
-              </a:graphicData>
-            </a:graphic>
-          </wp:inline>
-        </w:drawing>
-      </w:r>
-    </w:p>
-    <w:p>
-      <w:pPr>
-        <w:pStyle w:val="BodyText"/>
-      </w:pPr>
-      <w:r>
-        <w:rPr>
-          <w:b/>
-          <w:bCs/>
-        </w:rPr>
-        <w:t xml:space="preserve">Figure 8. The RPCA-based methods performed worse or at best, no better, than other methods for classifying samples when using KNN classification.</w:t>
-      </w:r>
-      <w:r>
-        <w:t xml:space="preserve"> </w:t>
-      </w:r>
-      <w:r>
-        <w:t xml:space="preserve">Each dataset was subsampled to the indicated number of samples per treatment group 10 times and was used to train and test a KNN classifier. The value in each cell is the median accuracy amongst those subsamplings.</w:t>
-      </w:r>
-    </w:p>
-    <w:p>
-      <w:r>
-        <w:br w:type="page"/>
-      </w:r>
-    </w:p>
-    <w:p>
-      <w:pPr>
-        <w:pStyle w:val="BodyText"/>
-      </w:pPr>
-      <w:r>
-        <w:drawing>
-          <wp:inline>
-            <wp:extent cx="5334000" cy="3333749"/>
-            <wp:effectExtent b="0" l="0" r="0" t="0"/>
-            <wp:docPr descr="" title="" id="147" name="Picture"/>
-            <a:graphic>
-              <a:graphicData uri="http://schemas.openxmlformats.org/drawingml/2006/picture">
-                <pic:pic>
-                  <pic:nvPicPr>
-                    <pic:cNvPr descr="../figures/heatmap_depth_sig.png" id="148" name="Picture"/>
-                    <pic:cNvPicPr>
-                      <a:picLocks noChangeArrowheads="1" noChangeAspect="1"/>
-                    </pic:cNvPicPr>
-                  </pic:nvPicPr>
-                  <pic:blipFill>
-                    <a:blip r:embed="rId146"/>
-                    <a:stretch>
-                      <a:fillRect/>
-                    </a:stretch>
-                  </pic:blipFill>
-                  <pic:spPr bwMode="auto">
-                    <a:xfrm>
-                      <a:off x="0" y="0"/>
-                      <a:ext cx="5334000" cy="3333749"/>
-                    </a:xfrm>
-                    <a:prstGeom prst="rect">
-                      <a:avLst/>
-                    </a:prstGeom>
-                    <a:noFill/>
-                    <a:ln w="9525">
-                      <a:noFill/>
-                      <a:headEnd/>
-                      <a:tailEnd/>
-                    </a:ln>
-                  </pic:spPr>
-                </pic:pic>
-              </a:graphicData>
-            </a:graphic>
-          </wp:inline>
-        </w:drawing>
-      </w:r>
-    </w:p>
-    <w:p>
-      <w:pPr>
-        <w:pStyle w:val="BodyText"/>
-      </w:pPr>
-      <w:r>
-        <w:rPr>
-          <w:b/>
-          <w:bCs/>
-        </w:rPr>
-        <w:t xml:space="preserve">Figure 9. RPCA did not alleviate clustering of samples by sequencing depth; rarefaction and subsampling did.</w:t>
-      </w:r>
-      <w:r>
-        <w:t xml:space="preserve"> </w:t>
-      </w:r>
-      <w:r>
-        <w:t xml:space="preserve">The numbers within each cell indicate the number of simulations out of 10 that falsely gave a significant P-value for the comparison of sequencing depth. Cells without a number had no falsely significant P-values. Synthetic versions of each dataset were generated where each sample was subsampled to 5,000 and 10,000 sequences, combined, processed, and analyzed by a two-factor PERMANOVA. Each simulation was repeated 10 times.</w:t>
-      </w:r>
-    </w:p>
-    <w:bookmarkEnd w:id="149"/>
-    <w:bookmarkStart w:id="156" w:name="supplemental-figures"/>
-    <w:p>
-      <w:pPr>
-        <w:pStyle w:val="Heading2"/>
-      </w:pPr>
-      <w:r>
-        <w:t xml:space="preserve">Supplemental Figures</w:t>
-      </w:r>
-    </w:p>
-    <w:p>
-      <w:pPr>
-        <w:pStyle w:val="FirstParagraph"/>
-      </w:pPr>
-      <w:r>
-        <w:drawing>
-          <wp:inline>
-            <wp:extent cx="5334000" cy="3810000"/>
-            <wp:effectExtent b="0" l="0" r="0" t="0"/>
-            <wp:docPr descr="" title="" id="151" name="Picture"/>
-            <a:graphic>
-              <a:graphicData uri="http://schemas.openxmlformats.org/drawingml/2006/picture">
-                <pic:pic>
-                  <pic:nvPicPr>
-                    <pic:cNvPr descr="../figures/knn_methods_martino.png" id="152" name="Picture"/>
-                    <pic:cNvPicPr>
-                      <a:picLocks noChangeArrowheads="1" noChangeAspect="1"/>
-                    </pic:cNvPicPr>
-                  </pic:nvPicPr>
-                  <pic:blipFill>
-                    <a:blip r:embed="rId150"/>
-                    <a:stretch>
-                      <a:fillRect/>
-                    </a:stretch>
-                  </pic:blipFill>
-                  <pic:spPr bwMode="auto">
-                    <a:xfrm>
-                      <a:off x="0" y="0"/>
-                      <a:ext cx="5334000" cy="3810000"/>
-                    </a:xfrm>
-                    <a:prstGeom prst="rect">
-                      <a:avLst/>
-                    </a:prstGeom>
-                    <a:noFill/>
-                    <a:ln w="9525">
-                      <a:noFill/>
-                      <a:headEnd/>
-                      <a:tailEnd/>
-                    </a:ln>
-                  </pic:spPr>
-                </pic:pic>
-              </a:graphicData>
-            </a:graphic>
-          </wp:inline>
-        </w:drawing>
-      </w:r>
-    </w:p>
-    <w:p>
-      <w:pPr>
-        <w:pStyle w:val="BodyText"/>
-      </w:pPr>
-      <w:r>
-        <w:rPr>
-          <w:b/>
-          <w:bCs/>
-        </w:rPr>
-        <w:t xml:space="preserve">Figure S1. The choice of K and the size of the training and testing data sets had a minimal effect on KNN classification accuracy when using the original Martino overlap simulation data.</w:t>
+        <w:t xml:space="preserve">Figure S2. The choice of K and the size of the training and testing data sets had a minimal effect on KNN classification accuracy when using the data generated by the revised simulation code.</w:t>
       </w:r>
       <w:r>
         <w:t xml:space="preserve"> </w:t>
@@ -6330,87 +5991,8 @@
         <w:t xml:space="preserve">, I optimized the number of neighbors using 60:40 and 80:20 training-testing splits. The 80:20 data were used in the Results section.</w:t>
       </w:r>
     </w:p>
-    <w:p>
-      <w:r>
-        <w:br w:type="page"/>
-      </w:r>
-    </w:p>
-    <w:p>
-      <w:pPr>
-        <w:pStyle w:val="BodyText"/>
-      </w:pPr>
-      <w:r>
-        <w:drawing>
-          <wp:inline>
-            <wp:extent cx="5334000" cy="3810000"/>
-            <wp:effectExtent b="0" l="0" r="0" t="0"/>
-            <wp:docPr descr="" title="" id="154" name="Picture"/>
-            <a:graphic>
-              <a:graphicData uri="http://schemas.openxmlformats.org/drawingml/2006/picture">
-                <pic:pic>
-                  <pic:nvPicPr>
-                    <pic:cNvPr descr="../figures/knn_methods_pds.png" id="155" name="Picture"/>
-                    <pic:cNvPicPr>
-                      <a:picLocks noChangeArrowheads="1" noChangeAspect="1"/>
-                    </pic:cNvPicPr>
-                  </pic:nvPicPr>
-                  <pic:blipFill>
-                    <a:blip r:embed="rId153"/>
-                    <a:stretch>
-                      <a:fillRect/>
-                    </a:stretch>
-                  </pic:blipFill>
-                  <pic:spPr bwMode="auto">
-                    <a:xfrm>
-                      <a:off x="0" y="0"/>
-                      <a:ext cx="5334000" cy="3810000"/>
-                    </a:xfrm>
-                    <a:prstGeom prst="rect">
-                      <a:avLst/>
-                    </a:prstGeom>
-                    <a:noFill/>
-                    <a:ln w="9525">
-                      <a:noFill/>
-                      <a:headEnd/>
-                      <a:tailEnd/>
-                    </a:ln>
-                  </pic:spPr>
-                </pic:pic>
-              </a:graphicData>
-            </a:graphic>
-          </wp:inline>
-        </w:drawing>
-      </w:r>
-    </w:p>
-    <w:p>
-      <w:pPr>
-        <w:pStyle w:val="BodyText"/>
-      </w:pPr>
-      <w:r>
-        <w:rPr>
-          <w:b/>
-          <w:bCs/>
-        </w:rPr>
-        <w:t xml:space="preserve">Figure S2. The choice of K and the size of the training and testing data sets had a minimal effect on KNN classification accuracy when using the data generated by the revised simulation code.</w:t>
-      </w:r>
-      <w:r>
-        <w:t xml:space="preserve"> </w:t>
-      </w:r>
-      <w:r>
-        <w:t xml:space="preserve">Martino split 60% of their data into a training set using 13 neighbors and tested on the remaining 40%. Following Topcuoglu et al.</w:t>
-      </w:r>
-      <w:r>
-        <w:t xml:space="preserve"> </w:t>
-      </w:r>
-      <w:r>
-        <w:t xml:space="preserve">(28)</w:t>
-      </w:r>
-      <w:r>
-        <w:t xml:space="preserve">, I optimized the number of neighbors using 60:40 and 80:20 training-testing splits. The 80:20 data were used in the Results section.</w:t>
-      </w:r>
-    </w:p>
-    <w:bookmarkEnd w:id="156"/>
-    <w:bookmarkEnd w:id="157"/>
+    <w:bookmarkEnd w:id="127"/>
+    <w:bookmarkEnd w:id="128"/>
     <w:sectPr>
       <w:footnotePr>
         <w:numRestart w:val="eachSect"/>

</xml_diff>

<commit_message>
Change Martino to Martino et al.
</commit_message>
<xml_diff>
--- a/submission/manuscript.docx
+++ b/submission/manuscript.docx
@@ -86,7 +86,7 @@
           <w:b/>
           <w:bCs/>
         </w:rPr>
-        <w:t xml:space="preserve">Research article</w:t>
+        <w:t xml:space="preserve">Matters arising</w:t>
       </w:r>
     </w:p>
     <w:p>
@@ -334,7 +334,7 @@
         <w:t xml:space="preserve"> </w:t>
       </w:r>
       <w:r>
-        <w:t xml:space="preserve">(i.e., Martino) proposed calculating CLR values for each sample after ignoring zero values followed by matrix completion using the OptSpace matrix completion algorithm. They called this method robust Aitchison principal components analysis (PCA) (i.e., RPCA). The authors claimed that the advantage of RPCA over the other CLR-based approaches was that it did not require imputing zero values and that the method was less sensitive to uneven sampling effort.</w:t>
+        <w:t xml:space="preserve">proposed calculating CLR values for each sample after ignoring zero values followed by matrix completion using the OptSpace matrix completion algorithm. They called this method robust Aitchison principal components analysis (PCA) (i.e., RPCA). The authors claimed that the advantage of RPCA over the other CLR-based approaches was that it did not require imputing zero values and that the method was less sensitive to uneven sampling effort.</w:t>
       </w:r>
     </w:p>
     <w:p>
@@ -428,7 +428,7 @@
         <w:t xml:space="preserve">(4)</w:t>
       </w:r>
       <w:r>
-        <w:t xml:space="preserve">. Alternatively, Martino modelled communities with known effect sizes using a statistical model that sought to mimic the diversity of communities described in a study comparing the microbial communities found on people’s fingertips and their computer keyboards</w:t>
+        <w:t xml:space="preserve">. Alternatively, Martino et al. modelled communities with known effect sizes using a statistical model that sought to mimic the diversity of communities described in a study comparing the microbial communities found on people’s fingertips and their computer keyboards</w:t>
       </w:r>
       <w:r>
         <w:t xml:space="preserve"> </w:t>
@@ -437,7 +437,7 @@
         <w:t xml:space="preserve">(27)</w:t>
       </w:r>
       <w:r>
-        <w:t xml:space="preserve">. As described in Martino, the overall simulation framework involved simulating two treatment groups each represented by 100 communities for a total of 200 communities. Each community contained as many as 1,000 taxa. They stated that for each treatment group they fit a normal distribution to the relative abundances of taxa from two individuals’ samples to obtain a mean and standard deviation for each taxon. The fraction of taxa that overlapped between treatment groups was also selected to mimic the overlap observed between the two individuals. The expected taxon relative abundances for each sample were the same across each sample within the same treatment group. Next, a common normal distribution with a single mean and standard deviation was used to generate noise (i.e., homoscedastic noise) that was added to each relative abundance value to create variation across samples and features. Next, a random subset of sample-taxa combinations were selected for incorporation of additional noise (i.e., heteroscedastic noise). Finally, the sample-taxa combinations were randomly sampled using a Poisson-lognormal distribution to generate the simulated number of sequences for each sample-taxa combination so that the total number of sequences within a sample contained approximately 1,000, 2,000, 4,000, or 10,000 sequences per simulation; one set of 200 samples were simulated for each sequencing depth. In addition to the simulation where a subset of taxa was shared in both treatment groups, Martino created positive and negative control simulations. In the positive control simulation, there were no overlapping taxa resulting in two clearly defined groups of samples. In the negative control simulation all the taxa were shared in similar abundance so that the groups of samples could not be distinguished. Finally, they compared RPCA to other methods using two published datasets.</w:t>
+        <w:t xml:space="preserve">. As described in Martino et al., the overall simulation framework involved simulating two treatment groups each represented by 100 communities for a total of 200 communities. Each community contained as many as 1,000 taxa. They stated that for each treatment group they fit a normal distribution to the relative abundances of taxa from two individuals’ samples to obtain a mean and standard deviation for each taxon. The fraction of taxa that overlapped between treatment groups was also selected to mimic the overlap observed between the two individuals. The expected taxon relative abundances for each sample were the same across each sample within the same treatment group. Next, a common normal distribution with a single mean and standard deviation was used to generate noise (i.e., homoscedastic noise) that was added to each relative abundance value to create variation across samples and features. Next, a random subset of sample-taxa combinations were selected for incorporation of additional noise (i.e., heteroscedastic noise). Finally, the sample-taxa combinations were randomly sampled using a Poisson-lognormal distribution to generate the simulated number of sequences for each sample-taxa combination so that the total number of sequences within a sample contained approximately 1,000, 2,000, 4,000, or 10,000 sequences per simulation; one set of 200 samples were simulated for each sequencing depth. In addition to the simulation where a subset of taxa was shared in both treatment groups, Martino et al. created positive and negative control simulations. In the positive control simulation, there were no overlapping taxa resulting in two clearly defined groups of samples. In the negative control simulation all the taxa were shared in similar abundance so that the groups of samples could not be distinguished. Finally, they compared RPCA to other methods using two published datasets.</w:t>
       </w:r>
     </w:p>
     <w:p>
@@ -445,7 +445,7 @@
         <w:pStyle w:val="BodyText"/>
       </w:pPr>
       <w:r>
-        <w:t xml:space="preserve">This difference in modelling strategy created an interesting opportunity to reassess the performance of RPCA and other CLR-based approaches relative to rarefaction. Although Martino used an interesting modelling approach, they did not compare RPCA to other CLR-based approaches or to rarefaction. Furthermore, they used benchmarking tests that did not reflect how researchers typically analyze microbial community data. The goal of the current study was to repeat the benchmarking of RPCA and other CLR-based methods relative to rarefaction using the modelling framework described by Martino.</w:t>
+        <w:t xml:space="preserve">This difference in modelling strategy created an interesting opportunity to reassess the performance of RPCA and other CLR-based approaches relative to rarefaction. Although Martino et al. used an interesting modelling approach, they did not compare RPCA to other CLR-based approaches or to rarefaction. Furthermore, they used benchmarking tests that did not reflect how researchers typically analyze microbial community data. The goal of the current study was to repeat the benchmarking of RPCA and other CLR-based methods relative to rarefaction using the modelling framework described by Martino et al.</w:t>
       </w:r>
     </w:p>
     <w:bookmarkEnd w:id="22"/>
@@ -472,7 +472,7 @@
         <w:pStyle w:val="FirstParagraph"/>
       </w:pPr>
       <w:r>
-        <w:t xml:space="preserve">To maintain a connection to Martino’s original simulations and implement a broader set of tests, several changes were necessary in the implementation of Martino’s code. First, Martino’s code did not return the same number of sequences for each sample. Because one goal of the current study was to assess the effect of variation in sequencing effort on the performance of RPCA, I modified the parameters inputted to Martino’s code to produce more than the desired number of sequences per sample and then performed a single subsampling of the samples to 1,000, 2,000, 4,000, or 10,000 sequences per sample to have exactly the desired number of sequences per sample. Second, to account for the effect of the random number generator, instead of replicating each simulation condition only once as Martino did, I replicated each condition 10 or 100 times depending on the analysis. Third, Martino only analyzed their positive and negative control simulations with 4,000 sequences. My implementation of their simulations and subsequent tests added the sequencing depths of 1,000, 2,000, and 10,000 sequences for the positive and negative controls and for the simulations with partially overlapping treatment groups. The regenerated heatmaps and PCoA plots in Figure 1 are qualitatively similar to those in Figure 3 of Martino suggesting that my changes to the original code were superficial. The most notable difference to Martino’s version of the figure was that they inadvertently switched the labels of the axes and performed the One CLR transformation on features rather than samples (Supplementary Text). Replicating what Martino reported, the first two axes of the Bray-Curtis ordinations only explained a fraction of the total variation in the data while the RPCA ordinations explained all the variation. However, this was because RPCA is run by giving the algorithm a desired number of axes; in this case, 2 axes. Regardless, the ratio of the fraction of the variation explained by the first two axes were similar between RPCA and PCoA with Bray-Curtis.</w:t>
+        <w:t xml:space="preserve">To maintain a connection to Martino et al.’s original simulations and implement a broader set of tests, several changes were necessary in the implementation of Martino et al.’s code. First, Martino et al.’s code did not return the same number of sequences for each sample. Because one goal of the current study was to assess the effect of variation in sequencing effort on the performance of RPCA, I modified the parameters inputted to Martino et al.’s code to produce more than the desired number of sequences per sample and then performed a single subsampling of the samples to 1,000, 2,000, 4,000, or 10,000 sequences per sample to have exactly the desired number of sequences per sample. Second, to account for the effect of the random number generator, instead of replicating each simulation condition only once as Martino et al. did, I replicated each condition 10 or 100 times depending on the analysis. Third, Martino et al. only analyzed their positive and negative control simulations with 4,000 sequences. My implementation of their simulations and subsequent tests added the sequencing depths of 1,000, 2,000, and 10,000 sequences for the positive and negative controls and for the simulations with partially overlapping treatment groups. The regenerated heatmaps and PCoA plots in Figure 1 are qualitatively similar to those in Figure 3 of Martino et al. suggesting that my changes to the original code were superficial. The most notable difference to Martino et al.’s version of the figure was that they inadvertently switched the labels of the axes and performed the One CLR transformation on features rather than samples (Supplementary Text). Replicating what Martino et al. reported, the first two axes of the Bray-Curtis ordinations only explained a fraction of the total variation in the data while the RPCA ordinations explained all the variation. However, this was because RPCA is run by giving the algorithm a desired number of axes; in this case, 2 axes. Regardless, the ratio of the fraction of the variation explained by the first two axes were similar between RPCA and PCoA with Bray-Curtis.</w:t>
       </w:r>
     </w:p>
     <w:bookmarkEnd w:id="23"/>
@@ -490,7 +490,7 @@
         <w:pStyle w:val="FirstParagraph"/>
       </w:pPr>
       <w:r>
-        <w:t xml:space="preserve">Martino used the PERMANOVA F statistic to compare the ability of RPCA to differentiate treatment groups using raw counts or removing zero values prior to calculating the CLR (RCLR). Using the partially overlapping treatment groups they found that the RCLR pretreatment yielded larger F statistics than using raw counts. Repeating Martino’s PERMANOVA analysis, I was able to replicate their results when using RPCA (Figure 2). However, by generating 10 replicate datasets (Martino only performed one), I observed considerable variation across replicates for the F statistics calculated using RPCA with raw counts. Unfortunately, Martino did not make any comparisons to other methods of calculating distances. When I calculated Euclidean distances using other CLR and DeSeq2 transformations and Bray-Curtis distances using raw counts and normalized data, all resulted in small F statistics. I suspected that the RPCA data generated relatively large F statistics because the Euclidean distances calculated using RPCA was only done with the first two axes. This would have removed a considerable amount of variation that was embedded in the third and higher axes. The result would be elevated F statistics. To test this hypothesis, I performed PCoA on Bray-Curtis distances, calculated Euclidean distances using the first two axes of the resulting PCoA, and subjected those distances to PERMANOVA (see</w:t>
+        <w:t xml:space="preserve">Martino et al. used the PERMANOVA F statistic to compare the ability of RPCA to differentiate treatment groups using raw counts or removing zero values prior to calculating the CLR (RCLR). Using the partially overlapping treatment groups they found that the RCLR pretreatment yielded larger F statistics than using raw counts. Repeating Martino et al.’s PERMANOVA analysis, I was able to replicate their results when using RPCA (Figure 2). However, by generating 10 replicate datasets (Martino et al. only performed one), I observed considerable variation across replicates for the F statistics calculated using RPCA with raw counts. Unfortunately, Martino et al. did not make any comparisons to other methods of calculating distances. When I calculated Euclidean distances using other CLR and DeSeq2 transformations and Bray-Curtis distances using raw counts and normalized data, all resulted in small F statistics. I suspected that the RPCA data generated relatively large F statistics because the Euclidean distances calculated using RPCA was only done with the first two axes. This would have removed a considerable amount of variation that was embedded in the third and higher axes. The result would be elevated F statistics. To test this hypothesis, I performed PCoA on Bray-Curtis distances, calculated Euclidean distances using the first two axes of the resulting PCoA, and subjected those distances to PERMANOVA (see</w:t>
       </w:r>
       <w:r>
         <w:t xml:space="preserve"> </w:t>
@@ -520,7 +520,7 @@
         <w:pStyle w:val="FirstParagraph"/>
       </w:pPr>
       <w:r>
-        <w:t xml:space="preserve">In addition to comparing PERMANOVA F statistics, Martino used KNN classification to distinguish between the two partially overlapping treatment groups. Although Martino’s text indicated they used 40% of the samples in the training set and 60% in the testing set (i.e., a 40:60 cross validation split), their code indicated that the design was actually the opposite with 60% of the samples in the training set and the remaining in the testing set (Supplemental Text); a 60:40 split is more conventional. To execute the KNN classification, Martino used the first two axes calculated from RPCA using raw counts and RCLR transformed data as the input to their KNN classification. I replicated the 60:40 split 100 times for each of the 10 simulations reporting the median accuracy on the 40% testing data for each simulation. The original Martino data indicated that the accuracy of using raw counts with RPCA was near 0.5, indicating it did no better than randomly guessing. While the minimum values I observed across the 10 replicate simulations overlapped with these results, the median values were all better than random (</w:t>
+        <w:t xml:space="preserve">In addition to comparing PERMANOVA F statistics, Martino et al. used KNN classification to distinguish between the two partially overlapping treatment groups. Although Martino et al.’s text indicated they used 40% of the samples in the training set and 60% in the testing set (i.e., a 40:60 cross validation split), their code indicated that the design was actually the opposite with 60% of the samples in the training set and the remaining in the testing set (Supplemental Text); a 60:40 split is more conventional. To execute the KNN classification, Martino et al. used the first two axes calculated from RPCA using raw counts and RCLR transformed data as the input to their KNN classification. I replicated the 60:40 split 100 times for each of the 10 simulations reporting the median accuracy on the 40% testing data for each simulation. The original Martino et al. data indicated that the accuracy of using raw counts with RPCA was near 0.5, indicating it did no better than randomly guessing. While the minimum values I observed across the 10 replicate simulations overlapped with these results, the median values were all better than random (</w:t>
       </w:r>
       <w:r>
         <w:t xml:space="preserve">“Raw + RPCA”</w:t>
@@ -529,7 +529,7 @@
         <w:t xml:space="preserve"> </w:t>
       </w:r>
       <w:r>
-        <w:t xml:space="preserve">in Figure 2). I was able to replicate Martino’s result showing that using RCLR transformed counts as input to RPCA yielded higher accuracy than using raw counts.</w:t>
+        <w:t xml:space="preserve">in Figure 2). I was able to replicate Martino et al.’s result showing that using RCLR transformed counts as input to RPCA yielded higher accuracy than using raw counts.</w:t>
       </w:r>
     </w:p>
     <w:p>
@@ -545,7 +545,7 @@
         <w:pStyle w:val="BodyText"/>
       </w:pPr>
       <w:r>
-        <w:t xml:space="preserve">Martino did not report the classification accuracy for their positive and negative controls. As would be expected, the mean accuracy for classifying the treatment groups in the negative control model across each depth, transformation, and distance calculation was 0.50 (sd = 0.01). Furthermore, the mean accuracy for classifying samples in the positive control was 0.99 (sd = 0.01).</w:t>
+        <w:t xml:space="preserve">Martino et al. did not report the classification accuracy for their positive and negative controls. As would be expected, the mean accuracy for classifying the treatment groups in the negative control model across each depth, transformation, and distance calculation was 0.50 (sd = 0.01). Furthermore, the mean accuracy for classifying samples in the positive control was 0.99 (sd = 0.01).</w:t>
       </w:r>
     </w:p>
     <w:p>
@@ -553,7 +553,7 @@
         <w:pStyle w:val="BodyText"/>
       </w:pPr>
       <w:r>
-        <w:t xml:space="preserve">Rather than using a training data set to identify an optimal number of neighbors (i.e., K), Martino used 13 neighbors. To assess whether the classification was sensitive to the number of neighbors, I split the 60% of samples in the training data into another 60:40 split to train and optimize the number of neighbors 100 times</w:t>
+        <w:t xml:space="preserve">Rather than using a training data set to identify an optimal number of neighbors (i.e., K), Martino et al. used 13 neighbors. To assess whether the classification was sensitive to the number of neighbors, I split the 60% of samples in the training data into another 60:40 split to train and optimize the number of neighbors 100 times</w:t>
       </w:r>
       <w:r>
         <w:t xml:space="preserve"> </w:t>
@@ -562,7 +562,7 @@
         <w:t xml:space="preserve">(28)</w:t>
       </w:r>
       <w:r>
-        <w:t xml:space="preserve">. Across the various conditions, the median optimal number of neighbors was 33 (IQR=21 to 41). When I repeated the search for the optimal value of K using a more conventional 80:20 split, the median optimal number of neighbors was 58 (IQR=42 to 65). Regardless of finding that the optimal number of neighbors was consistently larger than the 13 that Martino used, the difference in accuracy values was only modestly better than the other fitting procedures when using 80:20 splits with the simulated data (Figure S1).</w:t>
+        <w:t xml:space="preserve">. Across the various conditions, the median optimal number of neighbors was 33 (IQR=21 to 41). When I repeated the search for the optimal value of K using a more conventional 80:20 split, the median optimal number of neighbors was 58 (IQR=42 to 65). Regardless of finding that the optimal number of neighbors was consistently larger than the 13 that Martino et al. used, the difference in accuracy values was only modestly better than the other fitting procedures when using 80:20 splits with the simulated data (Figure S1).</w:t>
       </w:r>
     </w:p>
     <w:bookmarkEnd w:id="25"/>
@@ -580,7 +580,7 @@
         <w:pStyle w:val="FirstParagraph"/>
       </w:pPr>
       <w:r>
-        <w:t xml:space="preserve">Using the simulation where the treatment groups partially overlapped, the PERMANOVA analyses yielded significant P-values and KNN classification were effective at distinguishing between the groups for nearly all of the methods. Because the simulated effect size was so large, it was not possible to easily differentiate between the methods’ performance. Therefore, I created treatment groups that were more similar than those simulated by Martino. Unfortunately, in the process of modifying their code to decrease the effect size, I identified a number of incongruities between Martino’s written description in their paper and in their code. This limited my ability to reuse their code to simulate greater overlap between the treatment groups (Supplemental Text). These issues included: (i) samples rather than features were shared between treatment groups; (ii) among samples from the same treatment group, the relative abundance distributions for the features were uniform; (iii) the total number of individuals in the samples varied across the simulated datasets; (iv) the heteroscedastic source of noise was actually applied to all sample-feature combinations; (v) negative mean values were used when sampling normal distribution sampling functions when calculating the heteroscedastic noise; (vi) negative abundance values generated after applying the heteroscedastic noise were made positive; and (vii) setting the random number generator seed was unable to produce reproducible simulations. I rewrote the simulation code in the R programming language to correct these issues. To simulate a more nuanced difference in treatment groups, I increased the total number of features across all samples from 1,000 to 10,000 and set 12 features to be differentially abundant between the treatment groups. These parameter values were selected to create conditions where approximately 50% of PERMANOVA tests using Bray-Curtis distances yielded P-values less than 0.05. Using the same number of features, I recreated negative and positive control simulations in which all features were shared or where the features were differentially represented between one of the two treatment groups. The resulting simulations provided benchmarking data that is more indicative of what is commonly observed with empirical data than what was observed by Martino (Figure 3). The simulations were replicated 100 times to obtain greater precision in calculating the power to detect differences by PERMANOVA and the accuracy of KNN classification.</w:t>
+        <w:t xml:space="preserve">Using the simulation where the treatment groups partially overlapped, the PERMANOVA analyses yielded significant P-values and KNN classification were effective at distinguishing between the groups for nearly all of the methods. Because the simulated effect size was so large, it was not possible to easily differentiate between the methods’ performance. Therefore, I created treatment groups that were more similar than those simulated by Martino et al. Unfortunately, in the process of modifying their code to decrease the effect size, I identified a number of incongruities between Martino et al.’s written description in their paper and in their code. This limited my ability to reuse their code to simulate greater overlap between the treatment groups (Supplemental Text). These issues included: (i) samples rather than features were shared between treatment groups; (ii) among samples from the same treatment group, the relative abundance distributions for the features were uniform; (iii) the total number of individuals in the samples varied across the simulated datasets; (iv) the heteroscedastic source of noise was actually applied to all sample-feature combinations; (v) negative mean values were used when sampling normal distribution sampling functions when calculating the heteroscedastic noise; (vi) negative abundance values generated after applying the heteroscedastic noise were made positive; and (vii) setting the random number generator seed was unable to produce reproducible simulations. I rewrote the simulation code in the R programming language to correct these issues. To simulate a more nuanced difference in treatment groups, I increased the total number of features across all samples from 1,000 to 10,000 and set 12 features to be differentially abundant between the treatment groups. These parameter values were selected to create conditions where approximately 50% of PERMANOVA tests using Bray-Curtis distances yielded P-values less than 0.05. Using the same number of features, I recreated negative and positive control simulations in which all features were shared or where the features were differentially represented between one of the two treatment groups. The resulting simulations provided benchmarking data that is more indicative of what is commonly observed with empirical data than what was observed by Martino et al. (Figure 3). The simulations were replicated 100 times to obtain greater precision in calculating the power to detect differences by PERMANOVA and the accuracy of KNN classification.</w:t>
       </w:r>
     </w:p>
     <w:p>
@@ -606,7 +606,7 @@
         <w:pStyle w:val="FirstParagraph"/>
       </w:pPr>
       <w:r>
-        <w:t xml:space="preserve">After describing the results of their simulations, Martino used two published datasets as case studies to evaluate RPCA relative to Bray-Curtis and weighted UniFrac distances using PERMANOVA, KNN, and ordinations. The two datasets were drawn from a natural study comparing healthy and stressed sponges</w:t>
+        <w:t xml:space="preserve">After describing the results of their simulations, Martino et al. used two published datasets as case studies to evaluate RPCA relative to Bray-Curtis and weighted UniFrac distances using PERMANOVA, KNN, and ordinations. The two datasets were drawn from a natural study comparing healthy and stressed sponges</w:t>
       </w:r>
       <w:r>
         <w:t xml:space="preserve"> </w:t>
@@ -644,7 +644,7 @@
         <w:pStyle w:val="BodyText"/>
       </w:pPr>
       <w:r>
-        <w:t xml:space="preserve">After conducting an exhaustive review of the code that Martino and colleagues provided in their GitHub repository, I discovered several problems in the original analysis of the case studies. The details of this review can be found in the Supplementary Text. Aside from the selection of datasets with large effect sizes that were visible using the first two PCoA axes, the principle problems included (i) performing a single subsampling the samples in each data to an artificially low number of sequences (i.e., 1,000) for the Bray-Curtis and weighted UniFrac distance calculations; (ii) removal of sequences for the Bray-Curtis and weighted UniFrac distance calculations prior to subsampling that weren’t removed from the RPCA analysis because sequences were missing from the trees; (iii) they performed 9 rather than the 10 random subsamples of the datasets when generating balanced designs of the data sets (10 was described in the manuscript); (iv) running RPCA with a rank of 3 for the sleep apnea dataset rather than 2 as specified in the manuscript; (v) significant problems in the training and testing of the KNN classification to the data including the selection of the hyperparameter, lack of balance design in the stratifications, and only performing a single iteration; and (vi) only using two PCoA axes rather than the actual Bray-Curtis and weighted UniFrac distances in the KNN classification. The following analyses used the remedies as described in the Supplementary Text.</w:t>
+        <w:t xml:space="preserve">After conducting an exhaustive review of the code that Martino et al. provided in their GitHub repository, I discovered several problems in the original analysis of the case studies. The details of this review can be found in the Supplementary Text. Aside from the selection of datasets with large effect sizes that were visible using the first two PCoA axes, the principle problems included (i) performing a single subsampling the samples in each data to an artificially low number of sequences (i.e., 1,000) for the Bray-Curtis and weighted UniFrac distance calculations; (ii) removal of sequences for the Bray-Curtis and weighted UniFrac distance calculations prior to subsampling that weren’t removed from the RPCA analysis because sequences were missing from the trees; (iii) they performed 9 rather than the 10 random subsamples of the datasets when generating balanced designs of the data sets (10 was described in the manuscript); (iv) running RPCA with a rank of 3 for the sleep apnea dataset rather than 2 as specified in the manuscript; (v) significant problems in the training and testing of the KNN classification to the data including the selection of the hyperparameter, lack of balance design in the stratifications, and only performing a single iteration; and (vi) only using two PCoA axes rather than the actual Bray-Curtis and weighted UniFrac distances in the KNN classification. The following analyses used the remedies as described in the Supplementary Text.</w:t>
       </w:r>
     </w:p>
     <w:p>
@@ -679,7 +679,7 @@
         <w:pStyle w:val="FirstParagraph"/>
       </w:pPr>
       <w:r>
-        <w:t xml:space="preserve">I repeated Martino’s PERMANOVA analysis to test whether the average beta-diversity was significantly different between the two treatment groups within each of the three case studies. Their analysis varied the number of samples per treatment group to maintain a balanced design. This choice was peculiar since PERMANOVA is not sensitive to unbalanced sampling. When I used all of the samples available and performed the PERMANOVA analysis, the only dataset and methods that did not yield a significant result was for the colorectal cancer dataset using RPCA with 2 or 3 axes (P = 0.09 and 0.06, respectively). A second peculiar choice was to subsample the number of sequences to 1,000 sequences per sample when calculating Bray-Curtis distances but to use all of the sequences with RPCA. They could have increased the number of sequences by more than ten-fold without adversely impacting the number of samples in their analysis (Figure 5). Acceptable thresholds could have been 11,879 sequences for the sleep apnea dataset, 13,755 sequences for the sponge dataset, and 10,439 sequences for the colorectal cancer dataset. Overall, using the higher sequence count thresholds did not drastically alter the results of the analyses; however, it typically resulted in larger PERMANOVA F statistics (Figure 6). For the remainder of the PERMANOVA analysis, I have used the larger number of sequences instead of 1,000 sequences.</w:t>
+        <w:t xml:space="preserve">I repeated Martino et al.’s PERMANOVA analysis to test whether the average beta-diversity was significantly different between the two treatment groups within each of the three case studies. Their analysis varied the number of samples per treatment group to maintain a balanced design. This choice was peculiar since PERMANOVA is not sensitive to unbalanced sampling. When I used all of the samples available and performed the PERMANOVA analysis, the only dataset and methods that did not yield a significant result was for the colorectal cancer dataset using RPCA with 2 or 3 axes (P = 0.09 and 0.06, respectively). A second peculiar choice was to subsample the number of sequences to 1,000 sequences per sample when calculating Bray-Curtis distances but to use all of the sequences with RPCA. They could have increased the number of sequences by more than ten-fold without adversely impacting the number of samples in their analysis (Figure 5). Acceptable thresholds could have been 11,879 sequences for the sleep apnea dataset, 13,755 sequences for the sponge dataset, and 10,439 sequences for the colorectal cancer dataset. Overall, using the higher sequence count thresholds did not drastically alter the results of the analyses; however, it typically resulted in larger PERMANOVA F statistics (Figure 6). For the remainder of the PERMANOVA analysis, I have used the larger number of sequences instead of 1,000 sequences.</w:t>
       </w:r>
     </w:p>
     <w:p>
@@ -705,7 +705,7 @@
         <w:pStyle w:val="FirstParagraph"/>
       </w:pPr>
       <w:r>
-        <w:t xml:space="preserve">I repeated Martino’s KNN-based analysis using the remedies described in the Supplementary Text on all three datasets with each of the methods for correcting for uneven sampling effort (Figure 8). Rather than using their strategy of using a fixed number of nearest neighbors, I repeatedly fit the hyperparameter for the number of neighbors (i.e., K) using 80:20 training and testing splits. Overall, using the higher sequence count threshold did not dramatically alter the results of the analyses; however, it typically resulted in higher accuracy to classify samples into the treatment groups for the sleep apnea dataset, which had fewer samples (Figure 6). For the remainder of this analysis, I will describe the results using the larger number of sequences.</w:t>
+        <w:t xml:space="preserve">I repeated Martino et al.’s KNN-based analysis using the remedies described in the Supplementary Text on all three datasets with each of the methods for correcting for uneven sampling effort (Figure 8). Rather than using their strategy of using a fixed number of nearest neighbors, I repeatedly fit the hyperparameter for the number of neighbors (i.e., K) using 80:20 training and testing splits. Overall, using the higher sequence count threshold did not dramatically alter the results of the analyses; however, it typically resulted in higher accuracy to classify samples into the treatment groups for the sleep apnea dataset, which had fewer samples (Figure 6). For the remainder of this analysis, I will describe the results using the larger number of sequences.</w:t>
       </w:r>
     </w:p>
     <w:p>
@@ -713,7 +713,7 @@
         <w:pStyle w:val="BodyText"/>
       </w:pPr>
       <w:r>
-        <w:t xml:space="preserve">Similar to the PERMANOVA analysis, my KNN classification results largely replicated those observed for the sleep apnea and sponge datasets by Martino. In general, using RPCA with any number of axes resulted in median accuracies greater than 0.90 for these datasets. When using RPCA with the colorectal cancer dataset the accuracy increased modestly with the number of axes and the effect of the number of samples per group did not have a consistent effect on classification accuracy. Caution should be used in interpreting such results as there was no</w:t>
+        <w:t xml:space="preserve">Similar to the PERMANOVA analysis, my KNN classification results largely replicated those observed for the sleep apnea and sponge datasets by Martino et al.. In general, using RPCA with any number of axes resulted in median accuracies greater than 0.90 for these datasets. When using RPCA with the colorectal cancer dataset the accuracy increased modestly with the number of axes and the effect of the number of samples per group did not have a consistent effect on classification accuracy. Caution should be used in interpreting such results as there was no</w:t>
       </w:r>
       <w:r>
         <w:t xml:space="preserve"> </w:t>
@@ -747,7 +747,7 @@
         <w:pStyle w:val="FirstParagraph"/>
       </w:pPr>
       <w:r>
-        <w:t xml:space="preserve">To test the sensitivity of various methods to uneven sequencing effort, Martino generated duplicated each of the case study samples by subsampling one copy to 500 sequences per sample and subsampling the other copy to 100 sequences per sample. They calculated distances using Jaccard, Bray-Curtis, and RPCA and then visualized the distances using ordination. Martino stated that</w:t>
+        <w:t xml:space="preserve">To test the sensitivity of various methods to uneven sequencing effort, Martino et al. generated duplicated each of the case study samples by subsampling one copy to 500 sequences per sample and subsampling the other copy to 100 sequences per sample. They calculated distances using Jaccard, Bray-Curtis, and RPCA and then visualized the distances using ordination. Martino et al. stated that</w:t>
       </w:r>
       <w:r>
         <w:t xml:space="preserve"> </w:t>
@@ -775,7 +775,7 @@
         <w:pStyle w:val="FirstParagraph"/>
       </w:pPr>
       <w:r>
-        <w:t xml:space="preserve">When evaluating bioinformatics tools, simulated datasets are useful when a null or true difference between treatment groups in a real dataset cannot be established. The simulation approach described by Martino offered a novel approach to studying the performance of various methods for controlling uneven sampling effort. Unfortunately, as implemented in the original study, the simulation code had critical errors that made it impossible to meaningfully compare overlapping treatment groups. When the code was corrected and a smaller effect size was applied, the limitations of RPCA relative to other methods became clear. Because simulated data does not not always depict the complexity of real data, real datasets can be useful for demonstrating the utility of these methods. The datasets selected by Martino had large effect sizes, which limited the ability to detect variation in performance since the differences were relatively easy to detect. For example, significant P-values and median classification accuracies above 0.90 were common regardless of the method. By incorporating the colorectal cancer dataset, which had a small effect size, there was more variation in the power to detect differences and classification accuracy. Under more nuanced conditions RPCA was no better than rarefaction and was often worse. Since a researcher is unlikely to know the effect size before conducting their analysis, it would be most prudent to select methods with the most power.</w:t>
+        <w:t xml:space="preserve">When evaluating bioinformatics tools, simulated datasets are useful when a null or true difference between treatment groups in a real dataset cannot be established. The simulation approach described by Martino et al. offered a novel approach to studying the performance of various methods for controlling uneven sampling effort. Unfortunately, as implemented in the original study, the simulation code had critical errors that made it impossible to meaningfully compare overlapping treatment groups. When the code was corrected and a smaller effect size was applied, the limitations of RPCA relative to other methods became clear. Because simulated data does not not always depict the complexity of real data, real datasets can be useful for demonstrating the utility of these methods. The datasets selected by Martino et al. had large effect sizes, which limited the ability to detect variation in performance since the differences were relatively easy to detect. For example, significant P-values and median classification accuracies above 0.90 were common regardless of the method. By incorporating the colorectal cancer dataset, which had a small effect size, there was more variation in the power to detect differences and classification accuracy. Under more nuanced conditions RPCA was no better than rarefaction and was often worse. Since a researcher is unlikely to know the effect size before conducting their analysis, it would be most prudent to select methods with the most power.</w:t>
       </w:r>
     </w:p>
     <w:p>
@@ -783,7 +783,7 @@
         <w:pStyle w:val="BodyText"/>
       </w:pPr>
       <w:r>
-        <w:t xml:space="preserve">Martino implemented methods for evaluating RPCA relative to other strategies of controlling for uneven sampling effort that would not normally be used in a typical microbiome analysis. First, Martino benchmarked RPCA by comparing the method’s performance using raw counts or RCLR-transformed data. Missing from their benchmarking was a comparison to Bray-Curtis or UniFrac distances or use of other methods of controlling for uneven sampling effort. The result was a comparison that made their new method appear considerably better than a method that no one else has used in a published microbiome analysis. Second, they used KNN as a classification tool rather than using logistic regression or random forest. KNN is simply not used for classifying microbiome data. Compounding the problem of using KNN was that they did so based on distances from the first two or three axes of a PCoA using a Bray-Curtis or weighted UniFrac distance matrices rather than directly using the ecological distances themselves. The effect was a loss of information stored in higher dimensions. Even with the limitations of KNN (e.g., requirement of balanced design), the other methods outperformed RPCA.</w:t>
+        <w:t xml:space="preserve">Martino et al. implemented methods for evaluating RPCA relative to other strategies of controlling for uneven sampling effort that would not normally be used in a typical microbiome analysis. First, Martino et al. benchmarked RPCA by comparing the method’s performance using raw counts or RCLR-transformed data. Missing from their benchmarking was a comparison to Bray-Curtis or UniFrac distances or use of other methods of controlling for uneven sampling effort. The result was a comparison that made their new method appear considerably better than a method that no one else has used in a published microbiome analysis. Second, they used KNN as a classification tool rather than using logistic regression or random forest. KNN is simply not used for classifying microbiome data. Compounding the problem of using KNN was that they did so based on distances from the first two or three axes of a PCoA using a Bray-Curtis or weighted UniFrac distance matrices rather than directly using the ecological distances themselves. The effect was a loss of information stored in higher dimensions. Even with the limitations of KNN (e.g., requirement of balanced design), the other methods outperformed RPCA.</w:t>
       </w:r>
     </w:p>
     <w:p>
@@ -791,7 +791,7 @@
         <w:pStyle w:val="BodyText"/>
       </w:pPr>
       <w:r>
-        <w:t xml:space="preserve">There are several limitations inherent in RPCA that would still limit its use even if its performance were better. First, there is no guidance on selecting the number of axes one should use with RPCA. Martino used 2 axes with their simulated and sponges dataset and 3 axes with the sleep apnea dataset; 3 is the default value in their publicly released gemelli software for running RPCA. As I showed with the real datasets, increasing the number of axes increased the power to detect differences and the classification accuracy. This creates a scenario where users could select a number of axes to fit their expected results (i.e.,</w:t>
+        <w:t xml:space="preserve">There are several limitations inherent in RPCA that would still limit its use even if its performance were better. First, there is no guidance on selecting the number of axes one should use with RPCA. Martino et al. used 2 axes with their simulated and sponges dataset and 3 axes with the sleep apnea dataset; 3 is the default value in their publicly released gemelli software for running RPCA. As I showed with the real datasets, increasing the number of axes increased the power to detect differences and the classification accuracy. This creates a scenario where users could select a number of axes to fit their expected results (i.e.,</w:t>
       </w:r>
       <w:r>
         <w:t xml:space="preserve"> </w:t>
@@ -800,7 +800,7 @@
         <w:t xml:space="preserve">“P-hacking”</w:t>
       </w:r>
       <w:r>
-        <w:t xml:space="preserve">). Second, as Martino indicated the method does not perform well with time series data or where there is considerable variation between the samples. This is likely when effect sizes between treatment groups are small as is typical in most microbiome analyses.</w:t>
+        <w:t xml:space="preserve">). Second, as Martino et al. indicated the method does not perform well with time series data or where there is considerable variation between the samples. This is likely when effect sizes between treatment groups are small as is typical in most microbiome analyses.</w:t>
       </w:r>
     </w:p>
     <w:p>
@@ -808,7 +808,7 @@
         <w:pStyle w:val="BodyText"/>
       </w:pPr>
       <w:r>
-        <w:t xml:space="preserve">Martino made the claim in their paper’s Discussion section that Aitchison distances calculated using RPCA are insensitive to uneven sequencing effort. The only data they provide to support this claim was found in their paper’s Materials and Methods section, which references their Supplemental Figure 3 and Supplemental Table 2. Yet, those data show that the RPCA ordination also clustered by sequencing depth. Unfortunately, they did not rarefy the Jaccard or Bray-Curtis distances to a common number of sequences as one would do in a real analysis. I replicated this analysis, but with a larger number of sequences per sample using simulated and real datasets, and using a two-factor PERMANOVA analysis. These results (Figure 9) confirmed that RPCA, the other CLR-based methods, using raw counts, DeSeq2, CSS normalization, and relative abundance were unable to control for uneven sampling effort in this analysis. Only rarefaction, subsampling, and SRS normalization were able to control for uneven sampling effort.</w:t>
+        <w:t xml:space="preserve">Martino et al. made the claim in their paper’s Discussion section that Aitchison distances calculated using RPCA are insensitive to uneven sequencing effort. The only data they provide to support this claim was found in their paper’s Materials and Methods section, which references their Supplemental Figure 3 and Supplemental Table 2. Yet, those data show that the RPCA ordination also clustered by sequencing depth. Unfortunately, they did not rarefy the Jaccard or Bray-Curtis distances to a common number of sequences as one would do in a real analysis. I replicated this analysis, but with a larger number of sequences per sample using simulated and real datasets, and using a two-factor PERMANOVA analysis. These results (Figure 9) confirmed that RPCA, the other CLR-based methods, using raw counts, DeSeq2, CSS normalization, and relative abundance were unable to control for uneven sampling effort in this analysis. Only rarefaction, subsampling, and SRS normalization were able to control for uneven sampling effort.</w:t>
       </w:r>
     </w:p>
     <w:p>
@@ -852,7 +852,7 @@
         <w:pStyle w:val="FirstParagraph"/>
       </w:pPr>
       <w:r>
-        <w:t xml:space="preserve">Martino made a git-based repository available on GitHub that includes the actual benchmarking code written in Python and the data used in their analysis (https://github.com/cameronmartino/deicode-benchmarking). Deicode was the original name of the package that implemented RPCA. That functionality is now available as part of the gemelli package. The code and data from their benchmarking repository are included as the directory</w:t>
+        <w:t xml:space="preserve">Martino et al. made a git-based repository available on GitHub that includes the actual benchmarking code written in Python and the data used in their analysis (https://github.com/cameronmartino/deicode-benchmarking). Deicode was the original name of the package that implemented RPCA. That functionality is now available as part of the gemelli package. The code and data from their benchmarking repository are included as the directory</w:t>
       </w:r>
       <w:r>
         <w:t xml:space="preserve"> </w:t>
@@ -882,7 +882,7 @@
         <w:pStyle w:val="FirstParagraph"/>
       </w:pPr>
       <w:r>
-        <w:t xml:space="preserve">A revised version of Martino’s simulation code was written in R as described in the Results section. The code I generated used functions from base R and the tidyverse metapackage. The script that implemented the simulation is available in the repository as workflow/scripts/simulations.R. Similar to Martino’s original Python implementation, the simulation code took as input the number of samples, OTUs, treatment groups, OTUs shared between the treatment groups, and sequences to generate the simulated communities. A driver script subsampled the data to the desired number of sequences and formatted the data for downstream analysis.</w:t>
+        <w:t xml:space="preserve">A revised version of Martino et al.’s simulation code was written in R as described in the Results section. The code I generated used functions from base R and the tidyverse metapackage. The script that implemented the simulation is available in the repository as workflow/scripts/simulations.R. Similar to Martino et al.’s original Python implementation, the simulation code took as input the number of samples, OTUs, treatment groups, OTUs shared between the treatment groups, and sequences to generate the simulated communities. A driver script subsampled the data to the desired number of sequences and formatted the data for downstream analysis.</w:t>
       </w:r>
     </w:p>
     <w:bookmarkEnd w:id="34"/>
@@ -1026,7 +1026,7 @@
         <w:pStyle w:val="FirstParagraph"/>
       </w:pPr>
       <w:r>
-        <w:t xml:space="preserve">Martino’s KNN classification analysis used the KNeighborsClassifier function from scikit-learn</w:t>
+        <w:t xml:space="preserve">Martino et al.’s KNN classification analysis used the KNeighborsClassifier function from scikit-learn</w:t>
       </w:r>
       <w:r>
         <w:t xml:space="preserve"> </w:t>
@@ -1035,7 +1035,7 @@
         <w:t xml:space="preserve">(39)</w:t>
       </w:r>
       <w:r>
-        <w:t xml:space="preserve">. Although that function could have taken a pre-computed distance matrix as input in the version of scikit-learn that Martino used (v.0.5.9), they gave the function the ordination results with the desired number of axes. I reimplemented an R-based version of the KNN classification method as workflow/scripts/test_train_knn.R. This method implemented the training-testing framework described by Topcuoglu et al.</w:t>
+        <w:t xml:space="preserve">. Although that function could have taken a pre-computed distance matrix as input in the version of scikit-learn that Martino et al. used (v.0.5.9), they gave the function the ordination results with the desired number of axes. I reimplemented an R-based version of the KNN classification method as workflow/scripts/test_train_knn.R. This method implemented the training-testing framework described by Topcuoglu et al.</w:t>
       </w:r>
       <w:r>
         <w:t xml:space="preserve"> </w:t>
@@ -1218,7 +1218,7 @@
         <w:pStyle w:val="FirstParagraph"/>
       </w:pPr>
       <w:r>
-        <w:t xml:space="preserve">Following the approach described by Martino to assess the sensitivity of the different methods to uneven sequencing I randomly sampled 5,000 and 10,000 sequences from each of the simulation and case study datasets. These data were pooled so that each sample was represented at each of the sequencing levels. A sequencing depth variable was added to the treatment group label. Each dataset was replicated 10 times with a different random number generator seed. To test the effects of sequencing depth, I used the adonis2 function from the vegan R package (v.2.6_4)</w:t>
+        <w:t xml:space="preserve">Following the approach described by Martino et al. to assess the sensitivity of the different methods to uneven sequencing I randomly sampled 5,000 and 10,000 sequences from each of the simulation and case study datasets. These data were pooled so that each sample was represented at each of the sequencing levels. A sequencing depth variable was added to the treatment group label. Each dataset was replicated 10 times with a different random number generator seed. To test the effects of sequencing depth, I used the adonis2 function from the vegan R package (v.2.6_4)</w:t>
       </w:r>
       <w:r>
         <w:t xml:space="preserve"> </w:t>
@@ -1248,7 +1248,7 @@
         <w:pStyle w:val="FirstParagraph"/>
       </w:pPr>
       <w:r>
-        <w:t xml:space="preserve">No new biological data were generated in this study. The entire codebase for my analysis is available as a GitHub repository at https://github.com/SchlossLab/Schloss_RPCA_mSystems_2026. The repository includes a copy of Martino’s benchmarking repository. My repository includes a Snakemake-based workflow (v.7.32.4) includes all of the steps in the analyses described in this manuscript. The workflow uses R (v.4.3.3) and Python (v.3.11.14) packages and code. Notable R packages not already indicated included tidyverse (v.2.0.0), data.table (v.1.14.8), ggh4x (v.0.2.6), ggtext (v.0.1.2), patchwork (v.1.1.3), quarto (v.1.4.550), and reticulate (v.1.43.0). Notable Python packages not already indicated included matplotlib (v.3.8.1), numpy (v.1.12.1), pandas (v.2.1.3), scikit-bio (v.0.5.9), scikit-learn (v.1.3.2), and scipy (v.1.10.0).</w:t>
+        <w:t xml:space="preserve">No new biological data were generated in this study. The entire codebase for my analysis is available as a GitHub repository at https://github.com/SchlossLab/Schloss_RPCA_mSystems_2026. The repository includes a copy of Martino et al.’s benchmarking repository. My repository includes a Snakemake-based workflow (v.7.32.4) includes all of the steps in the analyses described in this manuscript. The workflow uses R (v.4.3.3) and Python (v.3.11.14) packages and code. Notable R packages not already indicated included tidyverse (v.2.0.0), data.table (v.1.14.8), ggh4x (v.0.2.6), ggtext (v.0.1.2), patchwork (v.1.1.3), quarto (v.1.4.550), and reticulate (v.1.43.0). Notable Python packages not already indicated included matplotlib (v.3.8.1), numpy (v.1.12.1), pandas (v.2.1.3), scikit-bio (v.0.5.9), scikit-learn (v.1.3.2), and scipy (v.1.10.0).</w:t>
       </w:r>
     </w:p>
     <w:bookmarkEnd w:id="41"/>
@@ -1267,7 +1267,7 @@
         <w:pStyle w:val="FirstParagraph"/>
       </w:pPr>
       <w:r>
-        <w:t xml:space="preserve">I am grateful to the reviewers of the papers describing my previous analyses who raised the question of why I saw different results from other developers who had developed methods of controlling for uneven sampling effort. I appreciate that Martino and colleagues made their benchmarking code and data publicly accessible. This study would not have been possibly without their commendable transparency. No generative artificial intelligence tools were intentionally used in this study or in the preparation of this manuscript.</w:t>
+        <w:t xml:space="preserve">I am grateful to the reviewers of the papers describing my previous analyses who raised the question of why I saw different results from other developers who had developed methods of controlling for uneven sampling effort. I appreciate that Martino et al. and colleagues made their benchmarking code and data publicly accessible. This study would not have been possibly without their commendable transparency. No generative artificial intelligence tools were intentionally used in this study or in the preparation of this manuscript.</w:t>
       </w:r>
     </w:p>
     <w:p>
@@ -5621,13 +5621,13 @@
           <w:b/>
           <w:bCs/>
         </w:rPr>
-        <w:t xml:space="preserve">Figure 1. Rerunning the original Martino code in my computational environment produced qualitatively similar heatmaps (A) and ordination diagrams (B) to what they originally reported when 4,000 sequences were sampled from each sample.</w:t>
-      </w:r>
-      <w:r>
-        <w:t xml:space="preserve"> </w:t>
-      </w:r>
-      <w:r>
-        <w:t xml:space="preserve">This figure is analogous to Figure 3DE of Martino with the inclusion of additional data from simulations where there was partial overlap between the two treatment groups (</w:t>
+        <w:t xml:space="preserve">Figure 1. Rerunning the original Martino et al. code in my computational environment produced qualitatively similar heatmaps (A) and ordination diagrams (B) to what they originally reported when 4,000 sequences were sampled from each sample.</w:t>
+      </w:r>
+      <w:r>
+        <w:t xml:space="preserve"> </w:t>
+      </w:r>
+      <w:r>
+        <w:t xml:space="preserve">This figure is analogous to Figure 3DE of Martino et al. with the inclusion of additional data from simulations where there was partial overlap between the two treatment groups (</w:t>
       </w:r>
       <w:r>
         <w:t xml:space="preserve">“Overlap”</w:t>
@@ -5651,7 +5651,7 @@
         <w:t xml:space="preserve"> </w:t>
       </w:r>
       <w:r>
-        <w:t xml:space="preserve">This figure includes data that was shown in in Figure 3BC of Martino with the inclusion of results when using additional data transformations, Bray-Curtis distances, and I used 10 instead of 1 replicate simulation. Each circle represents the median of ten replicate simulations and the confidence line indicates the range between the minimum and maximum values. The median KNN classification accuracy and range were the median of 10 median values each calculated across 100 training-testing splits using the fitted K value from 80:20 splits. The vertical gray line for KNN classification indicates the accuracy one would expect from randomly guessing the treatment group.</w:t>
+        <w:t xml:space="preserve">This figure includes data that was shown in in Figure 3BC of Martino et al. with the inclusion of results when using additional data transformations, Bray-Curtis distances, and I used 10 instead of 1 replicate simulation. Each circle represents the median of ten replicate simulations and the confidence line indicates the range between the minimum and maximum values. The median KNN classification accuracy and range were the median of 10 median values each calculated across 100 training-testing splits using the fitted K value from 80:20 splits. The vertical gray line for KNN classification indicates the accuracy one would expect from randomly guessing the treatment group.</w:t>
       </w:r>
     </w:p>
     <w:p>
@@ -5663,7 +5663,7 @@
           <w:b/>
           <w:bCs/>
         </w:rPr>
-        <w:t xml:space="preserve">Figure 3. Heatmaps (A) and ordinations (B) of an example dataset comparing communities simulated rewritten in R based on the description in Martino when 10,000 sequences were sampled from each sample.</w:t>
+        <w:t xml:space="preserve">Figure 3. Heatmaps (A) and ordinations (B) of an example dataset comparing communities simulated rewritten in R based on the description in Martino et al. when 10,000 sequences were sampled from each sample.</w:t>
       </w:r>
       <w:r>
         <w:t xml:space="preserve"> </w:t>
@@ -5699,13 +5699,13 @@
           <w:b/>
           <w:bCs/>
         </w:rPr>
-        <w:t xml:space="preserve">Figure 5. Martino selected an arbitrarily small number of sequences and a pair of datasets that were small relative to other available datasets.</w:t>
-      </w:r>
-      <w:r>
-        <w:t xml:space="preserve"> </w:t>
-      </w:r>
-      <w:r>
-        <w:t xml:space="preserve">The vertical dashed line indicates the 1,000 sequence threshold, which was used by Martino and colleagues when calculating Bray-Curtis and weighted UniFrac distances. The vertical solid line indicates the higher threshold that was added in this study to explore the effects of sequencing depths. The higher threshold was 11,879 sequences for the sleep apnea dataset, 13,755 sequences for the sponges dataset, and 10,439 sequences for the colorectal cancer dataset.</w:t>
+        <w:t xml:space="preserve">Figure 5. Martino et al. selected an arbitrarily small number of sequences and a pair of datasets that were small relative to other available datasets.</w:t>
+      </w:r>
+      <w:r>
+        <w:t xml:space="preserve"> </w:t>
+      </w:r>
+      <w:r>
+        <w:t xml:space="preserve">The vertical dashed line indicates the 1,000 sequence threshold, which was used by Martino et al. and colleagues when calculating Bray-Curtis and weighted UniFrac distances. The vertical solid line indicates the higher threshold that was added in this study to explore the effects of sequencing depths. The higher threshold was 11,879 sequences for the sleep apnea dataset, 13,755 sequences for the sponges dataset, and 10,439 sequences for the colorectal cancer dataset.</w:t>
       </w:r>
     </w:p>
     <w:p>
@@ -5799,13 +5799,13 @@
           <w:b/>
           <w:bCs/>
         </w:rPr>
-        <w:t xml:space="preserve">Figure S1. The choice of K and the size of the training and testing data sets had a minimal effect on KNN classification accuracy when using the original Martino overlap simulation data.</w:t>
-      </w:r>
-      <w:r>
-        <w:t xml:space="preserve"> </w:t>
-      </w:r>
-      <w:r>
-        <w:t xml:space="preserve">Martino split 60% of their data into a training set using 13 neighbors and tested on the remaining 40%. Following Topcuoglu et al.</w:t>
+        <w:t xml:space="preserve">Figure S1. The choice of K and the size of the training and testing data sets had a minimal effect on KNN classification accuracy when using the original Martino et al. overlap simulation data.</w:t>
+      </w:r>
+      <w:r>
+        <w:t xml:space="preserve"> </w:t>
+      </w:r>
+      <w:r>
+        <w:t xml:space="preserve">Martino et al. split 60% of their data into a training set using 13 neighbors and tested on the remaining 40%. Following Topcuoglu et al.</w:t>
       </w:r>
       <w:r>
         <w:t xml:space="preserve"> </w:t>
@@ -5832,7 +5832,7 @@
         <w:t xml:space="preserve"> </w:t>
       </w:r>
       <w:r>
-        <w:t xml:space="preserve">Martino split 60% of their data into a training set using 13 neighbors and tested on the remaining 40%. Following Topcuoglu et al.</w:t>
+        <w:t xml:space="preserve">Martino et al. split 60% of their data into a training set using 13 neighbors and tested on the remaining 40%. Following Topcuoglu et al.</w:t>
       </w:r>
       <w:r>
         <w:t xml:space="preserve"> </w:t>

</xml_diff>